<commit_message>
Adding context builder for sit rep.
</commit_message>
<xml_diff>
--- a/das/reports/docx_template/lewa_sitrep_template.docx
+++ b/das/reports/docx_template/lewa_sitrep_template.docx
@@ -5,10 +5,6 @@
     <w:p>
       <w:pPr>
         <w:pStyle w:val="Title"/>
-        <w:rPr>
-          <w:sz w:val="22"/>
-          <w:szCs w:val="22"/>
-        </w:rPr>
       </w:pPr>
       <w:r>
         <w:t>Daily</w:t>
@@ -18,11 +14,20 @@
       </w:r>
       <w:proofErr w:type="spellStart"/>
       <w:r>
-        <w:t>Sitrep</w:t>
+        <w:t>Sit</w:t>
+      </w:r>
+      <w:r>
+        <w:t>R</w:t>
+      </w:r>
+      <w:r>
+        <w:t>ep</w:t>
       </w:r>
       <w:proofErr w:type="spellEnd"/>
       <w:r>
-        <w:t xml:space="preserve">: </w:t>
+        <w:t>:</w:t>
+      </w:r>
+      <w:r>
+        <w:t xml:space="preserve"> </w:t>
       </w:r>
       <w:r>
         <w:t>{{</w:t>
@@ -38,15 +43,67 @@
     </w:p>
     <w:p>
       <w:pPr>
+        <w:jc w:val="left"/>
+        <w:rPr>
+          <w:rFonts w:ascii="Cambria" w:hAnsi="Cambria"/>
+          <w:b/>
+          <w:color w:val="000000"/>
+          <w:sz w:val="22"/>
+          <w:szCs w:val="22"/>
+        </w:rPr>
+      </w:pPr>
+      <w:proofErr w:type="gramStart"/>
+      <w:r>
+        <w:rPr>
+          <w:rFonts w:ascii="Cambria" w:hAnsi="Cambria"/>
+          <w:b/>
+          <w:color w:val="000000"/>
+          <w:sz w:val="22"/>
+          <w:szCs w:val="22"/>
+        </w:rPr>
+        <w:t xml:space="preserve">{{ </w:t>
+      </w:r>
+      <w:proofErr w:type="spellStart"/>
+      <w:r>
+        <w:rPr>
+          <w:rFonts w:ascii="Cambria" w:hAnsi="Cambria"/>
+          <w:b/>
+          <w:color w:val="000000"/>
+          <w:sz w:val="22"/>
+          <w:szCs w:val="22"/>
+        </w:rPr>
+        <w:t>report</w:t>
+      </w:r>
+      <w:proofErr w:type="gramEnd"/>
+      <w:r>
+        <w:rPr>
+          <w:rFonts w:ascii="Cambria" w:hAnsi="Cambria"/>
+          <w:b/>
+          <w:color w:val="000000"/>
+          <w:sz w:val="22"/>
+          <w:szCs w:val="22"/>
+        </w:rPr>
+        <w:t>_daterange_text</w:t>
+      </w:r>
+      <w:proofErr w:type="spellEnd"/>
+      <w:r>
+        <w:rPr>
+          <w:rFonts w:ascii="Cambria" w:hAnsi="Cambria"/>
+          <w:b/>
+          <w:color w:val="000000"/>
+          <w:sz w:val="22"/>
+          <w:szCs w:val="22"/>
+        </w:rPr>
+        <w:t xml:space="preserve"> }}</w:t>
+      </w:r>
+      <w:bookmarkStart w:id="0" w:name="_GoBack"/>
+      <w:bookmarkEnd w:id="0"/>
+    </w:p>
+    <w:p>
+      <w:pPr>
         <w:pStyle w:val="Heading1"/>
-        <w:rPr>
-          <w:color w:val="538135" w:themeColor="accent6" w:themeShade="BF"/>
-        </w:rPr>
       </w:pPr>
       <w:r>
-        <w:rPr>
-          <w:color w:val="538135" w:themeColor="accent6" w:themeShade="BF"/>
-        </w:rPr>
         <w:t>Wildlife</w:t>
       </w:r>
     </w:p>
@@ -123,31 +180,235 @@
           <w:szCs w:val="22"/>
         </w:rPr>
         <w:t xml:space="preserve"> %}</w:t>
+      </w:r>
+    </w:p>
+    <w:p>
+      <w:pPr>
+        <w:rPr>
+          <w:rFonts w:ascii="Cambria" w:hAnsi="Cambria"/>
+          <w:b/>
+          <w:sz w:val="22"/>
+          <w:szCs w:val="22"/>
+        </w:rPr>
+      </w:pPr>
+      <w:r>
+        <w:rPr>
+          <w:rFonts w:ascii="Cambria" w:hAnsi="Cambria"/>
+          <w:b/>
+          <w:color w:val="000000"/>
+          <w:sz w:val="22"/>
+          <w:szCs w:val="22"/>
+        </w:rPr>
+        <w:t>Total</w:t>
+      </w:r>
+      <w:r>
+        <w:rPr>
+          <w:rFonts w:ascii="Cambria" w:hAnsi="Cambria"/>
+          <w:b/>
+          <w:sz w:val="22"/>
+          <w:szCs w:val="22"/>
+        </w:rPr>
+        <w:t xml:space="preserve"> Number of Rhi</w:t>
+      </w:r>
+      <w:r>
+        <w:rPr>
+          <w:rFonts w:ascii="Cambria" w:hAnsi="Cambria"/>
+          <w:b/>
+          <w:sz w:val="22"/>
+          <w:szCs w:val="22"/>
+        </w:rPr>
+        <w:t>no o</w:t>
+      </w:r>
+      <w:r>
+        <w:rPr>
+          <w:rFonts w:ascii="Cambria" w:hAnsi="Cambria"/>
+          <w:b/>
+          <w:sz w:val="22"/>
+          <w:szCs w:val="22"/>
+        </w:rPr>
+        <w:t xml:space="preserve">n </w:t>
+      </w:r>
+      <w:r>
+        <w:rPr>
+          <w:rFonts w:ascii="Cambria" w:hAnsi="Cambria"/>
+          <w:b/>
+          <w:sz w:val="22"/>
+          <w:szCs w:val="22"/>
+        </w:rPr>
+        <w:t>{{</w:t>
+      </w:r>
+      <w:proofErr w:type="spellStart"/>
+      <w:proofErr w:type="gramStart"/>
+      <w:r>
+        <w:rPr>
+          <w:rFonts w:ascii="Cambria" w:hAnsi="Cambria"/>
+          <w:b/>
+          <w:sz w:val="22"/>
+          <w:szCs w:val="22"/>
+        </w:rPr>
+        <w:t>ws.</w:t>
+      </w:r>
+      <w:r>
+        <w:rPr>
+          <w:rFonts w:ascii="Cambria" w:hAnsi="Cambria"/>
+          <w:b/>
+          <w:sz w:val="22"/>
+          <w:szCs w:val="22"/>
+        </w:rPr>
+        <w:t>conservancy</w:t>
+      </w:r>
+      <w:proofErr w:type="spellEnd"/>
+      <w:proofErr w:type="gramEnd"/>
+      <w:r>
+        <w:rPr>
+          <w:rFonts w:ascii="Cambria" w:hAnsi="Cambria"/>
+          <w:b/>
+          <w:sz w:val="22"/>
+          <w:szCs w:val="22"/>
+        </w:rPr>
+        <w:t>}}</w:t>
+      </w:r>
+      <w:r>
+        <w:rPr>
+          <w:rFonts w:ascii="Cambria" w:hAnsi="Cambria"/>
+          <w:b/>
+          <w:sz w:val="22"/>
+          <w:szCs w:val="22"/>
+        </w:rPr>
+        <w:t>: Black</w:t>
+      </w:r>
+      <w:r>
+        <w:rPr>
+          <w:rFonts w:ascii="Cambria" w:hAnsi="Cambria"/>
+          <w:b/>
+          <w:sz w:val="22"/>
+          <w:szCs w:val="22"/>
+        </w:rPr>
+        <w:t xml:space="preserve"> = </w:t>
+      </w:r>
+      <w:r>
+        <w:rPr>
+          <w:rFonts w:ascii="Cambria" w:hAnsi="Cambria"/>
+          <w:b/>
+          <w:sz w:val="22"/>
+          <w:szCs w:val="22"/>
+        </w:rPr>
+        <w:t>{{</w:t>
+      </w:r>
+      <w:proofErr w:type="spellStart"/>
+      <w:r>
+        <w:rPr>
+          <w:rFonts w:ascii="Cambria" w:hAnsi="Cambria"/>
+          <w:b/>
+          <w:sz w:val="22"/>
+          <w:szCs w:val="22"/>
+        </w:rPr>
+        <w:t>ws.</w:t>
+      </w:r>
+      <w:r>
+        <w:rPr>
+          <w:rFonts w:ascii="Cambria" w:hAnsi="Cambria"/>
+          <w:b/>
+          <w:sz w:val="22"/>
+          <w:szCs w:val="22"/>
+        </w:rPr>
+        <w:t>total_rhino_black</w:t>
+      </w:r>
+      <w:proofErr w:type="spellEnd"/>
+      <w:r>
+        <w:rPr>
+          <w:rFonts w:ascii="Cambria" w:hAnsi="Cambria"/>
+          <w:b/>
+          <w:sz w:val="22"/>
+          <w:szCs w:val="22"/>
+        </w:rPr>
+        <w:t>}}</w:t>
+      </w:r>
+      <w:r>
+        <w:rPr>
+          <w:rFonts w:ascii="Cambria" w:hAnsi="Cambria"/>
+          <w:b/>
+          <w:sz w:val="22"/>
+          <w:szCs w:val="22"/>
+        </w:rPr>
+        <w:t>;</w:t>
+      </w:r>
+      <w:r>
+        <w:rPr>
+          <w:rFonts w:ascii="Cambria" w:hAnsi="Cambria"/>
+          <w:b/>
+          <w:sz w:val="22"/>
+          <w:szCs w:val="22"/>
+        </w:rPr>
+        <w:t xml:space="preserve"> White</w:t>
+      </w:r>
+      <w:r>
+        <w:rPr>
+          <w:rFonts w:ascii="Cambria" w:hAnsi="Cambria"/>
+          <w:b/>
+          <w:sz w:val="22"/>
+          <w:szCs w:val="22"/>
+        </w:rPr>
+        <w:t xml:space="preserve"> = </w:t>
+      </w:r>
+      <w:r>
+        <w:rPr>
+          <w:rFonts w:ascii="Cambria" w:hAnsi="Cambria"/>
+          <w:b/>
+          <w:sz w:val="22"/>
+          <w:szCs w:val="22"/>
+        </w:rPr>
+        <w:t>{{</w:t>
+      </w:r>
+      <w:proofErr w:type="spellStart"/>
+      <w:r>
+        <w:rPr>
+          <w:rFonts w:ascii="Cambria" w:hAnsi="Cambria"/>
+          <w:b/>
+          <w:sz w:val="22"/>
+          <w:szCs w:val="22"/>
+        </w:rPr>
+        <w:t>ws.</w:t>
+      </w:r>
+      <w:r>
+        <w:rPr>
+          <w:rFonts w:ascii="Cambria" w:hAnsi="Cambria"/>
+          <w:b/>
+          <w:sz w:val="22"/>
+          <w:szCs w:val="22"/>
+        </w:rPr>
+        <w:t>total_rhino_white</w:t>
+      </w:r>
+      <w:proofErr w:type="spellEnd"/>
+      <w:r>
+        <w:rPr>
+          <w:rFonts w:ascii="Cambria" w:hAnsi="Cambria"/>
+          <w:b/>
+          <w:sz w:val="22"/>
+          <w:szCs w:val="22"/>
+        </w:rPr>
+        <w:t>}}</w:t>
       </w:r>
     </w:p>
     <w:tbl>
       <w:tblPr>
         <w:tblStyle w:val="ListTable4-Accent6"/>
-        <w:tblpPr w:leftFromText="180" w:rightFromText="180" w:vertAnchor="text" w:horzAnchor="page" w:tblpX="1549" w:tblpY="638"/>
-        <w:tblW w:w="6655" w:type="dxa"/>
-        <w:tblLayout w:type="fixed"/>
+        <w:tblW w:w="0" w:type="auto"/>
         <w:tblLook w:val="04A0" w:firstRow="1" w:lastRow="0" w:firstColumn="1" w:lastColumn="0" w:noHBand="0" w:noVBand="1"/>
       </w:tblPr>
       <w:tblGrid>
-        <w:gridCol w:w="2245"/>
-        <w:gridCol w:w="4410"/>
+        <w:gridCol w:w="4675"/>
+        <w:gridCol w:w="2356"/>
       </w:tblGrid>
       <w:tr>
         <w:trPr>
           <w:cnfStyle w:val="100000000000" w:firstRow="1" w:lastRow="0" w:firstColumn="0" w:lastColumn="0" w:oddVBand="0" w:evenVBand="0" w:oddHBand="0" w:evenHBand="0" w:firstRowFirstColumn="0" w:firstRowLastColumn="0" w:lastRowFirstColumn="0" w:lastRowLastColumn="0"/>
-          <w:trHeight w:val="323"/>
         </w:trPr>
         <w:tc>
           <w:tcPr>
             <w:cnfStyle w:val="001000000000" w:firstRow="0" w:lastRow="0" w:firstColumn="1" w:lastColumn="0" w:oddVBand="0" w:evenVBand="0" w:oddHBand="0" w:evenHBand="0" w:firstRowFirstColumn="0" w:firstRowLastColumn="0" w:lastRowFirstColumn="0" w:lastRowLastColumn="0"/>
-            <w:tcW w:w="6655" w:type="dxa"/>
+            <w:tcW w:w="7031" w:type="dxa"/>
             <w:gridSpan w:val="2"/>
-            <w:hideMark/>
           </w:tcPr>
           <w:p>
             <w:pPr>
@@ -155,7 +416,6 @@
               <w:jc w:val="left"/>
               <w:rPr>
                 <w:rFonts w:ascii="Calibri" w:hAnsi="Calibri"/>
-                <w:b w:val="0"/>
                 <w:sz w:val="22"/>
                 <w:szCs w:val="22"/>
               </w:rPr>
@@ -166,7 +426,7 @@
                 <w:sz w:val="22"/>
                 <w:szCs w:val="22"/>
               </w:rPr>
-              <w:t>Rhino sightings today</w:t>
+              <w:t>Rhino Sightings today</w:t>
             </w:r>
           </w:p>
         </w:tc>
@@ -174,29 +434,32 @@
       <w:tr>
         <w:trPr>
           <w:cnfStyle w:val="000000100000" w:firstRow="0" w:lastRow="0" w:firstColumn="0" w:lastColumn="0" w:oddVBand="0" w:evenVBand="0" w:oddHBand="1" w:evenHBand="0" w:firstRowFirstColumn="0" w:firstRowLastColumn="0" w:lastRowFirstColumn="0" w:lastRowLastColumn="0"/>
-          <w:trHeight w:val="324"/>
         </w:trPr>
         <w:tc>
           <w:tcPr>
             <w:cnfStyle w:val="001000000000" w:firstRow="0" w:lastRow="0" w:firstColumn="1" w:lastColumn="0" w:oddVBand="0" w:evenVBand="0" w:oddHBand="0" w:evenHBand="0" w:firstRowFirstColumn="0" w:firstRowLastColumn="0" w:lastRowFirstColumn="0" w:lastRowLastColumn="0"/>
-            <w:tcW w:w="6655" w:type="dxa"/>
-            <w:gridSpan w:val="2"/>
+            <w:tcW w:w="4675" w:type="dxa"/>
           </w:tcPr>
           <w:p>
             <w:pPr>
-              <w:spacing w:after="0"/>
-              <w:jc w:val="left"/>
-              <w:rPr>
-                <w:rFonts w:ascii="Calibri" w:hAnsi="Calibri"/>
+              <w:tabs>
+                <w:tab w:val="clear" w:pos="2940"/>
+                <w:tab w:val="center" w:pos="995"/>
+              </w:tabs>
+              <w:spacing w:before="0" w:beforeAutospacing="0" w:after="0"/>
+              <w:rPr>
+                <w:rFonts w:ascii="Cambria" w:hAnsi="Cambria"/>
                 <w:b w:val="0"/>
+                <w:color w:val="000000"/>
                 <w:sz w:val="22"/>
                 <w:szCs w:val="22"/>
               </w:rPr>
             </w:pPr>
             <w:r>
               <w:rPr>
-                <w:rFonts w:ascii="Calibri" w:hAnsi="Calibri"/>
+                <w:rFonts w:ascii="Cambria" w:hAnsi="Cambria"/>
                 <w:b w:val="0"/>
+                <w:color w:val="000000"/>
                 <w:sz w:val="22"/>
                 <w:szCs w:val="22"/>
               </w:rPr>
@@ -205,8 +468,9 @@
             <w:proofErr w:type="spellStart"/>
             <w:r>
               <w:rPr>
-                <w:rFonts w:ascii="Calibri" w:hAnsi="Calibri"/>
+                <w:rFonts w:ascii="Cambria" w:hAnsi="Cambria"/>
                 <w:b w:val="0"/>
+                <w:color w:val="000000"/>
                 <w:sz w:val="22"/>
                 <w:szCs w:val="22"/>
               </w:rPr>
@@ -215,8 +479,9 @@
             <w:proofErr w:type="spellEnd"/>
             <w:r>
               <w:rPr>
-                <w:rFonts w:ascii="Calibri" w:hAnsi="Calibri"/>
+                <w:rFonts w:ascii="Cambria" w:hAnsi="Cambria"/>
                 <w:b w:val="0"/>
+                <w:color w:val="000000"/>
                 <w:sz w:val="22"/>
                 <w:szCs w:val="22"/>
               </w:rPr>
@@ -225,8 +490,9 @@
             <w:proofErr w:type="spellStart"/>
             <w:r>
               <w:rPr>
-                <w:rFonts w:ascii="Calibri" w:hAnsi="Calibri"/>
+                <w:rFonts w:ascii="Cambria" w:hAnsi="Cambria"/>
                 <w:b w:val="0"/>
+                <w:color w:val="000000"/>
                 <w:sz w:val="22"/>
                 <w:szCs w:val="22"/>
               </w:rPr>
@@ -235,95 +501,128 @@
             <w:proofErr w:type="spellEnd"/>
             <w:r>
               <w:rPr>
-                <w:rFonts w:ascii="Calibri" w:hAnsi="Calibri"/>
+                <w:rFonts w:ascii="Cambria" w:hAnsi="Cambria"/>
                 <w:b w:val="0"/>
+                <w:color w:val="000000"/>
                 <w:sz w:val="22"/>
                 <w:szCs w:val="22"/>
               </w:rPr>
               <w:t xml:space="preserve"> %}</w:t>
-            </w:r>
-          </w:p>
-        </w:tc>
-      </w:tr>
-      <w:tr>
-        <w:trPr>
-          <w:trHeight w:val="315"/>
-        </w:trPr>
-        <w:tc>
-          <w:tcPr>
-            <w:cnfStyle w:val="001000000000" w:firstRow="0" w:lastRow="0" w:firstColumn="1" w:lastColumn="0" w:oddVBand="0" w:evenVBand="0" w:oddHBand="0" w:evenHBand="0" w:firstRowFirstColumn="0" w:firstRowLastColumn="0" w:lastRowFirstColumn="0" w:lastRowLastColumn="0"/>
-            <w:tcW w:w="2245" w:type="dxa"/>
-            <w:hideMark/>
-          </w:tcPr>
-          <w:p>
-            <w:pPr>
-              <w:spacing w:after="0"/>
-              <w:jc w:val="left"/>
-              <w:rPr>
-                <w:rFonts w:ascii="Calibri" w:hAnsi="Calibri"/>
-                <w:b w:val="0"/>
-                <w:sz w:val="22"/>
-                <w:szCs w:val="22"/>
-              </w:rPr>
-            </w:pPr>
-            <w:r>
-              <w:rPr>
-                <w:rFonts w:ascii="Calibri" w:hAnsi="Calibri"/>
-                <w:b w:val="0"/>
-                <w:sz w:val="22"/>
-                <w:szCs w:val="22"/>
-              </w:rPr>
-              <w:t xml:space="preserve">{{ </w:t>
-            </w:r>
-            <w:proofErr w:type="spellStart"/>
-            <w:r>
-              <w:rPr>
-                <w:rFonts w:ascii="Calibri" w:hAnsi="Calibri"/>
-                <w:b w:val="0"/>
-                <w:sz w:val="22"/>
-                <w:szCs w:val="22"/>
-              </w:rPr>
-              <w:t>item.type</w:t>
-            </w:r>
-            <w:proofErr w:type="spellEnd"/>
-            <w:r>
-              <w:rPr>
-                <w:rFonts w:ascii="Calibri" w:hAnsi="Calibri"/>
-                <w:b w:val="0"/>
-                <w:sz w:val="22"/>
-                <w:szCs w:val="22"/>
-              </w:rPr>
-              <w:t xml:space="preserve"> }}</w:t>
             </w:r>
           </w:p>
         </w:tc>
         <w:tc>
           <w:tcPr>
-            <w:tcW w:w="4410" w:type="dxa"/>
+            <w:tcW w:w="2356" w:type="dxa"/>
           </w:tcPr>
           <w:p>
             <w:pPr>
-              <w:spacing w:after="0"/>
-              <w:jc w:val="right"/>
-              <w:cnfStyle w:val="000000000000" w:firstRow="0" w:lastRow="0" w:firstColumn="0" w:lastColumn="0" w:oddVBand="0" w:evenVBand="0" w:oddHBand="0" w:evenHBand="0" w:firstRowFirstColumn="0" w:firstRowLastColumn="0" w:lastRowFirstColumn="0" w:lastRowLastColumn="0"/>
-              <w:rPr>
-                <w:rFonts w:ascii="Calibri" w:hAnsi="Calibri"/>
+              <w:tabs>
+                <w:tab w:val="clear" w:pos="2940"/>
+                <w:tab w:val="center" w:pos="995"/>
+              </w:tabs>
+              <w:spacing w:before="0" w:beforeAutospacing="0" w:after="0"/>
+              <w:cnfStyle w:val="000000100000" w:firstRow="0" w:lastRow="0" w:firstColumn="0" w:lastColumn="0" w:oddVBand="0" w:evenVBand="0" w:oddHBand="1" w:evenHBand="0" w:firstRowFirstColumn="0" w:firstRowLastColumn="0" w:lastRowFirstColumn="0" w:lastRowLastColumn="0"/>
+              <w:rPr>
+                <w:rFonts w:ascii="Cambria" w:hAnsi="Cambria"/>
+                <w:b/>
+                <w:color w:val="000000"/>
+                <w:sz w:val="22"/>
+                <w:szCs w:val="22"/>
+              </w:rPr>
+            </w:pPr>
+          </w:p>
+        </w:tc>
+      </w:tr>
+      <w:tr>
+        <w:tc>
+          <w:tcPr>
+            <w:cnfStyle w:val="001000000000" w:firstRow="0" w:lastRow="0" w:firstColumn="1" w:lastColumn="0" w:oddVBand="0" w:evenVBand="0" w:oddHBand="0" w:evenHBand="0" w:firstRowFirstColumn="0" w:firstRowLastColumn="0" w:lastRowFirstColumn="0" w:lastRowLastColumn="0"/>
+            <w:tcW w:w="4675" w:type="dxa"/>
+          </w:tcPr>
+          <w:p>
+            <w:pPr>
+              <w:tabs>
+                <w:tab w:val="clear" w:pos="2940"/>
+                <w:tab w:val="center" w:pos="995"/>
+              </w:tabs>
+              <w:spacing w:before="0" w:beforeAutospacing="0" w:after="0"/>
+              <w:rPr>
+                <w:rFonts w:ascii="Cambria" w:hAnsi="Cambria"/>
+                <w:b w:val="0"/>
+                <w:color w:val="000000"/>
                 <w:sz w:val="22"/>
                 <w:szCs w:val="22"/>
               </w:rPr>
             </w:pPr>
             <w:r>
               <w:rPr>
-                <w:rFonts w:ascii="Calibri" w:hAnsi="Calibri"/>
-                <w:sz w:val="22"/>
-                <w:szCs w:val="22"/>
-              </w:rPr>
-              <w:t xml:space="preserve">{{ </w:t>
+                <w:rFonts w:ascii="Cambria" w:hAnsi="Cambria"/>
+                <w:b w:val="0"/>
+                <w:color w:val="000000"/>
+                <w:sz w:val="22"/>
+                <w:szCs w:val="22"/>
+              </w:rPr>
+              <w:t>{{</w:t>
             </w:r>
             <w:proofErr w:type="spellStart"/>
             <w:r>
               <w:rPr>
-                <w:rFonts w:ascii="Calibri" w:hAnsi="Calibri"/>
+                <w:rFonts w:ascii="Cambria" w:hAnsi="Cambria"/>
+                <w:b w:val="0"/>
+                <w:color w:val="000000"/>
+                <w:sz w:val="22"/>
+                <w:szCs w:val="22"/>
+              </w:rPr>
+              <w:t>item.type</w:t>
+            </w:r>
+            <w:proofErr w:type="spellEnd"/>
+            <w:r>
+              <w:rPr>
+                <w:rFonts w:ascii="Cambria" w:hAnsi="Cambria"/>
+                <w:b w:val="0"/>
+                <w:color w:val="000000"/>
+                <w:sz w:val="22"/>
+                <w:szCs w:val="22"/>
+              </w:rPr>
+              <w:t>}}</w:t>
+            </w:r>
+          </w:p>
+        </w:tc>
+        <w:tc>
+          <w:tcPr>
+            <w:tcW w:w="2356" w:type="dxa"/>
+          </w:tcPr>
+          <w:p>
+            <w:pPr>
+              <w:tabs>
+                <w:tab w:val="clear" w:pos="2940"/>
+                <w:tab w:val="center" w:pos="995"/>
+              </w:tabs>
+              <w:spacing w:before="0" w:beforeAutospacing="0" w:after="0"/>
+              <w:jc w:val="right"/>
+              <w:cnfStyle w:val="000000000000" w:firstRow="0" w:lastRow="0" w:firstColumn="0" w:lastColumn="0" w:oddVBand="0" w:evenVBand="0" w:oddHBand="0" w:evenHBand="0" w:firstRowFirstColumn="0" w:firstRowLastColumn="0" w:lastRowFirstColumn="0" w:lastRowLastColumn="0"/>
+              <w:rPr>
+                <w:rFonts w:ascii="Cambria" w:hAnsi="Cambria"/>
+                <w:color w:val="000000"/>
+                <w:sz w:val="22"/>
+                <w:szCs w:val="22"/>
+              </w:rPr>
+            </w:pPr>
+            <w:r>
+              <w:rPr>
+                <w:rFonts w:ascii="Cambria" w:hAnsi="Cambria"/>
+                <w:color w:val="000000"/>
+                <w:sz w:val="22"/>
+                <w:szCs w:val="22"/>
+              </w:rPr>
+              <w:t>{{</w:t>
+            </w:r>
+            <w:proofErr w:type="spellStart"/>
+            <w:r>
+              <w:rPr>
+                <w:rFonts w:ascii="Cambria" w:hAnsi="Cambria"/>
+                <w:color w:val="000000"/>
                 <w:sz w:val="22"/>
                 <w:szCs w:val="22"/>
               </w:rPr>
@@ -332,11 +631,12 @@
             <w:proofErr w:type="spellEnd"/>
             <w:r>
               <w:rPr>
-                <w:rFonts w:ascii="Calibri" w:hAnsi="Calibri"/>
-                <w:sz w:val="22"/>
-                <w:szCs w:val="22"/>
-              </w:rPr>
-              <w:t xml:space="preserve"> }}</w:t>
+                <w:rFonts w:ascii="Cambria" w:hAnsi="Cambria"/>
+                <w:color w:val="000000"/>
+                <w:sz w:val="22"/>
+                <w:szCs w:val="22"/>
+              </w:rPr>
+              <w:t>}}</w:t>
             </w:r>
           </w:p>
         </w:tc>
@@ -344,28 +644,32 @@
       <w:tr>
         <w:trPr>
           <w:cnfStyle w:val="000000100000" w:firstRow="0" w:lastRow="0" w:firstColumn="0" w:lastColumn="0" w:oddVBand="0" w:evenVBand="0" w:oddHBand="1" w:evenHBand="0" w:firstRowFirstColumn="0" w:firstRowLastColumn="0" w:lastRowFirstColumn="0" w:lastRowLastColumn="0"/>
-          <w:trHeight w:val="267"/>
         </w:trPr>
         <w:tc>
           <w:tcPr>
             <w:cnfStyle w:val="001000000000" w:firstRow="0" w:lastRow="0" w:firstColumn="1" w:lastColumn="0" w:oddVBand="0" w:evenVBand="0" w:oddHBand="0" w:evenHBand="0" w:firstRowFirstColumn="0" w:firstRowLastColumn="0" w:lastRowFirstColumn="0" w:lastRowLastColumn="0"/>
-            <w:tcW w:w="6655" w:type="dxa"/>
-            <w:gridSpan w:val="2"/>
+            <w:tcW w:w="4675" w:type="dxa"/>
           </w:tcPr>
           <w:p>
             <w:pPr>
-              <w:spacing w:after="0"/>
-              <w:jc w:val="left"/>
-              <w:rPr>
-                <w:rFonts w:ascii="Calibri" w:hAnsi="Calibri"/>
+              <w:tabs>
+                <w:tab w:val="clear" w:pos="2940"/>
+                <w:tab w:val="center" w:pos="995"/>
+              </w:tabs>
+              <w:spacing w:before="0" w:beforeAutospacing="0" w:after="0"/>
+              <w:rPr>
+                <w:rFonts w:ascii="Cambria" w:hAnsi="Cambria"/>
                 <w:b w:val="0"/>
+                <w:color w:val="000000"/>
                 <w:sz w:val="22"/>
                 <w:szCs w:val="22"/>
               </w:rPr>
             </w:pPr>
             <w:r>
               <w:rPr>
-                <w:rFonts w:ascii="Calibri" w:hAnsi="Calibri"/>
+                <w:rFonts w:ascii="Cambria" w:hAnsi="Cambria"/>
+                <w:b w:val="0"/>
+                <w:color w:val="000000"/>
                 <w:sz w:val="22"/>
                 <w:szCs w:val="22"/>
               </w:rPr>
@@ -374,7 +678,9 @@
             <w:proofErr w:type="spellStart"/>
             <w:r>
               <w:rPr>
-                <w:rFonts w:ascii="Calibri" w:hAnsi="Calibri"/>
+                <w:rFonts w:ascii="Cambria" w:hAnsi="Cambria"/>
+                <w:b w:val="0"/>
+                <w:color w:val="000000"/>
                 <w:sz w:val="22"/>
                 <w:szCs w:val="22"/>
               </w:rPr>
@@ -383,7 +689,9 @@
             <w:proofErr w:type="spellEnd"/>
             <w:r>
               <w:rPr>
-                <w:rFonts w:ascii="Calibri" w:hAnsi="Calibri"/>
+                <w:rFonts w:ascii="Cambria" w:hAnsi="Cambria"/>
+                <w:b w:val="0"/>
+                <w:color w:val="000000"/>
                 <w:sz w:val="22"/>
                 <w:szCs w:val="22"/>
               </w:rPr>
@@ -392,75 +700,117 @@
             <w:proofErr w:type="spellStart"/>
             <w:r>
               <w:rPr>
-                <w:rFonts w:ascii="Calibri" w:hAnsi="Calibri"/>
-                <w:sz w:val="22"/>
-                <w:szCs w:val="22"/>
-              </w:rPr>
-              <w:t>endfor</w:t>
+                <w:rFonts w:ascii="Cambria" w:hAnsi="Cambria"/>
+                <w:b w:val="0"/>
+                <w:color w:val="000000"/>
+                <w:sz w:val="22"/>
+                <w:szCs w:val="22"/>
+              </w:rPr>
+              <w:t>end</w:t>
+            </w:r>
+            <w:r>
+              <w:rPr>
+                <w:rFonts w:ascii="Cambria" w:hAnsi="Cambria"/>
+                <w:b w:val="0"/>
+                <w:color w:val="000000"/>
+                <w:sz w:val="22"/>
+                <w:szCs w:val="22"/>
+              </w:rPr>
+              <w:t>for</w:t>
             </w:r>
             <w:proofErr w:type="spellEnd"/>
             <w:r>
               <w:rPr>
-                <w:rFonts w:ascii="Calibri" w:hAnsi="Calibri"/>
+                <w:rFonts w:ascii="Cambria" w:hAnsi="Cambria"/>
+                <w:b w:val="0"/>
+                <w:color w:val="000000"/>
                 <w:sz w:val="22"/>
                 <w:szCs w:val="22"/>
               </w:rPr>
               <w:t xml:space="preserve"> %}</w:t>
-            </w:r>
-          </w:p>
-        </w:tc>
-      </w:tr>
-      <w:tr>
-        <w:trPr>
-          <w:trHeight w:val="234"/>
-        </w:trPr>
-        <w:tc>
-          <w:tcPr>
-            <w:cnfStyle w:val="001000000000" w:firstRow="0" w:lastRow="0" w:firstColumn="1" w:lastColumn="0" w:oddVBand="0" w:evenVBand="0" w:oddHBand="0" w:evenHBand="0" w:firstRowFirstColumn="0" w:firstRowLastColumn="0" w:lastRowFirstColumn="0" w:lastRowLastColumn="0"/>
-            <w:tcW w:w="2245" w:type="dxa"/>
-            <w:hideMark/>
-          </w:tcPr>
-          <w:p>
-            <w:pPr>
-              <w:spacing w:after="0"/>
-              <w:jc w:val="left"/>
-              <w:rPr>
-                <w:rFonts w:ascii="Calibri" w:hAnsi="Calibri"/>
-                <w:b w:val="0"/>
-                <w:sz w:val="22"/>
-                <w:szCs w:val="22"/>
-              </w:rPr>
-            </w:pPr>
-            <w:r>
-              <w:rPr>
-                <w:rFonts w:ascii="Calibri" w:hAnsi="Calibri"/>
-                <w:sz w:val="22"/>
-                <w:szCs w:val="22"/>
-              </w:rPr>
-              <w:t>Total</w:t>
             </w:r>
           </w:p>
         </w:tc>
         <w:tc>
           <w:tcPr>
-            <w:tcW w:w="4410" w:type="dxa"/>
+            <w:tcW w:w="2356" w:type="dxa"/>
           </w:tcPr>
           <w:p>
             <w:pPr>
-              <w:spacing w:after="0"/>
+              <w:tabs>
+                <w:tab w:val="clear" w:pos="2940"/>
+                <w:tab w:val="center" w:pos="995"/>
+              </w:tabs>
+              <w:spacing w:before="0" w:beforeAutospacing="0" w:after="0"/>
+              <w:cnfStyle w:val="000000100000" w:firstRow="0" w:lastRow="0" w:firstColumn="0" w:lastColumn="0" w:oddVBand="0" w:evenVBand="0" w:oddHBand="1" w:evenHBand="0" w:firstRowFirstColumn="0" w:firstRowLastColumn="0" w:lastRowFirstColumn="0" w:lastRowLastColumn="0"/>
+              <w:rPr>
+                <w:rFonts w:ascii="Cambria" w:hAnsi="Cambria"/>
+                <w:b/>
+                <w:color w:val="000000"/>
+                <w:sz w:val="22"/>
+                <w:szCs w:val="22"/>
+              </w:rPr>
+            </w:pPr>
+          </w:p>
+        </w:tc>
+      </w:tr>
+      <w:tr>
+        <w:tc>
+          <w:tcPr>
+            <w:cnfStyle w:val="001000000000" w:firstRow="0" w:lastRow="0" w:firstColumn="1" w:lastColumn="0" w:oddVBand="0" w:evenVBand="0" w:oddHBand="0" w:evenHBand="0" w:firstRowFirstColumn="0" w:firstRowLastColumn="0" w:lastRowFirstColumn="0" w:lastRowLastColumn="0"/>
+            <w:tcW w:w="4675" w:type="dxa"/>
+          </w:tcPr>
+          <w:p>
+            <w:pPr>
+              <w:tabs>
+                <w:tab w:val="clear" w:pos="2940"/>
+                <w:tab w:val="center" w:pos="995"/>
+              </w:tabs>
+              <w:spacing w:before="0" w:beforeAutospacing="0" w:after="0"/>
+              <w:rPr>
+                <w:rFonts w:ascii="Cambria" w:hAnsi="Cambria"/>
+                <w:color w:val="000000"/>
+                <w:sz w:val="22"/>
+                <w:szCs w:val="22"/>
+              </w:rPr>
+            </w:pPr>
+            <w:r>
+              <w:rPr>
+                <w:rFonts w:ascii="Cambria" w:hAnsi="Cambria"/>
+                <w:color w:val="000000"/>
+                <w:sz w:val="22"/>
+                <w:szCs w:val="22"/>
+              </w:rPr>
+              <w:t>Total:</w:t>
+            </w:r>
+          </w:p>
+        </w:tc>
+        <w:tc>
+          <w:tcPr>
+            <w:tcW w:w="2356" w:type="dxa"/>
+          </w:tcPr>
+          <w:p>
+            <w:pPr>
+              <w:tabs>
+                <w:tab w:val="clear" w:pos="2940"/>
+                <w:tab w:val="center" w:pos="995"/>
+              </w:tabs>
+              <w:spacing w:before="0" w:beforeAutospacing="0" w:after="0"/>
               <w:jc w:val="right"/>
               <w:cnfStyle w:val="000000000000" w:firstRow="0" w:lastRow="0" w:firstColumn="0" w:lastColumn="0" w:oddVBand="0" w:evenVBand="0" w:oddHBand="0" w:evenHBand="0" w:firstRowFirstColumn="0" w:firstRowLastColumn="0" w:lastRowFirstColumn="0" w:lastRowLastColumn="0"/>
               <w:rPr>
-                <w:rFonts w:ascii="Calibri" w:hAnsi="Calibri"/>
+                <w:rFonts w:ascii="Cambria" w:hAnsi="Cambria"/>
                 <w:b/>
+                <w:color w:val="000000"/>
                 <w:sz w:val="22"/>
                 <w:szCs w:val="22"/>
               </w:rPr>
             </w:pPr>
             <w:r>
               <w:rPr>
-                <w:rFonts w:ascii="Calibri" w:hAnsi="Calibri"/>
+                <w:rFonts w:ascii="Cambria" w:hAnsi="Cambria"/>
                 <w:b/>
+                <w:color w:val="000000"/>
                 <w:sz w:val="22"/>
                 <w:szCs w:val="22"/>
               </w:rPr>
@@ -469,8 +819,9 @@
             <w:proofErr w:type="spellStart"/>
             <w:r>
               <w:rPr>
-                <w:rFonts w:ascii="Calibri" w:hAnsi="Calibri"/>
+                <w:rFonts w:ascii="Cambria" w:hAnsi="Cambria"/>
                 <w:b/>
+                <w:color w:val="000000"/>
                 <w:sz w:val="22"/>
                 <w:szCs w:val="22"/>
               </w:rPr>
@@ -479,8 +830,9 @@
             <w:proofErr w:type="spellEnd"/>
             <w:r>
               <w:rPr>
-                <w:rFonts w:ascii="Calibri" w:hAnsi="Calibri"/>
+                <w:rFonts w:ascii="Cambria" w:hAnsi="Cambria"/>
                 <w:b/>
+                <w:color w:val="000000"/>
                 <w:sz w:val="22"/>
                 <w:szCs w:val="22"/>
               </w:rPr>
@@ -494,6 +846,8 @@
       <w:pPr>
         <w:rPr>
           <w:rFonts w:ascii="Cambria" w:hAnsi="Cambria"/>
+          <w:bCs w:val="0"/>
+          <w:color w:val="000000"/>
           <w:sz w:val="22"/>
           <w:szCs w:val="22"/>
         </w:rPr>
@@ -501,321 +855,7 @@
       <w:r>
         <w:rPr>
           <w:rFonts w:ascii="Cambria" w:hAnsi="Cambria"/>
-          <w:b/>
-          <w:color w:val="000000"/>
-          <w:sz w:val="22"/>
-          <w:szCs w:val="22"/>
-        </w:rPr>
-        <w:t>Total</w:t>
-      </w:r>
-      <w:r>
-        <w:rPr>
-          <w:rFonts w:ascii="Cambria" w:hAnsi="Cambria"/>
-          <w:b/>
-          <w:sz w:val="22"/>
-          <w:szCs w:val="22"/>
-        </w:rPr>
-        <w:t xml:space="preserve"> Number of Rhi</w:t>
-      </w:r>
-      <w:r>
-        <w:rPr>
-          <w:rFonts w:ascii="Cambria" w:hAnsi="Cambria"/>
-          <w:b/>
-          <w:sz w:val="22"/>
-          <w:szCs w:val="22"/>
-        </w:rPr>
-        <w:t>no o</w:t>
-      </w:r>
-      <w:r>
-        <w:rPr>
-          <w:rFonts w:ascii="Cambria" w:hAnsi="Cambria"/>
-          <w:b/>
-          <w:sz w:val="22"/>
-          <w:szCs w:val="22"/>
-        </w:rPr>
-        <w:t xml:space="preserve">n </w:t>
-      </w:r>
-      <w:r>
-        <w:rPr>
-          <w:rFonts w:ascii="Cambria" w:hAnsi="Cambria"/>
-          <w:b/>
-          <w:sz w:val="22"/>
-          <w:szCs w:val="22"/>
-        </w:rPr>
-        <w:t>{{</w:t>
-      </w:r>
-      <w:proofErr w:type="spellStart"/>
-      <w:proofErr w:type="gramStart"/>
-      <w:r>
-        <w:rPr>
-          <w:rFonts w:ascii="Cambria" w:hAnsi="Cambria"/>
-          <w:b/>
-          <w:sz w:val="22"/>
-          <w:szCs w:val="22"/>
-        </w:rPr>
-        <w:t>ws.</w:t>
-      </w:r>
-      <w:r>
-        <w:rPr>
-          <w:rFonts w:ascii="Cambria" w:hAnsi="Cambria"/>
-          <w:b/>
-          <w:sz w:val="22"/>
-          <w:szCs w:val="22"/>
-        </w:rPr>
-        <w:t>conservancy</w:t>
-      </w:r>
-      <w:proofErr w:type="spellEnd"/>
-      <w:proofErr w:type="gramEnd"/>
-      <w:r>
-        <w:rPr>
-          <w:rFonts w:ascii="Cambria" w:hAnsi="Cambria"/>
-          <w:b/>
-          <w:sz w:val="22"/>
-          <w:szCs w:val="22"/>
-        </w:rPr>
-        <w:t>}}</w:t>
-      </w:r>
-      <w:r>
-        <w:rPr>
-          <w:rFonts w:ascii="Cambria" w:hAnsi="Cambria"/>
-          <w:b/>
-          <w:sz w:val="22"/>
-          <w:szCs w:val="22"/>
-        </w:rPr>
-        <w:t>:</w:t>
-      </w:r>
-      <w:r>
-        <w:rPr>
-          <w:rFonts w:ascii="Cambria" w:hAnsi="Cambria"/>
-          <w:sz w:val="22"/>
-          <w:szCs w:val="22"/>
-        </w:rPr>
-        <w:t xml:space="preserve"> </w:t>
-      </w:r>
-      <w:r>
-        <w:rPr>
-          <w:rFonts w:ascii="Cambria" w:hAnsi="Cambria"/>
-          <w:b/>
-          <w:sz w:val="22"/>
-          <w:szCs w:val="22"/>
-        </w:rPr>
-        <w:t>Black</w:t>
-      </w:r>
-      <w:r>
-        <w:rPr>
-          <w:rFonts w:ascii="Cambria" w:hAnsi="Cambria"/>
-          <w:b/>
-          <w:sz w:val="22"/>
-          <w:szCs w:val="22"/>
-        </w:rPr>
-        <w:t xml:space="preserve"> = </w:t>
-      </w:r>
-      <w:r>
-        <w:rPr>
-          <w:rFonts w:ascii="Cambria" w:hAnsi="Cambria"/>
-          <w:b/>
-          <w:sz w:val="22"/>
-          <w:szCs w:val="22"/>
-        </w:rPr>
-        <w:t>{{</w:t>
-      </w:r>
-      <w:proofErr w:type="spellStart"/>
-      <w:r>
-        <w:rPr>
-          <w:rFonts w:ascii="Cambria" w:hAnsi="Cambria"/>
-          <w:b/>
-          <w:sz w:val="22"/>
-          <w:szCs w:val="22"/>
-        </w:rPr>
-        <w:t>ws.</w:t>
-      </w:r>
-      <w:r>
-        <w:rPr>
-          <w:rFonts w:ascii="Cambria" w:hAnsi="Cambria"/>
-          <w:b/>
-          <w:sz w:val="22"/>
-          <w:szCs w:val="22"/>
-        </w:rPr>
-        <w:t>total_rhino_black</w:t>
-      </w:r>
-      <w:proofErr w:type="spellEnd"/>
-      <w:r>
-        <w:rPr>
-          <w:rFonts w:ascii="Cambria" w:hAnsi="Cambria"/>
-          <w:b/>
-          <w:sz w:val="22"/>
-          <w:szCs w:val="22"/>
-        </w:rPr>
-        <w:t>}}</w:t>
-      </w:r>
-      <w:r>
-        <w:rPr>
-          <w:rFonts w:ascii="Cambria" w:hAnsi="Cambria"/>
-          <w:b/>
-          <w:sz w:val="22"/>
-          <w:szCs w:val="22"/>
-        </w:rPr>
-        <w:t>;</w:t>
-      </w:r>
-      <w:r>
-        <w:rPr>
-          <w:rFonts w:ascii="Cambria" w:hAnsi="Cambria"/>
-          <w:b/>
-          <w:sz w:val="22"/>
-          <w:szCs w:val="22"/>
-        </w:rPr>
-        <w:t xml:space="preserve"> White</w:t>
-      </w:r>
-      <w:r>
-        <w:rPr>
-          <w:rFonts w:ascii="Cambria" w:hAnsi="Cambria"/>
-          <w:b/>
-          <w:sz w:val="22"/>
-          <w:szCs w:val="22"/>
-        </w:rPr>
-        <w:t xml:space="preserve"> = </w:t>
-      </w:r>
-      <w:r>
-        <w:rPr>
-          <w:rFonts w:ascii="Cambria" w:hAnsi="Cambria"/>
-          <w:b/>
-          <w:sz w:val="22"/>
-          <w:szCs w:val="22"/>
-        </w:rPr>
-        <w:t>{{</w:t>
-      </w:r>
-      <w:proofErr w:type="spellStart"/>
-      <w:r>
-        <w:rPr>
-          <w:rFonts w:ascii="Cambria" w:hAnsi="Cambria"/>
-          <w:b/>
-          <w:sz w:val="22"/>
-          <w:szCs w:val="22"/>
-        </w:rPr>
-        <w:t>ws.</w:t>
-      </w:r>
-      <w:r>
-        <w:rPr>
-          <w:rFonts w:ascii="Cambria" w:hAnsi="Cambria"/>
-          <w:b/>
-          <w:sz w:val="22"/>
-          <w:szCs w:val="22"/>
-        </w:rPr>
-        <w:t>total_rhino_white</w:t>
-      </w:r>
-      <w:proofErr w:type="spellEnd"/>
-      <w:r>
-        <w:rPr>
-          <w:rFonts w:ascii="Cambria" w:hAnsi="Cambria"/>
-          <w:sz w:val="22"/>
-          <w:szCs w:val="22"/>
-        </w:rPr>
-        <w:t>}}</w:t>
-      </w:r>
-    </w:p>
-    <w:p>
-      <w:pPr>
-        <w:spacing w:before="0" w:beforeAutospacing="0" w:after="0"/>
-        <w:jc w:val="left"/>
-        <w:rPr>
-          <w:rFonts w:ascii="Cambria" w:hAnsi="Cambria"/>
-          <w:b/>
-          <w:sz w:val="22"/>
-          <w:szCs w:val="22"/>
-        </w:rPr>
-      </w:pPr>
-    </w:p>
-    <w:p>
-      <w:pPr>
-        <w:spacing w:before="0" w:beforeAutospacing="0" w:after="0"/>
-        <w:jc w:val="left"/>
-        <w:rPr>
-          <w:rFonts w:ascii="Cambria" w:hAnsi="Cambria"/>
-          <w:b/>
-          <w:sz w:val="22"/>
-          <w:szCs w:val="22"/>
-        </w:rPr>
-      </w:pPr>
-    </w:p>
-    <w:p>
-      <w:pPr>
-        <w:spacing w:before="0" w:beforeAutospacing="0" w:after="0"/>
-        <w:jc w:val="left"/>
-        <w:rPr>
-          <w:rFonts w:ascii="Cambria" w:hAnsi="Cambria"/>
-          <w:b/>
-          <w:sz w:val="22"/>
-          <w:szCs w:val="22"/>
-        </w:rPr>
-      </w:pPr>
-    </w:p>
-    <w:p>
-      <w:pPr>
-        <w:tabs>
-          <w:tab w:val="clear" w:pos="2940"/>
-          <w:tab w:val="center" w:pos="995"/>
-        </w:tabs>
-        <w:spacing w:before="0" w:beforeAutospacing="0" w:after="0"/>
-        <w:rPr>
-          <w:rFonts w:ascii="Cambria" w:hAnsi="Cambria"/>
-          <w:b/>
-          <w:color w:val="000000"/>
-          <w:sz w:val="22"/>
-          <w:szCs w:val="22"/>
-        </w:rPr>
-      </w:pPr>
-    </w:p>
-    <w:p>
-      <w:pPr>
-        <w:tabs>
-          <w:tab w:val="clear" w:pos="2940"/>
-          <w:tab w:val="center" w:pos="995"/>
-        </w:tabs>
-        <w:spacing w:before="0" w:beforeAutospacing="0" w:after="0"/>
-        <w:rPr>
-          <w:rFonts w:ascii="Cambria" w:hAnsi="Cambria"/>
-          <w:b/>
-          <w:color w:val="000000"/>
-          <w:sz w:val="22"/>
-          <w:szCs w:val="22"/>
-        </w:rPr>
-      </w:pPr>
-    </w:p>
-    <w:p>
-      <w:pPr>
-        <w:tabs>
-          <w:tab w:val="clear" w:pos="2940"/>
-          <w:tab w:val="center" w:pos="995"/>
-        </w:tabs>
-        <w:spacing w:before="0" w:beforeAutospacing="0" w:after="0"/>
-        <w:rPr>
-          <w:rFonts w:ascii="Cambria" w:hAnsi="Cambria"/>
-          <w:b/>
-          <w:color w:val="000000"/>
-          <w:sz w:val="22"/>
-          <w:szCs w:val="22"/>
-        </w:rPr>
-      </w:pPr>
-    </w:p>
-    <w:p>
-      <w:pPr>
-        <w:tabs>
-          <w:tab w:val="clear" w:pos="2940"/>
-          <w:tab w:val="center" w:pos="995"/>
-        </w:tabs>
-        <w:spacing w:before="0" w:beforeAutospacing="0" w:after="0"/>
-        <w:rPr>
-          <w:rFonts w:ascii="Cambria" w:hAnsi="Cambria"/>
-          <w:b/>
-          <w:color w:val="000000"/>
-          <w:sz w:val="22"/>
-          <w:szCs w:val="22"/>
-        </w:rPr>
-      </w:pPr>
-      <w:r>
-        <w:rPr>
-          <w:rFonts w:ascii="Cambria" w:hAnsi="Cambria"/>
-          <w:b/>
+          <w:bCs w:val="0"/>
           <w:color w:val="000000"/>
           <w:sz w:val="22"/>
           <w:szCs w:val="22"/>
@@ -826,7 +866,7 @@
       <w:r>
         <w:rPr>
           <w:rFonts w:ascii="Cambria" w:hAnsi="Cambria"/>
-          <w:b/>
+          <w:bCs w:val="0"/>
           <w:color w:val="000000"/>
           <w:sz w:val="22"/>
           <w:szCs w:val="22"/>
@@ -837,7 +877,7 @@
       <w:r>
         <w:rPr>
           <w:rFonts w:ascii="Cambria" w:hAnsi="Cambria"/>
-          <w:b/>
+          <w:bCs w:val="0"/>
           <w:color w:val="000000"/>
           <w:sz w:val="22"/>
           <w:szCs w:val="22"/>
@@ -847,39 +887,20 @@
     </w:p>
     <w:p>
       <w:pPr>
-        <w:tabs>
-          <w:tab w:val="clear" w:pos="2940"/>
-          <w:tab w:val="center" w:pos="995"/>
-        </w:tabs>
-        <w:spacing w:before="0" w:beforeAutospacing="0" w:after="0"/>
         <w:rPr>
           <w:rFonts w:ascii="Cambria" w:hAnsi="Cambria"/>
           <w:b/>
+          <w:bCs w:val="0"/>
           <w:color w:val="000000"/>
           <w:sz w:val="22"/>
           <w:szCs w:val="22"/>
         </w:rPr>
       </w:pPr>
-    </w:p>
-    <w:p>
-      <w:pPr>
-        <w:tabs>
-          <w:tab w:val="clear" w:pos="2940"/>
-          <w:tab w:val="center" w:pos="995"/>
-        </w:tabs>
-        <w:spacing w:before="0" w:beforeAutospacing="0" w:after="0"/>
+      <w:r>
         <w:rPr>
           <w:rFonts w:ascii="Cambria" w:hAnsi="Cambria"/>
           <w:b/>
-          <w:color w:val="000000"/>
-          <w:sz w:val="22"/>
-          <w:szCs w:val="22"/>
-        </w:rPr>
-      </w:pPr>
-      <w:r>
-        <w:rPr>
-          <w:rFonts w:ascii="Cambria" w:hAnsi="Cambria"/>
-          <w:b/>
+          <w:bCs w:val="0"/>
           <w:color w:val="000000"/>
           <w:sz w:val="22"/>
           <w:szCs w:val="22"/>
@@ -889,39 +910,18 @@
     </w:p>
     <w:p>
       <w:pPr>
-        <w:tabs>
-          <w:tab w:val="clear" w:pos="2940"/>
-          <w:tab w:val="center" w:pos="995"/>
-        </w:tabs>
-        <w:spacing w:before="0" w:beforeAutospacing="0" w:after="0"/>
-        <w:rPr>
-          <w:rFonts w:ascii="Cambria" w:hAnsi="Cambria"/>
-          <w:b/>
+        <w:rPr>
+          <w:rFonts w:ascii="Cambria" w:hAnsi="Cambria"/>
+          <w:bCs w:val="0"/>
           <w:color w:val="000000"/>
           <w:sz w:val="22"/>
           <w:szCs w:val="22"/>
         </w:rPr>
       </w:pPr>
-    </w:p>
-    <w:p>
-      <w:pPr>
-        <w:tabs>
-          <w:tab w:val="clear" w:pos="2940"/>
-          <w:tab w:val="center" w:pos="995"/>
-        </w:tabs>
-        <w:spacing w:before="0" w:beforeAutospacing="0" w:after="0"/>
-        <w:rPr>
-          <w:rFonts w:ascii="Cambria" w:hAnsi="Cambria"/>
-          <w:b/>
-          <w:color w:val="000000"/>
-          <w:sz w:val="22"/>
-          <w:szCs w:val="22"/>
-        </w:rPr>
-      </w:pPr>
       <w:r>
         <w:rPr>
           <w:rFonts w:ascii="Cambria" w:hAnsi="Cambria"/>
-          <w:b/>
+          <w:bCs w:val="0"/>
           <w:color w:val="000000"/>
           <w:sz w:val="22"/>
           <w:szCs w:val="22"/>
@@ -931,39 +931,21 @@
     </w:p>
     <w:p>
       <w:pPr>
-        <w:tabs>
-          <w:tab w:val="clear" w:pos="2940"/>
-          <w:tab w:val="center" w:pos="995"/>
-        </w:tabs>
-        <w:spacing w:before="0" w:beforeAutospacing="0" w:after="0"/>
+        <w:keepNext/>
         <w:rPr>
           <w:rFonts w:ascii="Cambria" w:hAnsi="Cambria"/>
           <w:b/>
+          <w:bCs w:val="0"/>
           <w:color w:val="000000"/>
           <w:sz w:val="22"/>
           <w:szCs w:val="22"/>
         </w:rPr>
       </w:pPr>
-    </w:p>
-    <w:p>
-      <w:pPr>
-        <w:tabs>
-          <w:tab w:val="clear" w:pos="2940"/>
-          <w:tab w:val="center" w:pos="995"/>
-        </w:tabs>
-        <w:spacing w:before="0" w:beforeAutospacing="0" w:after="0"/>
+      <w:r>
         <w:rPr>
           <w:rFonts w:ascii="Cambria" w:hAnsi="Cambria"/>
           <w:b/>
-          <w:color w:val="000000"/>
-          <w:sz w:val="22"/>
-          <w:szCs w:val="22"/>
-        </w:rPr>
-      </w:pPr>
-      <w:r>
-        <w:rPr>
-          <w:rFonts w:ascii="Cambria" w:hAnsi="Cambria"/>
-          <w:b/>
+          <w:bCs w:val="0"/>
           <w:color w:val="000000"/>
           <w:sz w:val="22"/>
           <w:szCs w:val="22"/>
@@ -979,7 +961,7 @@
       </w:tblPr>
       <w:tblGrid>
         <w:gridCol w:w="4680"/>
-        <w:gridCol w:w="2065"/>
+        <w:gridCol w:w="2335"/>
       </w:tblGrid>
       <w:tr>
         <w:trPr>
@@ -1012,7 +994,7 @@
         </w:tc>
         <w:tc>
           <w:tcPr>
-            <w:tcW w:w="2065" w:type="dxa"/>
+            <w:tcW w:w="2335" w:type="dxa"/>
           </w:tcPr>
           <w:p>
             <w:pPr>
@@ -1118,7 +1100,7 @@
         </w:tc>
         <w:tc>
           <w:tcPr>
-            <w:tcW w:w="2065" w:type="dxa"/>
+            <w:tcW w:w="2335" w:type="dxa"/>
           </w:tcPr>
           <w:p>
             <w:pPr>
@@ -1141,7 +1123,7 @@
       </w:tr>
       <w:tr>
         <w:trPr>
-          <w:trHeight w:val="296"/>
+          <w:trHeight w:val="332"/>
         </w:trPr>
         <w:tc>
           <w:tcPr>
@@ -1177,7 +1159,7 @@
         </w:tc>
         <w:tc>
           <w:tcPr>
-            <w:tcW w:w="2065" w:type="dxa"/>
+            <w:tcW w:w="2335" w:type="dxa"/>
           </w:tcPr>
           <w:p>
             <w:pPr>
@@ -1189,7 +1171,7 @@
               <w:cnfStyle w:val="000000000000" w:firstRow="0" w:lastRow="0" w:firstColumn="0" w:lastColumn="0" w:oddVBand="0" w:evenVBand="0" w:oddHBand="0" w:evenHBand="0" w:firstRowFirstColumn="0" w:firstRowLastColumn="0" w:lastRowFirstColumn="0" w:lastRowLastColumn="0"/>
               <w:rPr>
                 <w:rFonts w:ascii="Cambria" w:hAnsi="Cambria"/>
-                <w:b/>
+                <w:bCs w:val="0"/>
                 <w:color w:val="000000"/>
                 <w:sz w:val="22"/>
                 <w:szCs w:val="22"/>
@@ -1198,7 +1180,7 @@
             <w:r>
               <w:rPr>
                 <w:rFonts w:ascii="Cambria" w:hAnsi="Cambria"/>
-                <w:b/>
+                <w:bCs w:val="0"/>
                 <w:color w:val="000000"/>
                 <w:sz w:val="22"/>
                 <w:szCs w:val="22"/>
@@ -1209,7 +1191,7 @@
             <w:r>
               <w:rPr>
                 <w:rFonts w:ascii="Cambria" w:hAnsi="Cambria"/>
-                <w:b/>
+                <w:bCs w:val="0"/>
                 <w:color w:val="000000"/>
                 <w:sz w:val="22"/>
                 <w:szCs w:val="22"/>
@@ -1220,7 +1202,7 @@
             <w:r>
               <w:rPr>
                 <w:rFonts w:ascii="Cambria" w:hAnsi="Cambria"/>
-                <w:b/>
+                <w:bCs w:val="0"/>
                 <w:color w:val="000000"/>
                 <w:sz w:val="22"/>
                 <w:szCs w:val="22"/>
@@ -1312,7 +1294,7 @@
         </w:tc>
         <w:tc>
           <w:tcPr>
-            <w:tcW w:w="2065" w:type="dxa"/>
+            <w:tcW w:w="2335" w:type="dxa"/>
           </w:tcPr>
           <w:p>
             <w:pPr>
@@ -1342,11 +1324,7 @@
         </w:tabs>
         <w:spacing w:before="0" w:beforeAutospacing="0" w:after="0"/>
         <w:rPr>
-          <w:rFonts w:ascii="Cambria" w:hAnsi="Cambria"/>
-          <w:b/>
-          <w:color w:val="000000"/>
-          <w:sz w:val="22"/>
-          <w:szCs w:val="22"/>
+          <w:rStyle w:val="Strong"/>
         </w:rPr>
       </w:pPr>
     </w:p>
@@ -1358,11 +1336,7 @@
         </w:tabs>
         <w:spacing w:before="0" w:beforeAutospacing="0" w:after="0"/>
         <w:rPr>
-          <w:rFonts w:ascii="Cambria" w:hAnsi="Cambria"/>
-          <w:b/>
-          <w:color w:val="000000"/>
-          <w:sz w:val="22"/>
-          <w:szCs w:val="22"/>
+          <w:rStyle w:val="Strong"/>
         </w:rPr>
       </w:pPr>
     </w:p>
@@ -1376,6 +1350,7 @@
         <w:rPr>
           <w:rFonts w:ascii="Cambria" w:hAnsi="Cambria"/>
           <w:b/>
+          <w:bCs w:val="0"/>
           <w:color w:val="000000"/>
           <w:sz w:val="22"/>
           <w:szCs w:val="22"/>
@@ -1385,6 +1360,7 @@
         <w:rPr>
           <w:rFonts w:ascii="Cambria" w:hAnsi="Cambria"/>
           <w:b/>
+          <w:bCs w:val="0"/>
           <w:color w:val="000000"/>
           <w:sz w:val="22"/>
           <w:szCs w:val="22"/>
@@ -1402,6 +1378,7 @@
         <w:rPr>
           <w:rFonts w:ascii="Cambria" w:hAnsi="Cambria"/>
           <w:b/>
+          <w:bCs w:val="0"/>
           <w:color w:val="000000"/>
           <w:sz w:val="22"/>
           <w:szCs w:val="22"/>
@@ -1418,6 +1395,7 @@
         <w:rPr>
           <w:rFonts w:ascii="Cambria" w:hAnsi="Cambria"/>
           <w:b/>
+          <w:bCs w:val="0"/>
           <w:color w:val="000000"/>
           <w:sz w:val="22"/>
           <w:szCs w:val="22"/>
@@ -1427,33 +1405,23 @@
         <w:rPr>
           <w:rFonts w:ascii="Cambria" w:hAnsi="Cambria"/>
           <w:b/>
+          <w:bCs w:val="0"/>
           <w:color w:val="000000"/>
           <w:sz w:val="22"/>
           <w:szCs w:val="22"/>
         </w:rPr>
         <w:t xml:space="preserve"># </w:t>
       </w:r>
-      <w:proofErr w:type="spellStart"/>
       <w:r>
         <w:rPr>
           <w:rFonts w:ascii="Cambria" w:hAnsi="Cambria"/>
           <w:b/>
+          <w:bCs w:val="0"/>
           <w:color w:val="000000"/>
           <w:sz w:val="22"/>
           <w:szCs w:val="22"/>
         </w:rPr>
-        <w:t>todo</w:t>
-      </w:r>
-      <w:proofErr w:type="spellEnd"/>
-      <w:r>
-        <w:rPr>
-          <w:rFonts w:ascii="Cambria" w:hAnsi="Cambria"/>
-          <w:b/>
-          <w:color w:val="000000"/>
-          <w:sz w:val="22"/>
-          <w:szCs w:val="22"/>
-        </w:rPr>
-        <w:t>:</w:t>
+        <w:t>TODO</w:t>
       </w:r>
     </w:p>
     <w:p>
@@ -1466,6 +1434,7 @@
         <w:rPr>
           <w:rFonts w:ascii="Cambria" w:hAnsi="Cambria"/>
           <w:b/>
+          <w:bCs w:val="0"/>
           <w:color w:val="000000"/>
           <w:sz w:val="22"/>
           <w:szCs w:val="22"/>
@@ -1562,6 +1531,7 @@
         <w:rPr>
           <w:rFonts w:ascii="Cambria" w:hAnsi="Cambria"/>
           <w:b/>
+          <w:bCs w:val="0"/>
           <w:color w:val="000000"/>
           <w:sz w:val="22"/>
           <w:szCs w:val="22"/>
@@ -1571,6 +1541,7 @@
         <w:rPr>
           <w:rFonts w:ascii="Cambria" w:hAnsi="Cambria"/>
           <w:b/>
+          <w:bCs w:val="0"/>
           <w:color w:val="000000"/>
           <w:sz w:val="22"/>
           <w:szCs w:val="22"/>
@@ -1581,6 +1552,7 @@
         <w:rPr>
           <w:rFonts w:ascii="Cambria" w:hAnsi="Cambria"/>
           <w:b/>
+          <w:bCs w:val="0"/>
           <w:color w:val="000000"/>
           <w:sz w:val="22"/>
           <w:szCs w:val="22"/>
@@ -1592,6 +1564,7 @@
         <w:rPr>
           <w:rFonts w:ascii="Cambria" w:hAnsi="Cambria"/>
           <w:b/>
+          <w:bCs w:val="0"/>
           <w:color w:val="000000"/>
           <w:sz w:val="22"/>
           <w:szCs w:val="22"/>
@@ -1603,6 +1576,7 @@
         <w:rPr>
           <w:rFonts w:ascii="Cambria" w:hAnsi="Cambria"/>
           <w:b/>
+          <w:bCs w:val="0"/>
           <w:color w:val="000000"/>
           <w:sz w:val="22"/>
           <w:szCs w:val="22"/>
@@ -1614,6 +1588,7 @@
         <w:rPr>
           <w:rFonts w:ascii="Cambria" w:hAnsi="Cambria"/>
           <w:b/>
+          <w:bCs w:val="0"/>
           <w:color w:val="000000"/>
           <w:sz w:val="22"/>
           <w:szCs w:val="22"/>
@@ -1625,6 +1600,7 @@
         <w:rPr>
           <w:rFonts w:ascii="Cambria" w:hAnsi="Cambria"/>
           <w:b/>
+          <w:bCs w:val="0"/>
           <w:color w:val="000000"/>
           <w:sz w:val="22"/>
           <w:szCs w:val="22"/>
@@ -1635,6 +1611,7 @@
         <w:rPr>
           <w:rFonts w:ascii="Cambria" w:hAnsi="Cambria"/>
           <w:b/>
+          <w:bCs w:val="0"/>
           <w:color w:val="000000"/>
           <w:sz w:val="22"/>
           <w:szCs w:val="22"/>
@@ -1645,6 +1622,7 @@
         <w:rPr>
           <w:rFonts w:ascii="Cambria" w:hAnsi="Cambria"/>
           <w:b/>
+          <w:bCs w:val="0"/>
           <w:color w:val="000000"/>
           <w:sz w:val="22"/>
           <w:szCs w:val="22"/>
@@ -1687,6 +1665,7 @@
                 <w:sz w:val="22"/>
                 <w:szCs w:val="22"/>
               </w:rPr>
+              <w:lastRenderedPageBreak/>
               <w:t>Species</w:t>
             </w:r>
           </w:p>
@@ -1869,7 +1848,6 @@
                 <w:sz w:val="22"/>
                 <w:szCs w:val="22"/>
               </w:rPr>
-              <w:lastRenderedPageBreak/>
               <w:t xml:space="preserve">{{ </w:t>
             </w:r>
             <w:proofErr w:type="spellStart"/>
@@ -1907,10 +1885,11 @@
                 <w:tab w:val="center" w:pos="995"/>
               </w:tabs>
               <w:spacing w:before="0" w:beforeAutospacing="0" w:after="0"/>
+              <w:jc w:val="right"/>
               <w:cnfStyle w:val="000000000000" w:firstRow="0" w:lastRow="0" w:firstColumn="0" w:lastColumn="0" w:oddVBand="0" w:evenVBand="0" w:oddHBand="0" w:evenHBand="0" w:firstRowFirstColumn="0" w:firstRowLastColumn="0" w:lastRowFirstColumn="0" w:lastRowLastColumn="0"/>
               <w:rPr>
                 <w:rFonts w:ascii="Cambria" w:hAnsi="Cambria"/>
-                <w:b/>
+                <w:bCs w:val="0"/>
                 <w:color w:val="000000"/>
                 <w:sz w:val="22"/>
                 <w:szCs w:val="22"/>
@@ -1919,7 +1898,7 @@
             <w:r>
               <w:rPr>
                 <w:rFonts w:ascii="Cambria" w:hAnsi="Cambria"/>
-                <w:b/>
+                <w:bCs w:val="0"/>
                 <w:color w:val="000000"/>
                 <w:sz w:val="22"/>
                 <w:szCs w:val="22"/>
@@ -1930,7 +1909,7 @@
             <w:r>
               <w:rPr>
                 <w:rFonts w:ascii="Cambria" w:hAnsi="Cambria"/>
-                <w:b/>
+                <w:bCs w:val="0"/>
                 <w:color w:val="000000"/>
                 <w:sz w:val="22"/>
                 <w:szCs w:val="22"/>
@@ -1941,7 +1920,7 @@
             <w:r>
               <w:rPr>
                 <w:rFonts w:ascii="Cambria" w:hAnsi="Cambria"/>
-                <w:b/>
+                <w:bCs w:val="0"/>
                 <w:color w:val="000000"/>
                 <w:sz w:val="22"/>
                 <w:szCs w:val="22"/>
@@ -2063,11 +2042,7 @@
         </w:tabs>
         <w:spacing w:before="0" w:beforeAutospacing="0" w:after="0"/>
         <w:rPr>
-          <w:rFonts w:ascii="Cambria" w:hAnsi="Cambria"/>
-          <w:b/>
-          <w:color w:val="000000"/>
-          <w:sz w:val="22"/>
-          <w:szCs w:val="22"/>
+          <w:rStyle w:val="Strong"/>
         </w:rPr>
       </w:pPr>
     </w:p>
@@ -2317,6 +2292,8 @@
     </w:p>
     <w:p>
       <w:pPr>
+        <w:keepNext/>
+        <w:keepLines/>
         <w:tabs>
           <w:tab w:val="clear" w:pos="2940"/>
           <w:tab w:val="center" w:pos="995"/>
@@ -2343,17 +2320,14 @@
     </w:p>
     <w:p>
       <w:pPr>
+        <w:keepLines/>
         <w:tabs>
           <w:tab w:val="clear" w:pos="2940"/>
           <w:tab w:val="center" w:pos="995"/>
         </w:tabs>
         <w:spacing w:before="0" w:beforeAutospacing="0" w:after="0"/>
         <w:rPr>
-          <w:rFonts w:ascii="Cambria" w:hAnsi="Cambria"/>
-          <w:b/>
-          <w:color w:val="000000"/>
-          <w:sz w:val="22"/>
-          <w:szCs w:val="22"/>
+          <w:rStyle w:val="Strong"/>
         </w:rPr>
       </w:pPr>
     </w:p>
@@ -2380,6 +2354,7 @@
           </w:tcPr>
           <w:p>
             <w:pPr>
+              <w:keepLines/>
               <w:spacing w:after="0"/>
               <w:jc w:val="left"/>
               <w:rPr>
@@ -2404,6 +2379,7 @@
           </w:tcPr>
           <w:p>
             <w:pPr>
+              <w:keepLines/>
               <w:spacing w:after="0"/>
               <w:jc w:val="left"/>
               <w:cnfStyle w:val="100000000000" w:firstRow="1" w:lastRow="0" w:firstColumn="0" w:lastColumn="0" w:oddVBand="0" w:evenVBand="0" w:oddHBand="0" w:evenHBand="0" w:firstRowFirstColumn="0" w:firstRowLastColumn="0" w:lastRowFirstColumn="0" w:lastRowLastColumn="0"/>
@@ -2429,6 +2405,7 @@
           </w:tcPr>
           <w:p>
             <w:pPr>
+              <w:keepLines/>
               <w:spacing w:after="0"/>
               <w:jc w:val="left"/>
               <w:cnfStyle w:val="100000000000" w:firstRow="1" w:lastRow="0" w:firstColumn="0" w:lastColumn="0" w:oddVBand="0" w:evenVBand="0" w:oddHBand="0" w:evenHBand="0" w:firstRowFirstColumn="0" w:firstRowLastColumn="0" w:lastRowFirstColumn="0" w:lastRowLastColumn="0"/>
@@ -2454,6 +2431,7 @@
           </w:tcPr>
           <w:p>
             <w:pPr>
+              <w:keepLines/>
               <w:spacing w:after="0"/>
               <w:jc w:val="left"/>
               <w:cnfStyle w:val="100000000000" w:firstRow="1" w:lastRow="0" w:firstColumn="0" w:lastColumn="0" w:oddVBand="0" w:evenVBand="0" w:oddHBand="0" w:evenHBand="0" w:firstRowFirstColumn="0" w:firstRowLastColumn="0" w:lastRowFirstColumn="0" w:lastRowLastColumn="0"/>
@@ -2485,6 +2463,7 @@
           </w:tcPr>
           <w:p>
             <w:pPr>
+              <w:keepLines/>
               <w:tabs>
                 <w:tab w:val="clear" w:pos="2940"/>
                 <w:tab w:val="center" w:pos="995"/>
@@ -2560,6 +2539,7 @@
           </w:tcPr>
           <w:p>
             <w:pPr>
+              <w:keepLines/>
               <w:tabs>
                 <w:tab w:val="clear" w:pos="2940"/>
                 <w:tab w:val="center" w:pos="995"/>
@@ -2582,6 +2562,7 @@
           </w:tcPr>
           <w:p>
             <w:pPr>
+              <w:keepLines/>
               <w:tabs>
                 <w:tab w:val="clear" w:pos="2940"/>
                 <w:tab w:val="center" w:pos="995"/>
@@ -2604,6 +2585,7 @@
           </w:tcPr>
           <w:p>
             <w:pPr>
+              <w:keepLines/>
               <w:tabs>
                 <w:tab w:val="clear" w:pos="2940"/>
                 <w:tab w:val="center" w:pos="995"/>
@@ -2629,6 +2611,7 @@
           </w:tcPr>
           <w:p>
             <w:pPr>
+              <w:keepLines/>
               <w:tabs>
                 <w:tab w:val="clear" w:pos="2940"/>
                 <w:tab w:val="center" w:pos="995"/>
@@ -2682,6 +2665,7 @@
           </w:tcPr>
           <w:p>
             <w:pPr>
+              <w:keepLines/>
               <w:tabs>
                 <w:tab w:val="clear" w:pos="2940"/>
                 <w:tab w:val="center" w:pos="995"/>
@@ -2690,7 +2674,7 @@
               <w:cnfStyle w:val="000000000000" w:firstRow="0" w:lastRow="0" w:firstColumn="0" w:lastColumn="0" w:oddVBand="0" w:evenVBand="0" w:oddHBand="0" w:evenHBand="0" w:firstRowFirstColumn="0" w:firstRowLastColumn="0" w:lastRowFirstColumn="0" w:lastRowLastColumn="0"/>
               <w:rPr>
                 <w:rFonts w:ascii="Cambria" w:hAnsi="Cambria"/>
-                <w:b/>
+                <w:bCs w:val="0"/>
                 <w:color w:val="000000"/>
                 <w:sz w:val="22"/>
                 <w:szCs w:val="22"/>
@@ -2699,7 +2683,7 @@
             <w:r>
               <w:rPr>
                 <w:rFonts w:ascii="Cambria" w:hAnsi="Cambria"/>
-                <w:b/>
+                <w:bCs w:val="0"/>
                 <w:color w:val="000000"/>
                 <w:sz w:val="22"/>
                 <w:szCs w:val="22"/>
@@ -2710,7 +2694,7 @@
             <w:r>
               <w:rPr>
                 <w:rFonts w:ascii="Cambria" w:hAnsi="Cambria"/>
-                <w:b/>
+                <w:bCs w:val="0"/>
                 <w:color w:val="000000"/>
                 <w:sz w:val="22"/>
                 <w:szCs w:val="22"/>
@@ -2721,7 +2705,7 @@
             <w:r>
               <w:rPr>
                 <w:rFonts w:ascii="Cambria" w:hAnsi="Cambria"/>
-                <w:b/>
+                <w:bCs w:val="0"/>
                 <w:color w:val="000000"/>
                 <w:sz w:val="22"/>
                 <w:szCs w:val="22"/>
@@ -2736,6 +2720,7 @@
           </w:tcPr>
           <w:p>
             <w:pPr>
+              <w:keepLines/>
               <w:tabs>
                 <w:tab w:val="clear" w:pos="2940"/>
                 <w:tab w:val="center" w:pos="995"/>
@@ -2744,7 +2729,7 @@
               <w:cnfStyle w:val="000000000000" w:firstRow="0" w:lastRow="0" w:firstColumn="0" w:lastColumn="0" w:oddVBand="0" w:evenVBand="0" w:oddHBand="0" w:evenHBand="0" w:firstRowFirstColumn="0" w:firstRowLastColumn="0" w:lastRowFirstColumn="0" w:lastRowLastColumn="0"/>
               <w:rPr>
                 <w:rFonts w:ascii="Cambria" w:hAnsi="Cambria"/>
-                <w:b/>
+                <w:bCs w:val="0"/>
                 <w:color w:val="000000"/>
                 <w:sz w:val="22"/>
                 <w:szCs w:val="22"/>
@@ -2753,7 +2738,7 @@
             <w:r>
               <w:rPr>
                 <w:rFonts w:ascii="Cambria" w:hAnsi="Cambria"/>
-                <w:b/>
+                <w:bCs w:val="0"/>
                 <w:color w:val="000000"/>
                 <w:sz w:val="22"/>
                 <w:szCs w:val="22"/>
@@ -2764,7 +2749,7 @@
             <w:r>
               <w:rPr>
                 <w:rFonts w:ascii="Cambria" w:hAnsi="Cambria"/>
-                <w:b/>
+                <w:bCs w:val="0"/>
                 <w:color w:val="000000"/>
                 <w:sz w:val="22"/>
                 <w:szCs w:val="22"/>
@@ -2775,7 +2760,7 @@
             <w:r>
               <w:rPr>
                 <w:rFonts w:ascii="Cambria" w:hAnsi="Cambria"/>
-                <w:b/>
+                <w:bCs w:val="0"/>
                 <w:color w:val="000000"/>
                 <w:sz w:val="22"/>
                 <w:szCs w:val="22"/>
@@ -2790,6 +2775,7 @@
           </w:tcPr>
           <w:p>
             <w:pPr>
+              <w:keepLines/>
               <w:tabs>
                 <w:tab w:val="clear" w:pos="2940"/>
                 <w:tab w:val="center" w:pos="995"/>
@@ -2798,7 +2784,7 @@
               <w:cnfStyle w:val="000000000000" w:firstRow="0" w:lastRow="0" w:firstColumn="0" w:lastColumn="0" w:oddVBand="0" w:evenVBand="0" w:oddHBand="0" w:evenHBand="0" w:firstRowFirstColumn="0" w:firstRowLastColumn="0" w:lastRowFirstColumn="0" w:lastRowLastColumn="0"/>
               <w:rPr>
                 <w:rFonts w:ascii="Cambria" w:hAnsi="Cambria"/>
-                <w:b/>
+                <w:bCs w:val="0"/>
                 <w:color w:val="000000"/>
                 <w:sz w:val="22"/>
                 <w:szCs w:val="22"/>
@@ -2807,7 +2793,7 @@
             <w:r>
               <w:rPr>
                 <w:rFonts w:ascii="Cambria" w:hAnsi="Cambria"/>
-                <w:b/>
+                <w:bCs w:val="0"/>
                 <w:color w:val="000000"/>
                 <w:sz w:val="22"/>
                 <w:szCs w:val="22"/>
@@ -2818,7 +2804,7 @@
             <w:r>
               <w:rPr>
                 <w:rFonts w:ascii="Cambria" w:hAnsi="Cambria"/>
-                <w:b/>
+                <w:bCs w:val="0"/>
                 <w:color w:val="000000"/>
                 <w:sz w:val="22"/>
                 <w:szCs w:val="22"/>
@@ -2829,7 +2815,7 @@
             <w:r>
               <w:rPr>
                 <w:rFonts w:ascii="Cambria" w:hAnsi="Cambria"/>
-                <w:b/>
+                <w:bCs w:val="0"/>
                 <w:color w:val="000000"/>
                 <w:sz w:val="22"/>
                 <w:szCs w:val="22"/>
@@ -2995,11 +2981,7 @@
         </w:tabs>
         <w:spacing w:before="0" w:beforeAutospacing="0" w:after="0"/>
         <w:rPr>
-          <w:rFonts w:ascii="Cambria" w:hAnsi="Cambria"/>
-          <w:b/>
-          <w:color w:val="000000"/>
-          <w:sz w:val="22"/>
-          <w:szCs w:val="22"/>
+          <w:rStyle w:val="Strong"/>
         </w:rPr>
       </w:pPr>
     </w:p>
@@ -3012,7 +2994,7 @@
         <w:spacing w:before="0" w:beforeAutospacing="0" w:after="0"/>
         <w:rPr>
           <w:rFonts w:ascii="Cambria" w:hAnsi="Cambria"/>
-          <w:b/>
+          <w:bCs w:val="0"/>
           <w:color w:val="000000"/>
           <w:sz w:val="22"/>
           <w:szCs w:val="22"/>
@@ -3053,11 +3035,7 @@
         </w:tabs>
         <w:spacing w:before="0" w:beforeAutospacing="0" w:after="0"/>
         <w:rPr>
-          <w:rFonts w:ascii="Cambria" w:hAnsi="Cambria"/>
-          <w:b/>
-          <w:color w:val="000000"/>
-          <w:sz w:val="22"/>
-          <w:szCs w:val="22"/>
+          <w:rStyle w:val="Strong"/>
         </w:rPr>
       </w:pPr>
     </w:p>
@@ -3351,7 +3329,7 @@
         <w:spacing w:before="0" w:beforeAutospacing="0" w:after="0"/>
         <w:rPr>
           <w:rFonts w:ascii="Cambria" w:hAnsi="Cambria"/>
-          <w:b/>
+          <w:bCs w:val="0"/>
           <w:color w:val="000000"/>
           <w:sz w:val="22"/>
           <w:szCs w:val="22"/>
@@ -3368,6 +3346,7 @@
         <w:rPr>
           <w:rFonts w:ascii="Cambria" w:hAnsi="Cambria"/>
           <w:b/>
+          <w:bCs w:val="0"/>
           <w:color w:val="000000"/>
           <w:sz w:val="22"/>
           <w:szCs w:val="22"/>
@@ -3377,6 +3356,7 @@
         <w:rPr>
           <w:rFonts w:ascii="Cambria" w:hAnsi="Cambria"/>
           <w:b/>
+          <w:bCs w:val="0"/>
           <w:color w:val="000000"/>
           <w:sz w:val="22"/>
           <w:szCs w:val="22"/>
@@ -3393,7 +3373,7 @@
         <w:spacing w:before="0" w:beforeAutospacing="0" w:after="0"/>
         <w:rPr>
           <w:rFonts w:ascii="Cambria" w:hAnsi="Cambria"/>
-          <w:b/>
+          <w:bCs w:val="0"/>
           <w:color w:val="000000"/>
           <w:sz w:val="22"/>
           <w:szCs w:val="22"/>
@@ -3409,7 +3389,7 @@
         <w:spacing w:before="0" w:beforeAutospacing="0" w:after="0"/>
         <w:rPr>
           <w:rFonts w:ascii="Cambria" w:hAnsi="Cambria"/>
-          <w:b/>
+          <w:bCs w:val="0"/>
           <w:color w:val="000000"/>
           <w:sz w:val="22"/>
           <w:szCs w:val="22"/>
@@ -3418,7 +3398,7 @@
       <w:r>
         <w:rPr>
           <w:rFonts w:ascii="Cambria" w:hAnsi="Cambria"/>
-          <w:b/>
+          <w:bCs w:val="0"/>
           <w:color w:val="000000"/>
           <w:sz w:val="22"/>
           <w:szCs w:val="22"/>
@@ -3428,7 +3408,7 @@
       <w:r>
         <w:rPr>
           <w:rFonts w:ascii="Cambria" w:hAnsi="Cambria"/>
-          <w:b/>
+          <w:bCs w:val="0"/>
           <w:color w:val="000000"/>
           <w:sz w:val="22"/>
           <w:szCs w:val="22"/>
@@ -3438,7 +3418,7 @@
       <w:r>
         <w:rPr>
           <w:rFonts w:ascii="Cambria" w:hAnsi="Cambria"/>
-          <w:b/>
+          <w:bCs w:val="0"/>
           <w:color w:val="000000"/>
           <w:sz w:val="22"/>
           <w:szCs w:val="22"/>
@@ -3448,7 +3428,7 @@
       <w:r>
         <w:rPr>
           <w:rFonts w:ascii="Cambria" w:hAnsi="Cambria"/>
-          <w:b/>
+          <w:bCs w:val="0"/>
           <w:color w:val="000000"/>
           <w:sz w:val="22"/>
           <w:szCs w:val="22"/>
@@ -3458,7 +3438,7 @@
       <w:r>
         <w:rPr>
           <w:rFonts w:ascii="Cambria" w:hAnsi="Cambria"/>
-          <w:b/>
+          <w:bCs w:val="0"/>
           <w:color w:val="000000"/>
           <w:sz w:val="22"/>
           <w:szCs w:val="22"/>
@@ -3475,7 +3455,7 @@
         <w:spacing w:before="0" w:beforeAutospacing="0" w:after="0"/>
         <w:rPr>
           <w:rFonts w:ascii="Cambria" w:hAnsi="Cambria"/>
-          <w:b/>
+          <w:bCs w:val="0"/>
           <w:color w:val="000000"/>
           <w:sz w:val="22"/>
           <w:szCs w:val="22"/>
@@ -3484,7 +3464,7 @@
       <w:r>
         <w:rPr>
           <w:rFonts w:ascii="Cambria" w:hAnsi="Cambria"/>
-          <w:b/>
+          <w:bCs w:val="0"/>
           <w:color w:val="000000"/>
           <w:sz w:val="22"/>
           <w:szCs w:val="22"/>
@@ -3496,7 +3476,7 @@
       <w:r>
         <w:rPr>
           <w:rFonts w:ascii="Cambria" w:hAnsi="Cambria"/>
-          <w:b/>
+          <w:bCs w:val="0"/>
           <w:color w:val="000000"/>
           <w:sz w:val="22"/>
           <w:szCs w:val="22"/>
@@ -3507,7 +3487,7 @@
       <w:r>
         <w:rPr>
           <w:rFonts w:ascii="Cambria" w:hAnsi="Cambria"/>
-          <w:b/>
+          <w:bCs w:val="0"/>
           <w:color w:val="000000"/>
           <w:sz w:val="22"/>
           <w:szCs w:val="22"/>
@@ -3518,7 +3498,7 @@
       <w:r>
         <w:rPr>
           <w:rFonts w:ascii="Cambria" w:hAnsi="Cambria"/>
-          <w:b/>
+          <w:bCs w:val="0"/>
           <w:color w:val="000000"/>
           <w:sz w:val="22"/>
           <w:szCs w:val="22"/>
@@ -3528,11 +3508,6 @@
     </w:p>
     <w:p>
       <w:pPr>
-        <w:pStyle w:val="ListParagraph"/>
-        <w:numPr>
-          <w:ilvl w:val="0"/>
-          <w:numId w:val="48"/>
-        </w:numPr>
         <w:tabs>
           <w:tab w:val="clear" w:pos="2940"/>
           <w:tab w:val="center" w:pos="995"/>
@@ -3566,7 +3541,7 @@
         <w:spacing w:before="0" w:beforeAutospacing="0" w:after="0"/>
         <w:rPr>
           <w:rFonts w:ascii="Cambria" w:hAnsi="Cambria"/>
-          <w:b/>
+          <w:bCs w:val="0"/>
           <w:color w:val="000000"/>
           <w:sz w:val="22"/>
           <w:szCs w:val="22"/>
@@ -3582,7 +3557,7 @@
         <w:spacing w:before="0" w:beforeAutospacing="0" w:after="0"/>
         <w:rPr>
           <w:rFonts w:ascii="Cambria" w:hAnsi="Cambria"/>
-          <w:b/>
+          <w:bCs w:val="0"/>
           <w:color w:val="000000"/>
           <w:sz w:val="22"/>
           <w:szCs w:val="22"/>
@@ -3591,7 +3566,7 @@
       <w:r>
         <w:rPr>
           <w:rFonts w:ascii="Cambria" w:hAnsi="Cambria"/>
-          <w:b/>
+          <w:bCs w:val="0"/>
           <w:color w:val="000000"/>
           <w:sz w:val="22"/>
           <w:szCs w:val="22"/>
@@ -3601,7 +3576,7 @@
       <w:r>
         <w:rPr>
           <w:rFonts w:ascii="Cambria" w:hAnsi="Cambria"/>
-          <w:b/>
+          <w:bCs w:val="0"/>
           <w:color w:val="000000"/>
           <w:sz w:val="22"/>
           <w:szCs w:val="22"/>
@@ -3612,7 +3587,7 @@
       <w:r>
         <w:rPr>
           <w:rFonts w:ascii="Cambria" w:hAnsi="Cambria"/>
-          <w:b/>
+          <w:bCs w:val="0"/>
           <w:color w:val="000000"/>
           <w:sz w:val="22"/>
           <w:szCs w:val="22"/>
@@ -3623,7 +3598,7 @@
       <w:r>
         <w:rPr>
           <w:rFonts w:ascii="Cambria" w:hAnsi="Cambria"/>
-          <w:b/>
+          <w:bCs w:val="0"/>
           <w:color w:val="000000"/>
           <w:sz w:val="22"/>
           <w:szCs w:val="22"/>
@@ -3640,12 +3615,20 @@
         <w:spacing w:before="0" w:beforeAutospacing="0" w:after="0"/>
         <w:rPr>
           <w:rFonts w:ascii="Cambria" w:hAnsi="Cambria"/>
-          <w:b/>
+          <w:bCs w:val="0"/>
           <w:color w:val="000000"/>
           <w:sz w:val="22"/>
           <w:szCs w:val="22"/>
         </w:rPr>
       </w:pPr>
+    </w:p>
+    <w:p>
+      <w:pPr>
+        <w:pStyle w:val="Heading1"/>
+      </w:pPr>
+      <w:r>
+        <w:t>Security</w:t>
+      </w:r>
     </w:p>
     <w:p>
       <w:pPr>
@@ -3654,28 +3637,7 @@
           <w:tab w:val="center" w:pos="995"/>
         </w:tabs>
         <w:spacing w:before="0" w:beforeAutospacing="0" w:after="0"/>
-        <w:rPr>
-          <w:rFonts w:ascii="Cambria" w:hAnsi="Cambria"/>
-          <w:b/>
-          <w:color w:val="000000"/>
-          <w:sz w:val="22"/>
-          <w:szCs w:val="22"/>
-        </w:rPr>
-      </w:pPr>
-    </w:p>
-    <w:p>
-      <w:pPr>
-        <w:pStyle w:val="Heading1"/>
-        <w:rPr>
-          <w:color w:val="538135" w:themeColor="accent6" w:themeShade="BF"/>
-        </w:rPr>
-      </w:pPr>
-      <w:r>
-        <w:rPr>
-          <w:color w:val="538135" w:themeColor="accent6" w:themeShade="BF"/>
-        </w:rPr>
-        <w:t>Security</w:t>
-      </w:r>
+      </w:pPr>
     </w:p>
     <w:p>
       <w:pPr>
@@ -3684,7 +3646,25 @@
           <w:tab w:val="center" w:pos="995"/>
         </w:tabs>
         <w:spacing w:before="0" w:beforeAutospacing="0" w:after="0"/>
-      </w:pPr>
+        <w:rPr>
+          <w:rFonts w:ascii="Cambria" w:hAnsi="Cambria"/>
+          <w:b/>
+          <w:color w:val="000000"/>
+          <w:sz w:val="22"/>
+          <w:szCs w:val="22"/>
+        </w:rPr>
+      </w:pPr>
+      <w:r>
+        <w:rPr>
+          <w:rFonts w:ascii="Cambria" w:hAnsi="Cambria"/>
+          <w:b/>
+          <w:color w:val="000000"/>
+          <w:sz w:val="22"/>
+          <w:szCs w:val="22"/>
+        </w:rPr>
+        <w:lastRenderedPageBreak/>
+        <w:t>Internal issues/deployments:</w:t>
+      </w:r>
     </w:p>
     <w:p>
       <w:pPr>
@@ -3695,7 +3675,7 @@
         <w:spacing w:before="0" w:beforeAutospacing="0" w:after="0"/>
         <w:rPr>
           <w:rFonts w:ascii="Cambria" w:hAnsi="Cambria"/>
-          <w:b/>
+          <w:bCs w:val="0"/>
           <w:color w:val="000000"/>
           <w:sz w:val="22"/>
           <w:szCs w:val="22"/>
@@ -3704,22 +3684,16 @@
       <w:r>
         <w:rPr>
           <w:rFonts w:ascii="Cambria" w:hAnsi="Cambria"/>
-          <w:b/>
+          <w:bCs w:val="0"/>
           <w:color w:val="000000"/>
           <w:sz w:val="22"/>
           <w:szCs w:val="22"/>
         </w:rPr>
-        <w:lastRenderedPageBreak/>
-        <w:t>Internal issues/deployments:</w:t>
+        <w:t>&lt;reports&gt;</w:t>
       </w:r>
     </w:p>
     <w:p>
       <w:pPr>
-        <w:pStyle w:val="ListParagraph"/>
-        <w:numPr>
-          <w:ilvl w:val="0"/>
-          <w:numId w:val="48"/>
-        </w:numPr>
         <w:tabs>
           <w:tab w:val="clear" w:pos="2940"/>
           <w:tab w:val="center" w:pos="995"/>
@@ -3733,19 +3707,10 @@
           <w:szCs w:val="22"/>
         </w:rPr>
       </w:pPr>
-      <w:r>
-        <w:rPr>
-          <w:rFonts w:ascii="Cambria" w:hAnsi="Cambria"/>
-          <w:b/>
-          <w:color w:val="000000"/>
-          <w:sz w:val="22"/>
-          <w:szCs w:val="22"/>
-        </w:rPr>
-        <w:t>&lt;reports&gt;</w:t>
-      </w:r>
     </w:p>
     <w:p>
       <w:pPr>
+        <w:keepLines/>
         <w:tabs>
           <w:tab w:val="clear" w:pos="2940"/>
           <w:tab w:val="center" w:pos="995"/>
@@ -3759,46 +3724,27 @@
           <w:szCs w:val="22"/>
         </w:rPr>
       </w:pPr>
+      <w:r>
+        <w:rPr>
+          <w:rFonts w:ascii="Cambria" w:hAnsi="Cambria"/>
+          <w:b/>
+          <w:color w:val="000000"/>
+          <w:sz w:val="22"/>
+          <w:szCs w:val="22"/>
+        </w:rPr>
+        <w:t>Fence Breaks</w:t>
+      </w:r>
     </w:p>
     <w:p>
       <w:pPr>
+        <w:keepLines/>
         <w:tabs>
           <w:tab w:val="clear" w:pos="2940"/>
           <w:tab w:val="center" w:pos="995"/>
         </w:tabs>
         <w:spacing w:before="0" w:beforeAutospacing="0" w:after="0"/>
         <w:rPr>
-          <w:rFonts w:ascii="Cambria" w:hAnsi="Cambria"/>
-          <w:b/>
-          <w:color w:val="000000"/>
-          <w:sz w:val="22"/>
-          <w:szCs w:val="22"/>
-        </w:rPr>
-      </w:pPr>
-      <w:r>
-        <w:rPr>
-          <w:rFonts w:ascii="Cambria" w:hAnsi="Cambria"/>
-          <w:b/>
-          <w:color w:val="000000"/>
-          <w:sz w:val="22"/>
-          <w:szCs w:val="22"/>
-        </w:rPr>
-        <w:t>Fence Breaks</w:t>
-      </w:r>
-    </w:p>
-    <w:p>
-      <w:pPr>
-        <w:tabs>
-          <w:tab w:val="clear" w:pos="2940"/>
-          <w:tab w:val="center" w:pos="995"/>
-        </w:tabs>
-        <w:spacing w:before="0" w:beforeAutospacing="0" w:after="0"/>
-        <w:rPr>
-          <w:rFonts w:ascii="Cambria" w:hAnsi="Cambria"/>
-          <w:b/>
-          <w:color w:val="000000"/>
-          <w:sz w:val="22"/>
-          <w:szCs w:val="22"/>
+          <w:rStyle w:val="Strong"/>
         </w:rPr>
       </w:pPr>
     </w:p>
@@ -3828,6 +3774,7 @@
           </w:tcPr>
           <w:p>
             <w:pPr>
+              <w:keepLines/>
               <w:spacing w:after="0"/>
               <w:jc w:val="left"/>
               <w:rPr>
@@ -3852,6 +3799,7 @@
           </w:tcPr>
           <w:p>
             <w:pPr>
+              <w:keepLines/>
               <w:spacing w:after="0"/>
               <w:jc w:val="left"/>
               <w:cnfStyle w:val="100000000000" w:firstRow="1" w:lastRow="0" w:firstColumn="0" w:lastColumn="0" w:oddVBand="0" w:evenVBand="0" w:oddHBand="0" w:evenHBand="0" w:firstRowFirstColumn="0" w:firstRowLastColumn="0" w:lastRowFirstColumn="0" w:lastRowLastColumn="0"/>
@@ -3877,6 +3825,7 @@
           </w:tcPr>
           <w:p>
             <w:pPr>
+              <w:keepLines/>
               <w:spacing w:after="0"/>
               <w:jc w:val="left"/>
               <w:cnfStyle w:val="100000000000" w:firstRow="1" w:lastRow="0" w:firstColumn="0" w:lastColumn="0" w:oddVBand="0" w:evenVBand="0" w:oddHBand="0" w:evenHBand="0" w:firstRowFirstColumn="0" w:firstRowLastColumn="0" w:lastRowFirstColumn="0" w:lastRowLastColumn="0"/>
@@ -3902,6 +3851,7 @@
           </w:tcPr>
           <w:p>
             <w:pPr>
+              <w:keepLines/>
               <w:spacing w:after="0"/>
               <w:jc w:val="left"/>
               <w:cnfStyle w:val="100000000000" w:firstRow="1" w:lastRow="0" w:firstColumn="0" w:lastColumn="0" w:oddVBand="0" w:evenVBand="0" w:oddHBand="0" w:evenHBand="0" w:firstRowFirstColumn="0" w:firstRowLastColumn="0" w:lastRowFirstColumn="0" w:lastRowLastColumn="0"/>
@@ -3927,6 +3877,7 @@
           </w:tcPr>
           <w:p>
             <w:pPr>
+              <w:keepLines/>
               <w:spacing w:after="0"/>
               <w:jc w:val="left"/>
               <w:cnfStyle w:val="100000000000" w:firstRow="1" w:lastRow="0" w:firstColumn="0" w:lastColumn="0" w:oddVBand="0" w:evenVBand="0" w:oddHBand="0" w:evenHBand="0" w:firstRowFirstColumn="0" w:firstRowLastColumn="0" w:lastRowFirstColumn="0" w:lastRowLastColumn="0"/>
@@ -3952,6 +3903,7 @@
           </w:tcPr>
           <w:p>
             <w:pPr>
+              <w:keepLines/>
               <w:spacing w:after="0"/>
               <w:jc w:val="left"/>
               <w:cnfStyle w:val="100000000000" w:firstRow="1" w:lastRow="0" w:firstColumn="0" w:lastColumn="0" w:oddVBand="0" w:evenVBand="0" w:oddHBand="0" w:evenHBand="0" w:firstRowFirstColumn="0" w:firstRowLastColumn="0" w:lastRowFirstColumn="0" w:lastRowLastColumn="0"/>
@@ -3977,6 +3929,7 @@
           </w:tcPr>
           <w:p>
             <w:pPr>
+              <w:keepLines/>
               <w:spacing w:after="0"/>
               <w:jc w:val="left"/>
               <w:cnfStyle w:val="100000000000" w:firstRow="1" w:lastRow="0" w:firstColumn="0" w:lastColumn="0" w:oddVBand="0" w:evenVBand="0" w:oddHBand="0" w:evenHBand="0" w:firstRowFirstColumn="0" w:firstRowLastColumn="0" w:lastRowFirstColumn="0" w:lastRowLastColumn="0"/>
@@ -4018,6 +3971,7 @@
           </w:tcPr>
           <w:p>
             <w:pPr>
+              <w:keepLines/>
               <w:tabs>
                 <w:tab w:val="clear" w:pos="2940"/>
                 <w:tab w:val="center" w:pos="995"/>
@@ -4039,6 +3993,7 @@
           </w:tcPr>
           <w:p>
             <w:pPr>
+              <w:keepLines/>
               <w:tabs>
                 <w:tab w:val="clear" w:pos="2940"/>
                 <w:tab w:val="center" w:pos="995"/>
@@ -4061,6 +4016,7 @@
           </w:tcPr>
           <w:p>
             <w:pPr>
+              <w:keepLines/>
               <w:tabs>
                 <w:tab w:val="clear" w:pos="2940"/>
                 <w:tab w:val="center" w:pos="995"/>
@@ -4083,6 +4039,7 @@
           </w:tcPr>
           <w:p>
             <w:pPr>
+              <w:keepLines/>
               <w:tabs>
                 <w:tab w:val="clear" w:pos="2940"/>
                 <w:tab w:val="center" w:pos="995"/>
@@ -4105,6 +4062,7 @@
           </w:tcPr>
           <w:p>
             <w:pPr>
+              <w:keepLines/>
               <w:tabs>
                 <w:tab w:val="clear" w:pos="2940"/>
                 <w:tab w:val="center" w:pos="995"/>
@@ -4127,6 +4085,7 @@
           </w:tcPr>
           <w:p>
             <w:pPr>
+              <w:keepLines/>
               <w:tabs>
                 <w:tab w:val="clear" w:pos="2940"/>
                 <w:tab w:val="center" w:pos="995"/>
@@ -4149,6 +4108,7 @@
           </w:tcPr>
           <w:p>
             <w:pPr>
+              <w:keepLines/>
               <w:tabs>
                 <w:tab w:val="clear" w:pos="2940"/>
                 <w:tab w:val="center" w:pos="995"/>
@@ -4331,45 +4291,17 @@
         </w:tabs>
         <w:spacing w:before="0" w:beforeAutospacing="0" w:after="0"/>
         <w:rPr>
-          <w:rFonts w:ascii="Cambria" w:hAnsi="Cambria"/>
-          <w:b/>
-          <w:color w:val="000000"/>
-          <w:sz w:val="22"/>
-          <w:szCs w:val="22"/>
+          <w:rStyle w:val="Strong"/>
         </w:rPr>
       </w:pPr>
     </w:p>
     <w:p>
       <w:pPr>
         <w:pStyle w:val="Heading1"/>
-        <w:rPr>
-          <w:color w:val="538135" w:themeColor="accent6" w:themeShade="BF"/>
-          <w14:textFill>
-            <w14:solidFill>
-              <w14:schemeClr w14:val="accent6">
-                <w14:lumMod w14:val="75000"/>
-                <w14:lumMod w14:val="75000"/>
-              </w14:schemeClr>
-            </w14:solidFill>
-          </w14:textFill>
-        </w:rPr>
       </w:pPr>
       <w:r>
-        <w:rPr>
-          <w:color w:val="538135" w:themeColor="accent6" w:themeShade="BF"/>
-          <w14:textFill>
-            <w14:solidFill>
-              <w14:schemeClr w14:val="accent6">
-                <w14:lumMod w14:val="75000"/>
-                <w14:lumMod w14:val="75000"/>
-              </w14:schemeClr>
-            </w14:solidFill>
-          </w14:textFill>
-        </w:rPr>
         <w:t>N.R.T. Report</w:t>
       </w:r>
-      <w:bookmarkStart w:id="0" w:name="_GoBack"/>
-      <w:bookmarkEnd w:id="0"/>
     </w:p>
     <w:p>
       <w:pPr>
@@ -4380,7 +4312,7 @@
         <w:spacing w:before="0" w:beforeAutospacing="0" w:after="0"/>
         <w:rPr>
           <w:rFonts w:ascii="Cambria" w:hAnsi="Cambria"/>
-          <w:b/>
+          <w:bCs w:val="0"/>
           <w:color w:val="000000"/>
           <w:sz w:val="22"/>
           <w:szCs w:val="22"/>
@@ -4389,7 +4321,7 @@
       <w:r>
         <w:rPr>
           <w:rFonts w:ascii="Cambria" w:hAnsi="Cambria"/>
-          <w:b/>
+          <w:bCs w:val="0"/>
           <w:color w:val="000000"/>
           <w:sz w:val="22"/>
           <w:szCs w:val="22"/>
@@ -4406,7 +4338,7 @@
         <w:spacing w:before="0" w:beforeAutospacing="0" w:after="0"/>
         <w:rPr>
           <w:rFonts w:ascii="Cambria" w:hAnsi="Cambria"/>
-          <w:b/>
+          <w:bCs w:val="0"/>
           <w:color w:val="000000"/>
           <w:sz w:val="22"/>
           <w:szCs w:val="22"/>
@@ -4415,7 +4347,7 @@
       <w:r>
         <w:rPr>
           <w:rFonts w:ascii="Cambria" w:hAnsi="Cambria"/>
-          <w:b/>
+          <w:bCs w:val="0"/>
           <w:color w:val="000000"/>
           <w:sz w:val="22"/>
           <w:szCs w:val="22"/>
@@ -4432,7 +4364,7 @@
         <w:spacing w:before="0" w:beforeAutospacing="0" w:after="0"/>
         <w:rPr>
           <w:rFonts w:ascii="Cambria" w:hAnsi="Cambria"/>
-          <w:b/>
+          <w:bCs w:val="0"/>
           <w:color w:val="000000"/>
           <w:sz w:val="22"/>
           <w:szCs w:val="22"/>
@@ -4441,7 +4373,7 @@
       <w:r>
         <w:rPr>
           <w:rFonts w:ascii="Cambria" w:hAnsi="Cambria"/>
-          <w:b/>
+          <w:bCs w:val="0"/>
           <w:color w:val="000000"/>
           <w:sz w:val="22"/>
           <w:szCs w:val="22"/>
@@ -4458,7 +4390,7 @@
         <w:spacing w:before="0" w:beforeAutospacing="0" w:after="0"/>
         <w:rPr>
           <w:rFonts w:ascii="Cambria" w:hAnsi="Cambria"/>
-          <w:b/>
+          <w:bCs w:val="0"/>
           <w:color w:val="000000"/>
           <w:sz w:val="22"/>
           <w:szCs w:val="22"/>
@@ -4467,7 +4399,7 @@
       <w:r>
         <w:rPr>
           <w:rFonts w:ascii="Cambria" w:hAnsi="Cambria"/>
-          <w:b/>
+          <w:bCs w:val="0"/>
           <w:color w:val="000000"/>
           <w:sz w:val="22"/>
           <w:szCs w:val="22"/>
@@ -4484,7 +4416,7 @@
         <w:spacing w:before="0" w:beforeAutospacing="0" w:after="0"/>
         <w:rPr>
           <w:rFonts w:ascii="Cambria" w:hAnsi="Cambria"/>
-          <w:b/>
+          <w:bCs w:val="0"/>
           <w:color w:val="000000"/>
           <w:sz w:val="22"/>
           <w:szCs w:val="22"/>
@@ -4493,7 +4425,7 @@
       <w:r>
         <w:rPr>
           <w:rFonts w:ascii="Cambria" w:hAnsi="Cambria"/>
-          <w:b/>
+          <w:bCs w:val="0"/>
           <w:color w:val="000000"/>
           <w:sz w:val="22"/>
           <w:szCs w:val="22"/>
@@ -4510,7 +4442,7 @@
         <w:spacing w:before="0" w:beforeAutospacing="0" w:after="0"/>
         <w:rPr>
           <w:rFonts w:ascii="Cambria" w:hAnsi="Cambria"/>
-          <w:b/>
+          <w:bCs w:val="0"/>
           <w:color w:val="000000"/>
           <w:sz w:val="22"/>
           <w:szCs w:val="22"/>
@@ -4592,29 +4524,38 @@
 <w:hdr xmlns:wpc="http://schemas.microsoft.com/office/word/2010/wordprocessingCanvas" xmlns:mo="http://schemas.microsoft.com/office/mac/office/2008/main" xmlns:mc="http://schemas.openxmlformats.org/markup-compatibility/2006" xmlns:mv="urn:schemas-microsoft-com:mac:vml" xmlns:o="urn:schemas-microsoft-com:office:office" xmlns:r="http://schemas.openxmlformats.org/officeDocument/2006/relationships" xmlns:m="http://schemas.openxmlformats.org/officeDocument/2006/math" xmlns:v="urn:schemas-microsoft-com:vml" xmlns:wp14="http://schemas.microsoft.com/office/word/2010/wordprocessingDrawing" xmlns:wp="http://schemas.openxmlformats.org/drawingml/2006/wordprocessingDrawing" xmlns:w10="urn:schemas-microsoft-com:office:word" xmlns:w="http://schemas.openxmlformats.org/wordprocessingml/2006/main" xmlns:w14="http://schemas.microsoft.com/office/word/2010/wordml" xmlns:w15="http://schemas.microsoft.com/office/word/2012/wordml" xmlns:wpg="http://schemas.microsoft.com/office/word/2010/wordprocessingGroup" xmlns:wpi="http://schemas.microsoft.com/office/word/2010/wordprocessingInk" xmlns:wne="http://schemas.microsoft.com/office/word/2006/wordml" xmlns:wps="http://schemas.microsoft.com/office/word/2010/wordprocessingShape" mc:Ignorable="w14 w15 wp14">
   <w:tbl>
     <w:tblPr>
+      <w:tblStyle w:val="TableGridLight"/>
       <w:tblW w:w="0" w:type="auto"/>
+      <w:tblBorders>
+        <w:top w:val="none" w:sz="0" w:space="0" w:color="auto"/>
+        <w:left w:val="none" w:sz="0" w:space="0" w:color="auto"/>
+        <w:bottom w:val="single" w:sz="12" w:space="0" w:color="70AD47" w:themeColor="accent6"/>
+        <w:right w:val="none" w:sz="0" w:space="0" w:color="auto"/>
+        <w:insideH w:val="none" w:sz="0" w:space="0" w:color="auto"/>
+        <w:insideV w:val="none" w:sz="0" w:space="0" w:color="auto"/>
+      </w:tblBorders>
       <w:tblLook w:val="04A0" w:firstRow="1" w:lastRow="0" w:firstColumn="1" w:lastColumn="0" w:noHBand="0" w:noVBand="1"/>
     </w:tblPr>
     <w:tblGrid>
-      <w:gridCol w:w="4095"/>
-      <w:gridCol w:w="2201"/>
-      <w:gridCol w:w="3064"/>
+      <w:gridCol w:w="3542"/>
+      <w:gridCol w:w="2942"/>
+      <w:gridCol w:w="2876"/>
     </w:tblGrid>
     <w:tr>
       <w:trPr>
-        <w:trHeight w:val="2979"/>
+        <w:trHeight w:val="2943"/>
       </w:trPr>
       <w:tc>
         <w:tcPr>
-          <w:tcW w:w="4178" w:type="dxa"/>
+          <w:tcW w:w="3116" w:type="dxa"/>
+          <w:vAlign w:val="center"/>
         </w:tcPr>
         <w:p>
           <w:pPr>
             <w:pStyle w:val="Header"/>
-            <w:jc w:val="left"/>
+            <w:jc w:val="center"/>
             <w:rPr>
-              <w:sz w:val="48"/>
-              <w:szCs w:val="48"/>
+              <w:b/>
             </w:rPr>
           </w:pPr>
           <w:r>
@@ -4624,9 +4565,17 @@
               <w:szCs w:val="48"/>
             </w:rPr>
             <w:drawing>
-              <wp:inline distT="0" distB="0" distL="0" distR="0" wp14:anchorId="05487A63" wp14:editId="18BBBFAE">
-                <wp:extent cx="1944370" cy="925830"/>
-                <wp:effectExtent l="0" t="0" r="11430" b="0"/>
+              <wp:anchor distT="0" distB="0" distL="114300" distR="114300" simplePos="0" relativeHeight="251659264" behindDoc="0" locked="0" layoutInCell="1" allowOverlap="1" wp14:anchorId="446F0672" wp14:editId="72570D11">
+                <wp:simplePos x="0" y="0"/>
+                <wp:positionH relativeFrom="margin">
+                  <wp:posOffset>-6350</wp:posOffset>
+                </wp:positionH>
+                <wp:positionV relativeFrom="margin">
+                  <wp:posOffset>138430</wp:posOffset>
+                </wp:positionV>
+                <wp:extent cx="2112403" cy="1005840"/>
+                <wp:effectExtent l="0" t="0" r="0" b="10160"/>
+                <wp:wrapSquare wrapText="bothSides"/>
                 <wp:docPr id="2" name="Picture 2" descr="Lewa_Olive_rgb_med"/>
                 <wp:cNvGraphicFramePr>
                   <a:graphicFrameLocks xmlns:a="http://schemas.openxmlformats.org/drawingml/2006/main" noChangeAspect="1"/>
@@ -4656,7 +4605,7 @@
                       <pic:spPr bwMode="auto">
                         <a:xfrm>
                           <a:off x="0" y="0"/>
-                          <a:ext cx="1944370" cy="925830"/>
+                          <a:ext cx="2112403" cy="1005840"/>
                         </a:xfrm>
                         <a:prstGeom prst="rect">
                           <a:avLst/>
@@ -4669,22 +4618,22 @@
                     </pic:pic>
                   </a:graphicData>
                 </a:graphic>
-              </wp:inline>
+              </wp:anchor>
             </w:drawing>
           </w:r>
         </w:p>
       </w:tc>
       <w:tc>
         <w:tcPr>
-          <w:tcW w:w="2204" w:type="dxa"/>
+          <w:tcW w:w="3117" w:type="dxa"/>
+          <w:vAlign w:val="center"/>
         </w:tcPr>
         <w:p>
           <w:pPr>
             <w:pStyle w:val="Header"/>
             <w:jc w:val="center"/>
             <w:rPr>
-              <w:sz w:val="56"/>
-              <w:szCs w:val="48"/>
+              <w:b/>
             </w:rPr>
           </w:pPr>
           <w:r>
@@ -4694,7 +4643,7 @@
               <w:szCs w:val="48"/>
             </w:rPr>
             <w:drawing>
-              <wp:inline distT="0" distB="0" distL="0" distR="0" wp14:anchorId="488BCE8D" wp14:editId="55AA9211">
+              <wp:inline distT="0" distB="0" distL="0" distR="0" wp14:anchorId="691BAF27" wp14:editId="661B58DC">
                 <wp:extent cx="1238250" cy="1782445"/>
                 <wp:effectExtent l="0" t="0" r="6350" b="0"/>
                 <wp:docPr id="1" name="Picture 1"/>
@@ -4746,24 +4695,25 @@
       </w:tc>
       <w:tc>
         <w:tcPr>
-          <w:tcW w:w="3194" w:type="dxa"/>
+          <w:tcW w:w="3117" w:type="dxa"/>
+          <w:vAlign w:val="center"/>
         </w:tcPr>
         <w:p>
           <w:pPr>
             <w:pStyle w:val="Header"/>
-            <w:jc w:val="right"/>
+            <w:jc w:val="center"/>
             <w:rPr>
-              <w:sz w:val="48"/>
-              <w:szCs w:val="48"/>
+              <w:b/>
             </w:rPr>
           </w:pPr>
           <w:r>
             <w:rPr>
+              <w:noProof/>
               <w:sz w:val="48"/>
               <w:szCs w:val="48"/>
             </w:rPr>
             <w:drawing>
-              <wp:inline distT="0" distB="0" distL="0" distR="0" wp14:anchorId="607DA778" wp14:editId="1C43C0FD">
+              <wp:inline distT="0" distB="0" distL="0" distR="0" wp14:anchorId="79E0506A" wp14:editId="2D79D903">
                 <wp:extent cx="1009489" cy="1608527"/>
                 <wp:effectExtent l="0" t="0" r="6985" b="0"/>
                 <wp:docPr id="4" name="Picture 4"/>
@@ -4836,7 +4786,7 @@
         <v:path o:extrusionok="f" gradientshapeok="t" o:connecttype="rect"/>
         <o:lock v:ext="edit" aspectratio="t"/>
       </v:shapetype>
-      <v:shape id="_x0000_i1101" type="#_x0000_t75" style="width:10.95pt;height:10.95pt" o:bullet="t">
+      <v:shape id="_x0000_i1049" type="#_x0000_t75" style="width:10.95pt;height:10.95pt" o:bullet="t">
         <v:imagedata r:id="rId1" o:title="mso53BE"/>
       </v:shape>
     </w:pict>
@@ -4844,7 +4794,7 @@
   <w:abstractNum w:abstractNumId="0">
     <w:nsid w:val="FFFFFF1D"/>
     <w:multiLevelType w:val="multilevel"/>
-    <w:tmpl w:val="24E6DA08"/>
+    <w:tmpl w:val="0484BE58"/>
     <w:lvl w:ilvl="0">
       <w:start w:val="1"/>
       <w:numFmt w:val="bullet"/>
@@ -11263,6 +11213,77 @@
       </w:tcPr>
     </w:tblStylePr>
   </w:style>
+  <w:style w:type="character" w:styleId="Strong">
+    <w:name w:val="Strong"/>
+    <w:basedOn w:val="DefaultParagraphFont"/>
+    <w:uiPriority w:val="22"/>
+    <w:qFormat/>
+    <w:rsid w:val="003A0C3B"/>
+    <w:rPr>
+      <w:b/>
+      <w:bCs/>
+    </w:rPr>
+  </w:style>
+  <w:style w:type="table" w:styleId="TableGridLight">
+    <w:name w:val="Grid Table Light"/>
+    <w:basedOn w:val="TableNormal"/>
+    <w:uiPriority w:val="40"/>
+    <w:rsid w:val="00693839"/>
+    <w:tblPr>
+      <w:tblInd w:w="0" w:type="dxa"/>
+      <w:tblBorders>
+        <w:top w:val="single" w:sz="4" w:space="0" w:color="BFBFBF" w:themeColor="background1" w:themeShade="BF"/>
+        <w:left w:val="single" w:sz="4" w:space="0" w:color="BFBFBF" w:themeColor="background1" w:themeShade="BF"/>
+        <w:bottom w:val="single" w:sz="4" w:space="0" w:color="BFBFBF" w:themeColor="background1" w:themeShade="BF"/>
+        <w:right w:val="single" w:sz="4" w:space="0" w:color="BFBFBF" w:themeColor="background1" w:themeShade="BF"/>
+        <w:insideH w:val="single" w:sz="4" w:space="0" w:color="BFBFBF" w:themeColor="background1" w:themeShade="BF"/>
+        <w:insideV w:val="single" w:sz="4" w:space="0" w:color="BFBFBF" w:themeColor="background1" w:themeShade="BF"/>
+      </w:tblBorders>
+      <w:tblCellMar>
+        <w:top w:w="0" w:type="dxa"/>
+        <w:left w:w="108" w:type="dxa"/>
+        <w:bottom w:w="0" w:type="dxa"/>
+        <w:right w:w="108" w:type="dxa"/>
+      </w:tblCellMar>
+    </w:tblPr>
+  </w:style>
+  <w:style w:type="paragraph" w:styleId="Subtitle">
+    <w:name w:val="Subtitle"/>
+    <w:basedOn w:val="Normal"/>
+    <w:next w:val="Normal"/>
+    <w:link w:val="SubtitleChar"/>
+    <w:uiPriority w:val="11"/>
+    <w:qFormat/>
+    <w:rsid w:val="006A630E"/>
+    <w:pPr>
+      <w:numPr>
+        <w:ilvl w:val="1"/>
+      </w:numPr>
+      <w:spacing w:after="160"/>
+    </w:pPr>
+    <w:rPr>
+      <w:rFonts w:asciiTheme="minorHAnsi" w:eastAsiaTheme="minorEastAsia" w:hAnsiTheme="minorHAnsi" w:cstheme="minorBidi"/>
+      <w:color w:val="5A5A5A" w:themeColor="text1" w:themeTint="A5"/>
+      <w:spacing w:val="15"/>
+      <w:sz w:val="22"/>
+      <w:szCs w:val="22"/>
+    </w:rPr>
+  </w:style>
+  <w:style w:type="character" w:customStyle="1" w:styleId="SubtitleChar">
+    <w:name w:val="Subtitle Char"/>
+    <w:basedOn w:val="DefaultParagraphFont"/>
+    <w:link w:val="Subtitle"/>
+    <w:uiPriority w:val="11"/>
+    <w:rsid w:val="006A630E"/>
+    <w:rPr>
+      <w:rFonts w:asciiTheme="minorHAnsi" w:eastAsiaTheme="minorEastAsia" w:hAnsiTheme="minorHAnsi" w:cstheme="minorBidi"/>
+      <w:bCs/>
+      <w:color w:val="5A5A5A" w:themeColor="text1" w:themeTint="A5"/>
+      <w:spacing w:val="15"/>
+      <w:sz w:val="22"/>
+      <w:szCs w:val="22"/>
+    </w:rPr>
+  </w:style>
 </w:styles>
 </file>
 
@@ -11528,6 +11549,15 @@
 </file>
 
 <file path=customXml/item1.xml><?xml version="1.0" encoding="utf-8"?>
+<?mso-contentType ?>
+<FormTemplates xmlns="http://schemas.microsoft.com/sharepoint/v3/contenttype/forms">
+  <Display>DocumentLibraryForm</Display>
+  <Edit>DocumentLibraryForm</Edit>
+  <New>DocumentLibraryForm</New>
+</FormTemplates>
+</file>
+
+<file path=customXml/item2.xml><?xml version="1.0" encoding="utf-8"?>
 <ct:contentTypeSchema xmlns:ct="http://schemas.microsoft.com/office/2006/metadata/contentType" xmlns:ma="http://schemas.microsoft.com/office/2006/metadata/properties/metaAttributes" ct:_="" ma:_="" ma:contentTypeName="Document" ma:contentTypeID="0x010100F41CCD4B7892504C89A6E38F4B314456" ma:contentTypeVersion="6" ma:contentTypeDescription="Create a new document." ma:contentTypeScope="" ma:versionID="89af725d52d02b694d8677ebf28c09a1">
   <xsd:schema xmlns:xsd="http://www.w3.org/2001/XMLSchema" xmlns:xs="http://www.w3.org/2001/XMLSchema" xmlns:p="http://schemas.microsoft.com/office/2006/metadata/properties" xmlns:ns1="http://schemas.microsoft.com/sharepoint/v3" xmlns:ns2="af2ffc1a-8a72-49fd-8696-8f2bb51a004c" targetNamespace="http://schemas.microsoft.com/office/2006/metadata/properties" ma:root="true" ma:fieldsID="7357ca35f665b83e2a365df59e8315fd" ns1:_="" ns2:_="">
     <xsd:import namespace="http://schemas.microsoft.com/sharepoint/v3"/>
@@ -11692,20 +11722,19 @@
 </ct:contentTypeSchema>
 </file>
 
-<file path=customXml/item2.xml><?xml version="1.0" encoding="utf-8"?>
-<?mso-contentType ?>
-<FormTemplates xmlns="http://schemas.microsoft.com/sharepoint/v3/contenttype/forms">
-  <Display>DocumentLibraryForm</Display>
-  <Edit>DocumentLibraryForm</Edit>
-  <New>DocumentLibraryForm</New>
-</FormTemplates>
-</file>
-
 <file path=customXml/item3.xml><?xml version="1.0" encoding="utf-8"?>
 <b:Sources xmlns:b="http://schemas.openxmlformats.org/officeDocument/2006/bibliography" xmlns="http://schemas.openxmlformats.org/officeDocument/2006/bibliography" SelectedStyle="\APA.XSL" StyleName="APA"/>
 </file>
 
 <file path=customXml/itemProps1.xml><?xml version="1.0" encoding="utf-8"?>
+<ds:datastoreItem xmlns:ds="http://schemas.openxmlformats.org/officeDocument/2006/customXml" ds:itemID="{CB114600-4DAC-4247-A033-FF6ABD5BC677}">
+  <ds:schemaRefs>
+    <ds:schemaRef ds:uri="http://schemas.microsoft.com/sharepoint/v3/contenttype/forms"/>
+  </ds:schemaRefs>
+</ds:datastoreItem>
+</file>
+
+<file path=customXml/itemProps2.xml><?xml version="1.0" encoding="utf-8"?>
 <ds:datastoreItem xmlns:ds="http://schemas.openxmlformats.org/officeDocument/2006/customXml" ds:itemID="{13EB7D80-2DFE-4BA7-B5BD-416D224EFC5D}">
   <ds:schemaRefs>
     <ds:schemaRef ds:uri="http://schemas.microsoft.com/office/2006/metadata/contentType"/>
@@ -11724,16 +11753,8 @@
 </ds:datastoreItem>
 </file>
 
-<file path=customXml/itemProps2.xml><?xml version="1.0" encoding="utf-8"?>
-<ds:datastoreItem xmlns:ds="http://schemas.openxmlformats.org/officeDocument/2006/customXml" ds:itemID="{CB114600-4DAC-4247-A033-FF6ABD5BC677}">
-  <ds:schemaRefs>
-    <ds:schemaRef ds:uri="http://schemas.microsoft.com/sharepoint/v3/contenttype/forms"/>
-  </ds:schemaRefs>
-</ds:datastoreItem>
-</file>
-
 <file path=customXml/itemProps3.xml><?xml version="1.0" encoding="utf-8"?>
-<ds:datastoreItem xmlns:ds="http://schemas.openxmlformats.org/officeDocument/2006/customXml" ds:itemID="{4BF8450E-A258-F645-97AF-6AC35462B2F8}">
+<ds:datastoreItem xmlns:ds="http://schemas.openxmlformats.org/officeDocument/2006/customXml" ds:itemID="{E5F9BB47-E994-7646-A1E8-AD974CBC7554}">
   <ds:schemaRefs>
     <ds:schemaRef ds:uri="http://schemas.openxmlformats.org/officeDocument/2006/bibliography"/>
   </ds:schemaRefs>

</xml_diff>

<commit_message>
Intermediate commit on reworking report context.
</commit_message>
<xml_diff>
--- a/das/reports/docx_template/lewa_sitrep_template.docx
+++ b/das/reports/docx_template/lewa_sitrep_template.docx
@@ -12,7 +12,6 @@
       <w:r>
         <w:t xml:space="preserve"> </w:t>
       </w:r>
-      <w:proofErr w:type="spellStart"/>
       <w:r>
         <w:t>Sit</w:t>
       </w:r>
@@ -22,7 +21,6 @@
       <w:r>
         <w:t>ep</w:t>
       </w:r>
-      <w:proofErr w:type="spellEnd"/>
       <w:r>
         <w:t>:</w:t>
       </w:r>
@@ -30,15 +28,7 @@
         <w:t xml:space="preserve"> </w:t>
       </w:r>
       <w:r>
-        <w:t>{{</w:t>
-      </w:r>
-      <w:proofErr w:type="spellStart"/>
-      <w:r>
-        <w:t>report_date</w:t>
-      </w:r>
-      <w:proofErr w:type="spellEnd"/>
-      <w:r>
-        <w:t>}}</w:t>
+        <w:t>{{report_date}}</w:t>
       </w:r>
     </w:p>
     <w:p>
@@ -52,7 +42,6 @@
           <w:szCs w:val="22"/>
         </w:rPr>
       </w:pPr>
-      <w:proofErr w:type="gramStart"/>
       <w:r>
         <w:rPr>
           <w:rFonts w:ascii="Cambria" w:hAnsi="Cambria"/>
@@ -61,43 +50,8 @@
           <w:sz w:val="22"/>
           <w:szCs w:val="22"/>
         </w:rPr>
-        <w:t xml:space="preserve">{{ </w:t>
+        <w:t>{{ report_daterange_text }}</w:t>
       </w:r>
-      <w:proofErr w:type="spellStart"/>
-      <w:r>
-        <w:rPr>
-          <w:rFonts w:ascii="Cambria" w:hAnsi="Cambria"/>
-          <w:b/>
-          <w:color w:val="000000"/>
-          <w:sz w:val="22"/>
-          <w:szCs w:val="22"/>
-        </w:rPr>
-        <w:t>report</w:t>
-      </w:r>
-      <w:proofErr w:type="gramEnd"/>
-      <w:r>
-        <w:rPr>
-          <w:rFonts w:ascii="Cambria" w:hAnsi="Cambria"/>
-          <w:b/>
-          <w:color w:val="000000"/>
-          <w:sz w:val="22"/>
-          <w:szCs w:val="22"/>
-        </w:rPr>
-        <w:t>_daterange_text</w:t>
-      </w:r>
-      <w:proofErr w:type="spellEnd"/>
-      <w:r>
-        <w:rPr>
-          <w:rFonts w:ascii="Cambria" w:hAnsi="Cambria"/>
-          <w:b/>
-          <w:color w:val="000000"/>
-          <w:sz w:val="22"/>
-          <w:szCs w:val="22"/>
-        </w:rPr>
-        <w:t xml:space="preserve"> }}</w:t>
-      </w:r>
-      <w:bookmarkStart w:id="0" w:name="_GoBack"/>
-      <w:bookmarkEnd w:id="0"/>
     </w:p>
     <w:p>
       <w:pPr>
@@ -125,10 +79,11 @@
           <w:sz w:val="22"/>
           <w:szCs w:val="22"/>
         </w:rPr>
-        <w:t xml:space="preserve">{% for </w:t>
+        <w:t>{% if wildlife_sightings %}</w:t>
       </w:r>
-      <w:proofErr w:type="spellStart"/>
-      <w:r>
+    </w:p>
+    <w:p>
+      <w:pPr>
         <w:rPr>
           <w:rFonts w:ascii="Cambria" w:hAnsi="Cambria"/>
           <w:b/>
@@ -136,9 +91,7 @@
           <w:sz w:val="22"/>
           <w:szCs w:val="22"/>
         </w:rPr>
-        <w:t>ws</w:t>
-      </w:r>
-      <w:proofErr w:type="spellEnd"/>
+      </w:pPr>
       <w:r>
         <w:rPr>
           <w:rFonts w:ascii="Cambria" w:hAnsi="Cambria"/>
@@ -147,9 +100,8 @@
           <w:sz w:val="22"/>
           <w:szCs w:val="22"/>
         </w:rPr>
-        <w:t xml:space="preserve"> in </w:t>
+        <w:t>{% for ws in wildlife_sighting</w:t>
       </w:r>
-      <w:proofErr w:type="spellStart"/>
       <w:r>
         <w:rPr>
           <w:rFonts w:ascii="Cambria" w:hAnsi="Cambria"/>
@@ -158,19 +110,8 @@
           <w:sz w:val="22"/>
           <w:szCs w:val="22"/>
         </w:rPr>
-        <w:t>wildlife_sighting</w:t>
-      </w:r>
-      <w:r>
-        <w:rPr>
-          <w:rFonts w:ascii="Cambria" w:hAnsi="Cambria"/>
-          <w:b/>
-          <w:color w:val="000000"/>
-          <w:sz w:val="22"/>
-          <w:szCs w:val="22"/>
-        </w:rPr>
         <w:t>s</w:t>
       </w:r>
-      <w:proofErr w:type="spellEnd"/>
       <w:r>
         <w:rPr>
           <w:rFonts w:ascii="Cambria" w:hAnsi="Cambria"/>
@@ -235,10 +176,53 @@
           <w:sz w:val="22"/>
           <w:szCs w:val="22"/>
         </w:rPr>
+        <w:t>{{ws.</w:t>
+      </w:r>
+      <w:r>
+        <w:rPr>
+          <w:rFonts w:ascii="Cambria" w:hAnsi="Cambria"/>
+          <w:b/>
+          <w:sz w:val="22"/>
+          <w:szCs w:val="22"/>
+        </w:rPr>
+        <w:t>conservancy</w:t>
+      </w:r>
+      <w:r>
+        <w:rPr>
+          <w:rFonts w:ascii="Cambria" w:hAnsi="Cambria"/>
+          <w:b/>
+          <w:sz w:val="22"/>
+          <w:szCs w:val="22"/>
+        </w:rPr>
+        <w:t>}}</w:t>
+      </w:r>
+      <w:r>
+        <w:rPr>
+          <w:rFonts w:ascii="Cambria" w:hAnsi="Cambria"/>
+          <w:b/>
+          <w:sz w:val="22"/>
+          <w:szCs w:val="22"/>
+        </w:rPr>
+        <w:t>: Black</w:t>
+      </w:r>
+      <w:r>
+        <w:rPr>
+          <w:rFonts w:ascii="Cambria" w:hAnsi="Cambria"/>
+          <w:b/>
+          <w:sz w:val="22"/>
+          <w:szCs w:val="22"/>
+        </w:rPr>
+        <w:t xml:space="preserve"> = </w:t>
+      </w:r>
+      <w:r>
+        <w:rPr>
+          <w:rFonts w:ascii="Cambria" w:hAnsi="Cambria"/>
+          <w:b/>
+          <w:sz w:val="22"/>
+          <w:szCs w:val="22"/>
+        </w:rPr>
         <w:t>{{</w:t>
       </w:r>
-      <w:proofErr w:type="spellStart"/>
-      <w:proofErr w:type="gramStart"/>
       <w:r>
         <w:rPr>
           <w:rFonts w:ascii="Cambria" w:hAnsi="Cambria"/>
@@ -255,18 +239,7 @@
           <w:sz w:val="22"/>
           <w:szCs w:val="22"/>
         </w:rPr>
-        <w:t>conservancy</w:t>
-      </w:r>
-      <w:proofErr w:type="spellEnd"/>
-      <w:proofErr w:type="gramEnd"/>
-      <w:r>
-        <w:rPr>
-          <w:rFonts w:ascii="Cambria" w:hAnsi="Cambria"/>
-          <w:b/>
-          <w:sz w:val="22"/>
-          <w:szCs w:val="22"/>
-        </w:rPr>
-        <w:t>}}</w:t>
+        <w:t>total_rhino_black}}</w:t>
       </w:r>
       <w:r>
         <w:rPr>
@@ -275,7 +248,16 @@
           <w:sz w:val="22"/>
           <w:szCs w:val="22"/>
         </w:rPr>
-        <w:t>: Black</w:t>
+        <w:t>;</w:t>
+      </w:r>
+      <w:r>
+        <w:rPr>
+          <w:rFonts w:ascii="Cambria" w:hAnsi="Cambria"/>
+          <w:b/>
+          <w:sz w:val="22"/>
+          <w:szCs w:val="22"/>
+        </w:rPr>
+        <w:t xml:space="preserve"> White</w:t>
       </w:r>
       <w:r>
         <w:rPr>
@@ -295,7 +277,6 @@
         </w:rPr>
         <w:t>{{</w:t>
       </w:r>
-      <w:proofErr w:type="spellStart"/>
       <w:r>
         <w:rPr>
           <w:rFonts w:ascii="Cambria" w:hAnsi="Cambria"/>
@@ -312,74 +293,8 @@
           <w:sz w:val="22"/>
           <w:szCs w:val="22"/>
         </w:rPr>
-        <w:t>total_rhino_black</w:t>
-      </w:r>
-      <w:proofErr w:type="spellEnd"/>
-      <w:r>
-        <w:rPr>
-          <w:rFonts w:ascii="Cambria" w:hAnsi="Cambria"/>
-          <w:b/>
-          <w:sz w:val="22"/>
-          <w:szCs w:val="22"/>
-        </w:rPr>
-        <w:t>}}</w:t>
-      </w:r>
-      <w:r>
-        <w:rPr>
-          <w:rFonts w:ascii="Cambria" w:hAnsi="Cambria"/>
-          <w:b/>
-          <w:sz w:val="22"/>
-          <w:szCs w:val="22"/>
-        </w:rPr>
-        <w:t>;</w:t>
-      </w:r>
-      <w:r>
-        <w:rPr>
-          <w:rFonts w:ascii="Cambria" w:hAnsi="Cambria"/>
-          <w:b/>
-          <w:sz w:val="22"/>
-          <w:szCs w:val="22"/>
-        </w:rPr>
-        <w:t xml:space="preserve"> White</w:t>
-      </w:r>
-      <w:r>
-        <w:rPr>
-          <w:rFonts w:ascii="Cambria" w:hAnsi="Cambria"/>
-          <w:b/>
-          <w:sz w:val="22"/>
-          <w:szCs w:val="22"/>
-        </w:rPr>
-        <w:t xml:space="preserve"> = </w:t>
-      </w:r>
-      <w:r>
-        <w:rPr>
-          <w:rFonts w:ascii="Cambria" w:hAnsi="Cambria"/>
-          <w:b/>
-          <w:sz w:val="22"/>
-          <w:szCs w:val="22"/>
-        </w:rPr>
-        <w:t>{{</w:t>
-      </w:r>
-      <w:proofErr w:type="spellStart"/>
-      <w:r>
-        <w:rPr>
-          <w:rFonts w:ascii="Cambria" w:hAnsi="Cambria"/>
-          <w:b/>
-          <w:sz w:val="22"/>
-          <w:szCs w:val="22"/>
-        </w:rPr>
-        <w:t>ws.</w:t>
-      </w:r>
-      <w:r>
-        <w:rPr>
-          <w:rFonts w:ascii="Cambria" w:hAnsi="Cambria"/>
-          <w:b/>
-          <w:sz w:val="22"/>
-          <w:szCs w:val="22"/>
-        </w:rPr>
         <w:t>total_rhino_white</w:t>
       </w:r>
-      <w:proofErr w:type="spellEnd"/>
       <w:r>
         <w:rPr>
           <w:rFonts w:ascii="Cambria" w:hAnsi="Cambria"/>
@@ -463,51 +378,7 @@
                 <w:sz w:val="22"/>
                 <w:szCs w:val="22"/>
               </w:rPr>
-              <w:t>{%</w:t>
-            </w:r>
-            <w:proofErr w:type="spellStart"/>
-            <w:r>
-              <w:rPr>
-                <w:rFonts w:ascii="Cambria" w:hAnsi="Cambria"/>
-                <w:b w:val="0"/>
-                <w:color w:val="000000"/>
-                <w:sz w:val="22"/>
-                <w:szCs w:val="22"/>
-              </w:rPr>
-              <w:t>tr</w:t>
-            </w:r>
-            <w:proofErr w:type="spellEnd"/>
-            <w:r>
-              <w:rPr>
-                <w:rFonts w:ascii="Cambria" w:hAnsi="Cambria"/>
-                <w:b w:val="0"/>
-                <w:color w:val="000000"/>
-                <w:sz w:val="22"/>
-                <w:szCs w:val="22"/>
-              </w:rPr>
-              <w:t xml:space="preserve"> for item in </w:t>
-            </w:r>
-            <w:proofErr w:type="spellStart"/>
-            <w:r>
-              <w:rPr>
-                <w:rFonts w:ascii="Cambria" w:hAnsi="Cambria"/>
-                <w:b w:val="0"/>
-                <w:color w:val="000000"/>
-                <w:sz w:val="22"/>
-                <w:szCs w:val="22"/>
-              </w:rPr>
-              <w:t>ws.rhino_sightings</w:t>
-            </w:r>
-            <w:proofErr w:type="spellEnd"/>
-            <w:r>
-              <w:rPr>
-                <w:rFonts w:ascii="Cambria" w:hAnsi="Cambria"/>
-                <w:b w:val="0"/>
-                <w:color w:val="000000"/>
-                <w:sz w:val="22"/>
-                <w:szCs w:val="22"/>
-              </w:rPr>
-              <w:t xml:space="preserve"> %}</w:t>
+              <w:t>{%tr for item in ws.rhino_sightings %}</w:t>
             </w:r>
           </w:p>
         </w:tc>
@@ -563,29 +434,7 @@
                 <w:sz w:val="22"/>
                 <w:szCs w:val="22"/>
               </w:rPr>
-              <w:t>{{</w:t>
-            </w:r>
-            <w:proofErr w:type="spellStart"/>
-            <w:r>
-              <w:rPr>
-                <w:rFonts w:ascii="Cambria" w:hAnsi="Cambria"/>
-                <w:b w:val="0"/>
-                <w:color w:val="000000"/>
-                <w:sz w:val="22"/>
-                <w:szCs w:val="22"/>
-              </w:rPr>
-              <w:t>item.type</w:t>
-            </w:r>
-            <w:proofErr w:type="spellEnd"/>
-            <w:r>
-              <w:rPr>
-                <w:rFonts w:ascii="Cambria" w:hAnsi="Cambria"/>
-                <w:b w:val="0"/>
-                <w:color w:val="000000"/>
-                <w:sz w:val="22"/>
-                <w:szCs w:val="22"/>
-              </w:rPr>
-              <w:t>}}</w:t>
+              <w:t>{{item.type}}</w:t>
             </w:r>
           </w:p>
         </w:tc>
@@ -616,27 +465,7 @@
                 <w:sz w:val="22"/>
                 <w:szCs w:val="22"/>
               </w:rPr>
-              <w:t>{{</w:t>
-            </w:r>
-            <w:proofErr w:type="spellStart"/>
-            <w:r>
-              <w:rPr>
-                <w:rFonts w:ascii="Cambria" w:hAnsi="Cambria"/>
-                <w:color w:val="000000"/>
-                <w:sz w:val="22"/>
-                <w:szCs w:val="22"/>
-              </w:rPr>
-              <w:t>item.count</w:t>
-            </w:r>
-            <w:proofErr w:type="spellEnd"/>
-            <w:r>
-              <w:rPr>
-                <w:rFonts w:ascii="Cambria" w:hAnsi="Cambria"/>
-                <w:color w:val="000000"/>
-                <w:sz w:val="22"/>
-                <w:szCs w:val="22"/>
-              </w:rPr>
-              <w:t>}}</w:t>
+              <w:t>{{item.count}}</w:t>
             </w:r>
           </w:p>
         </w:tc>
@@ -673,9 +502,8 @@
                 <w:sz w:val="22"/>
                 <w:szCs w:val="22"/>
               </w:rPr>
-              <w:t>{%</w:t>
+              <w:t>{%tr end</w:t>
             </w:r>
-            <w:proofErr w:type="spellStart"/>
             <w:r>
               <w:rPr>
                 <w:rFonts w:ascii="Cambria" w:hAnsi="Cambria"/>
@@ -684,50 +512,7 @@
                 <w:sz w:val="22"/>
                 <w:szCs w:val="22"/>
               </w:rPr>
-              <w:t>tr</w:t>
-            </w:r>
-            <w:proofErr w:type="spellEnd"/>
-            <w:r>
-              <w:rPr>
-                <w:rFonts w:ascii="Cambria" w:hAnsi="Cambria"/>
-                <w:b w:val="0"/>
-                <w:color w:val="000000"/>
-                <w:sz w:val="22"/>
-                <w:szCs w:val="22"/>
-              </w:rPr>
-              <w:t xml:space="preserve"> </w:t>
-            </w:r>
-            <w:proofErr w:type="spellStart"/>
-            <w:r>
-              <w:rPr>
-                <w:rFonts w:ascii="Cambria" w:hAnsi="Cambria"/>
-                <w:b w:val="0"/>
-                <w:color w:val="000000"/>
-                <w:sz w:val="22"/>
-                <w:szCs w:val="22"/>
-              </w:rPr>
-              <w:t>end</w:t>
-            </w:r>
-            <w:r>
-              <w:rPr>
-                <w:rFonts w:ascii="Cambria" w:hAnsi="Cambria"/>
-                <w:b w:val="0"/>
-                <w:color w:val="000000"/>
-                <w:sz w:val="22"/>
-                <w:szCs w:val="22"/>
-              </w:rPr>
-              <w:t>for</w:t>
-            </w:r>
-            <w:proofErr w:type="spellEnd"/>
-            <w:r>
-              <w:rPr>
-                <w:rFonts w:ascii="Cambria" w:hAnsi="Cambria"/>
-                <w:b w:val="0"/>
-                <w:color w:val="000000"/>
-                <w:sz w:val="22"/>
-                <w:szCs w:val="22"/>
-              </w:rPr>
-              <w:t xml:space="preserve"> %}</w:t>
+              <w:t>for %}</w:t>
             </w:r>
           </w:p>
         </w:tc>
@@ -814,29 +599,7 @@
                 <w:sz w:val="22"/>
                 <w:szCs w:val="22"/>
               </w:rPr>
-              <w:t>{{</w:t>
-            </w:r>
-            <w:proofErr w:type="spellStart"/>
-            <w:r>
-              <w:rPr>
-                <w:rFonts w:ascii="Cambria" w:hAnsi="Cambria"/>
-                <w:b/>
-                <w:color w:val="000000"/>
-                <w:sz w:val="22"/>
-                <w:szCs w:val="22"/>
-              </w:rPr>
-              <w:t>ws.total_sightings</w:t>
-            </w:r>
-            <w:proofErr w:type="spellEnd"/>
-            <w:r>
-              <w:rPr>
-                <w:rFonts w:ascii="Cambria" w:hAnsi="Cambria"/>
-                <w:b/>
-                <w:color w:val="000000"/>
-                <w:sz w:val="22"/>
-                <w:szCs w:val="22"/>
-              </w:rPr>
-              <w:t>}}</w:t>
+              <w:t>{{ws.total_sightings}}</w:t>
             </w:r>
           </w:p>
         </w:tc>
@@ -860,10 +623,11 @@
           <w:sz w:val="22"/>
           <w:szCs w:val="22"/>
         </w:rPr>
-        <w:t xml:space="preserve">{% </w:t>
+        <w:t>{% endfor %}</w:t>
       </w:r>
-      <w:proofErr w:type="spellStart"/>
-      <w:r>
+    </w:p>
+    <w:p>
+      <w:pPr>
         <w:rPr>
           <w:rFonts w:ascii="Cambria" w:hAnsi="Cambria"/>
           <w:bCs w:val="0"/>
@@ -871,9 +635,7 @@
           <w:sz w:val="22"/>
           <w:szCs w:val="22"/>
         </w:rPr>
-        <w:t>endfor</w:t>
-      </w:r>
-      <w:proofErr w:type="spellEnd"/>
+      </w:pPr>
       <w:r>
         <w:rPr>
           <w:rFonts w:ascii="Cambria" w:hAnsi="Cambria"/>
@@ -882,7 +644,51 @@
           <w:sz w:val="22"/>
           <w:szCs w:val="22"/>
         </w:rPr>
-        <w:t xml:space="preserve"> %}</w:t>
+        <w:t>{% else %}</w:t>
+      </w:r>
+    </w:p>
+    <w:p>
+      <w:pPr>
+        <w:rPr>
+          <w:rFonts w:ascii="Cambria" w:hAnsi="Cambria"/>
+          <w:bCs w:val="0"/>
+          <w:color w:val="000000"/>
+          <w:sz w:val="22"/>
+          <w:szCs w:val="22"/>
+        </w:rPr>
+      </w:pPr>
+      <w:r>
+        <w:rPr>
+          <w:rFonts w:ascii="Cambria" w:hAnsi="Cambria"/>
+          <w:bCs w:val="0"/>
+          <w:color w:val="000000"/>
+          <w:sz w:val="22"/>
+          <w:szCs w:val="22"/>
+        </w:rPr>
+        <w:t>No rhino sighting recorded.</w:t>
+      </w:r>
+      <w:bookmarkStart w:id="0" w:name="_GoBack"/>
+      <w:bookmarkEnd w:id="0"/>
+    </w:p>
+    <w:p>
+      <w:pPr>
+        <w:rPr>
+          <w:rFonts w:ascii="Cambria" w:hAnsi="Cambria"/>
+          <w:bCs w:val="0"/>
+          <w:color w:val="000000"/>
+          <w:sz w:val="22"/>
+          <w:szCs w:val="22"/>
+        </w:rPr>
+      </w:pPr>
+      <w:r>
+        <w:rPr>
+          <w:rFonts w:ascii="Cambria" w:hAnsi="Cambria"/>
+          <w:bCs w:val="0"/>
+          <w:color w:val="000000"/>
+          <w:sz w:val="22"/>
+          <w:szCs w:val="22"/>
+        </w:rPr>
+        <w:t>{% endif %}</w:t>
       </w:r>
     </w:p>
     <w:p>
@@ -1050,51 +856,7 @@
                 <w:sz w:val="22"/>
                 <w:szCs w:val="22"/>
               </w:rPr>
-              <w:t>{%</w:t>
-            </w:r>
-            <w:proofErr w:type="spellStart"/>
-            <w:r>
-              <w:rPr>
-                <w:rFonts w:ascii="Cambria" w:hAnsi="Cambria"/>
-                <w:b w:val="0"/>
-                <w:color w:val="000000"/>
-                <w:sz w:val="22"/>
-                <w:szCs w:val="22"/>
-              </w:rPr>
-              <w:t>tr</w:t>
-            </w:r>
-            <w:proofErr w:type="spellEnd"/>
-            <w:r>
-              <w:rPr>
-                <w:rFonts w:ascii="Cambria" w:hAnsi="Cambria"/>
-                <w:b w:val="0"/>
-                <w:color w:val="000000"/>
-                <w:sz w:val="22"/>
-                <w:szCs w:val="22"/>
-              </w:rPr>
-              <w:t xml:space="preserve"> for item in </w:t>
-            </w:r>
-            <w:proofErr w:type="spellStart"/>
-            <w:r>
-              <w:rPr>
-                <w:rFonts w:ascii="Cambria" w:hAnsi="Cambria"/>
-                <w:b w:val="0"/>
-                <w:color w:val="000000"/>
-                <w:sz w:val="22"/>
-                <w:szCs w:val="22"/>
-              </w:rPr>
-              <w:t>rhino_missing</w:t>
-            </w:r>
-            <w:proofErr w:type="spellEnd"/>
-            <w:r>
-              <w:rPr>
-                <w:rFonts w:ascii="Cambria" w:hAnsi="Cambria"/>
-                <w:b w:val="0"/>
-                <w:color w:val="000000"/>
-                <w:sz w:val="22"/>
-                <w:szCs w:val="22"/>
-              </w:rPr>
-              <w:t xml:space="preserve"> %}</w:t>
+              <w:t>{%tr for item in rhino_missing %}</w:t>
             </w:r>
           </w:p>
         </w:tc>
@@ -1185,29 +947,7 @@
                 <w:sz w:val="22"/>
                 <w:szCs w:val="22"/>
               </w:rPr>
-              <w:t>{{</w:t>
-            </w:r>
-            <w:proofErr w:type="spellStart"/>
-            <w:r>
-              <w:rPr>
-                <w:rFonts w:ascii="Cambria" w:hAnsi="Cambria"/>
-                <w:bCs w:val="0"/>
-                <w:color w:val="000000"/>
-                <w:sz w:val="22"/>
-                <w:szCs w:val="22"/>
-              </w:rPr>
-              <w:t>item.value</w:t>
-            </w:r>
-            <w:proofErr w:type="spellEnd"/>
-            <w:r>
-              <w:rPr>
-                <w:rFonts w:ascii="Cambria" w:hAnsi="Cambria"/>
-                <w:bCs w:val="0"/>
-                <w:color w:val="000000"/>
-                <w:sz w:val="22"/>
-                <w:szCs w:val="22"/>
-              </w:rPr>
-              <w:t>}} days</w:t>
+              <w:t>{{item.value}} days</w:t>
             </w:r>
           </w:p>
         </w:tc>
@@ -1244,51 +984,8 @@
                 <w:sz w:val="22"/>
                 <w:szCs w:val="22"/>
               </w:rPr>
-              <w:t>{%</w:t>
-            </w:r>
-            <w:proofErr w:type="spellStart"/>
-            <w:r>
-              <w:rPr>
-                <w:rFonts w:ascii="Cambria" w:hAnsi="Cambria"/>
-                <w:b w:val="0"/>
-                <w:color w:val="000000"/>
-                <w:sz w:val="22"/>
-                <w:szCs w:val="22"/>
-              </w:rPr>
-              <w:t>tr</w:t>
-            </w:r>
-            <w:proofErr w:type="spellEnd"/>
-            <w:r>
-              <w:rPr>
-                <w:rFonts w:ascii="Cambria" w:hAnsi="Cambria"/>
-                <w:b w:val="0"/>
-                <w:color w:val="000000"/>
-                <w:sz w:val="22"/>
-                <w:szCs w:val="22"/>
-              </w:rPr>
-              <w:t xml:space="preserve"> </w:t>
-            </w:r>
-            <w:proofErr w:type="spellStart"/>
-            <w:r>
-              <w:rPr>
-                <w:rFonts w:ascii="Cambria" w:hAnsi="Cambria"/>
-                <w:b w:val="0"/>
-                <w:color w:val="000000"/>
-                <w:sz w:val="22"/>
-                <w:szCs w:val="22"/>
-              </w:rPr>
-              <w:t>endfor</w:t>
-            </w:r>
-            <w:proofErr w:type="spellEnd"/>
-            <w:r>
-              <w:rPr>
-                <w:rFonts w:ascii="Cambria" w:hAnsi="Cambria"/>
-                <w:b w:val="0"/>
-                <w:color w:val="000000"/>
-                <w:sz w:val="22"/>
-                <w:szCs w:val="22"/>
-              </w:rPr>
-              <w:t xml:space="preserve"> %}</w:t>
+              <w:lastRenderedPageBreak/>
+              <w:t>{%tr endfor %}</w:t>
             </w:r>
           </w:p>
         </w:tc>
@@ -1474,51 +1171,7 @@
           <w:sz w:val="22"/>
           <w:szCs w:val="22"/>
         </w:rPr>
-        <w:t xml:space="preserve">% for </w:t>
-      </w:r>
-      <w:proofErr w:type="spellStart"/>
-      <w:r>
-        <w:rPr>
-          <w:rFonts w:ascii="Cambria" w:hAnsi="Cambria"/>
-          <w:b/>
-          <w:color w:val="000000"/>
-          <w:sz w:val="22"/>
-          <w:szCs w:val="22"/>
-        </w:rPr>
-        <w:t>os</w:t>
-      </w:r>
-      <w:proofErr w:type="spellEnd"/>
-      <w:r>
-        <w:rPr>
-          <w:rFonts w:ascii="Cambria" w:hAnsi="Cambria"/>
-          <w:b/>
-          <w:color w:val="000000"/>
-          <w:sz w:val="22"/>
-          <w:szCs w:val="22"/>
-        </w:rPr>
-        <w:t xml:space="preserve"> in </w:t>
-      </w:r>
-      <w:proofErr w:type="spellStart"/>
-      <w:r>
-        <w:rPr>
-          <w:rFonts w:ascii="Cambria" w:hAnsi="Cambria"/>
-          <w:b/>
-          <w:color w:val="000000"/>
-          <w:sz w:val="22"/>
-          <w:szCs w:val="22"/>
-        </w:rPr>
-        <w:t>other_sightings</w:t>
-      </w:r>
-      <w:proofErr w:type="spellEnd"/>
-      <w:r>
-        <w:rPr>
-          <w:rFonts w:ascii="Cambria" w:hAnsi="Cambria"/>
-          <w:b/>
-          <w:color w:val="000000"/>
-          <w:sz w:val="22"/>
-          <w:szCs w:val="22"/>
-        </w:rPr>
-        <w:t xml:space="preserve"> %}</w:t>
+        <w:t>% for os in other_sightings %}</w:t>
       </w:r>
     </w:p>
     <w:p>
@@ -1557,55 +1210,7 @@
           <w:sz w:val="22"/>
           <w:szCs w:val="22"/>
         </w:rPr>
-        <w:t xml:space="preserve">ightings on </w:t>
-      </w:r>
-      <w:proofErr w:type="gramStart"/>
-      <w:r>
-        <w:rPr>
-          <w:rFonts w:ascii="Cambria" w:hAnsi="Cambria"/>
-          <w:b/>
-          <w:bCs w:val="0"/>
-          <w:color w:val="000000"/>
-          <w:sz w:val="22"/>
-          <w:szCs w:val="22"/>
-        </w:rPr>
-        <w:t xml:space="preserve">{{ </w:t>
-      </w:r>
-      <w:proofErr w:type="spellStart"/>
-      <w:r>
-        <w:rPr>
-          <w:rFonts w:ascii="Cambria" w:hAnsi="Cambria"/>
-          <w:b/>
-          <w:bCs w:val="0"/>
-          <w:color w:val="000000"/>
-          <w:sz w:val="22"/>
-          <w:szCs w:val="22"/>
-        </w:rPr>
-        <w:t>os</w:t>
-      </w:r>
-      <w:proofErr w:type="gramEnd"/>
-      <w:r>
-        <w:rPr>
-          <w:rFonts w:ascii="Cambria" w:hAnsi="Cambria"/>
-          <w:b/>
-          <w:bCs w:val="0"/>
-          <w:color w:val="000000"/>
-          <w:sz w:val="22"/>
-          <w:szCs w:val="22"/>
-        </w:rPr>
-        <w:t>.conservancy</w:t>
-      </w:r>
-      <w:proofErr w:type="spellEnd"/>
-      <w:r>
-        <w:rPr>
-          <w:rFonts w:ascii="Cambria" w:hAnsi="Cambria"/>
-          <w:b/>
-          <w:bCs w:val="0"/>
-          <w:color w:val="000000"/>
-          <w:sz w:val="22"/>
-          <w:szCs w:val="22"/>
-        </w:rPr>
-        <w:t xml:space="preserve"> }</w:t>
+        <w:t>ightings on {{ os.conservancy }</w:t>
       </w:r>
       <w:r>
         <w:rPr>
@@ -1665,7 +1270,6 @@
                 <w:sz w:val="22"/>
                 <w:szCs w:val="22"/>
               </w:rPr>
-              <w:lastRenderedPageBreak/>
               <w:t>Species</w:t>
             </w:r>
           </w:p>
@@ -1730,7 +1334,6 @@
               </w:rPr>
               <w:t>{%</w:t>
             </w:r>
-            <w:proofErr w:type="spellStart"/>
             <w:r>
               <w:rPr>
                 <w:rFonts w:ascii="Cambria" w:hAnsi="Cambria"/>
@@ -1739,40 +1342,7 @@
                 <w:sz w:val="22"/>
                 <w:szCs w:val="22"/>
               </w:rPr>
-              <w:t>tr</w:t>
-            </w:r>
-            <w:proofErr w:type="spellEnd"/>
-            <w:r>
-              <w:rPr>
-                <w:rFonts w:ascii="Cambria" w:hAnsi="Cambria"/>
-                <w:b w:val="0"/>
-                <w:color w:val="000000"/>
-                <w:sz w:val="22"/>
-                <w:szCs w:val="22"/>
-              </w:rPr>
-              <w:t xml:space="preserve"> for item in </w:t>
-            </w:r>
-            <w:proofErr w:type="spellStart"/>
-            <w:r>
-              <w:rPr>
-                <w:rFonts w:ascii="Cambria" w:hAnsi="Cambria"/>
-                <w:b w:val="0"/>
-                <w:color w:val="000000"/>
-                <w:sz w:val="22"/>
-                <w:szCs w:val="22"/>
-              </w:rPr>
-              <w:t>os.sightings</w:t>
-            </w:r>
-            <w:proofErr w:type="spellEnd"/>
-            <w:r>
-              <w:rPr>
-                <w:rFonts w:ascii="Cambria" w:hAnsi="Cambria"/>
-                <w:b w:val="0"/>
-                <w:color w:val="000000"/>
-                <w:sz w:val="22"/>
-                <w:szCs w:val="22"/>
-              </w:rPr>
-              <w:t xml:space="preserve"> </w:t>
+              <w:t xml:space="preserve">tr for item in os.sightings </w:t>
             </w:r>
             <w:r>
               <w:rPr>
@@ -1848,29 +1418,7 @@
                 <w:sz w:val="22"/>
                 <w:szCs w:val="22"/>
               </w:rPr>
-              <w:t xml:space="preserve">{{ </w:t>
-            </w:r>
-            <w:proofErr w:type="spellStart"/>
-            <w:r>
-              <w:rPr>
-                <w:rFonts w:ascii="Cambria" w:hAnsi="Cambria"/>
-                <w:b w:val="0"/>
-                <w:color w:val="000000"/>
-                <w:sz w:val="22"/>
-                <w:szCs w:val="22"/>
-              </w:rPr>
-              <w:t>item.species</w:t>
-            </w:r>
-            <w:proofErr w:type="spellEnd"/>
-            <w:r>
-              <w:rPr>
-                <w:rFonts w:ascii="Cambria" w:hAnsi="Cambria"/>
-                <w:b w:val="0"/>
-                <w:color w:val="000000"/>
-                <w:sz w:val="22"/>
-                <w:szCs w:val="22"/>
-              </w:rPr>
-              <w:t>}}</w:t>
+              <w:t>{{ item.species}}</w:t>
             </w:r>
           </w:p>
         </w:tc>
@@ -1903,29 +1451,7 @@
                 <w:sz w:val="22"/>
                 <w:szCs w:val="22"/>
               </w:rPr>
-              <w:t>{{</w:t>
-            </w:r>
-            <w:proofErr w:type="spellStart"/>
-            <w:r>
-              <w:rPr>
-                <w:rFonts w:ascii="Cambria" w:hAnsi="Cambria"/>
-                <w:bCs w:val="0"/>
-                <w:color w:val="000000"/>
-                <w:sz w:val="22"/>
-                <w:szCs w:val="22"/>
-              </w:rPr>
-              <w:t>item.count</w:t>
-            </w:r>
-            <w:proofErr w:type="spellEnd"/>
-            <w:r>
-              <w:rPr>
-                <w:rFonts w:ascii="Cambria" w:hAnsi="Cambria"/>
-                <w:bCs w:val="0"/>
-                <w:color w:val="000000"/>
-                <w:sz w:val="22"/>
-                <w:szCs w:val="22"/>
-              </w:rPr>
-              <w:t>}}</w:t>
+              <w:t>{{item.count}}</w:t>
             </w:r>
           </w:p>
         </w:tc>
@@ -1964,7 +1490,6 @@
               </w:rPr>
               <w:t>{%</w:t>
             </w:r>
-            <w:proofErr w:type="spellStart"/>
             <w:r>
               <w:rPr>
                 <w:rFonts w:ascii="Cambria" w:hAnsi="Cambria"/>
@@ -1973,40 +1498,7 @@
                 <w:sz w:val="22"/>
                 <w:szCs w:val="22"/>
               </w:rPr>
-              <w:t>tr</w:t>
-            </w:r>
-            <w:proofErr w:type="spellEnd"/>
-            <w:r>
-              <w:rPr>
-                <w:rFonts w:ascii="Cambria" w:hAnsi="Cambria"/>
-                <w:b w:val="0"/>
-                <w:color w:val="000000"/>
-                <w:sz w:val="22"/>
-                <w:szCs w:val="22"/>
-              </w:rPr>
-              <w:t xml:space="preserve"> </w:t>
-            </w:r>
-            <w:proofErr w:type="spellStart"/>
-            <w:r>
-              <w:rPr>
-                <w:rFonts w:ascii="Cambria" w:hAnsi="Cambria"/>
-                <w:b w:val="0"/>
-                <w:color w:val="000000"/>
-                <w:sz w:val="22"/>
-                <w:szCs w:val="22"/>
-              </w:rPr>
-              <w:t>endfor</w:t>
-            </w:r>
-            <w:proofErr w:type="spellEnd"/>
-            <w:r>
-              <w:rPr>
-                <w:rFonts w:ascii="Cambria" w:hAnsi="Cambria"/>
-                <w:b w:val="0"/>
-                <w:color w:val="000000"/>
-                <w:sz w:val="22"/>
-                <w:szCs w:val="22"/>
-              </w:rPr>
-              <w:t xml:space="preserve"> %}</w:t>
+              <w:t>tr endfor %}</w:t>
             </w:r>
           </w:p>
         </w:tc>
@@ -2089,41 +1581,7 @@
           <w:sz w:val="22"/>
           <w:szCs w:val="22"/>
         </w:rPr>
-        <w:t>ted = {{</w:t>
-      </w:r>
-      <w:proofErr w:type="spellStart"/>
-      <w:proofErr w:type="gramStart"/>
-      <w:r>
-        <w:rPr>
-          <w:rFonts w:ascii="Cambria" w:hAnsi="Cambria"/>
-          <w:b/>
-          <w:color w:val="000000"/>
-          <w:sz w:val="22"/>
-          <w:szCs w:val="22"/>
-        </w:rPr>
-        <w:t>os.total</w:t>
-      </w:r>
-      <w:proofErr w:type="gramEnd"/>
-      <w:r>
-        <w:rPr>
-          <w:rFonts w:ascii="Cambria" w:hAnsi="Cambria"/>
-          <w:b/>
-          <w:color w:val="000000"/>
-          <w:sz w:val="22"/>
-          <w:szCs w:val="22"/>
-        </w:rPr>
-        <w:t>_sightings</w:t>
-      </w:r>
-      <w:proofErr w:type="spellEnd"/>
-      <w:r>
-        <w:rPr>
-          <w:rFonts w:ascii="Cambria" w:hAnsi="Cambria"/>
-          <w:b/>
-          <w:color w:val="000000"/>
-          <w:sz w:val="22"/>
-          <w:szCs w:val="22"/>
-        </w:rPr>
-        <w:t>}} reported.</w:t>
+        <w:t>ted = {{os.total_sightings}} reported.</w:t>
       </w:r>
     </w:p>
     <w:p>
@@ -2165,29 +1623,7 @@
           <w:sz w:val="22"/>
           <w:szCs w:val="22"/>
         </w:rPr>
-        <w:t xml:space="preserve">{% </w:t>
-      </w:r>
-      <w:proofErr w:type="spellStart"/>
-      <w:r>
-        <w:rPr>
-          <w:rFonts w:ascii="Cambria" w:hAnsi="Cambria"/>
-          <w:b/>
-          <w:color w:val="000000"/>
-          <w:sz w:val="22"/>
-          <w:szCs w:val="22"/>
-        </w:rPr>
-        <w:t>endfor</w:t>
-      </w:r>
-      <w:proofErr w:type="spellEnd"/>
-      <w:r>
-        <w:rPr>
-          <w:rFonts w:ascii="Cambria" w:hAnsi="Cambria"/>
-          <w:b/>
-          <w:color w:val="000000"/>
-          <w:sz w:val="22"/>
-          <w:szCs w:val="22"/>
-        </w:rPr>
-        <w:t xml:space="preserve"> %}</w:t>
+        <w:t>{% endfor %}</w:t>
       </w:r>
     </w:p>
     <w:p>
@@ -2485,51 +1921,7 @@
                 <w:sz w:val="22"/>
                 <w:szCs w:val="22"/>
               </w:rPr>
-              <w:t>{%</w:t>
-            </w:r>
-            <w:proofErr w:type="spellStart"/>
-            <w:r>
-              <w:rPr>
-                <w:rFonts w:ascii="Cambria" w:hAnsi="Cambria"/>
-                <w:b w:val="0"/>
-                <w:color w:val="000000"/>
-                <w:sz w:val="22"/>
-                <w:szCs w:val="22"/>
-              </w:rPr>
-              <w:t>tr</w:t>
-            </w:r>
-            <w:proofErr w:type="spellEnd"/>
-            <w:r>
-              <w:rPr>
-                <w:rFonts w:ascii="Cambria" w:hAnsi="Cambria"/>
-                <w:b w:val="0"/>
-                <w:color w:val="000000"/>
-                <w:sz w:val="22"/>
-                <w:szCs w:val="22"/>
-              </w:rPr>
-              <w:t xml:space="preserve"> for item in </w:t>
-            </w:r>
-            <w:proofErr w:type="spellStart"/>
-            <w:r>
-              <w:rPr>
-                <w:rFonts w:ascii="Cambria" w:hAnsi="Cambria"/>
-                <w:b w:val="0"/>
-                <w:color w:val="000000"/>
-                <w:sz w:val="22"/>
-                <w:szCs w:val="22"/>
-              </w:rPr>
-              <w:t>gap_counts</w:t>
-            </w:r>
-            <w:proofErr w:type="spellEnd"/>
-            <w:r>
-              <w:rPr>
-                <w:rFonts w:ascii="Cambria" w:hAnsi="Cambria"/>
-                <w:b w:val="0"/>
-                <w:color w:val="000000"/>
-                <w:sz w:val="22"/>
-                <w:szCs w:val="22"/>
-              </w:rPr>
-              <w:t xml:space="preserve"> %}</w:t>
+              <w:t>{%tr for item in gap_counts %}</w:t>
             </w:r>
           </w:p>
         </w:tc>
@@ -2633,29 +2025,7 @@
                 <w:sz w:val="22"/>
                 <w:szCs w:val="22"/>
               </w:rPr>
-              <w:t>{{</w:t>
-            </w:r>
-            <w:proofErr w:type="spellStart"/>
-            <w:r>
-              <w:rPr>
-                <w:rFonts w:ascii="Cambria" w:hAnsi="Cambria"/>
-                <w:b w:val="0"/>
-                <w:color w:val="000000"/>
-                <w:sz w:val="22"/>
-                <w:szCs w:val="22"/>
-              </w:rPr>
-              <w:t>item.gap_name</w:t>
-            </w:r>
-            <w:proofErr w:type="spellEnd"/>
-            <w:r>
-              <w:rPr>
-                <w:rFonts w:ascii="Cambria" w:hAnsi="Cambria"/>
-                <w:b w:val="0"/>
-                <w:color w:val="000000"/>
-                <w:sz w:val="22"/>
-                <w:szCs w:val="22"/>
-              </w:rPr>
-              <w:t>}}</w:t>
+              <w:t>{{item.gap_name}}</w:t>
             </w:r>
           </w:p>
         </w:tc>
@@ -2688,29 +2058,7 @@
                 <w:sz w:val="22"/>
                 <w:szCs w:val="22"/>
               </w:rPr>
-              <w:t>{{</w:t>
-            </w:r>
-            <w:proofErr w:type="spellStart"/>
-            <w:r>
-              <w:rPr>
-                <w:rFonts w:ascii="Cambria" w:hAnsi="Cambria"/>
-                <w:bCs w:val="0"/>
-                <w:color w:val="000000"/>
-                <w:sz w:val="22"/>
-                <w:szCs w:val="22"/>
-              </w:rPr>
-              <w:t>item.species</w:t>
-            </w:r>
-            <w:proofErr w:type="spellEnd"/>
-            <w:r>
-              <w:rPr>
-                <w:rFonts w:ascii="Cambria" w:hAnsi="Cambria"/>
-                <w:bCs w:val="0"/>
-                <w:color w:val="000000"/>
-                <w:sz w:val="22"/>
-                <w:szCs w:val="22"/>
-              </w:rPr>
-              <w:t>}}</w:t>
+              <w:t>{{item.species}}</w:t>
             </w:r>
           </w:p>
         </w:tc>
@@ -2743,29 +2091,7 @@
                 <w:sz w:val="22"/>
                 <w:szCs w:val="22"/>
               </w:rPr>
-              <w:t>{{</w:t>
-            </w:r>
-            <w:proofErr w:type="spellStart"/>
-            <w:r>
-              <w:rPr>
-                <w:rFonts w:ascii="Cambria" w:hAnsi="Cambria"/>
-                <w:bCs w:val="0"/>
-                <w:color w:val="000000"/>
-                <w:sz w:val="22"/>
-                <w:szCs w:val="22"/>
-              </w:rPr>
-              <w:t>item.total_in</w:t>
-            </w:r>
-            <w:proofErr w:type="spellEnd"/>
-            <w:r>
-              <w:rPr>
-                <w:rFonts w:ascii="Cambria" w:hAnsi="Cambria"/>
-                <w:bCs w:val="0"/>
-                <w:color w:val="000000"/>
-                <w:sz w:val="22"/>
-                <w:szCs w:val="22"/>
-              </w:rPr>
-              <w:t>}}</w:t>
+              <w:t>{{item.total_in}}</w:t>
             </w:r>
           </w:p>
         </w:tc>
@@ -2798,29 +2124,7 @@
                 <w:sz w:val="22"/>
                 <w:szCs w:val="22"/>
               </w:rPr>
-              <w:t>{{</w:t>
-            </w:r>
-            <w:proofErr w:type="spellStart"/>
-            <w:r>
-              <w:rPr>
-                <w:rFonts w:ascii="Cambria" w:hAnsi="Cambria"/>
-                <w:bCs w:val="0"/>
-                <w:color w:val="000000"/>
-                <w:sz w:val="22"/>
-                <w:szCs w:val="22"/>
-              </w:rPr>
-              <w:t>item.total_out</w:t>
-            </w:r>
-            <w:proofErr w:type="spellEnd"/>
-            <w:r>
-              <w:rPr>
-                <w:rFonts w:ascii="Cambria" w:hAnsi="Cambria"/>
-                <w:bCs w:val="0"/>
-                <w:color w:val="000000"/>
-                <w:sz w:val="22"/>
-                <w:szCs w:val="22"/>
-              </w:rPr>
-              <w:t>}}</w:t>
+              <w:t>{{item.total_out}}</w:t>
             </w:r>
           </w:p>
         </w:tc>
@@ -2857,51 +2161,7 @@
                 <w:sz w:val="22"/>
                 <w:szCs w:val="22"/>
               </w:rPr>
-              <w:t>{%</w:t>
-            </w:r>
-            <w:proofErr w:type="spellStart"/>
-            <w:r>
-              <w:rPr>
-                <w:rFonts w:ascii="Cambria" w:hAnsi="Cambria"/>
-                <w:b w:val="0"/>
-                <w:color w:val="000000"/>
-                <w:sz w:val="22"/>
-                <w:szCs w:val="22"/>
-              </w:rPr>
-              <w:t>tr</w:t>
-            </w:r>
-            <w:proofErr w:type="spellEnd"/>
-            <w:r>
-              <w:rPr>
-                <w:rFonts w:ascii="Cambria" w:hAnsi="Cambria"/>
-                <w:b w:val="0"/>
-                <w:color w:val="000000"/>
-                <w:sz w:val="22"/>
-                <w:szCs w:val="22"/>
-              </w:rPr>
-              <w:t xml:space="preserve"> </w:t>
-            </w:r>
-            <w:proofErr w:type="spellStart"/>
-            <w:r>
-              <w:rPr>
-                <w:rFonts w:ascii="Cambria" w:hAnsi="Cambria"/>
-                <w:b w:val="0"/>
-                <w:color w:val="000000"/>
-                <w:sz w:val="22"/>
-                <w:szCs w:val="22"/>
-              </w:rPr>
-              <w:t>endfor</w:t>
-            </w:r>
-            <w:proofErr w:type="spellEnd"/>
-            <w:r>
-              <w:rPr>
-                <w:rFonts w:ascii="Cambria" w:hAnsi="Cambria"/>
-                <w:b w:val="0"/>
-                <w:color w:val="000000"/>
-                <w:sz w:val="22"/>
-                <w:szCs w:val="22"/>
-              </w:rPr>
-              <w:t xml:space="preserve"> %}</w:t>
+              <w:t>{%tr endfor %}</w:t>
             </w:r>
           </w:p>
         </w:tc>
@@ -3469,10 +2729,9 @@
           <w:sz w:val="22"/>
           <w:szCs w:val="22"/>
         </w:rPr>
+        <w:lastRenderedPageBreak/>
         <w:t>{{</w:t>
       </w:r>
-      <w:proofErr w:type="spellStart"/>
-      <w:proofErr w:type="gramStart"/>
       <w:r>
         <w:rPr>
           <w:rFonts w:ascii="Cambria" w:hAnsi="Cambria"/>
@@ -3481,20 +2740,8 @@
           <w:sz w:val="22"/>
           <w:szCs w:val="22"/>
         </w:rPr>
-        <w:t>item.conservancy</w:t>
+        <w:t>item.conservancy_name</w:t>
       </w:r>
-      <w:proofErr w:type="gramEnd"/>
-      <w:r>
-        <w:rPr>
-          <w:rFonts w:ascii="Cambria" w:hAnsi="Cambria"/>
-          <w:bCs w:val="0"/>
-          <w:color w:val="000000"/>
-          <w:sz w:val="22"/>
-          <w:szCs w:val="22"/>
-        </w:rPr>
-        <w:t>_name</w:t>
-      </w:r>
-      <w:proofErr w:type="spellEnd"/>
       <w:r>
         <w:rPr>
           <w:rFonts w:ascii="Cambria" w:hAnsi="Cambria"/>
@@ -3583,7 +2830,6 @@
         </w:rPr>
         <w:t xml:space="preserve"> </w:t>
       </w:r>
-      <w:proofErr w:type="spellStart"/>
       <w:r>
         <w:rPr>
           <w:rFonts w:ascii="Cambria" w:hAnsi="Cambria"/>
@@ -3592,18 +2838,7 @@
           <w:sz w:val="22"/>
           <w:szCs w:val="22"/>
         </w:rPr>
-        <w:t>endfor</w:t>
-      </w:r>
-      <w:proofErr w:type="spellEnd"/>
-      <w:r>
-        <w:rPr>
-          <w:rFonts w:ascii="Cambria" w:hAnsi="Cambria"/>
-          <w:bCs w:val="0"/>
-          <w:color w:val="000000"/>
-          <w:sz w:val="22"/>
-          <w:szCs w:val="22"/>
-        </w:rPr>
-        <w:t>%}</w:t>
+        <w:t>endfor%}</w:t>
       </w:r>
     </w:p>
     <w:p>
@@ -3662,7 +2897,6 @@
           <w:sz w:val="22"/>
           <w:szCs w:val="22"/>
         </w:rPr>
-        <w:lastRenderedPageBreak/>
         <w:t>Internal issues/deployments:</w:t>
       </w:r>
     </w:p>
@@ -3945,18 +3179,8 @@
                 <w:sz w:val="22"/>
                 <w:szCs w:val="22"/>
               </w:rPr>
-              <w:t xml:space="preserve">Logistics </w:t>
+              <w:t>Logistics Feeback</w:t>
             </w:r>
-            <w:proofErr w:type="spellStart"/>
-            <w:r>
-              <w:rPr>
-                <w:rFonts w:ascii="Calibri" w:hAnsi="Calibri"/>
-                <w:sz w:val="22"/>
-                <w:szCs w:val="22"/>
-              </w:rPr>
-              <w:t>Feeback</w:t>
-            </w:r>
-            <w:proofErr w:type="spellEnd"/>
           </w:p>
         </w:tc>
       </w:tr>
@@ -4487,15 +3711,7 @@
       <w:pStyle w:val="Footer"/>
     </w:pPr>
     <w:r>
-      <w:t>{{</w:t>
-    </w:r>
-    <w:proofErr w:type="spellStart"/>
-    <w:r>
-      <w:t>footer_text</w:t>
-    </w:r>
-    <w:proofErr w:type="spellEnd"/>
-    <w:r>
-      <w:t>}}</w:t>
+      <w:t>{{footer_text}}</w:t>
     </w:r>
   </w:p>
 </w:ftr>
@@ -4786,7 +4002,7 @@
         <v:path o:extrusionok="f" gradientshapeok="t" o:connecttype="rect"/>
         <o:lock v:ext="edit" aspectratio="t"/>
       </v:shapetype>
-      <v:shape id="_x0000_i1049" type="#_x0000_t75" style="width:10.95pt;height:10.95pt" o:bullet="t">
+      <v:shape id="_x0000_i1055" type="#_x0000_t75" style="width:10.95pt;height:10.95pt" o:bullet="t">
         <v:imagedata r:id="rId1" o:title="mso53BE"/>
       </v:shape>
     </w:pict>
@@ -4794,7 +4010,7 @@
   <w:abstractNum w:abstractNumId="0">
     <w:nsid w:val="FFFFFF1D"/>
     <w:multiLevelType w:val="multilevel"/>
-    <w:tmpl w:val="0484BE58"/>
+    <w:tmpl w:val="676AC244"/>
     <w:lvl w:ilvl="0">
       <w:start w:val="1"/>
       <w:numFmt w:val="bullet"/>
@@ -11754,7 +10970,7 @@
 </file>
 
 <file path=customXml/itemProps3.xml><?xml version="1.0" encoding="utf-8"?>
-<ds:datastoreItem xmlns:ds="http://schemas.openxmlformats.org/officeDocument/2006/customXml" ds:itemID="{E5F9BB47-E994-7646-A1E8-AD974CBC7554}">
+<ds:datastoreItem xmlns:ds="http://schemas.openxmlformats.org/officeDocument/2006/customXml" ds:itemID="{B8AB452C-C425-274A-9D1A-02FA8F4DD4A9}">
   <ds:schemaRefs>
     <ds:schemaRef ds:uri="http://schemas.openxmlformats.org/officeDocument/2006/bibliography"/>
   </ds:schemaRefs>

</xml_diff>

<commit_message>
Several portions of sit-rep report complete.
</commit_message>
<xml_diff>
--- a/das/reports/docx_template/lewa_sitrep_template.docx
+++ b/das/reports/docx_template/lewa_sitrep_template.docx
@@ -28,7 +28,10 @@
         <w:t xml:space="preserve"> </w:t>
       </w:r>
       <w:r>
-        <w:t>{{report_date}}</w:t>
+        <w:t>{{report_time</w:t>
+      </w:r>
+      <w:r>
+        <w:t>}}</w:t>
       </w:r>
     </w:p>
     <w:p>
@@ -349,6 +352,7 @@
       <w:tr>
         <w:trPr>
           <w:cnfStyle w:val="000000100000" w:firstRow="0" w:lastRow="0" w:firstColumn="0" w:lastColumn="0" w:oddVBand="0" w:evenVBand="0" w:oddHBand="1" w:evenHBand="0" w:firstRowFirstColumn="0" w:firstRowLastColumn="0" w:lastRowFirstColumn="0" w:lastRowLastColumn="0"/>
+          <w:trHeight w:val="296"/>
         </w:trPr>
         <w:tc>
           <w:tcPr>
@@ -649,6 +653,11 @@
     </w:p>
     <w:p>
       <w:pPr>
+        <w:pStyle w:val="ListParagraph"/>
+        <w:numPr>
+          <w:ilvl w:val="0"/>
+          <w:numId w:val="50"/>
+        </w:numPr>
         <w:rPr>
           <w:rFonts w:ascii="Cambria" w:hAnsi="Cambria"/>
           <w:bCs w:val="0"/>
@@ -665,10 +674,18 @@
           <w:sz w:val="22"/>
           <w:szCs w:val="22"/>
         </w:rPr>
-        <w:t>No rhino sighting recorded.</w:t>
+        <w:t>No rhino sighting re</w:t>
       </w:r>
-      <w:bookmarkStart w:id="0" w:name="_GoBack"/>
-      <w:bookmarkEnd w:id="0"/>
+      <w:r>
+        <w:rPr>
+          <w:rFonts w:ascii="Cambria" w:hAnsi="Cambria"/>
+          <w:bCs w:val="0"/>
+          <w:color w:val="000000"/>
+          <w:sz w:val="22"/>
+          <w:szCs w:val="22"/>
+        </w:rPr>
+        <w:t>ported.</w:t>
+      </w:r>
     </w:p>
     <w:p>
       <w:pPr>
@@ -718,6 +735,7 @@
       <w:pPr>
         <w:rPr>
           <w:rFonts w:ascii="Cambria" w:hAnsi="Cambria"/>
+          <w:b/>
           <w:bCs w:val="0"/>
           <w:color w:val="000000"/>
           <w:sz w:val="22"/>
@@ -727,12 +745,474 @@
       <w:r>
         <w:rPr>
           <w:rFonts w:ascii="Cambria" w:hAnsi="Cambria"/>
+          <w:b/>
           <w:bCs w:val="0"/>
           <w:color w:val="000000"/>
           <w:sz w:val="22"/>
           <w:szCs w:val="22"/>
         </w:rPr>
-        <w:t># TODO:</w:t>
+        <w:t>{% if rhino_births %}</w:t>
+      </w:r>
+    </w:p>
+    <w:tbl>
+      <w:tblPr>
+        <w:tblStyle w:val="ListTable4-Accent6"/>
+        <w:tblW w:w="0" w:type="auto"/>
+        <w:tblLook w:val="04A0" w:firstRow="1" w:lastRow="0" w:firstColumn="1" w:lastColumn="0" w:noHBand="0" w:noVBand="1"/>
+      </w:tblPr>
+      <w:tblGrid>
+        <w:gridCol w:w="2065"/>
+        <w:gridCol w:w="1530"/>
+        <w:gridCol w:w="3780"/>
+        <w:gridCol w:w="1975"/>
+      </w:tblGrid>
+      <w:tr>
+        <w:trPr>
+          <w:cnfStyle w:val="100000000000" w:firstRow="1" w:lastRow="0" w:firstColumn="0" w:lastColumn="0" w:oddVBand="0" w:evenVBand="0" w:oddHBand="0" w:evenHBand="0" w:firstRowFirstColumn="0" w:firstRowLastColumn="0" w:lastRowFirstColumn="0" w:lastRowLastColumn="0"/>
+          <w:trHeight w:val="404"/>
+        </w:trPr>
+        <w:tc>
+          <w:tcPr>
+            <w:cnfStyle w:val="001000000000" w:firstRow="0" w:lastRow="0" w:firstColumn="1" w:lastColumn="0" w:oddVBand="0" w:evenVBand="0" w:oddHBand="0" w:evenHBand="0" w:firstRowFirstColumn="0" w:firstRowLastColumn="0" w:lastRowFirstColumn="0" w:lastRowLastColumn="0"/>
+            <w:tcW w:w="2065" w:type="dxa"/>
+          </w:tcPr>
+          <w:p>
+            <w:pPr>
+              <w:spacing w:after="0"/>
+              <w:jc w:val="left"/>
+              <w:rPr>
+                <w:rFonts w:ascii="Calibri" w:hAnsi="Calibri"/>
+                <w:sz w:val="22"/>
+                <w:szCs w:val="22"/>
+              </w:rPr>
+            </w:pPr>
+            <w:r>
+              <w:rPr>
+                <w:rFonts w:ascii="Calibri" w:hAnsi="Calibri"/>
+                <w:sz w:val="22"/>
+                <w:szCs w:val="22"/>
+              </w:rPr>
+              <w:t>Conservancy</w:t>
+            </w:r>
+          </w:p>
+        </w:tc>
+        <w:tc>
+          <w:tcPr>
+            <w:tcW w:w="1530" w:type="dxa"/>
+          </w:tcPr>
+          <w:p>
+            <w:pPr>
+              <w:spacing w:after="0"/>
+              <w:jc w:val="left"/>
+              <w:cnfStyle w:val="100000000000" w:firstRow="1" w:lastRow="0" w:firstColumn="0" w:lastColumn="0" w:oddVBand="0" w:evenVBand="0" w:oddHBand="0" w:evenHBand="0" w:firstRowFirstColumn="0" w:firstRowLastColumn="0" w:lastRowFirstColumn="0" w:lastRowLastColumn="0"/>
+              <w:rPr>
+                <w:rFonts w:ascii="Calibri" w:hAnsi="Calibri"/>
+                <w:sz w:val="22"/>
+                <w:szCs w:val="22"/>
+              </w:rPr>
+            </w:pPr>
+            <w:r>
+              <w:rPr>
+                <w:rFonts w:ascii="Calibri" w:hAnsi="Calibri"/>
+                <w:sz w:val="22"/>
+                <w:szCs w:val="22"/>
+              </w:rPr>
+              <w:t>Color</w:t>
+            </w:r>
+          </w:p>
+        </w:tc>
+        <w:tc>
+          <w:tcPr>
+            <w:tcW w:w="3780" w:type="dxa"/>
+          </w:tcPr>
+          <w:p>
+            <w:pPr>
+              <w:spacing w:after="0"/>
+              <w:jc w:val="left"/>
+              <w:cnfStyle w:val="100000000000" w:firstRow="1" w:lastRow="0" w:firstColumn="0" w:lastColumn="0" w:oddVBand="0" w:evenVBand="0" w:oddHBand="0" w:evenHBand="0" w:firstRowFirstColumn="0" w:firstRowLastColumn="0" w:lastRowFirstColumn="0" w:lastRowLastColumn="0"/>
+              <w:rPr>
+                <w:rFonts w:ascii="Calibri" w:hAnsi="Calibri"/>
+                <w:sz w:val="22"/>
+                <w:szCs w:val="22"/>
+              </w:rPr>
+            </w:pPr>
+            <w:r>
+              <w:rPr>
+                <w:rFonts w:ascii="Calibri" w:hAnsi="Calibri"/>
+                <w:sz w:val="22"/>
+                <w:szCs w:val="22"/>
+              </w:rPr>
+              <w:t>Mother</w:t>
+            </w:r>
+          </w:p>
+        </w:tc>
+        <w:tc>
+          <w:tcPr>
+            <w:tcW w:w="1975" w:type="dxa"/>
+          </w:tcPr>
+          <w:p>
+            <w:pPr>
+              <w:spacing w:after="0"/>
+              <w:jc w:val="left"/>
+              <w:cnfStyle w:val="100000000000" w:firstRow="1" w:lastRow="0" w:firstColumn="0" w:lastColumn="0" w:oddVBand="0" w:evenVBand="0" w:oddHBand="0" w:evenHBand="0" w:firstRowFirstColumn="0" w:firstRowLastColumn="0" w:lastRowFirstColumn="0" w:lastRowLastColumn="0"/>
+              <w:rPr>
+                <w:rFonts w:ascii="Calibri" w:hAnsi="Calibri"/>
+                <w:sz w:val="22"/>
+                <w:szCs w:val="22"/>
+              </w:rPr>
+            </w:pPr>
+            <w:r>
+              <w:rPr>
+                <w:rFonts w:ascii="Calibri" w:hAnsi="Calibri"/>
+                <w:sz w:val="22"/>
+                <w:szCs w:val="22"/>
+              </w:rPr>
+              <w:t>Health</w:t>
+            </w:r>
+          </w:p>
+        </w:tc>
+      </w:tr>
+      <w:tr>
+        <w:trPr>
+          <w:cnfStyle w:val="000000100000" w:firstRow="0" w:lastRow="0" w:firstColumn="0" w:lastColumn="0" w:oddVBand="0" w:evenVBand="0" w:oddHBand="1" w:evenHBand="0" w:firstRowFirstColumn="0" w:firstRowLastColumn="0" w:lastRowFirstColumn="0" w:lastRowLastColumn="0"/>
+        </w:trPr>
+        <w:tc>
+          <w:tcPr>
+            <w:cnfStyle w:val="001000000000" w:firstRow="0" w:lastRow="0" w:firstColumn="1" w:lastColumn="0" w:oddVBand="0" w:evenVBand="0" w:oddHBand="0" w:evenHBand="0" w:firstRowFirstColumn="0" w:firstRowLastColumn="0" w:lastRowFirstColumn="0" w:lastRowLastColumn="0"/>
+            <w:tcW w:w="2065" w:type="dxa"/>
+          </w:tcPr>
+          <w:p>
+            <w:pPr>
+              <w:rPr>
+                <w:rFonts w:ascii="Cambria" w:hAnsi="Cambria"/>
+                <w:bCs/>
+                <w:color w:val="000000"/>
+                <w:sz w:val="22"/>
+                <w:szCs w:val="22"/>
+              </w:rPr>
+            </w:pPr>
+          </w:p>
+        </w:tc>
+        <w:tc>
+          <w:tcPr>
+            <w:tcW w:w="7285" w:type="dxa"/>
+            <w:gridSpan w:val="3"/>
+          </w:tcPr>
+          <w:p>
+            <w:pPr>
+              <w:cnfStyle w:val="000000100000" w:firstRow="0" w:lastRow="0" w:firstColumn="0" w:lastColumn="0" w:oddVBand="0" w:evenVBand="0" w:oddHBand="1" w:evenHBand="0" w:firstRowFirstColumn="0" w:firstRowLastColumn="0" w:lastRowFirstColumn="0" w:lastRowLastColumn="0"/>
+              <w:rPr>
+                <w:rFonts w:ascii="Cambria" w:hAnsi="Cambria"/>
+                <w:bCs w:val="0"/>
+                <w:color w:val="000000"/>
+                <w:sz w:val="22"/>
+                <w:szCs w:val="22"/>
+              </w:rPr>
+            </w:pPr>
+            <w:r>
+              <w:rPr>
+                <w:rFonts w:ascii="Cambria" w:hAnsi="Cambria"/>
+                <w:bCs w:val="0"/>
+                <w:color w:val="000000"/>
+                <w:sz w:val="22"/>
+                <w:szCs w:val="22"/>
+              </w:rPr>
+              <w:t>{%tr for item in rhino_births %}</w:t>
+            </w:r>
+          </w:p>
+        </w:tc>
+      </w:tr>
+      <w:tr>
+        <w:tc>
+          <w:tcPr>
+            <w:cnfStyle w:val="001000000000" w:firstRow="0" w:lastRow="0" w:firstColumn="1" w:lastColumn="0" w:oddVBand="0" w:evenVBand="0" w:oddHBand="0" w:evenHBand="0" w:firstRowFirstColumn="0" w:firstRowLastColumn="0" w:lastRowFirstColumn="0" w:lastRowLastColumn="0"/>
+            <w:tcW w:w="2065" w:type="dxa"/>
+          </w:tcPr>
+          <w:p>
+            <w:pPr>
+              <w:rPr>
+                <w:rFonts w:ascii="Cambria" w:hAnsi="Cambria"/>
+                <w:bCs/>
+                <w:color w:val="000000"/>
+                <w:sz w:val="22"/>
+                <w:szCs w:val="22"/>
+              </w:rPr>
+            </w:pPr>
+            <w:r>
+              <w:rPr>
+                <w:rFonts w:ascii="Cambria" w:hAnsi="Cambria"/>
+                <w:bCs/>
+                <w:color w:val="000000"/>
+                <w:sz w:val="22"/>
+                <w:szCs w:val="22"/>
+              </w:rPr>
+              <w:lastRenderedPageBreak/>
+              <w:t>{{ item.conservancy }}</w:t>
+            </w:r>
+          </w:p>
+        </w:tc>
+        <w:tc>
+          <w:tcPr>
+            <w:tcW w:w="1530" w:type="dxa"/>
+          </w:tcPr>
+          <w:p>
+            <w:pPr>
+              <w:cnfStyle w:val="000000000000" w:firstRow="0" w:lastRow="0" w:firstColumn="0" w:lastColumn="0" w:oddVBand="0" w:evenVBand="0" w:oddHBand="0" w:evenHBand="0" w:firstRowFirstColumn="0" w:firstRowLastColumn="0" w:lastRowFirstColumn="0" w:lastRowLastColumn="0"/>
+              <w:rPr>
+                <w:rFonts w:ascii="Cambria" w:hAnsi="Cambria"/>
+                <w:bCs w:val="0"/>
+                <w:color w:val="000000"/>
+                <w:sz w:val="22"/>
+                <w:szCs w:val="22"/>
+              </w:rPr>
+            </w:pPr>
+            <w:r>
+              <w:rPr>
+                <w:rFonts w:ascii="Cambria" w:hAnsi="Cambria"/>
+                <w:bCs w:val="0"/>
+                <w:color w:val="000000"/>
+                <w:sz w:val="22"/>
+                <w:szCs w:val="22"/>
+              </w:rPr>
+              <w:t>{{ item.color }}</w:t>
+            </w:r>
+          </w:p>
+        </w:tc>
+        <w:tc>
+          <w:tcPr>
+            <w:tcW w:w="3780" w:type="dxa"/>
+          </w:tcPr>
+          <w:p>
+            <w:pPr>
+              <w:cnfStyle w:val="000000000000" w:firstRow="0" w:lastRow="0" w:firstColumn="0" w:lastColumn="0" w:oddVBand="0" w:evenVBand="0" w:oddHBand="0" w:evenHBand="0" w:firstRowFirstColumn="0" w:firstRowLastColumn="0" w:lastRowFirstColumn="0" w:lastRowLastColumn="0"/>
+              <w:rPr>
+                <w:rFonts w:ascii="Cambria" w:hAnsi="Cambria"/>
+                <w:bCs w:val="0"/>
+                <w:color w:val="000000"/>
+                <w:sz w:val="22"/>
+                <w:szCs w:val="22"/>
+              </w:rPr>
+            </w:pPr>
+            <w:r>
+              <w:rPr>
+                <w:rFonts w:ascii="Cambria" w:hAnsi="Cambria"/>
+                <w:bCs w:val="0"/>
+                <w:color w:val="000000"/>
+                <w:sz w:val="22"/>
+                <w:szCs w:val="22"/>
+              </w:rPr>
+              <w:t>{{ item.mother }}</w:t>
+            </w:r>
+          </w:p>
+        </w:tc>
+        <w:tc>
+          <w:tcPr>
+            <w:tcW w:w="1975" w:type="dxa"/>
+          </w:tcPr>
+          <w:p>
+            <w:pPr>
+              <w:cnfStyle w:val="000000000000" w:firstRow="0" w:lastRow="0" w:firstColumn="0" w:lastColumn="0" w:oddVBand="0" w:evenVBand="0" w:oddHBand="0" w:evenHBand="0" w:firstRowFirstColumn="0" w:firstRowLastColumn="0" w:lastRowFirstColumn="0" w:lastRowLastColumn="0"/>
+              <w:rPr>
+                <w:rFonts w:ascii="Cambria" w:hAnsi="Cambria"/>
+                <w:bCs w:val="0"/>
+                <w:color w:val="000000"/>
+                <w:sz w:val="22"/>
+                <w:szCs w:val="22"/>
+              </w:rPr>
+            </w:pPr>
+            <w:r>
+              <w:rPr>
+                <w:rFonts w:ascii="Cambria" w:hAnsi="Cambria"/>
+                <w:bCs w:val="0"/>
+                <w:color w:val="000000"/>
+                <w:sz w:val="22"/>
+                <w:szCs w:val="22"/>
+              </w:rPr>
+              <w:t>{{ item.health</w:t>
+            </w:r>
+            <w:r>
+              <w:rPr>
+                <w:rFonts w:ascii="Cambria" w:hAnsi="Cambria"/>
+                <w:bCs w:val="0"/>
+                <w:color w:val="000000"/>
+                <w:sz w:val="22"/>
+                <w:szCs w:val="22"/>
+              </w:rPr>
+              <w:t xml:space="preserve"> }}</w:t>
+            </w:r>
+          </w:p>
+        </w:tc>
+      </w:tr>
+      <w:tr>
+        <w:trPr>
+          <w:cnfStyle w:val="000000100000" w:firstRow="0" w:lastRow="0" w:firstColumn="0" w:lastColumn="0" w:oddVBand="0" w:evenVBand="0" w:oddHBand="1" w:evenHBand="0" w:firstRowFirstColumn="0" w:firstRowLastColumn="0" w:lastRowFirstColumn="0" w:lastRowLastColumn="0"/>
+        </w:trPr>
+        <w:tc>
+          <w:tcPr>
+            <w:cnfStyle w:val="001000000000" w:firstRow="0" w:lastRow="0" w:firstColumn="1" w:lastColumn="0" w:oddVBand="0" w:evenVBand="0" w:oddHBand="0" w:evenHBand="0" w:firstRowFirstColumn="0" w:firstRowLastColumn="0" w:lastRowFirstColumn="0" w:lastRowLastColumn="0"/>
+            <w:tcW w:w="2065" w:type="dxa"/>
+          </w:tcPr>
+          <w:p>
+            <w:pPr>
+              <w:rPr>
+                <w:rFonts w:ascii="Cambria" w:hAnsi="Cambria"/>
+                <w:bCs/>
+                <w:color w:val="000000"/>
+                <w:sz w:val="22"/>
+                <w:szCs w:val="22"/>
+              </w:rPr>
+            </w:pPr>
+            <w:r>
+              <w:rPr>
+                <w:rFonts w:ascii="Cambria" w:hAnsi="Cambria"/>
+                <w:bCs/>
+                <w:color w:val="000000"/>
+                <w:sz w:val="22"/>
+                <w:szCs w:val="22"/>
+              </w:rPr>
+              <w:t>{%tr endfor %}</w:t>
+            </w:r>
+          </w:p>
+        </w:tc>
+        <w:tc>
+          <w:tcPr>
+            <w:tcW w:w="1530" w:type="dxa"/>
+          </w:tcPr>
+          <w:p>
+            <w:pPr>
+              <w:cnfStyle w:val="000000100000" w:firstRow="0" w:lastRow="0" w:firstColumn="0" w:lastColumn="0" w:oddVBand="0" w:evenVBand="0" w:oddHBand="1" w:evenHBand="0" w:firstRowFirstColumn="0" w:firstRowLastColumn="0" w:lastRowFirstColumn="0" w:lastRowLastColumn="0"/>
+              <w:rPr>
+                <w:rFonts w:ascii="Cambria" w:hAnsi="Cambria"/>
+                <w:bCs w:val="0"/>
+                <w:color w:val="000000"/>
+                <w:sz w:val="22"/>
+                <w:szCs w:val="22"/>
+              </w:rPr>
+            </w:pPr>
+          </w:p>
+        </w:tc>
+        <w:tc>
+          <w:tcPr>
+            <w:tcW w:w="3780" w:type="dxa"/>
+          </w:tcPr>
+          <w:p>
+            <w:pPr>
+              <w:cnfStyle w:val="000000100000" w:firstRow="0" w:lastRow="0" w:firstColumn="0" w:lastColumn="0" w:oddVBand="0" w:evenVBand="0" w:oddHBand="1" w:evenHBand="0" w:firstRowFirstColumn="0" w:firstRowLastColumn="0" w:lastRowFirstColumn="0" w:lastRowLastColumn="0"/>
+              <w:rPr>
+                <w:rFonts w:ascii="Cambria" w:hAnsi="Cambria"/>
+                <w:bCs w:val="0"/>
+                <w:color w:val="000000"/>
+                <w:sz w:val="22"/>
+                <w:szCs w:val="22"/>
+              </w:rPr>
+            </w:pPr>
+          </w:p>
+        </w:tc>
+        <w:tc>
+          <w:tcPr>
+            <w:tcW w:w="1975" w:type="dxa"/>
+          </w:tcPr>
+          <w:p>
+            <w:pPr>
+              <w:cnfStyle w:val="000000100000" w:firstRow="0" w:lastRow="0" w:firstColumn="0" w:lastColumn="0" w:oddVBand="0" w:evenVBand="0" w:oddHBand="1" w:evenHBand="0" w:firstRowFirstColumn="0" w:firstRowLastColumn="0" w:lastRowFirstColumn="0" w:lastRowLastColumn="0"/>
+              <w:rPr>
+                <w:rFonts w:ascii="Cambria" w:hAnsi="Cambria"/>
+                <w:bCs w:val="0"/>
+                <w:color w:val="000000"/>
+                <w:sz w:val="22"/>
+                <w:szCs w:val="22"/>
+              </w:rPr>
+            </w:pPr>
+          </w:p>
+        </w:tc>
+      </w:tr>
+    </w:tbl>
+    <w:p>
+      <w:pPr>
+        <w:rPr>
+          <w:rFonts w:ascii="Cambria" w:hAnsi="Cambria"/>
+          <w:bCs w:val="0"/>
+          <w:color w:val="000000"/>
+          <w:sz w:val="22"/>
+          <w:szCs w:val="22"/>
+        </w:rPr>
+      </w:pPr>
+      <w:r>
+        <w:rPr>
+          <w:rFonts w:ascii="Cambria" w:hAnsi="Cambria"/>
+          <w:bCs w:val="0"/>
+          <w:color w:val="000000"/>
+          <w:sz w:val="22"/>
+          <w:szCs w:val="22"/>
+        </w:rPr>
+        <w:t>{% else %}</w:t>
+      </w:r>
+    </w:p>
+    <w:p>
+      <w:pPr>
+        <w:pStyle w:val="ListParagraph"/>
+        <w:numPr>
+          <w:ilvl w:val="0"/>
+          <w:numId w:val="49"/>
+        </w:numPr>
+        <w:rPr>
+          <w:rFonts w:ascii="Cambria" w:hAnsi="Cambria"/>
+          <w:bCs w:val="0"/>
+          <w:color w:val="000000"/>
+          <w:sz w:val="22"/>
+          <w:szCs w:val="22"/>
+        </w:rPr>
+      </w:pPr>
+      <w:r>
+        <w:rPr>
+          <w:rFonts w:ascii="Cambria" w:hAnsi="Cambria"/>
+          <w:bCs w:val="0"/>
+          <w:color w:val="000000"/>
+          <w:sz w:val="22"/>
+          <w:szCs w:val="22"/>
+        </w:rPr>
+        <w:t>No rhino births reported.</w:t>
+      </w:r>
+    </w:p>
+    <w:p>
+      <w:pPr>
+        <w:rPr>
+          <w:rFonts w:ascii="Cambria" w:hAnsi="Cambria"/>
+          <w:bCs w:val="0"/>
+          <w:color w:val="000000"/>
+          <w:sz w:val="22"/>
+          <w:szCs w:val="22"/>
+        </w:rPr>
+      </w:pPr>
+      <w:r>
+        <w:rPr>
+          <w:rFonts w:ascii="Cambria" w:hAnsi="Cambria"/>
+          <w:bCs w:val="0"/>
+          <w:color w:val="000000"/>
+          <w:sz w:val="22"/>
+          <w:szCs w:val="22"/>
+        </w:rPr>
+        <w:t>{% endif</w:t>
+      </w:r>
+      <w:r>
+        <w:rPr>
+          <w:rFonts w:ascii="Cambria" w:hAnsi="Cambria"/>
+          <w:bCs w:val="0"/>
+          <w:color w:val="000000"/>
+          <w:sz w:val="22"/>
+          <w:szCs w:val="22"/>
+        </w:rPr>
+        <w:t xml:space="preserve"> %</w:t>
+      </w:r>
+      <w:r>
+        <w:rPr>
+          <w:rFonts w:ascii="Cambria" w:hAnsi="Cambria"/>
+          <w:bCs w:val="0"/>
+          <w:color w:val="000000"/>
+          <w:sz w:val="22"/>
+          <w:szCs w:val="22"/>
+        </w:rPr>
+        <w:t>}</w:t>
       </w:r>
     </w:p>
     <w:p>
@@ -984,7 +1464,6 @@
                 <w:sz w:val="22"/>
                 <w:szCs w:val="22"/>
               </w:rPr>
-              <w:lastRenderedPageBreak/>
               <w:t>{%tr endfor %}</w:t>
             </w:r>
           </w:p>
@@ -1084,6 +1563,666 @@
     </w:p>
     <w:p>
       <w:pPr>
+        <w:rPr>
+          <w:rFonts w:ascii="Cambria" w:hAnsi="Cambria"/>
+          <w:b/>
+          <w:bCs w:val="0"/>
+          <w:color w:val="000000"/>
+          <w:sz w:val="22"/>
+          <w:szCs w:val="22"/>
+        </w:rPr>
+      </w:pPr>
+      <w:r>
+        <w:rPr>
+          <w:rFonts w:ascii="Cambria" w:hAnsi="Cambria"/>
+          <w:b/>
+          <w:bCs w:val="0"/>
+          <w:color w:val="000000"/>
+          <w:sz w:val="22"/>
+          <w:szCs w:val="22"/>
+        </w:rPr>
+        <w:t>{% if rhino_</w:t>
+      </w:r>
+      <w:r>
+        <w:rPr>
+          <w:rFonts w:ascii="Cambria" w:hAnsi="Cambria"/>
+          <w:b/>
+          <w:bCs w:val="0"/>
+          <w:color w:val="000000"/>
+          <w:sz w:val="22"/>
+          <w:szCs w:val="22"/>
+        </w:rPr>
+        <w:t>territorial_movement</w:t>
+      </w:r>
+      <w:r>
+        <w:rPr>
+          <w:rFonts w:ascii="Cambria" w:hAnsi="Cambria"/>
+          <w:b/>
+          <w:bCs w:val="0"/>
+          <w:color w:val="000000"/>
+          <w:sz w:val="22"/>
+          <w:szCs w:val="22"/>
+        </w:rPr>
+        <w:t xml:space="preserve"> %}</w:t>
+      </w:r>
+    </w:p>
+    <w:tbl>
+      <w:tblPr>
+        <w:tblStyle w:val="ListTable4-Accent6"/>
+        <w:tblW w:w="0" w:type="auto"/>
+        <w:tblLook w:val="04A0" w:firstRow="1" w:lastRow="0" w:firstColumn="1" w:lastColumn="0" w:noHBand="0" w:noVBand="1"/>
+      </w:tblPr>
+      <w:tblGrid>
+        <w:gridCol w:w="1997"/>
+        <w:gridCol w:w="1169"/>
+        <w:gridCol w:w="1771"/>
+        <w:gridCol w:w="1295"/>
+        <w:gridCol w:w="1763"/>
+        <w:gridCol w:w="1355"/>
+      </w:tblGrid>
+      <w:tr>
+        <w:trPr>
+          <w:cnfStyle w:val="100000000000" w:firstRow="1" w:lastRow="0" w:firstColumn="0" w:lastColumn="0" w:oddVBand="0" w:evenVBand="0" w:oddHBand="0" w:evenHBand="0" w:firstRowFirstColumn="0" w:firstRowLastColumn="0" w:lastRowFirstColumn="0" w:lastRowLastColumn="0"/>
+          <w:trHeight w:val="404"/>
+        </w:trPr>
+        <w:tc>
+          <w:tcPr>
+            <w:cnfStyle w:val="001000000000" w:firstRow="0" w:lastRow="0" w:firstColumn="1" w:lastColumn="0" w:oddVBand="0" w:evenVBand="0" w:oddHBand="0" w:evenHBand="0" w:firstRowFirstColumn="0" w:firstRowLastColumn="0" w:lastRowFirstColumn="0" w:lastRowLastColumn="0"/>
+            <w:tcW w:w="1997" w:type="dxa"/>
+          </w:tcPr>
+          <w:p>
+            <w:pPr>
+              <w:spacing w:after="0"/>
+              <w:jc w:val="left"/>
+              <w:rPr>
+                <w:rFonts w:ascii="Calibri" w:hAnsi="Calibri"/>
+                <w:sz w:val="22"/>
+                <w:szCs w:val="22"/>
+              </w:rPr>
+            </w:pPr>
+            <w:r>
+              <w:rPr>
+                <w:rFonts w:ascii="Calibri" w:hAnsi="Calibri"/>
+                <w:sz w:val="22"/>
+                <w:szCs w:val="22"/>
+              </w:rPr>
+              <w:t>Conservancy</w:t>
+            </w:r>
+          </w:p>
+        </w:tc>
+        <w:tc>
+          <w:tcPr>
+            <w:tcW w:w="1169" w:type="dxa"/>
+          </w:tcPr>
+          <w:p>
+            <w:pPr>
+              <w:spacing w:after="0"/>
+              <w:jc w:val="left"/>
+              <w:cnfStyle w:val="100000000000" w:firstRow="1" w:lastRow="0" w:firstColumn="0" w:lastColumn="0" w:oddVBand="0" w:evenVBand="0" w:oddHBand="0" w:evenHBand="0" w:firstRowFirstColumn="0" w:firstRowLastColumn="0" w:lastRowFirstColumn="0" w:lastRowLastColumn="0"/>
+              <w:rPr>
+                <w:rFonts w:ascii="Calibri" w:hAnsi="Calibri"/>
+                <w:sz w:val="22"/>
+                <w:szCs w:val="22"/>
+              </w:rPr>
+            </w:pPr>
+            <w:r>
+              <w:rPr>
+                <w:rFonts w:ascii="Calibri" w:hAnsi="Calibri"/>
+                <w:sz w:val="22"/>
+                <w:szCs w:val="22"/>
+              </w:rPr>
+              <w:t>Color</w:t>
+            </w:r>
+          </w:p>
+        </w:tc>
+        <w:tc>
+          <w:tcPr>
+            <w:tcW w:w="1877" w:type="dxa"/>
+          </w:tcPr>
+          <w:p>
+            <w:pPr>
+              <w:spacing w:after="0"/>
+              <w:jc w:val="left"/>
+              <w:cnfStyle w:val="100000000000" w:firstRow="1" w:lastRow="0" w:firstColumn="0" w:lastColumn="0" w:oddVBand="0" w:evenVBand="0" w:oddHBand="0" w:evenHBand="0" w:firstRowFirstColumn="0" w:firstRowLastColumn="0" w:lastRowFirstColumn="0" w:lastRowLastColumn="0"/>
+              <w:rPr>
+                <w:rFonts w:ascii="Calibri" w:hAnsi="Calibri"/>
+                <w:sz w:val="22"/>
+                <w:szCs w:val="22"/>
+              </w:rPr>
+            </w:pPr>
+            <w:r>
+              <w:rPr>
+                <w:rFonts w:ascii="Calibri" w:hAnsi="Calibri"/>
+                <w:sz w:val="22"/>
+                <w:szCs w:val="22"/>
+              </w:rPr>
+              <w:t>Station</w:t>
+            </w:r>
+          </w:p>
+        </w:tc>
+        <w:tc>
+          <w:tcPr>
+            <w:tcW w:w="1112" w:type="dxa"/>
+          </w:tcPr>
+          <w:p>
+            <w:pPr>
+              <w:spacing w:after="0"/>
+              <w:jc w:val="left"/>
+              <w:cnfStyle w:val="100000000000" w:firstRow="1" w:lastRow="0" w:firstColumn="0" w:lastColumn="0" w:oddVBand="0" w:evenVBand="0" w:oddHBand="0" w:evenHBand="0" w:firstRowFirstColumn="0" w:firstRowLastColumn="0" w:lastRowFirstColumn="0" w:lastRowLastColumn="0"/>
+              <w:rPr>
+                <w:rFonts w:ascii="Calibri" w:hAnsi="Calibri"/>
+                <w:sz w:val="22"/>
+                <w:szCs w:val="22"/>
+              </w:rPr>
+            </w:pPr>
+            <w:r>
+              <w:rPr>
+                <w:rFonts w:ascii="Calibri" w:hAnsi="Calibri"/>
+                <w:sz w:val="22"/>
+                <w:szCs w:val="22"/>
+              </w:rPr>
+              <w:t>Rhinos</w:t>
+            </w:r>
+          </w:p>
+        </w:tc>
+        <w:tc>
+          <w:tcPr>
+            <w:tcW w:w="1821" w:type="dxa"/>
+          </w:tcPr>
+          <w:p>
+            <w:pPr>
+              <w:spacing w:after="0"/>
+              <w:jc w:val="left"/>
+              <w:cnfStyle w:val="100000000000" w:firstRow="1" w:lastRow="0" w:firstColumn="0" w:lastColumn="0" w:oddVBand="0" w:evenVBand="0" w:oddHBand="0" w:evenHBand="0" w:firstRowFirstColumn="0" w:firstRowLastColumn="0" w:lastRowFirstColumn="0" w:lastRowLastColumn="0"/>
+              <w:rPr>
+                <w:rFonts w:ascii="Calibri" w:hAnsi="Calibri"/>
+                <w:sz w:val="22"/>
+                <w:szCs w:val="22"/>
+              </w:rPr>
+            </w:pPr>
+            <w:r>
+              <w:rPr>
+                <w:rFonts w:ascii="Calibri" w:hAnsi="Calibri"/>
+                <w:sz w:val="22"/>
+                <w:szCs w:val="22"/>
+              </w:rPr>
+              <w:t>Behavior</w:t>
+            </w:r>
+          </w:p>
+        </w:tc>
+        <w:tc>
+          <w:tcPr>
+            <w:tcW w:w="1374" w:type="dxa"/>
+          </w:tcPr>
+          <w:p>
+            <w:pPr>
+              <w:spacing w:after="0"/>
+              <w:jc w:val="left"/>
+              <w:cnfStyle w:val="100000000000" w:firstRow="1" w:lastRow="0" w:firstColumn="0" w:lastColumn="0" w:oddVBand="0" w:evenVBand="0" w:oddHBand="0" w:evenHBand="0" w:firstRowFirstColumn="0" w:firstRowLastColumn="0" w:lastRowFirstColumn="0" w:lastRowLastColumn="0"/>
+              <w:rPr>
+                <w:rFonts w:ascii="Calibri" w:hAnsi="Calibri"/>
+                <w:sz w:val="22"/>
+                <w:szCs w:val="22"/>
+              </w:rPr>
+            </w:pPr>
+            <w:r>
+              <w:rPr>
+                <w:rFonts w:ascii="Calibri" w:hAnsi="Calibri"/>
+                <w:sz w:val="22"/>
+                <w:szCs w:val="22"/>
+              </w:rPr>
+              <w:t>Health</w:t>
+            </w:r>
+          </w:p>
+        </w:tc>
+      </w:tr>
+      <w:tr>
+        <w:trPr>
+          <w:cnfStyle w:val="000000100000" w:firstRow="0" w:lastRow="0" w:firstColumn="0" w:lastColumn="0" w:oddVBand="0" w:evenVBand="0" w:oddHBand="1" w:evenHBand="0" w:firstRowFirstColumn="0" w:firstRowLastColumn="0" w:lastRowFirstColumn="0" w:lastRowLastColumn="0"/>
+        </w:trPr>
+        <w:tc>
+          <w:tcPr>
+            <w:cnfStyle w:val="001000000000" w:firstRow="0" w:lastRow="0" w:firstColumn="1" w:lastColumn="0" w:oddVBand="0" w:evenVBand="0" w:oddHBand="0" w:evenHBand="0" w:firstRowFirstColumn="0" w:firstRowLastColumn="0" w:lastRowFirstColumn="0" w:lastRowLastColumn="0"/>
+            <w:tcW w:w="9350" w:type="dxa"/>
+            <w:gridSpan w:val="6"/>
+          </w:tcPr>
+          <w:p>
+            <w:pPr>
+              <w:jc w:val="left"/>
+              <w:rPr>
+                <w:rFonts w:ascii="Cambria" w:hAnsi="Cambria"/>
+                <w:bCs/>
+                <w:color w:val="000000"/>
+                <w:sz w:val="22"/>
+                <w:szCs w:val="22"/>
+              </w:rPr>
+            </w:pPr>
+            <w:r>
+              <w:rPr>
+                <w:rFonts w:ascii="Cambria" w:hAnsi="Cambria"/>
+                <w:bCs/>
+                <w:color w:val="000000"/>
+                <w:sz w:val="22"/>
+                <w:szCs w:val="22"/>
+              </w:rPr>
+              <w:t xml:space="preserve">{%tr for item in </w:t>
+            </w:r>
+            <w:r>
+              <w:rPr>
+                <w:rFonts w:ascii="Cambria" w:hAnsi="Cambria"/>
+                <w:bCs/>
+                <w:color w:val="000000"/>
+                <w:sz w:val="22"/>
+                <w:szCs w:val="22"/>
+              </w:rPr>
+              <w:t>rhino_territorial_movement</w:t>
+            </w:r>
+            <w:r>
+              <w:rPr>
+                <w:rFonts w:ascii="Cambria" w:hAnsi="Cambria"/>
+                <w:bCs/>
+                <w:color w:val="000000"/>
+                <w:sz w:val="22"/>
+                <w:szCs w:val="22"/>
+              </w:rPr>
+              <w:t xml:space="preserve"> %}</w:t>
+            </w:r>
+          </w:p>
+        </w:tc>
+      </w:tr>
+      <w:tr>
+        <w:tc>
+          <w:tcPr>
+            <w:cnfStyle w:val="001000000000" w:firstRow="0" w:lastRow="0" w:firstColumn="1" w:lastColumn="0" w:oddVBand="0" w:evenVBand="0" w:oddHBand="0" w:evenHBand="0" w:firstRowFirstColumn="0" w:firstRowLastColumn="0" w:lastRowFirstColumn="0" w:lastRowLastColumn="0"/>
+            <w:tcW w:w="1997" w:type="dxa"/>
+          </w:tcPr>
+          <w:p>
+            <w:pPr>
+              <w:rPr>
+                <w:rFonts w:ascii="Cambria" w:hAnsi="Cambria"/>
+                <w:bCs/>
+                <w:color w:val="000000"/>
+                <w:sz w:val="22"/>
+                <w:szCs w:val="22"/>
+              </w:rPr>
+            </w:pPr>
+            <w:r>
+              <w:rPr>
+                <w:rFonts w:ascii="Cambria" w:hAnsi="Cambria"/>
+                <w:bCs/>
+                <w:color w:val="000000"/>
+                <w:sz w:val="22"/>
+                <w:szCs w:val="22"/>
+              </w:rPr>
+              <w:t>{{ item.conservancy }}</w:t>
+            </w:r>
+          </w:p>
+        </w:tc>
+        <w:tc>
+          <w:tcPr>
+            <w:tcW w:w="1169" w:type="dxa"/>
+          </w:tcPr>
+          <w:p>
+            <w:pPr>
+              <w:cnfStyle w:val="000000000000" w:firstRow="0" w:lastRow="0" w:firstColumn="0" w:lastColumn="0" w:oddVBand="0" w:evenVBand="0" w:oddHBand="0" w:evenHBand="0" w:firstRowFirstColumn="0" w:firstRowLastColumn="0" w:lastRowFirstColumn="0" w:lastRowLastColumn="0"/>
+              <w:rPr>
+                <w:rFonts w:ascii="Cambria" w:hAnsi="Cambria"/>
+                <w:bCs w:val="0"/>
+                <w:color w:val="000000"/>
+                <w:sz w:val="22"/>
+                <w:szCs w:val="22"/>
+              </w:rPr>
+            </w:pPr>
+            <w:r>
+              <w:rPr>
+                <w:rFonts w:ascii="Cambria" w:hAnsi="Cambria"/>
+                <w:bCs w:val="0"/>
+                <w:color w:val="000000"/>
+                <w:sz w:val="22"/>
+                <w:szCs w:val="22"/>
+              </w:rPr>
+              <w:t>{{ item.color }}</w:t>
+            </w:r>
+          </w:p>
+        </w:tc>
+        <w:tc>
+          <w:tcPr>
+            <w:tcW w:w="1877" w:type="dxa"/>
+          </w:tcPr>
+          <w:p>
+            <w:pPr>
+              <w:cnfStyle w:val="000000000000" w:firstRow="0" w:lastRow="0" w:firstColumn="0" w:lastColumn="0" w:oddVBand="0" w:evenVBand="0" w:oddHBand="0" w:evenHBand="0" w:firstRowFirstColumn="0" w:firstRowLastColumn="0" w:lastRowFirstColumn="0" w:lastRowLastColumn="0"/>
+              <w:rPr>
+                <w:rFonts w:ascii="Cambria" w:hAnsi="Cambria"/>
+                <w:bCs w:val="0"/>
+                <w:color w:val="000000"/>
+                <w:sz w:val="22"/>
+                <w:szCs w:val="22"/>
+              </w:rPr>
+            </w:pPr>
+            <w:r>
+              <w:rPr>
+                <w:rFonts w:ascii="Cambria" w:hAnsi="Cambria"/>
+                <w:bCs w:val="0"/>
+                <w:color w:val="000000"/>
+                <w:sz w:val="22"/>
+                <w:szCs w:val="22"/>
+              </w:rPr>
+              <w:t>{{ item.station }}</w:t>
+            </w:r>
+          </w:p>
+        </w:tc>
+        <w:tc>
+          <w:tcPr>
+            <w:tcW w:w="1112" w:type="dxa"/>
+          </w:tcPr>
+          <w:p>
+            <w:pPr>
+              <w:cnfStyle w:val="000000000000" w:firstRow="0" w:lastRow="0" w:firstColumn="0" w:lastColumn="0" w:oddVBand="0" w:evenVBand="0" w:oddHBand="0" w:evenHBand="0" w:firstRowFirstColumn="0" w:firstRowLastColumn="0" w:lastRowFirstColumn="0" w:lastRowLastColumn="0"/>
+              <w:rPr>
+                <w:rFonts w:ascii="Cambria" w:hAnsi="Cambria"/>
+                <w:bCs w:val="0"/>
+                <w:color w:val="000000"/>
+                <w:sz w:val="22"/>
+                <w:szCs w:val="22"/>
+              </w:rPr>
+            </w:pPr>
+            <w:r>
+              <w:rPr>
+                <w:rFonts w:ascii="Cambria" w:hAnsi="Cambria"/>
+                <w:bCs w:val="0"/>
+                <w:color w:val="000000"/>
+                <w:sz w:val="22"/>
+                <w:szCs w:val="22"/>
+              </w:rPr>
+              <w:t>{{ item.rhinos }}</w:t>
+            </w:r>
+          </w:p>
+        </w:tc>
+        <w:tc>
+          <w:tcPr>
+            <w:tcW w:w="1821" w:type="dxa"/>
+          </w:tcPr>
+          <w:p>
+            <w:pPr>
+              <w:cnfStyle w:val="000000000000" w:firstRow="0" w:lastRow="0" w:firstColumn="0" w:lastColumn="0" w:oddVBand="0" w:evenVBand="0" w:oddHBand="0" w:evenHBand="0" w:firstRowFirstColumn="0" w:firstRowLastColumn="0" w:lastRowFirstColumn="0" w:lastRowLastColumn="0"/>
+              <w:rPr>
+                <w:rFonts w:ascii="Cambria" w:hAnsi="Cambria"/>
+                <w:bCs w:val="0"/>
+                <w:color w:val="000000"/>
+                <w:sz w:val="22"/>
+                <w:szCs w:val="22"/>
+              </w:rPr>
+            </w:pPr>
+            <w:r>
+              <w:rPr>
+                <w:rFonts w:ascii="Cambria" w:hAnsi="Cambria"/>
+                <w:bCs w:val="0"/>
+                <w:color w:val="000000"/>
+                <w:sz w:val="22"/>
+                <w:szCs w:val="22"/>
+              </w:rPr>
+              <w:t>{{ item.</w:t>
+            </w:r>
+            <w:r>
+              <w:rPr>
+                <w:rFonts w:ascii="Cambria" w:hAnsi="Cambria"/>
+                <w:bCs w:val="0"/>
+                <w:color w:val="000000"/>
+                <w:sz w:val="22"/>
+                <w:szCs w:val="22"/>
+              </w:rPr>
+              <w:t>behavior</w:t>
+            </w:r>
+            <w:r>
+              <w:rPr>
+                <w:rFonts w:ascii="Cambria" w:hAnsi="Cambria"/>
+                <w:bCs w:val="0"/>
+                <w:color w:val="000000"/>
+                <w:sz w:val="22"/>
+                <w:szCs w:val="22"/>
+              </w:rPr>
+              <w:t xml:space="preserve"> }}</w:t>
+            </w:r>
+          </w:p>
+        </w:tc>
+        <w:tc>
+          <w:tcPr>
+            <w:tcW w:w="1374" w:type="dxa"/>
+          </w:tcPr>
+          <w:p>
+            <w:pPr>
+              <w:cnfStyle w:val="000000000000" w:firstRow="0" w:lastRow="0" w:firstColumn="0" w:lastColumn="0" w:oddVBand="0" w:evenVBand="0" w:oddHBand="0" w:evenHBand="0" w:firstRowFirstColumn="0" w:firstRowLastColumn="0" w:lastRowFirstColumn="0" w:lastRowLastColumn="0"/>
+              <w:rPr>
+                <w:rFonts w:ascii="Cambria" w:hAnsi="Cambria"/>
+                <w:bCs w:val="0"/>
+                <w:color w:val="000000"/>
+                <w:sz w:val="22"/>
+                <w:szCs w:val="22"/>
+              </w:rPr>
+            </w:pPr>
+            <w:r>
+              <w:rPr>
+                <w:rFonts w:ascii="Cambria" w:hAnsi="Cambria"/>
+                <w:bCs w:val="0"/>
+                <w:color w:val="000000"/>
+                <w:sz w:val="22"/>
+                <w:szCs w:val="22"/>
+              </w:rPr>
+              <w:t>{{ item.health }}</w:t>
+            </w:r>
+          </w:p>
+        </w:tc>
+      </w:tr>
+      <w:tr>
+        <w:trPr>
+          <w:cnfStyle w:val="000000100000" w:firstRow="0" w:lastRow="0" w:firstColumn="0" w:lastColumn="0" w:oddVBand="0" w:evenVBand="0" w:oddHBand="1" w:evenHBand="0" w:firstRowFirstColumn="0" w:firstRowLastColumn="0" w:lastRowFirstColumn="0" w:lastRowLastColumn="0"/>
+        </w:trPr>
+        <w:tc>
+          <w:tcPr>
+            <w:cnfStyle w:val="001000000000" w:firstRow="0" w:lastRow="0" w:firstColumn="1" w:lastColumn="0" w:oddVBand="0" w:evenVBand="0" w:oddHBand="0" w:evenHBand="0" w:firstRowFirstColumn="0" w:firstRowLastColumn="0" w:lastRowFirstColumn="0" w:lastRowLastColumn="0"/>
+            <w:tcW w:w="1997" w:type="dxa"/>
+          </w:tcPr>
+          <w:p>
+            <w:pPr>
+              <w:rPr>
+                <w:rFonts w:ascii="Cambria" w:hAnsi="Cambria"/>
+                <w:bCs/>
+                <w:color w:val="000000"/>
+                <w:sz w:val="22"/>
+                <w:szCs w:val="22"/>
+              </w:rPr>
+            </w:pPr>
+            <w:r>
+              <w:rPr>
+                <w:rFonts w:ascii="Cambria" w:hAnsi="Cambria"/>
+                <w:bCs/>
+                <w:color w:val="000000"/>
+                <w:sz w:val="22"/>
+                <w:szCs w:val="22"/>
+              </w:rPr>
+              <w:t>{%tr endfor %}</w:t>
+            </w:r>
+          </w:p>
+        </w:tc>
+        <w:tc>
+          <w:tcPr>
+            <w:tcW w:w="1169" w:type="dxa"/>
+          </w:tcPr>
+          <w:p>
+            <w:pPr>
+              <w:cnfStyle w:val="000000100000" w:firstRow="0" w:lastRow="0" w:firstColumn="0" w:lastColumn="0" w:oddVBand="0" w:evenVBand="0" w:oddHBand="1" w:evenHBand="0" w:firstRowFirstColumn="0" w:firstRowLastColumn="0" w:lastRowFirstColumn="0" w:lastRowLastColumn="0"/>
+              <w:rPr>
+                <w:rFonts w:ascii="Cambria" w:hAnsi="Cambria"/>
+                <w:bCs w:val="0"/>
+                <w:color w:val="000000"/>
+                <w:sz w:val="22"/>
+                <w:szCs w:val="22"/>
+              </w:rPr>
+            </w:pPr>
+          </w:p>
+        </w:tc>
+        <w:tc>
+          <w:tcPr>
+            <w:tcW w:w="1877" w:type="dxa"/>
+          </w:tcPr>
+          <w:p>
+            <w:pPr>
+              <w:cnfStyle w:val="000000100000" w:firstRow="0" w:lastRow="0" w:firstColumn="0" w:lastColumn="0" w:oddVBand="0" w:evenVBand="0" w:oddHBand="1" w:evenHBand="0" w:firstRowFirstColumn="0" w:firstRowLastColumn="0" w:lastRowFirstColumn="0" w:lastRowLastColumn="0"/>
+              <w:rPr>
+                <w:rFonts w:ascii="Cambria" w:hAnsi="Cambria"/>
+                <w:bCs w:val="0"/>
+                <w:color w:val="000000"/>
+                <w:sz w:val="22"/>
+                <w:szCs w:val="22"/>
+              </w:rPr>
+            </w:pPr>
+          </w:p>
+        </w:tc>
+        <w:tc>
+          <w:tcPr>
+            <w:tcW w:w="1112" w:type="dxa"/>
+          </w:tcPr>
+          <w:p>
+            <w:pPr>
+              <w:cnfStyle w:val="000000100000" w:firstRow="0" w:lastRow="0" w:firstColumn="0" w:lastColumn="0" w:oddVBand="0" w:evenVBand="0" w:oddHBand="1" w:evenHBand="0" w:firstRowFirstColumn="0" w:firstRowLastColumn="0" w:lastRowFirstColumn="0" w:lastRowLastColumn="0"/>
+              <w:rPr>
+                <w:rFonts w:ascii="Cambria" w:hAnsi="Cambria"/>
+                <w:bCs w:val="0"/>
+                <w:color w:val="000000"/>
+                <w:sz w:val="22"/>
+                <w:szCs w:val="22"/>
+              </w:rPr>
+            </w:pPr>
+          </w:p>
+        </w:tc>
+        <w:tc>
+          <w:tcPr>
+            <w:tcW w:w="1821" w:type="dxa"/>
+          </w:tcPr>
+          <w:p>
+            <w:pPr>
+              <w:cnfStyle w:val="000000100000" w:firstRow="0" w:lastRow="0" w:firstColumn="0" w:lastColumn="0" w:oddVBand="0" w:evenVBand="0" w:oddHBand="1" w:evenHBand="0" w:firstRowFirstColumn="0" w:firstRowLastColumn="0" w:lastRowFirstColumn="0" w:lastRowLastColumn="0"/>
+              <w:rPr>
+                <w:rFonts w:ascii="Cambria" w:hAnsi="Cambria"/>
+                <w:bCs w:val="0"/>
+                <w:color w:val="000000"/>
+                <w:sz w:val="22"/>
+                <w:szCs w:val="22"/>
+              </w:rPr>
+            </w:pPr>
+          </w:p>
+        </w:tc>
+        <w:tc>
+          <w:tcPr>
+            <w:tcW w:w="1374" w:type="dxa"/>
+          </w:tcPr>
+          <w:p>
+            <w:pPr>
+              <w:cnfStyle w:val="000000100000" w:firstRow="0" w:lastRow="0" w:firstColumn="0" w:lastColumn="0" w:oddVBand="0" w:evenVBand="0" w:oddHBand="1" w:evenHBand="0" w:firstRowFirstColumn="0" w:firstRowLastColumn="0" w:lastRowFirstColumn="0" w:lastRowLastColumn="0"/>
+              <w:rPr>
+                <w:rFonts w:ascii="Cambria" w:hAnsi="Cambria"/>
+                <w:bCs w:val="0"/>
+                <w:color w:val="000000"/>
+                <w:sz w:val="22"/>
+                <w:szCs w:val="22"/>
+              </w:rPr>
+            </w:pPr>
+          </w:p>
+        </w:tc>
+      </w:tr>
+    </w:tbl>
+    <w:p>
+      <w:pPr>
+        <w:rPr>
+          <w:rFonts w:ascii="Cambria" w:hAnsi="Cambria"/>
+          <w:bCs w:val="0"/>
+          <w:color w:val="000000"/>
+          <w:sz w:val="22"/>
+          <w:szCs w:val="22"/>
+        </w:rPr>
+      </w:pPr>
+      <w:r>
+        <w:rPr>
+          <w:rFonts w:ascii="Cambria" w:hAnsi="Cambria"/>
+          <w:bCs w:val="0"/>
+          <w:color w:val="000000"/>
+          <w:sz w:val="22"/>
+          <w:szCs w:val="22"/>
+        </w:rPr>
+        <w:t>{% else %}</w:t>
+      </w:r>
+    </w:p>
+    <w:p>
+      <w:pPr>
+        <w:pStyle w:val="ListParagraph"/>
+        <w:numPr>
+          <w:ilvl w:val="0"/>
+          <w:numId w:val="49"/>
+        </w:numPr>
+        <w:rPr>
+          <w:rFonts w:ascii="Cambria" w:hAnsi="Cambria"/>
+          <w:bCs w:val="0"/>
+          <w:color w:val="000000"/>
+          <w:sz w:val="22"/>
+          <w:szCs w:val="22"/>
+        </w:rPr>
+      </w:pPr>
+      <w:r>
+        <w:rPr>
+          <w:rFonts w:ascii="Cambria" w:hAnsi="Cambria"/>
+          <w:bCs w:val="0"/>
+          <w:color w:val="000000"/>
+          <w:sz w:val="22"/>
+          <w:szCs w:val="22"/>
+        </w:rPr>
+        <w:t xml:space="preserve">No rhino </w:t>
+      </w:r>
+      <w:r>
+        <w:rPr>
+          <w:rFonts w:ascii="Cambria" w:hAnsi="Cambria"/>
+          <w:bCs w:val="0"/>
+          <w:color w:val="000000"/>
+          <w:sz w:val="22"/>
+          <w:szCs w:val="22"/>
+        </w:rPr>
+        <w:t>territorial movements</w:t>
+      </w:r>
+      <w:r>
+        <w:rPr>
+          <w:rFonts w:ascii="Cambria" w:hAnsi="Cambria"/>
+          <w:bCs w:val="0"/>
+          <w:color w:val="000000"/>
+          <w:sz w:val="22"/>
+          <w:szCs w:val="22"/>
+        </w:rPr>
+        <w:t xml:space="preserve"> reported.</w:t>
+      </w:r>
+    </w:p>
+    <w:p>
+      <w:pPr>
+        <w:rPr>
+          <w:rFonts w:ascii="Cambria" w:hAnsi="Cambria"/>
+          <w:bCs w:val="0"/>
+          <w:color w:val="000000"/>
+          <w:sz w:val="22"/>
+          <w:szCs w:val="22"/>
+        </w:rPr>
+      </w:pPr>
+      <w:r>
+        <w:rPr>
+          <w:rFonts w:ascii="Cambria" w:hAnsi="Cambria"/>
+          <w:bCs w:val="0"/>
+          <w:color w:val="000000"/>
+          <w:sz w:val="22"/>
+          <w:szCs w:val="22"/>
+        </w:rPr>
+        <w:lastRenderedPageBreak/>
+        <w:t>{% endif %}</w:t>
+      </w:r>
+    </w:p>
+    <w:p>
+      <w:pPr>
         <w:tabs>
           <w:tab w:val="clear" w:pos="2940"/>
           <w:tab w:val="center" w:pos="995"/>
@@ -1098,28 +2237,6 @@
           <w:szCs w:val="22"/>
         </w:rPr>
       </w:pPr>
-      <w:r>
-        <w:rPr>
-          <w:rFonts w:ascii="Cambria" w:hAnsi="Cambria"/>
-          <w:b/>
-          <w:bCs w:val="0"/>
-          <w:color w:val="000000"/>
-          <w:sz w:val="22"/>
-          <w:szCs w:val="22"/>
-        </w:rPr>
-        <w:t xml:space="preserve"># </w:t>
-      </w:r>
-      <w:r>
-        <w:rPr>
-          <w:rFonts w:ascii="Cambria" w:hAnsi="Cambria"/>
-          <w:b/>
-          <w:bCs w:val="0"/>
-          <w:color w:val="000000"/>
-          <w:sz w:val="22"/>
-          <w:szCs w:val="22"/>
-        </w:rPr>
-        <w:t>TODO</w:t>
-      </w:r>
     </w:p>
     <w:p>
       <w:pPr>
@@ -1242,8 +2359,8 @@
         <w:tblLook w:val="04A0" w:firstRow="1" w:lastRow="0" w:firstColumn="1" w:lastColumn="0" w:noHBand="0" w:noVBand="1"/>
       </w:tblPr>
       <w:tblGrid>
-        <w:gridCol w:w="4675"/>
-        <w:gridCol w:w="2070"/>
+        <w:gridCol w:w="6115"/>
+        <w:gridCol w:w="1561"/>
       </w:tblGrid>
       <w:tr>
         <w:trPr>
@@ -1252,7 +2369,7 @@
         <w:tc>
           <w:tcPr>
             <w:cnfStyle w:val="001000000000" w:firstRow="0" w:lastRow="0" w:firstColumn="1" w:lastColumn="0" w:oddVBand="0" w:evenVBand="0" w:oddHBand="0" w:evenHBand="0" w:firstRowFirstColumn="0" w:firstRowLastColumn="0" w:lastRowFirstColumn="0" w:lastRowLastColumn="0"/>
-            <w:tcW w:w="4675" w:type="dxa"/>
+            <w:tcW w:w="6115" w:type="dxa"/>
           </w:tcPr>
           <w:p>
             <w:pPr>
@@ -1276,7 +2393,7 @@
         </w:tc>
         <w:tc>
           <w:tcPr>
-            <w:tcW w:w="2070" w:type="dxa"/>
+            <w:tcW w:w="1561" w:type="dxa"/>
           </w:tcPr>
           <w:p>
             <w:pPr>
@@ -1307,7 +2424,7 @@
         <w:tc>
           <w:tcPr>
             <w:cnfStyle w:val="001000000000" w:firstRow="0" w:lastRow="0" w:firstColumn="1" w:lastColumn="0" w:oddVBand="0" w:evenVBand="0" w:oddHBand="0" w:evenHBand="0" w:firstRowFirstColumn="0" w:firstRowLastColumn="0" w:lastRowFirstColumn="0" w:lastRowLastColumn="0"/>
-            <w:tcW w:w="4675" w:type="dxa"/>
+            <w:tcW w:w="6115" w:type="dxa"/>
           </w:tcPr>
           <w:p>
             <w:pPr>
@@ -1368,7 +2485,7 @@
         </w:tc>
         <w:tc>
           <w:tcPr>
-            <w:tcW w:w="2070" w:type="dxa"/>
+            <w:tcW w:w="1561" w:type="dxa"/>
           </w:tcPr>
           <w:p>
             <w:pPr>
@@ -1393,7 +2510,7 @@
         <w:tc>
           <w:tcPr>
             <w:cnfStyle w:val="001000000000" w:firstRow="0" w:lastRow="0" w:firstColumn="1" w:lastColumn="0" w:oddVBand="0" w:evenVBand="0" w:oddHBand="0" w:evenHBand="0" w:firstRowFirstColumn="0" w:firstRowLastColumn="0" w:lastRowFirstColumn="0" w:lastRowLastColumn="0"/>
-            <w:tcW w:w="4675" w:type="dxa"/>
+            <w:tcW w:w="6115" w:type="dxa"/>
           </w:tcPr>
           <w:p>
             <w:pPr>
@@ -1424,7 +2541,7 @@
         </w:tc>
         <w:tc>
           <w:tcPr>
-            <w:tcW w:w="2070" w:type="dxa"/>
+            <w:tcW w:w="1561" w:type="dxa"/>
           </w:tcPr>
           <w:p>
             <w:pPr>
@@ -1463,7 +2580,7 @@
         <w:tc>
           <w:tcPr>
             <w:cnfStyle w:val="001000000000" w:firstRow="0" w:lastRow="0" w:firstColumn="1" w:lastColumn="0" w:oddVBand="0" w:evenVBand="0" w:oddHBand="0" w:evenHBand="0" w:firstRowFirstColumn="0" w:firstRowLastColumn="0" w:lastRowFirstColumn="0" w:lastRowLastColumn="0"/>
-            <w:tcW w:w="4675" w:type="dxa"/>
+            <w:tcW w:w="6115" w:type="dxa"/>
           </w:tcPr>
           <w:p>
             <w:pPr>
@@ -1504,7 +2621,7 @@
         </w:tc>
         <w:tc>
           <w:tcPr>
-            <w:tcW w:w="2070" w:type="dxa"/>
+            <w:tcW w:w="1561" w:type="dxa"/>
           </w:tcPr>
           <w:p>
             <w:pPr>
@@ -1670,6 +2787,632 @@
     </w:p>
     <w:p>
       <w:pPr>
+        <w:rPr>
+          <w:rFonts w:ascii="Cambria" w:hAnsi="Cambria"/>
+          <w:b/>
+          <w:bCs w:val="0"/>
+          <w:color w:val="000000"/>
+          <w:sz w:val="22"/>
+          <w:szCs w:val="22"/>
+        </w:rPr>
+      </w:pPr>
+      <w:r>
+        <w:rPr>
+          <w:rFonts w:ascii="Cambria" w:hAnsi="Cambria"/>
+          <w:b/>
+          <w:bCs w:val="0"/>
+          <w:color w:val="000000"/>
+          <w:sz w:val="22"/>
+          <w:szCs w:val="22"/>
+        </w:rPr>
+        <w:t xml:space="preserve">{% if </w:t>
+      </w:r>
+      <w:r>
+        <w:rPr>
+          <w:rFonts w:ascii="Cambria" w:hAnsi="Cambria"/>
+          <w:b/>
+          <w:bCs w:val="0"/>
+          <w:color w:val="000000"/>
+          <w:sz w:val="22"/>
+          <w:szCs w:val="22"/>
+        </w:rPr>
+        <w:t>carcass</w:t>
+      </w:r>
+      <w:r>
+        <w:rPr>
+          <w:rFonts w:ascii="Cambria" w:hAnsi="Cambria"/>
+          <w:b/>
+          <w:bCs w:val="0"/>
+          <w:color w:val="000000"/>
+          <w:sz w:val="22"/>
+          <w:szCs w:val="22"/>
+        </w:rPr>
+        <w:t xml:space="preserve"> %}</w:t>
+      </w:r>
+    </w:p>
+    <w:tbl>
+      <w:tblPr>
+        <w:tblStyle w:val="ListTable4-Accent6"/>
+        <w:tblW w:w="9175" w:type="dxa"/>
+        <w:tblLayout w:type="fixed"/>
+        <w:tblLook w:val="04A0" w:firstRow="1" w:lastRow="0" w:firstColumn="1" w:lastColumn="0" w:noHBand="0" w:noVBand="1"/>
+      </w:tblPr>
+      <w:tblGrid>
+        <w:gridCol w:w="1973"/>
+        <w:gridCol w:w="1892"/>
+        <w:gridCol w:w="1800"/>
+        <w:gridCol w:w="2610"/>
+        <w:gridCol w:w="900"/>
+      </w:tblGrid>
+      <w:tr>
+        <w:trPr>
+          <w:cnfStyle w:val="100000000000" w:firstRow="1" w:lastRow="0" w:firstColumn="0" w:lastColumn="0" w:oddVBand="0" w:evenVBand="0" w:oddHBand="0" w:evenHBand="0" w:firstRowFirstColumn="0" w:firstRowLastColumn="0" w:lastRowFirstColumn="0" w:lastRowLastColumn="0"/>
+          <w:trHeight w:val="449"/>
+        </w:trPr>
+        <w:tc>
+          <w:tcPr>
+            <w:cnfStyle w:val="001000000000" w:firstRow="0" w:lastRow="0" w:firstColumn="1" w:lastColumn="0" w:oddVBand="0" w:evenVBand="0" w:oddHBand="0" w:evenHBand="0" w:firstRowFirstColumn="0" w:firstRowLastColumn="0" w:lastRowFirstColumn="0" w:lastRowLastColumn="0"/>
+            <w:tcW w:w="1973" w:type="dxa"/>
+          </w:tcPr>
+          <w:p>
+            <w:pPr>
+              <w:spacing w:after="0"/>
+              <w:jc w:val="left"/>
+              <w:rPr>
+                <w:rFonts w:ascii="Calibri" w:hAnsi="Calibri"/>
+                <w:sz w:val="22"/>
+                <w:szCs w:val="22"/>
+              </w:rPr>
+            </w:pPr>
+            <w:r>
+              <w:rPr>
+                <w:rFonts w:ascii="Calibri" w:hAnsi="Calibri"/>
+                <w:sz w:val="22"/>
+                <w:szCs w:val="22"/>
+              </w:rPr>
+              <w:t>Conservancy</w:t>
+            </w:r>
+          </w:p>
+        </w:tc>
+        <w:tc>
+          <w:tcPr>
+            <w:tcW w:w="1892" w:type="dxa"/>
+          </w:tcPr>
+          <w:p>
+            <w:pPr>
+              <w:spacing w:after="0"/>
+              <w:jc w:val="left"/>
+              <w:cnfStyle w:val="100000000000" w:firstRow="1" w:lastRow="0" w:firstColumn="0" w:lastColumn="0" w:oddVBand="0" w:evenVBand="0" w:oddHBand="0" w:evenHBand="0" w:firstRowFirstColumn="0" w:firstRowLastColumn="0" w:lastRowFirstColumn="0" w:lastRowLastColumn="0"/>
+              <w:rPr>
+                <w:rFonts w:ascii="Calibri" w:hAnsi="Calibri"/>
+                <w:sz w:val="22"/>
+                <w:szCs w:val="22"/>
+              </w:rPr>
+            </w:pPr>
+            <w:r>
+              <w:rPr>
+                <w:rFonts w:ascii="Calibri" w:hAnsi="Calibri"/>
+                <w:sz w:val="22"/>
+                <w:szCs w:val="22"/>
+              </w:rPr>
+              <w:t>Species</w:t>
+            </w:r>
+          </w:p>
+        </w:tc>
+        <w:tc>
+          <w:tcPr>
+            <w:tcW w:w="1800" w:type="dxa"/>
+          </w:tcPr>
+          <w:p>
+            <w:pPr>
+              <w:spacing w:after="0"/>
+              <w:jc w:val="left"/>
+              <w:cnfStyle w:val="100000000000" w:firstRow="1" w:lastRow="0" w:firstColumn="0" w:lastColumn="0" w:oddVBand="0" w:evenVBand="0" w:oddHBand="0" w:evenHBand="0" w:firstRowFirstColumn="0" w:firstRowLastColumn="0" w:lastRowFirstColumn="0" w:lastRowLastColumn="0"/>
+              <w:rPr>
+                <w:rFonts w:ascii="Calibri" w:hAnsi="Calibri"/>
+                <w:sz w:val="22"/>
+                <w:szCs w:val="22"/>
+              </w:rPr>
+            </w:pPr>
+            <w:r>
+              <w:rPr>
+                <w:rFonts w:ascii="Calibri" w:hAnsi="Calibri"/>
+                <w:sz w:val="22"/>
+                <w:szCs w:val="22"/>
+              </w:rPr>
+              <w:t>Station</w:t>
+            </w:r>
+          </w:p>
+        </w:tc>
+        <w:tc>
+          <w:tcPr>
+            <w:tcW w:w="2610" w:type="dxa"/>
+          </w:tcPr>
+          <w:p>
+            <w:pPr>
+              <w:spacing w:after="0"/>
+              <w:jc w:val="left"/>
+              <w:cnfStyle w:val="100000000000" w:firstRow="1" w:lastRow="0" w:firstColumn="0" w:lastColumn="0" w:oddVBand="0" w:evenVBand="0" w:oddHBand="0" w:evenHBand="0" w:firstRowFirstColumn="0" w:firstRowLastColumn="0" w:lastRowFirstColumn="0" w:lastRowLastColumn="0"/>
+              <w:rPr>
+                <w:rFonts w:ascii="Calibri" w:hAnsi="Calibri"/>
+                <w:sz w:val="22"/>
+                <w:szCs w:val="22"/>
+              </w:rPr>
+            </w:pPr>
+            <w:r>
+              <w:rPr>
+                <w:rFonts w:ascii="Calibri" w:hAnsi="Calibri"/>
+                <w:sz w:val="22"/>
+                <w:szCs w:val="22"/>
+              </w:rPr>
+              <w:t>Cause</w:t>
+            </w:r>
+          </w:p>
+        </w:tc>
+        <w:tc>
+          <w:tcPr>
+            <w:tcW w:w="900" w:type="dxa"/>
+          </w:tcPr>
+          <w:p>
+            <w:pPr>
+              <w:spacing w:after="0"/>
+              <w:jc w:val="left"/>
+              <w:cnfStyle w:val="100000000000" w:firstRow="1" w:lastRow="0" w:firstColumn="0" w:lastColumn="0" w:oddVBand="0" w:evenVBand="0" w:oddHBand="0" w:evenHBand="0" w:firstRowFirstColumn="0" w:firstRowLastColumn="0" w:lastRowFirstColumn="0" w:lastRowLastColumn="0"/>
+              <w:rPr>
+                <w:rFonts w:ascii="Calibri" w:hAnsi="Calibri"/>
+                <w:sz w:val="22"/>
+                <w:szCs w:val="22"/>
+              </w:rPr>
+            </w:pPr>
+            <w:r>
+              <w:rPr>
+                <w:rFonts w:ascii="Calibri" w:hAnsi="Calibri"/>
+                <w:sz w:val="22"/>
+                <w:szCs w:val="22"/>
+              </w:rPr>
+              <w:t>No.</w:t>
+            </w:r>
+          </w:p>
+        </w:tc>
+      </w:tr>
+      <w:tr>
+        <w:trPr>
+          <w:cnfStyle w:val="000000100000" w:firstRow="0" w:lastRow="0" w:firstColumn="0" w:lastColumn="0" w:oddVBand="0" w:evenVBand="0" w:oddHBand="1" w:evenHBand="0" w:firstRowFirstColumn="0" w:firstRowLastColumn="0" w:lastRowFirstColumn="0" w:lastRowLastColumn="0"/>
+        </w:trPr>
+        <w:tc>
+          <w:tcPr>
+            <w:cnfStyle w:val="001000000000" w:firstRow="0" w:lastRow="0" w:firstColumn="1" w:lastColumn="0" w:oddVBand="0" w:evenVBand="0" w:oddHBand="0" w:evenHBand="0" w:firstRowFirstColumn="0" w:firstRowLastColumn="0" w:lastRowFirstColumn="0" w:lastRowLastColumn="0"/>
+            <w:tcW w:w="9175" w:type="dxa"/>
+            <w:gridSpan w:val="5"/>
+          </w:tcPr>
+          <w:p>
+            <w:pPr>
+              <w:rPr>
+                <w:rFonts w:ascii="Cambria" w:hAnsi="Cambria"/>
+                <w:b w:val="0"/>
+                <w:bCs/>
+                <w:color w:val="000000"/>
+                <w:sz w:val="22"/>
+                <w:szCs w:val="22"/>
+              </w:rPr>
+            </w:pPr>
+            <w:r>
+              <w:rPr>
+                <w:rFonts w:ascii="Cambria" w:hAnsi="Cambria"/>
+                <w:b w:val="0"/>
+                <w:bCs/>
+                <w:color w:val="000000"/>
+                <w:sz w:val="22"/>
+                <w:szCs w:val="22"/>
+              </w:rPr>
+              <w:t>{%</w:t>
+            </w:r>
+            <w:r>
+              <w:rPr>
+                <w:rFonts w:ascii="Cambria" w:hAnsi="Cambria"/>
+                <w:b w:val="0"/>
+                <w:bCs/>
+                <w:color w:val="000000"/>
+                <w:sz w:val="22"/>
+                <w:szCs w:val="22"/>
+              </w:rPr>
+              <w:t>tr for item in carcass %}</w:t>
+            </w:r>
+          </w:p>
+        </w:tc>
+      </w:tr>
+      <w:tr>
+        <w:tc>
+          <w:tcPr>
+            <w:cnfStyle w:val="001000000000" w:firstRow="0" w:lastRow="0" w:firstColumn="1" w:lastColumn="0" w:oddVBand="0" w:evenVBand="0" w:oddHBand="0" w:evenHBand="0" w:firstRowFirstColumn="0" w:firstRowLastColumn="0" w:lastRowFirstColumn="0" w:lastRowLastColumn="0"/>
+            <w:tcW w:w="1973" w:type="dxa"/>
+          </w:tcPr>
+          <w:p>
+            <w:pPr>
+              <w:rPr>
+                <w:rFonts w:ascii="Cambria" w:hAnsi="Cambria"/>
+                <w:b w:val="0"/>
+                <w:bCs/>
+                <w:color w:val="000000"/>
+                <w:sz w:val="22"/>
+                <w:szCs w:val="22"/>
+              </w:rPr>
+            </w:pPr>
+            <w:r>
+              <w:rPr>
+                <w:rFonts w:ascii="Cambria" w:hAnsi="Cambria"/>
+                <w:b w:val="0"/>
+                <w:bCs/>
+                <w:color w:val="000000"/>
+                <w:sz w:val="22"/>
+                <w:szCs w:val="22"/>
+              </w:rPr>
+              <w:t>{{ item.conservancy }}</w:t>
+            </w:r>
+          </w:p>
+        </w:tc>
+        <w:tc>
+          <w:tcPr>
+            <w:tcW w:w="1892" w:type="dxa"/>
+          </w:tcPr>
+          <w:p>
+            <w:pPr>
+              <w:cnfStyle w:val="000000000000" w:firstRow="0" w:lastRow="0" w:firstColumn="0" w:lastColumn="0" w:oddVBand="0" w:evenVBand="0" w:oddHBand="0" w:evenHBand="0" w:firstRowFirstColumn="0" w:firstRowLastColumn="0" w:lastRowFirstColumn="0" w:lastRowLastColumn="0"/>
+              <w:rPr>
+                <w:rFonts w:ascii="Cambria" w:hAnsi="Cambria"/>
+                <w:bCs w:val="0"/>
+                <w:color w:val="000000"/>
+                <w:sz w:val="22"/>
+                <w:szCs w:val="22"/>
+              </w:rPr>
+            </w:pPr>
+            <w:r>
+              <w:rPr>
+                <w:rFonts w:ascii="Cambria" w:hAnsi="Cambria"/>
+                <w:bCs w:val="0"/>
+                <w:color w:val="000000"/>
+                <w:sz w:val="22"/>
+                <w:szCs w:val="22"/>
+              </w:rPr>
+              <w:t>{{ item.</w:t>
+            </w:r>
+            <w:r>
+              <w:rPr>
+                <w:rFonts w:ascii="Cambria" w:hAnsi="Cambria"/>
+                <w:bCs w:val="0"/>
+                <w:color w:val="000000"/>
+                <w:sz w:val="22"/>
+                <w:szCs w:val="22"/>
+              </w:rPr>
+              <w:t>species</w:t>
+            </w:r>
+            <w:r>
+              <w:rPr>
+                <w:rFonts w:ascii="Cambria" w:hAnsi="Cambria"/>
+                <w:bCs w:val="0"/>
+                <w:color w:val="000000"/>
+                <w:sz w:val="22"/>
+                <w:szCs w:val="22"/>
+              </w:rPr>
+              <w:t xml:space="preserve"> }}</w:t>
+            </w:r>
+          </w:p>
+        </w:tc>
+        <w:tc>
+          <w:tcPr>
+            <w:tcW w:w="1800" w:type="dxa"/>
+          </w:tcPr>
+          <w:p>
+            <w:pPr>
+              <w:cnfStyle w:val="000000000000" w:firstRow="0" w:lastRow="0" w:firstColumn="0" w:lastColumn="0" w:oddVBand="0" w:evenVBand="0" w:oddHBand="0" w:evenHBand="0" w:firstRowFirstColumn="0" w:firstRowLastColumn="0" w:lastRowFirstColumn="0" w:lastRowLastColumn="0"/>
+              <w:rPr>
+                <w:rFonts w:ascii="Cambria" w:hAnsi="Cambria"/>
+                <w:bCs w:val="0"/>
+                <w:color w:val="000000"/>
+                <w:sz w:val="22"/>
+                <w:szCs w:val="22"/>
+              </w:rPr>
+            </w:pPr>
+            <w:r>
+              <w:rPr>
+                <w:rFonts w:ascii="Cambria" w:hAnsi="Cambria"/>
+                <w:bCs w:val="0"/>
+                <w:color w:val="000000"/>
+                <w:sz w:val="22"/>
+                <w:szCs w:val="22"/>
+              </w:rPr>
+              <w:t>{{ item.station }}</w:t>
+            </w:r>
+          </w:p>
+        </w:tc>
+        <w:tc>
+          <w:tcPr>
+            <w:tcW w:w="2610" w:type="dxa"/>
+          </w:tcPr>
+          <w:p>
+            <w:pPr>
+              <w:cnfStyle w:val="000000000000" w:firstRow="0" w:lastRow="0" w:firstColumn="0" w:lastColumn="0" w:oddVBand="0" w:evenVBand="0" w:oddHBand="0" w:evenHBand="0" w:firstRowFirstColumn="0" w:firstRowLastColumn="0" w:lastRowFirstColumn="0" w:lastRowLastColumn="0"/>
+              <w:rPr>
+                <w:rFonts w:ascii="Cambria" w:hAnsi="Cambria"/>
+                <w:bCs w:val="0"/>
+                <w:color w:val="000000"/>
+                <w:sz w:val="22"/>
+                <w:szCs w:val="22"/>
+              </w:rPr>
+            </w:pPr>
+            <w:r>
+              <w:rPr>
+                <w:rFonts w:ascii="Cambria" w:hAnsi="Cambria"/>
+                <w:bCs w:val="0"/>
+                <w:color w:val="000000"/>
+                <w:sz w:val="22"/>
+                <w:szCs w:val="22"/>
+              </w:rPr>
+              <w:t>{{ item.</w:t>
+            </w:r>
+            <w:r>
+              <w:rPr>
+                <w:rFonts w:ascii="Cambria" w:hAnsi="Cambria"/>
+                <w:bCs w:val="0"/>
+                <w:color w:val="000000"/>
+                <w:sz w:val="22"/>
+                <w:szCs w:val="22"/>
+              </w:rPr>
+              <w:t>cause_of_death</w:t>
+            </w:r>
+            <w:r>
+              <w:rPr>
+                <w:rFonts w:ascii="Cambria" w:hAnsi="Cambria"/>
+                <w:bCs w:val="0"/>
+                <w:color w:val="000000"/>
+                <w:sz w:val="22"/>
+                <w:szCs w:val="22"/>
+              </w:rPr>
+              <w:t xml:space="preserve"> }}</w:t>
+            </w:r>
+          </w:p>
+        </w:tc>
+        <w:tc>
+          <w:tcPr>
+            <w:tcW w:w="900" w:type="dxa"/>
+          </w:tcPr>
+          <w:p>
+            <w:pPr>
+              <w:cnfStyle w:val="000000000000" w:firstRow="0" w:lastRow="0" w:firstColumn="0" w:lastColumn="0" w:oddVBand="0" w:evenVBand="0" w:oddHBand="0" w:evenHBand="0" w:firstRowFirstColumn="0" w:firstRowLastColumn="0" w:lastRowFirstColumn="0" w:lastRowLastColumn="0"/>
+              <w:rPr>
+                <w:rFonts w:ascii="Cambria" w:hAnsi="Cambria"/>
+                <w:bCs w:val="0"/>
+                <w:color w:val="000000"/>
+                <w:sz w:val="22"/>
+                <w:szCs w:val="22"/>
+              </w:rPr>
+            </w:pPr>
+            <w:r>
+              <w:rPr>
+                <w:rFonts w:ascii="Cambria" w:hAnsi="Cambria"/>
+                <w:bCs w:val="0"/>
+                <w:color w:val="000000"/>
+                <w:sz w:val="22"/>
+                <w:szCs w:val="22"/>
+              </w:rPr>
+              <w:t>{{ item.</w:t>
+            </w:r>
+            <w:r>
+              <w:rPr>
+                <w:rFonts w:ascii="Cambria" w:hAnsi="Cambria"/>
+                <w:bCs w:val="0"/>
+                <w:color w:val="000000"/>
+                <w:sz w:val="22"/>
+                <w:szCs w:val="22"/>
+              </w:rPr>
+              <w:t>number_animals</w:t>
+            </w:r>
+            <w:r>
+              <w:rPr>
+                <w:rFonts w:ascii="Cambria" w:hAnsi="Cambria"/>
+                <w:bCs w:val="0"/>
+                <w:color w:val="000000"/>
+                <w:sz w:val="22"/>
+                <w:szCs w:val="22"/>
+              </w:rPr>
+              <w:t xml:space="preserve"> }}</w:t>
+            </w:r>
+          </w:p>
+        </w:tc>
+      </w:tr>
+      <w:tr>
+        <w:trPr>
+          <w:cnfStyle w:val="000000100000" w:firstRow="0" w:lastRow="0" w:firstColumn="0" w:lastColumn="0" w:oddVBand="0" w:evenVBand="0" w:oddHBand="1" w:evenHBand="0" w:firstRowFirstColumn="0" w:firstRowLastColumn="0" w:lastRowFirstColumn="0" w:lastRowLastColumn="0"/>
+        </w:trPr>
+        <w:tc>
+          <w:tcPr>
+            <w:cnfStyle w:val="001000000000" w:firstRow="0" w:lastRow="0" w:firstColumn="1" w:lastColumn="0" w:oddVBand="0" w:evenVBand="0" w:oddHBand="0" w:evenHBand="0" w:firstRowFirstColumn="0" w:firstRowLastColumn="0" w:lastRowFirstColumn="0" w:lastRowLastColumn="0"/>
+            <w:tcW w:w="1973" w:type="dxa"/>
+          </w:tcPr>
+          <w:p>
+            <w:pPr>
+              <w:rPr>
+                <w:rFonts w:ascii="Cambria" w:hAnsi="Cambria"/>
+                <w:b w:val="0"/>
+                <w:bCs/>
+                <w:color w:val="000000"/>
+                <w:sz w:val="22"/>
+                <w:szCs w:val="22"/>
+              </w:rPr>
+            </w:pPr>
+            <w:r>
+              <w:rPr>
+                <w:rFonts w:ascii="Cambria" w:hAnsi="Cambria"/>
+                <w:b w:val="0"/>
+                <w:bCs/>
+                <w:color w:val="000000"/>
+                <w:sz w:val="22"/>
+                <w:szCs w:val="22"/>
+              </w:rPr>
+              <w:t>{%tr endfor %}</w:t>
+            </w:r>
+          </w:p>
+        </w:tc>
+        <w:tc>
+          <w:tcPr>
+            <w:tcW w:w="1892" w:type="dxa"/>
+          </w:tcPr>
+          <w:p>
+            <w:pPr>
+              <w:cnfStyle w:val="000000100000" w:firstRow="0" w:lastRow="0" w:firstColumn="0" w:lastColumn="0" w:oddVBand="0" w:evenVBand="0" w:oddHBand="1" w:evenHBand="0" w:firstRowFirstColumn="0" w:firstRowLastColumn="0" w:lastRowFirstColumn="0" w:lastRowLastColumn="0"/>
+              <w:rPr>
+                <w:rFonts w:ascii="Cambria" w:hAnsi="Cambria"/>
+                <w:bCs w:val="0"/>
+                <w:color w:val="000000"/>
+                <w:sz w:val="22"/>
+                <w:szCs w:val="22"/>
+              </w:rPr>
+            </w:pPr>
+          </w:p>
+        </w:tc>
+        <w:tc>
+          <w:tcPr>
+            <w:tcW w:w="1800" w:type="dxa"/>
+          </w:tcPr>
+          <w:p>
+            <w:pPr>
+              <w:cnfStyle w:val="000000100000" w:firstRow="0" w:lastRow="0" w:firstColumn="0" w:lastColumn="0" w:oddVBand="0" w:evenVBand="0" w:oddHBand="1" w:evenHBand="0" w:firstRowFirstColumn="0" w:firstRowLastColumn="0" w:lastRowFirstColumn="0" w:lastRowLastColumn="0"/>
+              <w:rPr>
+                <w:rFonts w:ascii="Cambria" w:hAnsi="Cambria"/>
+                <w:bCs w:val="0"/>
+                <w:color w:val="000000"/>
+                <w:sz w:val="22"/>
+                <w:szCs w:val="22"/>
+              </w:rPr>
+            </w:pPr>
+          </w:p>
+        </w:tc>
+        <w:tc>
+          <w:tcPr>
+            <w:tcW w:w="2610" w:type="dxa"/>
+          </w:tcPr>
+          <w:p>
+            <w:pPr>
+              <w:cnfStyle w:val="000000100000" w:firstRow="0" w:lastRow="0" w:firstColumn="0" w:lastColumn="0" w:oddVBand="0" w:evenVBand="0" w:oddHBand="1" w:evenHBand="0" w:firstRowFirstColumn="0" w:firstRowLastColumn="0" w:lastRowFirstColumn="0" w:lastRowLastColumn="0"/>
+              <w:rPr>
+                <w:rFonts w:ascii="Cambria" w:hAnsi="Cambria"/>
+                <w:bCs w:val="0"/>
+                <w:color w:val="000000"/>
+                <w:sz w:val="22"/>
+                <w:szCs w:val="22"/>
+              </w:rPr>
+            </w:pPr>
+          </w:p>
+        </w:tc>
+        <w:tc>
+          <w:tcPr>
+            <w:tcW w:w="900" w:type="dxa"/>
+          </w:tcPr>
+          <w:p>
+            <w:pPr>
+              <w:cnfStyle w:val="000000100000" w:firstRow="0" w:lastRow="0" w:firstColumn="0" w:lastColumn="0" w:oddVBand="0" w:evenVBand="0" w:oddHBand="1" w:evenHBand="0" w:firstRowFirstColumn="0" w:firstRowLastColumn="0" w:lastRowFirstColumn="0" w:lastRowLastColumn="0"/>
+              <w:rPr>
+                <w:rFonts w:ascii="Cambria" w:hAnsi="Cambria"/>
+                <w:bCs w:val="0"/>
+                <w:color w:val="000000"/>
+                <w:sz w:val="22"/>
+                <w:szCs w:val="22"/>
+              </w:rPr>
+            </w:pPr>
+          </w:p>
+        </w:tc>
+      </w:tr>
+    </w:tbl>
+    <w:p>
+      <w:pPr>
+        <w:rPr>
+          <w:rFonts w:ascii="Cambria" w:hAnsi="Cambria"/>
+          <w:bCs w:val="0"/>
+          <w:color w:val="000000"/>
+          <w:sz w:val="22"/>
+          <w:szCs w:val="22"/>
+        </w:rPr>
+      </w:pPr>
+      <w:r>
+        <w:rPr>
+          <w:rFonts w:ascii="Cambria" w:hAnsi="Cambria"/>
+          <w:bCs w:val="0"/>
+          <w:color w:val="000000"/>
+          <w:sz w:val="22"/>
+          <w:szCs w:val="22"/>
+        </w:rPr>
+        <w:t>{% else %}</w:t>
+      </w:r>
+    </w:p>
+    <w:p>
+      <w:pPr>
+        <w:pStyle w:val="ListParagraph"/>
+        <w:numPr>
+          <w:ilvl w:val="0"/>
+          <w:numId w:val="49"/>
+        </w:numPr>
+        <w:rPr>
+          <w:rFonts w:ascii="Cambria" w:hAnsi="Cambria"/>
+          <w:bCs w:val="0"/>
+          <w:color w:val="000000"/>
+          <w:sz w:val="22"/>
+          <w:szCs w:val="22"/>
+        </w:rPr>
+      </w:pPr>
+      <w:r>
+        <w:rPr>
+          <w:rFonts w:ascii="Cambria" w:hAnsi="Cambria"/>
+          <w:bCs w:val="0"/>
+          <w:color w:val="000000"/>
+          <w:sz w:val="22"/>
+          <w:szCs w:val="22"/>
+        </w:rPr>
+        <w:t xml:space="preserve">No </w:t>
+      </w:r>
+      <w:r>
+        <w:rPr>
+          <w:rFonts w:ascii="Cambria" w:hAnsi="Cambria"/>
+          <w:bCs w:val="0"/>
+          <w:color w:val="000000"/>
+          <w:sz w:val="22"/>
+          <w:szCs w:val="22"/>
+        </w:rPr>
+        <w:t>wildlife mortality</w:t>
+      </w:r>
+      <w:r>
+        <w:rPr>
+          <w:rFonts w:ascii="Cambria" w:hAnsi="Cambria"/>
+          <w:bCs w:val="0"/>
+          <w:color w:val="000000"/>
+          <w:sz w:val="22"/>
+          <w:szCs w:val="22"/>
+        </w:rPr>
+        <w:t xml:space="preserve"> reported.</w:t>
+      </w:r>
+    </w:p>
+    <w:p>
+      <w:pPr>
+        <w:rPr>
+          <w:rFonts w:ascii="Cambria" w:hAnsi="Cambria"/>
+          <w:bCs w:val="0"/>
+          <w:color w:val="000000"/>
+          <w:sz w:val="22"/>
+          <w:szCs w:val="22"/>
+        </w:rPr>
+      </w:pPr>
+      <w:r>
+        <w:rPr>
+          <w:rFonts w:ascii="Cambria" w:hAnsi="Cambria"/>
+          <w:bCs w:val="0"/>
+          <w:color w:val="000000"/>
+          <w:sz w:val="22"/>
+          <w:szCs w:val="22"/>
+        </w:rPr>
+        <w:t>{% endif %}</w:t>
+      </w:r>
+    </w:p>
+    <w:p>
+      <w:pPr>
         <w:tabs>
           <w:tab w:val="clear" w:pos="2940"/>
           <w:tab w:val="center" w:pos="995"/>
@@ -1683,32 +3426,6 @@
           <w:szCs w:val="22"/>
         </w:rPr>
       </w:pPr>
-    </w:p>
-    <w:p>
-      <w:pPr>
-        <w:tabs>
-          <w:tab w:val="clear" w:pos="2940"/>
-          <w:tab w:val="center" w:pos="995"/>
-        </w:tabs>
-        <w:spacing w:before="0" w:beforeAutospacing="0" w:after="0"/>
-        <w:rPr>
-          <w:rFonts w:ascii="Cambria" w:hAnsi="Cambria"/>
-          <w:b/>
-          <w:color w:val="000000"/>
-          <w:sz w:val="22"/>
-          <w:szCs w:val="22"/>
-        </w:rPr>
-      </w:pPr>
-      <w:r>
-        <w:rPr>
-          <w:rFonts w:ascii="Cambria" w:hAnsi="Cambria"/>
-          <w:b/>
-          <w:color w:val="000000"/>
-          <w:sz w:val="22"/>
-          <w:szCs w:val="22"/>
-        </w:rPr>
-        <w:t># TODO:</w:t>
-      </w:r>
     </w:p>
     <w:p>
       <w:pPr>
@@ -1751,7 +3468,34 @@
           <w:sz w:val="22"/>
           <w:szCs w:val="22"/>
         </w:rPr>
+        <w:lastRenderedPageBreak/>
         <w:t>Wildlife movement through the gaps:</w:t>
+      </w:r>
+    </w:p>
+    <w:p>
+      <w:pPr>
+        <w:tabs>
+          <w:tab w:val="clear" w:pos="2940"/>
+          <w:tab w:val="center" w:pos="995"/>
+        </w:tabs>
+        <w:spacing w:before="0" w:beforeAutospacing="0" w:after="0"/>
+        <w:rPr>
+          <w:rFonts w:ascii="Cambria" w:hAnsi="Cambria"/>
+          <w:bCs w:val="0"/>
+          <w:color w:val="000000"/>
+          <w:sz w:val="22"/>
+          <w:szCs w:val="22"/>
+        </w:rPr>
+      </w:pPr>
+      <w:r>
+        <w:rPr>
+          <w:rFonts w:ascii="Cambria" w:hAnsi="Cambria"/>
+          <w:bCs w:val="0"/>
+          <w:color w:val="000000"/>
+          <w:sz w:val="22"/>
+          <w:szCs w:val="22"/>
+        </w:rPr>
+        <w:t>{% if gap_movement %}</w:t>
       </w:r>
     </w:p>
     <w:p>
@@ -1921,7 +3665,17 @@
                 <w:sz w:val="22"/>
                 <w:szCs w:val="22"/>
               </w:rPr>
-              <w:t>{%tr for item in gap_counts %}</w:t>
+              <w:t>{%tr for item in gap_movement</w:t>
+            </w:r>
+            <w:r>
+              <w:rPr>
+                <w:rFonts w:ascii="Cambria" w:hAnsi="Cambria"/>
+                <w:b w:val="0"/>
+                <w:color w:val="000000"/>
+                <w:sz w:val="22"/>
+                <w:szCs w:val="22"/>
+              </w:rPr>
+              <w:t xml:space="preserve"> %}</w:t>
             </w:r>
           </w:p>
         </w:tc>
@@ -2241,9 +3995,80 @@
         </w:tabs>
         <w:spacing w:before="0" w:beforeAutospacing="0" w:after="0"/>
         <w:rPr>
-          <w:rStyle w:val="Strong"/>
-        </w:rPr>
-      </w:pPr>
+          <w:rFonts w:ascii="Cambria" w:hAnsi="Cambria"/>
+          <w:bCs w:val="0"/>
+          <w:color w:val="000000"/>
+          <w:sz w:val="22"/>
+          <w:szCs w:val="22"/>
+        </w:rPr>
+      </w:pPr>
+      <w:r>
+        <w:rPr>
+          <w:rFonts w:ascii="Cambria" w:hAnsi="Cambria"/>
+          <w:bCs w:val="0"/>
+          <w:color w:val="000000"/>
+          <w:sz w:val="22"/>
+          <w:szCs w:val="22"/>
+        </w:rPr>
+        <w:t>{% else %}</w:t>
+      </w:r>
+    </w:p>
+    <w:p>
+      <w:pPr>
+        <w:pStyle w:val="ListParagraph"/>
+        <w:numPr>
+          <w:ilvl w:val="0"/>
+          <w:numId w:val="49"/>
+        </w:numPr>
+        <w:tabs>
+          <w:tab w:val="clear" w:pos="2940"/>
+          <w:tab w:val="center" w:pos="995"/>
+        </w:tabs>
+        <w:spacing w:before="0" w:beforeAutospacing="0" w:after="0"/>
+        <w:rPr>
+          <w:rFonts w:ascii="Cambria" w:hAnsi="Cambria"/>
+          <w:bCs w:val="0"/>
+          <w:color w:val="000000"/>
+          <w:sz w:val="22"/>
+          <w:szCs w:val="22"/>
+        </w:rPr>
+      </w:pPr>
+      <w:r>
+        <w:rPr>
+          <w:rFonts w:ascii="Cambria" w:hAnsi="Cambria"/>
+          <w:bCs w:val="0"/>
+          <w:color w:val="000000"/>
+          <w:sz w:val="22"/>
+          <w:szCs w:val="22"/>
+        </w:rPr>
+        <w:t>No gap movement reported.</w:t>
+      </w:r>
+    </w:p>
+    <w:p>
+      <w:pPr>
+        <w:tabs>
+          <w:tab w:val="clear" w:pos="2940"/>
+          <w:tab w:val="center" w:pos="995"/>
+        </w:tabs>
+        <w:spacing w:before="0" w:beforeAutospacing="0" w:after="0"/>
+        <w:rPr>
+          <w:rFonts w:ascii="Cambria" w:hAnsi="Cambria"/>
+          <w:bCs w:val="0"/>
+          <w:color w:val="000000"/>
+          <w:sz w:val="22"/>
+          <w:szCs w:val="22"/>
+        </w:rPr>
+      </w:pPr>
+      <w:r>
+        <w:rPr>
+          <w:rFonts w:ascii="Cambria" w:hAnsi="Cambria"/>
+          <w:bCs w:val="0"/>
+          <w:color w:val="000000"/>
+          <w:sz w:val="22"/>
+          <w:szCs w:val="22"/>
+        </w:rPr>
+        <w:t>{% endif %}</w:t>
+      </w:r>
     </w:p>
     <w:p>
       <w:pPr>
@@ -2683,7 +4508,27 @@
           <w:sz w:val="22"/>
           <w:szCs w:val="22"/>
         </w:rPr>
-        <w:t xml:space="preserve"> for item in rainfall</w:t>
+        <w:t xml:space="preserve"> for </w:t>
+      </w:r>
+      <w:r>
+        <w:rPr>
+          <w:rFonts w:ascii="Cambria" w:hAnsi="Cambria"/>
+          <w:bCs w:val="0"/>
+          <w:color w:val="000000"/>
+          <w:sz w:val="22"/>
+          <w:szCs w:val="22"/>
+        </w:rPr>
+        <w:t>conservancy</w:t>
+      </w:r>
+      <w:r>
+        <w:rPr>
+          <w:rFonts w:ascii="Cambria" w:hAnsi="Cambria"/>
+          <w:bCs w:val="0"/>
+          <w:color w:val="000000"/>
+          <w:sz w:val="22"/>
+          <w:szCs w:val="22"/>
+        </w:rPr>
+        <w:t xml:space="preserve"> in rainfall</w:t>
       </w:r>
       <w:r>
         <w:rPr>
@@ -2721,37 +4566,6 @@
           <w:szCs w:val="22"/>
         </w:rPr>
       </w:pPr>
-      <w:r>
-        <w:rPr>
-          <w:rFonts w:ascii="Cambria" w:hAnsi="Cambria"/>
-          <w:bCs w:val="0"/>
-          <w:color w:val="000000"/>
-          <w:sz w:val="22"/>
-          <w:szCs w:val="22"/>
-        </w:rPr>
-        <w:lastRenderedPageBreak/>
-        <w:t>{{</w:t>
-      </w:r>
-      <w:r>
-        <w:rPr>
-          <w:rFonts w:ascii="Cambria" w:hAnsi="Cambria"/>
-          <w:bCs w:val="0"/>
-          <w:color w:val="000000"/>
-          <w:sz w:val="22"/>
-          <w:szCs w:val="22"/>
-        </w:rPr>
-        <w:t>item.conservancy_name</w:t>
-      </w:r>
-      <w:r>
-        <w:rPr>
-          <w:rFonts w:ascii="Cambria" w:hAnsi="Cambria"/>
-          <w:bCs w:val="0"/>
-          <w:color w:val="000000"/>
-          <w:sz w:val="22"/>
-          <w:szCs w:val="22"/>
-        </w:rPr>
-        <w:t>}}</w:t>
-      </w:r>
     </w:p>
     <w:p>
       <w:pPr>
@@ -2763,6 +4577,7 @@
         <w:rPr>
           <w:rFonts w:ascii="Cambria" w:hAnsi="Cambria"/>
           <w:b/>
+          <w:bCs w:val="0"/>
           <w:color w:val="000000"/>
           <w:sz w:val="22"/>
           <w:szCs w:val="22"/>
@@ -2771,12 +4586,67 @@
       <w:r>
         <w:rPr>
           <w:rFonts w:ascii="Cambria" w:hAnsi="Cambria"/>
+          <w:bCs w:val="0"/>
+          <w:color w:val="000000"/>
+          <w:sz w:val="22"/>
+          <w:szCs w:val="22"/>
+        </w:rPr>
+        <w:t xml:space="preserve">Rainfall for: </w:t>
+      </w:r>
+      <w:r>
+        <w:rPr>
+          <w:rFonts w:ascii="Cambria" w:hAnsi="Cambria"/>
           <w:b/>
-          <w:color w:val="000000"/>
-          <w:sz w:val="22"/>
-          <w:szCs w:val="22"/>
-        </w:rPr>
-        <w:t>&lt;report details&gt;</w:t>
+          <w:bCs w:val="0"/>
+          <w:color w:val="000000"/>
+          <w:sz w:val="22"/>
+          <w:szCs w:val="22"/>
+        </w:rPr>
+        <w:t>{{</w:t>
+      </w:r>
+      <w:r>
+        <w:rPr>
+          <w:rFonts w:ascii="Cambria" w:hAnsi="Cambria"/>
+          <w:b/>
+          <w:bCs w:val="0"/>
+          <w:color w:val="000000"/>
+          <w:sz w:val="22"/>
+          <w:szCs w:val="22"/>
+        </w:rPr>
+        <w:t xml:space="preserve"> conservancy.</w:t>
+      </w:r>
+      <w:r>
+        <w:rPr>
+          <w:rFonts w:ascii="Cambria" w:hAnsi="Cambria"/>
+          <w:b/>
+          <w:bCs w:val="0"/>
+          <w:color w:val="000000"/>
+          <w:sz w:val="22"/>
+          <w:szCs w:val="22"/>
+        </w:rPr>
+        <w:t>conservancy</w:t>
+      </w:r>
+      <w:r>
+        <w:rPr>
+          <w:rFonts w:ascii="Cambria" w:hAnsi="Cambria"/>
+          <w:b/>
+          <w:bCs w:val="0"/>
+          <w:color w:val="000000"/>
+          <w:sz w:val="22"/>
+          <w:szCs w:val="22"/>
+        </w:rPr>
+        <w:t xml:space="preserve"> </w:t>
+      </w:r>
+      <w:r>
+        <w:rPr>
+          <w:rFonts w:ascii="Cambria" w:hAnsi="Cambria"/>
+          <w:b/>
+          <w:bCs w:val="0"/>
+          <w:color w:val="000000"/>
+          <w:sz w:val="22"/>
+          <w:szCs w:val="22"/>
+        </w:rPr>
+        <w:t>}}</w:t>
       </w:r>
     </w:p>
     <w:p>
@@ -2794,6 +4664,374 @@
           <w:szCs w:val="22"/>
         </w:rPr>
       </w:pPr>
+      <w:r>
+        <w:rPr>
+          <w:rFonts w:ascii="Cambria" w:hAnsi="Cambria"/>
+          <w:b/>
+          <w:bCs w:val="0"/>
+          <w:color w:val="000000"/>
+          <w:sz w:val="22"/>
+          <w:szCs w:val="22"/>
+        </w:rPr>
+        <w:t>{% if conservancy.rainfa</w:t>
+      </w:r>
+      <w:bookmarkStart w:id="0" w:name="_GoBack"/>
+      <w:bookmarkEnd w:id="0"/>
+      <w:r>
+        <w:rPr>
+          <w:rFonts w:ascii="Cambria" w:hAnsi="Cambria"/>
+          <w:b/>
+          <w:bCs w:val="0"/>
+          <w:color w:val="000000"/>
+          <w:sz w:val="22"/>
+          <w:szCs w:val="22"/>
+        </w:rPr>
+        <w:t>ll %}</w:t>
+      </w:r>
+    </w:p>
+    <w:tbl>
+      <w:tblPr>
+        <w:tblStyle w:val="ListTable4-Accent6"/>
+        <w:tblW w:w="0" w:type="auto"/>
+        <w:tblLook w:val="04A0" w:firstRow="1" w:lastRow="0" w:firstColumn="1" w:lastColumn="0" w:noHBand="0" w:noVBand="1"/>
+      </w:tblPr>
+      <w:tblGrid>
+        <w:gridCol w:w="7195"/>
+        <w:gridCol w:w="2155"/>
+      </w:tblGrid>
+      <w:tr>
+        <w:trPr>
+          <w:cnfStyle w:val="100000000000" w:firstRow="1" w:lastRow="0" w:firstColumn="0" w:lastColumn="0" w:oddVBand="0" w:evenVBand="0" w:oddHBand="0" w:evenHBand="0" w:firstRowFirstColumn="0" w:firstRowLastColumn="0" w:lastRowFirstColumn="0" w:lastRowLastColumn="0"/>
+        </w:trPr>
+        <w:tc>
+          <w:tcPr>
+            <w:cnfStyle w:val="001000000000" w:firstRow="0" w:lastRow="0" w:firstColumn="1" w:lastColumn="0" w:oddVBand="0" w:evenVBand="0" w:oddHBand="0" w:evenHBand="0" w:firstRowFirstColumn="0" w:firstRowLastColumn="0" w:lastRowFirstColumn="0" w:lastRowLastColumn="0"/>
+            <w:tcW w:w="7195" w:type="dxa"/>
+          </w:tcPr>
+          <w:p>
+            <w:pPr>
+              <w:keepLines/>
+              <w:spacing w:after="0"/>
+              <w:jc w:val="left"/>
+              <w:rPr>
+                <w:rFonts w:ascii="Calibri" w:hAnsi="Calibri"/>
+                <w:sz w:val="22"/>
+                <w:szCs w:val="22"/>
+              </w:rPr>
+            </w:pPr>
+            <w:r>
+              <w:rPr>
+                <w:rFonts w:ascii="Calibri" w:hAnsi="Calibri"/>
+                <w:sz w:val="22"/>
+                <w:szCs w:val="22"/>
+              </w:rPr>
+              <w:t>Station</w:t>
+            </w:r>
+          </w:p>
+        </w:tc>
+        <w:tc>
+          <w:tcPr>
+            <w:tcW w:w="2155" w:type="dxa"/>
+          </w:tcPr>
+          <w:p>
+            <w:pPr>
+              <w:keepLines/>
+              <w:spacing w:after="0"/>
+              <w:jc w:val="left"/>
+              <w:cnfStyle w:val="100000000000" w:firstRow="1" w:lastRow="0" w:firstColumn="0" w:lastColumn="0" w:oddVBand="0" w:evenVBand="0" w:oddHBand="0" w:evenHBand="0" w:firstRowFirstColumn="0" w:firstRowLastColumn="0" w:lastRowFirstColumn="0" w:lastRowLastColumn="0"/>
+              <w:rPr>
+                <w:rFonts w:ascii="Calibri" w:hAnsi="Calibri"/>
+                <w:sz w:val="22"/>
+                <w:szCs w:val="22"/>
+              </w:rPr>
+            </w:pPr>
+            <w:r>
+              <w:rPr>
+                <w:rFonts w:ascii="Calibri" w:hAnsi="Calibri"/>
+                <w:sz w:val="22"/>
+                <w:szCs w:val="22"/>
+              </w:rPr>
+              <w:t>Total millimeters</w:t>
+            </w:r>
+          </w:p>
+        </w:tc>
+      </w:tr>
+      <w:tr>
+        <w:trPr>
+          <w:cnfStyle w:val="000000100000" w:firstRow="0" w:lastRow="0" w:firstColumn="0" w:lastColumn="0" w:oddVBand="0" w:evenVBand="0" w:oddHBand="1" w:evenHBand="0" w:firstRowFirstColumn="0" w:firstRowLastColumn="0" w:lastRowFirstColumn="0" w:lastRowLastColumn="0"/>
+          <w:trHeight w:val="224"/>
+        </w:trPr>
+        <w:tc>
+          <w:tcPr>
+            <w:cnfStyle w:val="001000000000" w:firstRow="0" w:lastRow="0" w:firstColumn="1" w:lastColumn="0" w:oddVBand="0" w:evenVBand="0" w:oddHBand="0" w:evenHBand="0" w:firstRowFirstColumn="0" w:firstRowLastColumn="0" w:lastRowFirstColumn="0" w:lastRowLastColumn="0"/>
+            <w:tcW w:w="7195" w:type="dxa"/>
+          </w:tcPr>
+          <w:p>
+            <w:pPr>
+              <w:keepLines/>
+              <w:tabs>
+                <w:tab w:val="clear" w:pos="2940"/>
+                <w:tab w:val="center" w:pos="995"/>
+              </w:tabs>
+              <w:spacing w:before="0" w:beforeAutospacing="0" w:after="0"/>
+              <w:rPr>
+                <w:rFonts w:ascii="Cambria" w:hAnsi="Cambria"/>
+                <w:b w:val="0"/>
+                <w:color w:val="000000"/>
+                <w:sz w:val="22"/>
+                <w:szCs w:val="22"/>
+              </w:rPr>
+            </w:pPr>
+            <w:r>
+              <w:rPr>
+                <w:rFonts w:ascii="Cambria" w:hAnsi="Cambria"/>
+                <w:b w:val="0"/>
+                <w:color w:val="000000"/>
+                <w:sz w:val="22"/>
+                <w:szCs w:val="22"/>
+              </w:rPr>
+              <w:t>{%tr for item in conservancy.rainfall %}</w:t>
+            </w:r>
+          </w:p>
+        </w:tc>
+        <w:tc>
+          <w:tcPr>
+            <w:tcW w:w="2155" w:type="dxa"/>
+          </w:tcPr>
+          <w:p>
+            <w:pPr>
+              <w:keepLines/>
+              <w:tabs>
+                <w:tab w:val="clear" w:pos="2940"/>
+                <w:tab w:val="center" w:pos="995"/>
+              </w:tabs>
+              <w:spacing w:before="0" w:beforeAutospacing="0" w:after="0"/>
+              <w:cnfStyle w:val="000000100000" w:firstRow="0" w:lastRow="0" w:firstColumn="0" w:lastColumn="0" w:oddVBand="0" w:evenVBand="0" w:oddHBand="1" w:evenHBand="0" w:firstRowFirstColumn="0" w:firstRowLastColumn="0" w:lastRowFirstColumn="0" w:lastRowLastColumn="0"/>
+              <w:rPr>
+                <w:rFonts w:ascii="Cambria" w:hAnsi="Cambria"/>
+                <w:b/>
+                <w:color w:val="000000"/>
+                <w:sz w:val="22"/>
+                <w:szCs w:val="22"/>
+              </w:rPr>
+            </w:pPr>
+          </w:p>
+        </w:tc>
+      </w:tr>
+      <w:tr>
+        <w:trPr>
+          <w:trHeight w:val="83"/>
+        </w:trPr>
+        <w:tc>
+          <w:tcPr>
+            <w:cnfStyle w:val="001000000000" w:firstRow="0" w:lastRow="0" w:firstColumn="1" w:lastColumn="0" w:oddVBand="0" w:evenVBand="0" w:oddHBand="0" w:evenHBand="0" w:firstRowFirstColumn="0" w:firstRowLastColumn="0" w:lastRowFirstColumn="0" w:lastRowLastColumn="0"/>
+            <w:tcW w:w="7195" w:type="dxa"/>
+          </w:tcPr>
+          <w:p>
+            <w:pPr>
+              <w:keepLines/>
+              <w:tabs>
+                <w:tab w:val="clear" w:pos="2940"/>
+                <w:tab w:val="center" w:pos="995"/>
+              </w:tabs>
+              <w:spacing w:before="0" w:beforeAutospacing="0" w:after="0"/>
+              <w:rPr>
+                <w:rFonts w:ascii="Cambria" w:hAnsi="Cambria"/>
+                <w:b w:val="0"/>
+                <w:color w:val="000000"/>
+                <w:sz w:val="22"/>
+                <w:szCs w:val="22"/>
+              </w:rPr>
+            </w:pPr>
+            <w:r>
+              <w:rPr>
+                <w:rFonts w:ascii="Cambria" w:hAnsi="Cambria"/>
+                <w:b w:val="0"/>
+                <w:color w:val="000000"/>
+                <w:sz w:val="22"/>
+                <w:szCs w:val="22"/>
+              </w:rPr>
+              <w:t>{{ item.station }}</w:t>
+            </w:r>
+          </w:p>
+        </w:tc>
+        <w:tc>
+          <w:tcPr>
+            <w:tcW w:w="2155" w:type="dxa"/>
+          </w:tcPr>
+          <w:p>
+            <w:pPr>
+              <w:keepLines/>
+              <w:tabs>
+                <w:tab w:val="clear" w:pos="2940"/>
+                <w:tab w:val="center" w:pos="995"/>
+              </w:tabs>
+              <w:spacing w:before="0" w:beforeAutospacing="0" w:after="0"/>
+              <w:cnfStyle w:val="000000000000" w:firstRow="0" w:lastRow="0" w:firstColumn="0" w:lastColumn="0" w:oddVBand="0" w:evenVBand="0" w:oddHBand="0" w:evenHBand="0" w:firstRowFirstColumn="0" w:firstRowLastColumn="0" w:lastRowFirstColumn="0" w:lastRowLastColumn="0"/>
+              <w:rPr>
+                <w:rFonts w:ascii="Cambria" w:hAnsi="Cambria"/>
+                <w:color w:val="000000"/>
+                <w:sz w:val="22"/>
+                <w:szCs w:val="22"/>
+              </w:rPr>
+            </w:pPr>
+            <w:r>
+              <w:rPr>
+                <w:rFonts w:ascii="Cambria" w:hAnsi="Cambria"/>
+                <w:color w:val="000000"/>
+                <w:sz w:val="22"/>
+                <w:szCs w:val="22"/>
+              </w:rPr>
+              <w:t>{{ item.total_mm }}</w:t>
+            </w:r>
+          </w:p>
+        </w:tc>
+      </w:tr>
+      <w:tr>
+        <w:trPr>
+          <w:cnfStyle w:val="000000100000" w:firstRow="0" w:lastRow="0" w:firstColumn="0" w:lastColumn="0" w:oddVBand="0" w:evenVBand="0" w:oddHBand="1" w:evenHBand="0" w:firstRowFirstColumn="0" w:firstRowLastColumn="0" w:lastRowFirstColumn="0" w:lastRowLastColumn="0"/>
+          <w:trHeight w:val="143"/>
+        </w:trPr>
+        <w:tc>
+          <w:tcPr>
+            <w:cnfStyle w:val="001000000000" w:firstRow="0" w:lastRow="0" w:firstColumn="1" w:lastColumn="0" w:oddVBand="0" w:evenVBand="0" w:oddHBand="0" w:evenHBand="0" w:firstRowFirstColumn="0" w:firstRowLastColumn="0" w:lastRowFirstColumn="0" w:lastRowLastColumn="0"/>
+            <w:tcW w:w="7195" w:type="dxa"/>
+          </w:tcPr>
+          <w:p>
+            <w:pPr>
+              <w:keepLines/>
+              <w:tabs>
+                <w:tab w:val="clear" w:pos="2940"/>
+                <w:tab w:val="center" w:pos="995"/>
+              </w:tabs>
+              <w:spacing w:before="0" w:beforeAutospacing="0" w:after="0"/>
+              <w:rPr>
+                <w:rFonts w:ascii="Cambria" w:hAnsi="Cambria"/>
+                <w:b w:val="0"/>
+                <w:color w:val="000000"/>
+                <w:sz w:val="22"/>
+                <w:szCs w:val="22"/>
+              </w:rPr>
+            </w:pPr>
+            <w:r>
+              <w:rPr>
+                <w:rFonts w:ascii="Cambria" w:hAnsi="Cambria"/>
+                <w:b w:val="0"/>
+                <w:color w:val="000000"/>
+                <w:sz w:val="22"/>
+                <w:szCs w:val="22"/>
+              </w:rPr>
+              <w:t>{%tr endfor %}</w:t>
+            </w:r>
+          </w:p>
+        </w:tc>
+        <w:tc>
+          <w:tcPr>
+            <w:tcW w:w="2155" w:type="dxa"/>
+          </w:tcPr>
+          <w:p>
+            <w:pPr>
+              <w:keepLines/>
+              <w:tabs>
+                <w:tab w:val="clear" w:pos="2940"/>
+                <w:tab w:val="center" w:pos="995"/>
+              </w:tabs>
+              <w:spacing w:before="0" w:beforeAutospacing="0" w:after="0"/>
+              <w:cnfStyle w:val="000000100000" w:firstRow="0" w:lastRow="0" w:firstColumn="0" w:lastColumn="0" w:oddVBand="0" w:evenVBand="0" w:oddHBand="1" w:evenHBand="0" w:firstRowFirstColumn="0" w:firstRowLastColumn="0" w:lastRowFirstColumn="0" w:lastRowLastColumn="0"/>
+              <w:rPr>
+                <w:rFonts w:ascii="Cambria" w:hAnsi="Cambria"/>
+                <w:b/>
+                <w:color w:val="000000"/>
+                <w:sz w:val="22"/>
+                <w:szCs w:val="22"/>
+              </w:rPr>
+            </w:pPr>
+          </w:p>
+        </w:tc>
+      </w:tr>
+    </w:tbl>
+    <w:p>
+      <w:pPr>
+        <w:tabs>
+          <w:tab w:val="clear" w:pos="2940"/>
+          <w:tab w:val="center" w:pos="995"/>
+        </w:tabs>
+        <w:spacing w:before="0" w:beforeAutospacing="0" w:after="0"/>
+        <w:rPr>
+          <w:rFonts w:ascii="Cambria" w:hAnsi="Cambria"/>
+          <w:bCs w:val="0"/>
+          <w:color w:val="000000"/>
+          <w:sz w:val="22"/>
+          <w:szCs w:val="22"/>
+        </w:rPr>
+      </w:pPr>
+      <w:r>
+        <w:rPr>
+          <w:rFonts w:ascii="Cambria" w:hAnsi="Cambria"/>
+          <w:bCs w:val="0"/>
+          <w:color w:val="000000"/>
+          <w:sz w:val="22"/>
+          <w:szCs w:val="22"/>
+        </w:rPr>
+        <w:t>{% else %}</w:t>
+      </w:r>
+    </w:p>
+    <w:p>
+      <w:pPr>
+        <w:pStyle w:val="ListParagraph"/>
+        <w:numPr>
+          <w:ilvl w:val="0"/>
+          <w:numId w:val="49"/>
+        </w:numPr>
+        <w:tabs>
+          <w:tab w:val="clear" w:pos="2940"/>
+          <w:tab w:val="center" w:pos="995"/>
+        </w:tabs>
+        <w:spacing w:before="0" w:beforeAutospacing="0" w:after="0"/>
+        <w:rPr>
+          <w:rFonts w:ascii="Cambria" w:hAnsi="Cambria"/>
+          <w:bCs w:val="0"/>
+          <w:color w:val="000000"/>
+          <w:sz w:val="22"/>
+          <w:szCs w:val="22"/>
+        </w:rPr>
+      </w:pPr>
+      <w:r>
+        <w:rPr>
+          <w:rFonts w:ascii="Cambria" w:hAnsi="Cambria"/>
+          <w:bCs w:val="0"/>
+          <w:color w:val="000000"/>
+          <w:sz w:val="22"/>
+          <w:szCs w:val="22"/>
+        </w:rPr>
+        <w:t>No new rainfall report.</w:t>
+      </w:r>
+    </w:p>
+    <w:p>
+      <w:pPr>
+        <w:tabs>
+          <w:tab w:val="clear" w:pos="2940"/>
+          <w:tab w:val="center" w:pos="995"/>
+        </w:tabs>
+        <w:spacing w:before="0" w:beforeAutospacing="0" w:after="0"/>
+        <w:rPr>
+          <w:rFonts w:ascii="Cambria" w:hAnsi="Cambria"/>
+          <w:bCs w:val="0"/>
+          <w:color w:val="000000"/>
+          <w:sz w:val="22"/>
+          <w:szCs w:val="22"/>
+        </w:rPr>
+      </w:pPr>
+      <w:r>
+        <w:rPr>
+          <w:rFonts w:ascii="Cambria" w:hAnsi="Cambria"/>
+          <w:bCs w:val="0"/>
+          <w:color w:val="000000"/>
+          <w:sz w:val="22"/>
+          <w:szCs w:val="22"/>
+        </w:rPr>
+        <w:t>{% endif %}</w:t>
+      </w:r>
     </w:p>
     <w:p>
       <w:pPr>
@@ -2966,6 +5204,7 @@
           <w:sz w:val="22"/>
           <w:szCs w:val="22"/>
         </w:rPr>
+        <w:lastRenderedPageBreak/>
         <w:t>Fence Breaks</w:t>
       </w:r>
     </w:p>
@@ -4002,7 +6241,7 @@
         <v:path o:extrusionok="f" gradientshapeok="t" o:connecttype="rect"/>
         <o:lock v:ext="edit" aspectratio="t"/>
       </v:shapetype>
-      <v:shape id="_x0000_i1055" type="#_x0000_t75" style="width:10.95pt;height:10.95pt" o:bullet="t">
+      <v:shape id="_x0000_i1137" type="#_x0000_t75" style="width:10.95pt;height:10.95pt" o:bullet="t">
         <v:imagedata r:id="rId1" o:title="mso53BE"/>
       </v:shape>
     </w:pict>
@@ -4010,7 +6249,7 @@
   <w:abstractNum w:abstractNumId="0">
     <w:nsid w:val="FFFFFF1D"/>
     <w:multiLevelType w:val="multilevel"/>
-    <w:tmpl w:val="676AC244"/>
+    <w:tmpl w:val="24262FDA"/>
     <w:lvl w:ilvl="0">
       <w:start w:val="1"/>
       <w:numFmt w:val="bullet"/>
@@ -5475,6 +7714,118 @@
     </w:lvl>
   </w:abstractNum>
   <w:abstractNum w:abstractNumId="13">
+    <w:nsid w:val="10E00BB0"/>
+    <w:multiLevelType w:val="hybridMultilevel"/>
+    <w:tmpl w:val="8E5A7C5C"/>
+    <w:lvl w:ilvl="0" w:tplc="53AEC75C">
+      <w:numFmt w:val="bullet"/>
+      <w:lvlText w:val="-"/>
+      <w:lvlJc w:val="left"/>
+      <w:pPr>
+        <w:ind w:left="720" w:hanging="360"/>
+      </w:pPr>
+      <w:rPr>
+        <w:rFonts w:ascii="Cambria" w:eastAsia="Calibri" w:hAnsi="Cambria" w:cs="Arial" w:hint="default"/>
+      </w:rPr>
+    </w:lvl>
+    <w:lvl w:ilvl="1" w:tplc="04090003" w:tentative="1">
+      <w:start w:val="1"/>
+      <w:numFmt w:val="bullet"/>
+      <w:lvlText w:val="o"/>
+      <w:lvlJc w:val="left"/>
+      <w:pPr>
+        <w:ind w:left="1440" w:hanging="360"/>
+      </w:pPr>
+      <w:rPr>
+        <w:rFonts w:ascii="Courier New" w:hAnsi="Courier New" w:cs="Courier New" w:hint="default"/>
+      </w:rPr>
+    </w:lvl>
+    <w:lvl w:ilvl="2" w:tplc="04090005" w:tentative="1">
+      <w:start w:val="1"/>
+      <w:numFmt w:val="bullet"/>
+      <w:lvlText w:val=""/>
+      <w:lvlJc w:val="left"/>
+      <w:pPr>
+        <w:ind w:left="2160" w:hanging="360"/>
+      </w:pPr>
+      <w:rPr>
+        <w:rFonts w:ascii="Wingdings" w:hAnsi="Wingdings" w:hint="default"/>
+      </w:rPr>
+    </w:lvl>
+    <w:lvl w:ilvl="3" w:tplc="04090001" w:tentative="1">
+      <w:start w:val="1"/>
+      <w:numFmt w:val="bullet"/>
+      <w:lvlText w:val=""/>
+      <w:lvlJc w:val="left"/>
+      <w:pPr>
+        <w:ind w:left="2880" w:hanging="360"/>
+      </w:pPr>
+      <w:rPr>
+        <w:rFonts w:ascii="Symbol" w:hAnsi="Symbol" w:hint="default"/>
+      </w:rPr>
+    </w:lvl>
+    <w:lvl w:ilvl="4" w:tplc="04090003" w:tentative="1">
+      <w:start w:val="1"/>
+      <w:numFmt w:val="bullet"/>
+      <w:lvlText w:val="o"/>
+      <w:lvlJc w:val="left"/>
+      <w:pPr>
+        <w:ind w:left="3600" w:hanging="360"/>
+      </w:pPr>
+      <w:rPr>
+        <w:rFonts w:ascii="Courier New" w:hAnsi="Courier New" w:cs="Courier New" w:hint="default"/>
+      </w:rPr>
+    </w:lvl>
+    <w:lvl w:ilvl="5" w:tplc="04090005" w:tentative="1">
+      <w:start w:val="1"/>
+      <w:numFmt w:val="bullet"/>
+      <w:lvlText w:val=""/>
+      <w:lvlJc w:val="left"/>
+      <w:pPr>
+        <w:ind w:left="4320" w:hanging="360"/>
+      </w:pPr>
+      <w:rPr>
+        <w:rFonts w:ascii="Wingdings" w:hAnsi="Wingdings" w:hint="default"/>
+      </w:rPr>
+    </w:lvl>
+    <w:lvl w:ilvl="6" w:tplc="04090001" w:tentative="1">
+      <w:start w:val="1"/>
+      <w:numFmt w:val="bullet"/>
+      <w:lvlText w:val=""/>
+      <w:lvlJc w:val="left"/>
+      <w:pPr>
+        <w:ind w:left="5040" w:hanging="360"/>
+      </w:pPr>
+      <w:rPr>
+        <w:rFonts w:ascii="Symbol" w:hAnsi="Symbol" w:hint="default"/>
+      </w:rPr>
+    </w:lvl>
+    <w:lvl w:ilvl="7" w:tplc="04090003" w:tentative="1">
+      <w:start w:val="1"/>
+      <w:numFmt w:val="bullet"/>
+      <w:lvlText w:val="o"/>
+      <w:lvlJc w:val="left"/>
+      <w:pPr>
+        <w:ind w:left="5760" w:hanging="360"/>
+      </w:pPr>
+      <w:rPr>
+        <w:rFonts w:ascii="Courier New" w:hAnsi="Courier New" w:cs="Courier New" w:hint="default"/>
+      </w:rPr>
+    </w:lvl>
+    <w:lvl w:ilvl="8" w:tplc="04090005" w:tentative="1">
+      <w:start w:val="1"/>
+      <w:numFmt w:val="bullet"/>
+      <w:lvlText w:val=""/>
+      <w:lvlJc w:val="left"/>
+      <w:pPr>
+        <w:ind w:left="6480" w:hanging="360"/>
+      </w:pPr>
+      <w:rPr>
+        <w:rFonts w:ascii="Wingdings" w:hAnsi="Wingdings" w:hint="default"/>
+      </w:rPr>
+    </w:lvl>
+  </w:abstractNum>
+  <w:abstractNum w:abstractNumId="14">
     <w:nsid w:val="152F6CEC"/>
     <w:multiLevelType w:val="hybridMultilevel"/>
     <w:tmpl w:val="ACCA6096"/>
@@ -5560,7 +7911,7 @@
       </w:pPr>
     </w:lvl>
   </w:abstractNum>
-  <w:abstractNum w:abstractNumId="14">
+  <w:abstractNum w:abstractNumId="15">
     <w:nsid w:val="16B72C20"/>
     <w:multiLevelType w:val="hybridMultilevel"/>
     <w:tmpl w:val="180CDEA8"/>
@@ -5674,7 +8025,7 @@
       </w:rPr>
     </w:lvl>
   </w:abstractNum>
-  <w:abstractNum w:abstractNumId="15">
+  <w:abstractNum w:abstractNumId="16">
     <w:nsid w:val="173D418B"/>
     <w:multiLevelType w:val="hybridMultilevel"/>
     <w:tmpl w:val="6F2EC474"/>
@@ -5787,7 +8138,7 @@
       </w:rPr>
     </w:lvl>
   </w:abstractNum>
-  <w:abstractNum w:abstractNumId="16">
+  <w:abstractNum w:abstractNumId="17">
     <w:nsid w:val="176E070D"/>
     <w:multiLevelType w:val="hybridMultilevel"/>
     <w:tmpl w:val="84C8921C"/>
@@ -5900,7 +8251,7 @@
       </w:rPr>
     </w:lvl>
   </w:abstractNum>
-  <w:abstractNum w:abstractNumId="17">
+  <w:abstractNum w:abstractNumId="18">
     <w:nsid w:val="19EC1AD4"/>
     <w:multiLevelType w:val="hybridMultilevel"/>
     <w:tmpl w:val="7010A2F2"/>
@@ -6013,7 +8364,7 @@
       </w:rPr>
     </w:lvl>
   </w:abstractNum>
-  <w:abstractNum w:abstractNumId="18">
+  <w:abstractNum w:abstractNumId="19">
     <w:nsid w:val="1D421489"/>
     <w:multiLevelType w:val="hybridMultilevel"/>
     <w:tmpl w:val="B85065BA"/>
@@ -6126,7 +8477,7 @@
       </w:rPr>
     </w:lvl>
   </w:abstractNum>
-  <w:abstractNum w:abstractNumId="19">
+  <w:abstractNum w:abstractNumId="20">
     <w:nsid w:val="1D6C70A6"/>
     <w:multiLevelType w:val="hybridMultilevel"/>
     <w:tmpl w:val="2C54FD7C"/>
@@ -6239,7 +8590,7 @@
       </w:rPr>
     </w:lvl>
   </w:abstractNum>
-  <w:abstractNum w:abstractNumId="20">
+  <w:abstractNum w:abstractNumId="21">
     <w:nsid w:val="1DA20445"/>
     <w:multiLevelType w:val="hybridMultilevel"/>
     <w:tmpl w:val="7B3C1C20"/>
@@ -6352,7 +8703,7 @@
       </w:rPr>
     </w:lvl>
   </w:abstractNum>
-  <w:abstractNum w:abstractNumId="21">
+  <w:abstractNum w:abstractNumId="22">
     <w:nsid w:val="1DD82622"/>
     <w:multiLevelType w:val="hybridMultilevel"/>
     <w:tmpl w:val="07DA71FE"/>
@@ -6465,7 +8816,7 @@
       </w:rPr>
     </w:lvl>
   </w:abstractNum>
-  <w:abstractNum w:abstractNumId="22">
+  <w:abstractNum w:abstractNumId="23">
     <w:nsid w:val="1E8C177B"/>
     <w:multiLevelType w:val="hybridMultilevel"/>
     <w:tmpl w:val="DF5A197C"/>
@@ -6578,7 +8929,119 @@
       </w:rPr>
     </w:lvl>
   </w:abstractNum>
-  <w:abstractNum w:abstractNumId="23">
+  <w:abstractNum w:abstractNumId="24">
+    <w:nsid w:val="266E722D"/>
+    <w:multiLevelType w:val="hybridMultilevel"/>
+    <w:tmpl w:val="0B369846"/>
+    <w:lvl w:ilvl="0" w:tplc="890C27B0">
+      <w:numFmt w:val="bullet"/>
+      <w:lvlText w:val="-"/>
+      <w:lvlJc w:val="left"/>
+      <w:pPr>
+        <w:ind w:left="720" w:hanging="360"/>
+      </w:pPr>
+      <w:rPr>
+        <w:rFonts w:ascii="Cambria" w:eastAsia="Calibri" w:hAnsi="Cambria" w:cs="Arial" w:hint="default"/>
+      </w:rPr>
+    </w:lvl>
+    <w:lvl w:ilvl="1" w:tplc="04090003" w:tentative="1">
+      <w:start w:val="1"/>
+      <w:numFmt w:val="bullet"/>
+      <w:lvlText w:val="o"/>
+      <w:lvlJc w:val="left"/>
+      <w:pPr>
+        <w:ind w:left="1440" w:hanging="360"/>
+      </w:pPr>
+      <w:rPr>
+        <w:rFonts w:ascii="Courier New" w:hAnsi="Courier New" w:cs="Courier New" w:hint="default"/>
+      </w:rPr>
+    </w:lvl>
+    <w:lvl w:ilvl="2" w:tplc="04090005" w:tentative="1">
+      <w:start w:val="1"/>
+      <w:numFmt w:val="bullet"/>
+      <w:lvlText w:val=""/>
+      <w:lvlJc w:val="left"/>
+      <w:pPr>
+        <w:ind w:left="2160" w:hanging="360"/>
+      </w:pPr>
+      <w:rPr>
+        <w:rFonts w:ascii="Wingdings" w:hAnsi="Wingdings" w:hint="default"/>
+      </w:rPr>
+    </w:lvl>
+    <w:lvl w:ilvl="3" w:tplc="04090001" w:tentative="1">
+      <w:start w:val="1"/>
+      <w:numFmt w:val="bullet"/>
+      <w:lvlText w:val=""/>
+      <w:lvlJc w:val="left"/>
+      <w:pPr>
+        <w:ind w:left="2880" w:hanging="360"/>
+      </w:pPr>
+      <w:rPr>
+        <w:rFonts w:ascii="Symbol" w:hAnsi="Symbol" w:hint="default"/>
+      </w:rPr>
+    </w:lvl>
+    <w:lvl w:ilvl="4" w:tplc="04090003" w:tentative="1">
+      <w:start w:val="1"/>
+      <w:numFmt w:val="bullet"/>
+      <w:lvlText w:val="o"/>
+      <w:lvlJc w:val="left"/>
+      <w:pPr>
+        <w:ind w:left="3600" w:hanging="360"/>
+      </w:pPr>
+      <w:rPr>
+        <w:rFonts w:ascii="Courier New" w:hAnsi="Courier New" w:cs="Courier New" w:hint="default"/>
+      </w:rPr>
+    </w:lvl>
+    <w:lvl w:ilvl="5" w:tplc="04090005" w:tentative="1">
+      <w:start w:val="1"/>
+      <w:numFmt w:val="bullet"/>
+      <w:lvlText w:val=""/>
+      <w:lvlJc w:val="left"/>
+      <w:pPr>
+        <w:ind w:left="4320" w:hanging="360"/>
+      </w:pPr>
+      <w:rPr>
+        <w:rFonts w:ascii="Wingdings" w:hAnsi="Wingdings" w:hint="default"/>
+      </w:rPr>
+    </w:lvl>
+    <w:lvl w:ilvl="6" w:tplc="04090001" w:tentative="1">
+      <w:start w:val="1"/>
+      <w:numFmt w:val="bullet"/>
+      <w:lvlText w:val=""/>
+      <w:lvlJc w:val="left"/>
+      <w:pPr>
+        <w:ind w:left="5040" w:hanging="360"/>
+      </w:pPr>
+      <w:rPr>
+        <w:rFonts w:ascii="Symbol" w:hAnsi="Symbol" w:hint="default"/>
+      </w:rPr>
+    </w:lvl>
+    <w:lvl w:ilvl="7" w:tplc="04090003" w:tentative="1">
+      <w:start w:val="1"/>
+      <w:numFmt w:val="bullet"/>
+      <w:lvlText w:val="o"/>
+      <w:lvlJc w:val="left"/>
+      <w:pPr>
+        <w:ind w:left="5760" w:hanging="360"/>
+      </w:pPr>
+      <w:rPr>
+        <w:rFonts w:ascii="Courier New" w:hAnsi="Courier New" w:cs="Courier New" w:hint="default"/>
+      </w:rPr>
+    </w:lvl>
+    <w:lvl w:ilvl="8" w:tplc="04090005" w:tentative="1">
+      <w:start w:val="1"/>
+      <w:numFmt w:val="bullet"/>
+      <w:lvlText w:val=""/>
+      <w:lvlJc w:val="left"/>
+      <w:pPr>
+        <w:ind w:left="6480" w:hanging="360"/>
+      </w:pPr>
+      <w:rPr>
+        <w:rFonts w:ascii="Wingdings" w:hAnsi="Wingdings" w:hint="default"/>
+      </w:rPr>
+    </w:lvl>
+  </w:abstractNum>
+  <w:abstractNum w:abstractNumId="25">
     <w:nsid w:val="26EA08A0"/>
     <w:multiLevelType w:val="hybridMultilevel"/>
     <w:tmpl w:val="829641E4"/>
@@ -6691,7 +9154,7 @@
       </w:rPr>
     </w:lvl>
   </w:abstractNum>
-  <w:abstractNum w:abstractNumId="24">
+  <w:abstractNum w:abstractNumId="26">
     <w:nsid w:val="2C0165F4"/>
     <w:multiLevelType w:val="hybridMultilevel"/>
     <w:tmpl w:val="334E897E"/>
@@ -6804,7 +9267,7 @@
       </w:rPr>
     </w:lvl>
   </w:abstractNum>
-  <w:abstractNum w:abstractNumId="25">
+  <w:abstractNum w:abstractNumId="27">
     <w:nsid w:val="2D8F72F3"/>
     <w:multiLevelType w:val="hybridMultilevel"/>
     <w:tmpl w:val="52A2965E"/>
@@ -6917,7 +9380,7 @@
       </w:rPr>
     </w:lvl>
   </w:abstractNum>
-  <w:abstractNum w:abstractNumId="26">
+  <w:abstractNum w:abstractNumId="28">
     <w:nsid w:val="2DC643BA"/>
     <w:multiLevelType w:val="hybridMultilevel"/>
     <w:tmpl w:val="0ECAA710"/>
@@ -7030,7 +9493,7 @@
       </w:rPr>
     </w:lvl>
   </w:abstractNum>
-  <w:abstractNum w:abstractNumId="27">
+  <w:abstractNum w:abstractNumId="29">
     <w:nsid w:val="2ECA38EF"/>
     <w:multiLevelType w:val="hybridMultilevel"/>
     <w:tmpl w:val="B11E4A3C"/>
@@ -7116,7 +9579,7 @@
       </w:pPr>
     </w:lvl>
   </w:abstractNum>
-  <w:abstractNum w:abstractNumId="28">
+  <w:abstractNum w:abstractNumId="30">
     <w:nsid w:val="2FAC132D"/>
     <w:multiLevelType w:val="hybridMultilevel"/>
     <w:tmpl w:val="BE729FAA"/>
@@ -7229,7 +9692,7 @@
       </w:rPr>
     </w:lvl>
   </w:abstractNum>
-  <w:abstractNum w:abstractNumId="29">
+  <w:abstractNum w:abstractNumId="31">
     <w:nsid w:val="313E5EB6"/>
     <w:multiLevelType w:val="hybridMultilevel"/>
     <w:tmpl w:val="88D039CA"/>
@@ -7342,7 +9805,7 @@
       </w:rPr>
     </w:lvl>
   </w:abstractNum>
-  <w:abstractNum w:abstractNumId="30">
+  <w:abstractNum w:abstractNumId="32">
     <w:nsid w:val="33404EF4"/>
     <w:multiLevelType w:val="hybridMultilevel"/>
     <w:tmpl w:val="561E4182"/>
@@ -7455,7 +9918,7 @@
       </w:rPr>
     </w:lvl>
   </w:abstractNum>
-  <w:abstractNum w:abstractNumId="31">
+  <w:abstractNum w:abstractNumId="33">
     <w:nsid w:val="3E9C38AB"/>
     <w:multiLevelType w:val="hybridMultilevel"/>
     <w:tmpl w:val="6680BB0E"/>
@@ -7568,7 +10031,7 @@
       </w:rPr>
     </w:lvl>
   </w:abstractNum>
-  <w:abstractNum w:abstractNumId="32">
+  <w:abstractNum w:abstractNumId="34">
     <w:nsid w:val="46015606"/>
     <w:multiLevelType w:val="hybridMultilevel"/>
     <w:tmpl w:val="DF5AFE54"/>
@@ -7654,7 +10117,7 @@
       </w:pPr>
     </w:lvl>
   </w:abstractNum>
-  <w:abstractNum w:abstractNumId="33">
+  <w:abstractNum w:abstractNumId="35">
     <w:nsid w:val="49A178BE"/>
     <w:multiLevelType w:val="hybridMultilevel"/>
     <w:tmpl w:val="78A25DCE"/>
@@ -7767,7 +10230,7 @@
       </w:rPr>
     </w:lvl>
   </w:abstractNum>
-  <w:abstractNum w:abstractNumId="34">
+  <w:abstractNum w:abstractNumId="36">
     <w:nsid w:val="49E10486"/>
     <w:multiLevelType w:val="hybridMultilevel"/>
     <w:tmpl w:val="2EBE7E82"/>
@@ -7880,7 +10343,7 @@
       </w:rPr>
     </w:lvl>
   </w:abstractNum>
-  <w:abstractNum w:abstractNumId="35">
+  <w:abstractNum w:abstractNumId="37">
     <w:nsid w:val="4A776D3C"/>
     <w:multiLevelType w:val="hybridMultilevel"/>
     <w:tmpl w:val="C096D040"/>
@@ -7993,7 +10456,7 @@
       </w:rPr>
     </w:lvl>
   </w:abstractNum>
-  <w:abstractNum w:abstractNumId="36">
+  <w:abstractNum w:abstractNumId="38">
     <w:nsid w:val="582F4497"/>
     <w:multiLevelType w:val="hybridMultilevel"/>
     <w:tmpl w:val="25EC1AB0"/>
@@ -8106,7 +10569,7 @@
       </w:rPr>
     </w:lvl>
   </w:abstractNum>
-  <w:abstractNum w:abstractNumId="37">
+  <w:abstractNum w:abstractNumId="39">
     <w:nsid w:val="59BE1A59"/>
     <w:multiLevelType w:val="hybridMultilevel"/>
     <w:tmpl w:val="4D50860E"/>
@@ -8219,7 +10682,7 @@
       </w:rPr>
     </w:lvl>
   </w:abstractNum>
-  <w:abstractNum w:abstractNumId="38">
+  <w:abstractNum w:abstractNumId="40">
     <w:nsid w:val="5A57174F"/>
     <w:multiLevelType w:val="hybridMultilevel"/>
     <w:tmpl w:val="A85E93EA"/>
@@ -8332,7 +10795,7 @@
       </w:rPr>
     </w:lvl>
   </w:abstractNum>
-  <w:abstractNum w:abstractNumId="39">
+  <w:abstractNum w:abstractNumId="41">
     <w:nsid w:val="5C6F4872"/>
     <w:multiLevelType w:val="hybridMultilevel"/>
     <w:tmpl w:val="AB8A5472"/>
@@ -8445,7 +10908,7 @@
       </w:rPr>
     </w:lvl>
   </w:abstractNum>
-  <w:abstractNum w:abstractNumId="40">
+  <w:abstractNum w:abstractNumId="42">
     <w:nsid w:val="66436E6E"/>
     <w:multiLevelType w:val="hybridMultilevel"/>
     <w:tmpl w:val="020ABCB4"/>
@@ -8558,7 +11021,7 @@
       </w:rPr>
     </w:lvl>
   </w:abstractNum>
-  <w:abstractNum w:abstractNumId="41">
+  <w:abstractNum w:abstractNumId="43">
     <w:nsid w:val="68B77C52"/>
     <w:multiLevelType w:val="hybridMultilevel"/>
     <w:tmpl w:val="2D78BC38"/>
@@ -8671,7 +11134,7 @@
       </w:rPr>
     </w:lvl>
   </w:abstractNum>
-  <w:abstractNum w:abstractNumId="42">
+  <w:abstractNum w:abstractNumId="44">
     <w:nsid w:val="6B086D95"/>
     <w:multiLevelType w:val="hybridMultilevel"/>
     <w:tmpl w:val="82EAE472"/>
@@ -8784,7 +11247,7 @@
       </w:rPr>
     </w:lvl>
   </w:abstractNum>
-  <w:abstractNum w:abstractNumId="43">
+  <w:abstractNum w:abstractNumId="45">
     <w:nsid w:val="735146C6"/>
     <w:multiLevelType w:val="hybridMultilevel"/>
     <w:tmpl w:val="DE88970A"/>
@@ -8897,7 +11360,7 @@
       </w:rPr>
     </w:lvl>
   </w:abstractNum>
-  <w:abstractNum w:abstractNumId="44">
+  <w:abstractNum w:abstractNumId="46">
     <w:nsid w:val="74D9799D"/>
     <w:multiLevelType w:val="hybridMultilevel"/>
     <w:tmpl w:val="B8F28E16"/>
@@ -9010,7 +11473,7 @@
       </w:rPr>
     </w:lvl>
   </w:abstractNum>
-  <w:abstractNum w:abstractNumId="45">
+  <w:abstractNum w:abstractNumId="47">
     <w:nsid w:val="7559334D"/>
     <w:multiLevelType w:val="hybridMultilevel"/>
     <w:tmpl w:val="B3289B52"/>
@@ -9096,7 +11559,7 @@
       </w:pPr>
     </w:lvl>
   </w:abstractNum>
-  <w:abstractNum w:abstractNumId="46">
+  <w:abstractNum w:abstractNumId="48">
     <w:nsid w:val="788F68AF"/>
     <w:multiLevelType w:val="hybridMultilevel"/>
     <w:tmpl w:val="A934CDE8"/>
@@ -9182,7 +11645,7 @@
       </w:pPr>
     </w:lvl>
   </w:abstractNum>
-  <w:abstractNum w:abstractNumId="47">
+  <w:abstractNum w:abstractNumId="49">
     <w:nsid w:val="7BFD5C5C"/>
     <w:multiLevelType w:val="hybridMultilevel"/>
     <w:tmpl w:val="859E90D2"/>
@@ -9296,43 +11759,43 @@
     </w:lvl>
   </w:abstractNum>
   <w:num w:numId="1">
-    <w:abstractNumId w:val="37"/>
+    <w:abstractNumId w:val="39"/>
   </w:num>
   <w:num w:numId="2">
-    <w:abstractNumId w:val="19"/>
+    <w:abstractNumId w:val="20"/>
   </w:num>
   <w:num w:numId="3">
-    <w:abstractNumId w:val="39"/>
+    <w:abstractNumId w:val="41"/>
   </w:num>
   <w:num w:numId="4">
     <w:abstractNumId w:val="12"/>
   </w:num>
   <w:num w:numId="5">
-    <w:abstractNumId w:val="20"/>
+    <w:abstractNumId w:val="21"/>
   </w:num>
   <w:num w:numId="6">
-    <w:abstractNumId w:val="17"/>
+    <w:abstractNumId w:val="18"/>
   </w:num>
   <w:num w:numId="7">
-    <w:abstractNumId w:val="31"/>
+    <w:abstractNumId w:val="33"/>
   </w:num>
   <w:num w:numId="8">
     <w:abstractNumId w:val="10"/>
   </w:num>
   <w:num w:numId="9">
-    <w:abstractNumId w:val="38"/>
+    <w:abstractNumId w:val="40"/>
   </w:num>
   <w:num w:numId="10">
-    <w:abstractNumId w:val="34"/>
+    <w:abstractNumId w:val="36"/>
   </w:num>
   <w:num w:numId="11">
-    <w:abstractNumId w:val="35"/>
+    <w:abstractNumId w:val="37"/>
   </w:num>
   <w:num w:numId="12">
     <w:abstractNumId w:val="9"/>
   </w:num>
   <w:num w:numId="13">
-    <w:abstractNumId w:val="23"/>
+    <w:abstractNumId w:val="25"/>
   </w:num>
   <w:num w:numId="14">
     <w:abstractNumId w:val="3"/>
@@ -9341,10 +11804,10 @@
     <w:abstractNumId w:val="2"/>
   </w:num>
   <w:num w:numId="16">
-    <w:abstractNumId w:val="13"/>
+    <w:abstractNumId w:val="14"/>
   </w:num>
   <w:num w:numId="17">
-    <w:abstractNumId w:val="30"/>
+    <w:abstractNumId w:val="32"/>
   </w:num>
   <w:num w:numId="18">
     <w:abstractNumId w:val="7"/>
@@ -9353,13 +11816,13 @@
     <w:abstractNumId w:val="5"/>
   </w:num>
   <w:num w:numId="20">
-    <w:abstractNumId w:val="46"/>
+    <w:abstractNumId w:val="48"/>
   </w:num>
   <w:num w:numId="21">
-    <w:abstractNumId w:val="26"/>
+    <w:abstractNumId w:val="28"/>
   </w:num>
   <w:num w:numId="22">
-    <w:abstractNumId w:val="43"/>
+    <w:abstractNumId w:val="45"/>
   </w:num>
   <w:num w:numId="23">
     <w:abstractNumId w:val="1"/>
@@ -9368,76 +11831,82 @@
     <w:abstractNumId w:val="11"/>
   </w:num>
   <w:num w:numId="25">
-    <w:abstractNumId w:val="27"/>
+    <w:abstractNumId w:val="29"/>
   </w:num>
   <w:num w:numId="26">
-    <w:abstractNumId w:val="32"/>
+    <w:abstractNumId w:val="34"/>
   </w:num>
   <w:num w:numId="27">
-    <w:abstractNumId w:val="16"/>
+    <w:abstractNumId w:val="17"/>
   </w:num>
   <w:num w:numId="28">
-    <w:abstractNumId w:val="47"/>
+    <w:abstractNumId w:val="49"/>
   </w:num>
   <w:num w:numId="29">
     <w:abstractNumId w:val="8"/>
   </w:num>
   <w:num w:numId="30">
-    <w:abstractNumId w:val="14"/>
+    <w:abstractNumId w:val="15"/>
   </w:num>
   <w:num w:numId="31">
-    <w:abstractNumId w:val="36"/>
+    <w:abstractNumId w:val="38"/>
   </w:num>
   <w:num w:numId="32">
-    <w:abstractNumId w:val="29"/>
+    <w:abstractNumId w:val="31"/>
   </w:num>
   <w:num w:numId="33">
-    <w:abstractNumId w:val="24"/>
+    <w:abstractNumId w:val="26"/>
   </w:num>
   <w:num w:numId="34">
     <w:abstractNumId w:val="6"/>
   </w:num>
   <w:num w:numId="35">
-    <w:abstractNumId w:val="15"/>
+    <w:abstractNumId w:val="16"/>
   </w:num>
   <w:num w:numId="36">
-    <w:abstractNumId w:val="28"/>
+    <w:abstractNumId w:val="30"/>
   </w:num>
   <w:num w:numId="37">
-    <w:abstractNumId w:val="33"/>
+    <w:abstractNumId w:val="35"/>
   </w:num>
   <w:num w:numId="38">
+    <w:abstractNumId w:val="44"/>
+  </w:num>
+  <w:num w:numId="39">
+    <w:abstractNumId w:val="27"/>
+  </w:num>
+  <w:num w:numId="40">
+    <w:abstractNumId w:val="23"/>
+  </w:num>
+  <w:num w:numId="41">
     <w:abstractNumId w:val="42"/>
   </w:num>
-  <w:num w:numId="39">
-    <w:abstractNumId w:val="25"/>
+  <w:num w:numId="42">
+    <w:abstractNumId w:val="43"/>
   </w:num>
-  <w:num w:numId="40">
+  <w:num w:numId="43">
     <w:abstractNumId w:val="22"/>
   </w:num>
-  <w:num w:numId="41">
-    <w:abstractNumId w:val="40"/>
-  </w:num>
-  <w:num w:numId="42">
-    <w:abstractNumId w:val="41"/>
-  </w:num>
-  <w:num w:numId="43">
-    <w:abstractNumId w:val="21"/>
-  </w:num>
   <w:num w:numId="44">
-    <w:abstractNumId w:val="45"/>
+    <w:abstractNumId w:val="47"/>
   </w:num>
   <w:num w:numId="45">
-    <w:abstractNumId w:val="18"/>
+    <w:abstractNumId w:val="19"/>
   </w:num>
   <w:num w:numId="46">
-    <w:abstractNumId w:val="44"/>
+    <w:abstractNumId w:val="46"/>
   </w:num>
   <w:num w:numId="47">
     <w:abstractNumId w:val="0"/>
   </w:num>
   <w:num w:numId="48">
     <w:abstractNumId w:val="4"/>
+  </w:num>
+  <w:num w:numId="49">
+    <w:abstractNumId w:val="24"/>
+  </w:num>
+  <w:num w:numId="50">
+    <w:abstractNumId w:val="13"/>
   </w:num>
   <w:numIdMacAtCleanup w:val="3"/>
 </w:numbering>
@@ -10970,7 +13439,7 @@
 </file>
 
 <file path=customXml/itemProps3.xml><?xml version="1.0" encoding="utf-8"?>
-<ds:datastoreItem xmlns:ds="http://schemas.openxmlformats.org/officeDocument/2006/customXml" ds:itemID="{B8AB452C-C425-274A-9D1A-02FA8F4DD4A9}">
+<ds:datastoreItem xmlns:ds="http://schemas.openxmlformats.org/officeDocument/2006/customXml" ds:itemID="{81F70D3C-3425-A441-BCF1-3A07CDE9AEF8}">
   <ds:schemaRefs>
     <ds:schemaRef ds:uri="http://schemas.openxmlformats.org/officeDocument/2006/bibliography"/>
   </ds:schemaRefs>

</xml_diff>

<commit_message>
Added percentage to rhino sightings per conservancy.
</commit_message>
<xml_diff>
--- a/das/reports/docx_template/lewa_sitrep_template.docx
+++ b/das/reports/docx_template/lewa_sitrep_template.docx
@@ -17,7 +17,6 @@
       <w:r>
         <w:t xml:space="preserve"> </w:t>
       </w:r>
-      <w:proofErr w:type="spellStart"/>
       <w:r>
         <w:t>Sit</w:t>
       </w:r>
@@ -27,18 +26,12 @@
       <w:r>
         <w:t>ep</w:t>
       </w:r>
-      <w:proofErr w:type="spellEnd"/>
       <w:r>
         <w:tab/>
       </w:r>
       <w:r>
-        <w:t>{{</w:t>
-      </w:r>
-      <w:proofErr w:type="spellStart"/>
-      <w:r>
-        <w:t>report_time</w:t>
-      </w:r>
-      <w:proofErr w:type="spellEnd"/>
+        <w:t>{{report_time</w:t>
+      </w:r>
       <w:r>
         <w:t>}}</w:t>
       </w:r>
@@ -53,45 +46,14 @@
           <w:szCs w:val="22"/>
         </w:rPr>
       </w:pPr>
-      <w:proofErr w:type="gramStart"/>
-      <w:r>
-        <w:rPr>
-          <w:rFonts w:ascii="Cambria" w:hAnsi="Cambria"/>
-          <w:color w:val="000000"/>
-          <w:sz w:val="22"/>
-          <w:szCs w:val="22"/>
-        </w:rPr>
-        <w:t xml:space="preserve">{{ </w:t>
-      </w:r>
-      <w:proofErr w:type="spellStart"/>
-      <w:r>
-        <w:rPr>
-          <w:rFonts w:ascii="Cambria" w:hAnsi="Cambria"/>
-          <w:color w:val="000000"/>
-          <w:sz w:val="22"/>
-          <w:szCs w:val="22"/>
-        </w:rPr>
-        <w:t>report</w:t>
-      </w:r>
-      <w:proofErr w:type="gramEnd"/>
-      <w:r>
-        <w:rPr>
-          <w:rFonts w:ascii="Cambria" w:hAnsi="Cambria"/>
-          <w:color w:val="000000"/>
-          <w:sz w:val="22"/>
-          <w:szCs w:val="22"/>
-        </w:rPr>
-        <w:t>_daterange_text</w:t>
-      </w:r>
-      <w:proofErr w:type="spellEnd"/>
-      <w:r>
-        <w:rPr>
-          <w:rFonts w:ascii="Cambria" w:hAnsi="Cambria"/>
-          <w:color w:val="000000"/>
-          <w:sz w:val="22"/>
-          <w:szCs w:val="22"/>
-        </w:rPr>
-        <w:t xml:space="preserve"> }}</w:t>
+      <w:r>
+        <w:rPr>
+          <w:rFonts w:ascii="Cambria" w:hAnsi="Cambria"/>
+          <w:color w:val="000000"/>
+          <w:sz w:val="22"/>
+          <w:szCs w:val="22"/>
+        </w:rPr>
+        <w:t>{{ report_daterange_text }}</w:t>
       </w:r>
     </w:p>
     <w:p>
@@ -112,43 +74,14 @@
         </w:rPr>
       </w:pPr>
       <w:r>
-        <w:t xml:space="preserve">{% if </w:t>
-      </w:r>
-      <w:proofErr w:type="spellStart"/>
-      <w:r>
-        <w:t>wildlife_sightings</w:t>
-      </w:r>
-      <w:proofErr w:type="spellEnd"/>
-      <w:r>
-        <w:t xml:space="preserve"> </w:t>
-      </w:r>
-      <w:proofErr w:type="gramStart"/>
-      <w:r>
-        <w:t>%}</w:t>
-      </w:r>
-      <w:r>
-        <w:t>{</w:t>
-      </w:r>
-      <w:proofErr w:type="gramEnd"/>
-      <w:r>
-        <w:t xml:space="preserve">% for </w:t>
-      </w:r>
-      <w:proofErr w:type="spellStart"/>
-      <w:r>
-        <w:t>ws</w:t>
-      </w:r>
-      <w:proofErr w:type="spellEnd"/>
-      <w:r>
-        <w:t xml:space="preserve"> in </w:t>
-      </w:r>
-      <w:proofErr w:type="spellStart"/>
-      <w:r>
-        <w:t>wildlife_sighting</w:t>
+        <w:t>{% if wildlife_sightings %}</w:t>
+      </w:r>
+      <w:r>
+        <w:t>{% for ws in wildlife_sighting</w:t>
       </w:r>
       <w:r>
         <w:t>s</w:t>
       </w:r>
-      <w:proofErr w:type="spellEnd"/>
       <w:r>
         <w:t xml:space="preserve"> %}</w:t>
       </w:r>
@@ -196,9 +129,53 @@
           <w:sz w:val="22"/>
           <w:szCs w:val="22"/>
         </w:rPr>
+        <w:t>{{ws.</w:t>
+      </w:r>
+      <w:r>
+        <w:rPr>
+          <w:rFonts w:ascii="Cambria" w:hAnsi="Cambria"/>
+          <w:b/>
+          <w:sz w:val="22"/>
+          <w:szCs w:val="22"/>
+        </w:rPr>
+        <w:t>conservancy</w:t>
+      </w:r>
+      <w:r>
+        <w:rPr>
+          <w:rFonts w:ascii="Cambria" w:hAnsi="Cambria"/>
+          <w:b/>
+          <w:sz w:val="22"/>
+          <w:szCs w:val="22"/>
+        </w:rPr>
+        <w:t>}}</w:t>
+      </w:r>
+      <w:r>
+        <w:rPr>
+          <w:rFonts w:ascii="Cambria" w:hAnsi="Cambria"/>
+          <w:b/>
+          <w:sz w:val="22"/>
+          <w:szCs w:val="22"/>
+        </w:rPr>
+        <w:t>: Black</w:t>
+      </w:r>
+      <w:r>
+        <w:rPr>
+          <w:rFonts w:ascii="Cambria" w:hAnsi="Cambria"/>
+          <w:b/>
+          <w:sz w:val="22"/>
+          <w:szCs w:val="22"/>
+        </w:rPr>
+        <w:t xml:space="preserve"> = </w:t>
+      </w:r>
+      <w:r>
+        <w:rPr>
+          <w:rFonts w:ascii="Cambria" w:hAnsi="Cambria"/>
+          <w:b/>
+          <w:sz w:val="22"/>
+          <w:szCs w:val="22"/>
+        </w:rPr>
         <w:t>{{</w:t>
       </w:r>
-      <w:proofErr w:type="spellStart"/>
       <w:r>
         <w:rPr>
           <w:rFonts w:ascii="Cambria" w:hAnsi="Cambria"/>
@@ -215,9 +192,8 @@
           <w:sz w:val="22"/>
           <w:szCs w:val="22"/>
         </w:rPr>
-        <w:t>conservancy</w:t>
-      </w:r>
-      <w:proofErr w:type="spellEnd"/>
+        <w:t>total_rhino_black}}</w:t>
+      </w:r>
       <w:r>
         <w:rPr>
           <w:rFonts w:ascii="Cambria" w:hAnsi="Cambria"/>
@@ -225,7 +201,7 @@
           <w:sz w:val="22"/>
           <w:szCs w:val="22"/>
         </w:rPr>
-        <w:t>}}</w:t>
+        <w:t>;</w:t>
       </w:r>
       <w:r>
         <w:rPr>
@@ -234,7 +210,7 @@
           <w:sz w:val="22"/>
           <w:szCs w:val="22"/>
         </w:rPr>
-        <w:t>: Black</w:t>
+        <w:t xml:space="preserve"> White</w:t>
       </w:r>
       <w:r>
         <w:rPr>
@@ -254,7 +230,6 @@
         </w:rPr>
         <w:t>{{</w:t>
       </w:r>
-      <w:proofErr w:type="spellStart"/>
       <w:r>
         <w:rPr>
           <w:rFonts w:ascii="Cambria" w:hAnsi="Cambria"/>
@@ -271,74 +246,8 @@
           <w:sz w:val="22"/>
           <w:szCs w:val="22"/>
         </w:rPr>
-        <w:t>total_rhino_black</w:t>
-      </w:r>
-      <w:proofErr w:type="spellEnd"/>
-      <w:r>
-        <w:rPr>
-          <w:rFonts w:ascii="Cambria" w:hAnsi="Cambria"/>
-          <w:b/>
-          <w:sz w:val="22"/>
-          <w:szCs w:val="22"/>
-        </w:rPr>
-        <w:t>}}</w:t>
-      </w:r>
-      <w:r>
-        <w:rPr>
-          <w:rFonts w:ascii="Cambria" w:hAnsi="Cambria"/>
-          <w:b/>
-          <w:sz w:val="22"/>
-          <w:szCs w:val="22"/>
-        </w:rPr>
-        <w:t>;</w:t>
-      </w:r>
-      <w:r>
-        <w:rPr>
-          <w:rFonts w:ascii="Cambria" w:hAnsi="Cambria"/>
-          <w:b/>
-          <w:sz w:val="22"/>
-          <w:szCs w:val="22"/>
-        </w:rPr>
-        <w:t xml:space="preserve"> White</w:t>
-      </w:r>
-      <w:r>
-        <w:rPr>
-          <w:rFonts w:ascii="Cambria" w:hAnsi="Cambria"/>
-          <w:b/>
-          <w:sz w:val="22"/>
-          <w:szCs w:val="22"/>
-        </w:rPr>
-        <w:t xml:space="preserve"> = </w:t>
-      </w:r>
-      <w:r>
-        <w:rPr>
-          <w:rFonts w:ascii="Cambria" w:hAnsi="Cambria"/>
-          <w:b/>
-          <w:sz w:val="22"/>
-          <w:szCs w:val="22"/>
-        </w:rPr>
-        <w:t>{{</w:t>
-      </w:r>
-      <w:proofErr w:type="spellStart"/>
-      <w:r>
-        <w:rPr>
-          <w:rFonts w:ascii="Cambria" w:hAnsi="Cambria"/>
-          <w:b/>
-          <w:sz w:val="22"/>
-          <w:szCs w:val="22"/>
-        </w:rPr>
-        <w:t>ws.</w:t>
-      </w:r>
-      <w:r>
-        <w:rPr>
-          <w:rFonts w:ascii="Cambria" w:hAnsi="Cambria"/>
-          <w:b/>
-          <w:sz w:val="22"/>
-          <w:szCs w:val="22"/>
-        </w:rPr>
         <w:t>total_rhino_white</w:t>
       </w:r>
-      <w:proofErr w:type="spellEnd"/>
       <w:r>
         <w:rPr>
           <w:rFonts w:ascii="Cambria" w:hAnsi="Cambria"/>
@@ -357,7 +266,7 @@
       </w:tblPr>
       <w:tblGrid>
         <w:gridCol w:w="4675"/>
-        <w:gridCol w:w="2356"/>
+        <w:gridCol w:w="3029"/>
       </w:tblGrid>
       <w:tr>
         <w:trPr>
@@ -423,51 +332,7 @@
                 <w:sz w:val="22"/>
                 <w:szCs w:val="22"/>
               </w:rPr>
-              <w:t>{%</w:t>
-            </w:r>
-            <w:proofErr w:type="spellStart"/>
-            <w:r>
-              <w:rPr>
-                <w:rFonts w:ascii="Cambria" w:hAnsi="Cambria"/>
-                <w:b w:val="0"/>
-                <w:color w:val="000000"/>
-                <w:sz w:val="22"/>
-                <w:szCs w:val="22"/>
-              </w:rPr>
-              <w:t>tr</w:t>
-            </w:r>
-            <w:proofErr w:type="spellEnd"/>
-            <w:r>
-              <w:rPr>
-                <w:rFonts w:ascii="Cambria" w:hAnsi="Cambria"/>
-                <w:b w:val="0"/>
-                <w:color w:val="000000"/>
-                <w:sz w:val="22"/>
-                <w:szCs w:val="22"/>
-              </w:rPr>
-              <w:t xml:space="preserve"> for item in </w:t>
-            </w:r>
-            <w:proofErr w:type="spellStart"/>
-            <w:r>
-              <w:rPr>
-                <w:rFonts w:ascii="Cambria" w:hAnsi="Cambria"/>
-                <w:b w:val="0"/>
-                <w:color w:val="000000"/>
-                <w:sz w:val="22"/>
-                <w:szCs w:val="22"/>
-              </w:rPr>
-              <w:t>ws.rhino_sightings</w:t>
-            </w:r>
-            <w:proofErr w:type="spellEnd"/>
-            <w:r>
-              <w:rPr>
-                <w:rFonts w:ascii="Cambria" w:hAnsi="Cambria"/>
-                <w:b w:val="0"/>
-                <w:color w:val="000000"/>
-                <w:sz w:val="22"/>
-                <w:szCs w:val="22"/>
-              </w:rPr>
-              <w:t xml:space="preserve"> %}</w:t>
+              <w:t>{%tr for item in ws.rhino_sightings %}</w:t>
             </w:r>
           </w:p>
         </w:tc>
@@ -523,29 +388,7 @@
                 <w:sz w:val="22"/>
                 <w:szCs w:val="22"/>
               </w:rPr>
-              <w:t>{{</w:t>
-            </w:r>
-            <w:proofErr w:type="spellStart"/>
-            <w:r>
-              <w:rPr>
-                <w:rFonts w:ascii="Cambria" w:hAnsi="Cambria"/>
-                <w:b w:val="0"/>
-                <w:color w:val="000000"/>
-                <w:sz w:val="22"/>
-                <w:szCs w:val="22"/>
-              </w:rPr>
-              <w:t>item.type</w:t>
-            </w:r>
-            <w:proofErr w:type="spellEnd"/>
-            <w:r>
-              <w:rPr>
-                <w:rFonts w:ascii="Cambria" w:hAnsi="Cambria"/>
-                <w:b w:val="0"/>
-                <w:color w:val="000000"/>
-                <w:sz w:val="22"/>
-                <w:szCs w:val="22"/>
-              </w:rPr>
-              <w:t>}}</w:t>
+              <w:t>{{item.type}}</w:t>
             </w:r>
           </w:p>
         </w:tc>
@@ -576,27 +419,61 @@
                 <w:sz w:val="22"/>
                 <w:szCs w:val="22"/>
               </w:rPr>
-              <w:t>{{</w:t>
-            </w:r>
-            <w:proofErr w:type="spellStart"/>
-            <w:r>
-              <w:rPr>
-                <w:rFonts w:ascii="Cambria" w:hAnsi="Cambria"/>
-                <w:color w:val="000000"/>
-                <w:sz w:val="22"/>
-                <w:szCs w:val="22"/>
-              </w:rPr>
-              <w:t>item.count</w:t>
-            </w:r>
-            <w:proofErr w:type="spellEnd"/>
-            <w:r>
-              <w:rPr>
-                <w:rFonts w:ascii="Cambria" w:hAnsi="Cambria"/>
-                <w:color w:val="000000"/>
-                <w:sz w:val="22"/>
-                <w:szCs w:val="22"/>
-              </w:rPr>
-              <w:t>}}</w:t>
+              <w:t>{{item.count}}</w:t>
+            </w:r>
+            <w:r>
+              <w:rPr>
+                <w:rFonts w:ascii="Cambria" w:hAnsi="Cambria"/>
+                <w:color w:val="000000"/>
+                <w:sz w:val="22"/>
+                <w:szCs w:val="22"/>
+              </w:rPr>
+              <w:t xml:space="preserve"> {%if item.percentage</w:t>
+            </w:r>
+            <w:r>
+              <w:rPr>
+                <w:rFonts w:ascii="Cambria" w:hAnsi="Cambria"/>
+                <w:color w:val="000000"/>
+                <w:sz w:val="22"/>
+                <w:szCs w:val="22"/>
+              </w:rPr>
+              <w:t xml:space="preserve"> </w:t>
+            </w:r>
+            <w:r>
+              <w:rPr>
+                <w:rFonts w:ascii="Cambria" w:hAnsi="Cambria"/>
+                <w:color w:val="000000"/>
+                <w:sz w:val="22"/>
+                <w:szCs w:val="22"/>
+              </w:rPr>
+              <w:t>%}</w:t>
+            </w:r>
+            <w:r>
+              <w:rPr>
+                <w:rFonts w:ascii="Cambria" w:hAnsi="Cambria"/>
+                <w:color w:val="000000"/>
+                <w:sz w:val="22"/>
+                <w:szCs w:val="22"/>
+              </w:rPr>
+              <w:t xml:space="preserve"> ({{ item.percentage}})</w:t>
+            </w:r>
+            <w:r>
+              <w:rPr>
+                <w:rFonts w:ascii="Cambria" w:hAnsi="Cambria"/>
+                <w:color w:val="000000"/>
+                <w:sz w:val="22"/>
+                <w:szCs w:val="22"/>
+              </w:rPr>
+              <w:t>{%endif%}</w:t>
+            </w:r>
+            <w:r>
+              <w:rPr>
+                <w:rFonts w:ascii="Cambria" w:hAnsi="Cambria"/>
+                <w:color w:val="000000"/>
+                <w:sz w:val="22"/>
+                <w:szCs w:val="22"/>
+              </w:rPr>
+              <w:t xml:space="preserve"> </w:t>
             </w:r>
           </w:p>
         </w:tc>
@@ -633,9 +510,8 @@
                 <w:sz w:val="22"/>
                 <w:szCs w:val="22"/>
               </w:rPr>
-              <w:t>{%</w:t>
-            </w:r>
-            <w:proofErr w:type="spellStart"/>
+              <w:t>{%tr end</w:t>
+            </w:r>
             <w:r>
               <w:rPr>
                 <w:rFonts w:ascii="Cambria" w:hAnsi="Cambria"/>
@@ -644,50 +520,7 @@
                 <w:sz w:val="22"/>
                 <w:szCs w:val="22"/>
               </w:rPr>
-              <w:t>tr</w:t>
-            </w:r>
-            <w:proofErr w:type="spellEnd"/>
-            <w:r>
-              <w:rPr>
-                <w:rFonts w:ascii="Cambria" w:hAnsi="Cambria"/>
-                <w:b w:val="0"/>
-                <w:color w:val="000000"/>
-                <w:sz w:val="22"/>
-                <w:szCs w:val="22"/>
-              </w:rPr>
-              <w:t xml:space="preserve"> </w:t>
-            </w:r>
-            <w:proofErr w:type="spellStart"/>
-            <w:r>
-              <w:rPr>
-                <w:rFonts w:ascii="Cambria" w:hAnsi="Cambria"/>
-                <w:b w:val="0"/>
-                <w:color w:val="000000"/>
-                <w:sz w:val="22"/>
-                <w:szCs w:val="22"/>
-              </w:rPr>
-              <w:t>end</w:t>
-            </w:r>
-            <w:r>
-              <w:rPr>
-                <w:rFonts w:ascii="Cambria" w:hAnsi="Cambria"/>
-                <w:b w:val="0"/>
-                <w:color w:val="000000"/>
-                <w:sz w:val="22"/>
-                <w:szCs w:val="22"/>
-              </w:rPr>
-              <w:t>for</w:t>
-            </w:r>
-            <w:proofErr w:type="spellEnd"/>
-            <w:r>
-              <w:rPr>
-                <w:rFonts w:ascii="Cambria" w:hAnsi="Cambria"/>
-                <w:b w:val="0"/>
-                <w:color w:val="000000"/>
-                <w:sz w:val="22"/>
-                <w:szCs w:val="22"/>
-              </w:rPr>
-              <w:t xml:space="preserve"> %}</w:t>
+              <w:t>for %}</w:t>
             </w:r>
           </w:p>
         </w:tc>
@@ -776,28 +609,19 @@
                 <w:sz w:val="22"/>
                 <w:szCs w:val="22"/>
               </w:rPr>
-              <w:t>{{</w:t>
-            </w:r>
-            <w:proofErr w:type="spellStart"/>
-            <w:r>
-              <w:rPr>
-                <w:rFonts w:ascii="Cambria" w:hAnsi="Cambria"/>
-                <w:color w:val="000000"/>
-                <w:sz w:val="22"/>
-                <w:szCs w:val="22"/>
-              </w:rPr>
-              <w:t>ws.total_sightings</w:t>
-            </w:r>
-            <w:proofErr w:type="spellEnd"/>
-            <w:r>
-              <w:rPr>
-                <w:rFonts w:ascii="Cambria" w:hAnsi="Cambria"/>
-                <w:color w:val="000000"/>
-                <w:sz w:val="22"/>
-                <w:szCs w:val="22"/>
-              </w:rPr>
-              <w:t>}}</w:t>
-            </w:r>
+              <w:t>{{ws.total_sightings}}</w:t>
+            </w:r>
+            <w:r>
+              <w:rPr>
+                <w:rFonts w:ascii="Cambria" w:hAnsi="Cambria"/>
+                <w:color w:val="000000"/>
+                <w:sz w:val="22"/>
+                <w:szCs w:val="22"/>
+              </w:rPr>
+              <w:t xml:space="preserve"> ({{ ws.percentage }})</w:t>
+            </w:r>
+            <w:bookmarkStart w:id="0" w:name="_GoBack"/>
+            <w:bookmarkEnd w:id="0"/>
           </w:p>
         </w:tc>
       </w:tr>
@@ -820,61 +644,17 @@
           <w:sz w:val="22"/>
           <w:szCs w:val="22"/>
         </w:rPr>
-        <w:t xml:space="preserve">{% </w:t>
-      </w:r>
-      <w:proofErr w:type="spellStart"/>
-      <w:r>
-        <w:rPr>
-          <w:rFonts w:ascii="Cambria" w:hAnsi="Cambria"/>
-          <w:bCs w:val="0"/>
-          <w:color w:val="000000"/>
-          <w:sz w:val="22"/>
-          <w:szCs w:val="22"/>
-        </w:rPr>
-        <w:t>endfor</w:t>
-      </w:r>
-      <w:proofErr w:type="spellEnd"/>
-      <w:r>
-        <w:rPr>
-          <w:rFonts w:ascii="Cambria" w:hAnsi="Cambria"/>
-          <w:bCs w:val="0"/>
-          <w:color w:val="000000"/>
-          <w:sz w:val="22"/>
-          <w:szCs w:val="22"/>
-        </w:rPr>
-        <w:t xml:space="preserve"> </w:t>
-      </w:r>
-      <w:proofErr w:type="gramStart"/>
-      <w:r>
-        <w:rPr>
-          <w:rFonts w:ascii="Cambria" w:hAnsi="Cambria"/>
-          <w:bCs w:val="0"/>
-          <w:color w:val="000000"/>
-          <w:sz w:val="22"/>
-          <w:szCs w:val="22"/>
-        </w:rPr>
-        <w:t>%}</w:t>
-      </w:r>
-      <w:r>
-        <w:rPr>
-          <w:rFonts w:ascii="Cambria" w:hAnsi="Cambria"/>
-          <w:bCs w:val="0"/>
-          <w:color w:val="000000"/>
-          <w:sz w:val="22"/>
-          <w:szCs w:val="22"/>
-        </w:rPr>
-        <w:t>{</w:t>
-      </w:r>
-      <w:proofErr w:type="gramEnd"/>
-      <w:r>
-        <w:rPr>
-          <w:rFonts w:ascii="Cambria" w:hAnsi="Cambria"/>
-          <w:bCs w:val="0"/>
-          <w:color w:val="000000"/>
-          <w:sz w:val="22"/>
-          <w:szCs w:val="22"/>
-        </w:rPr>
-        <w:t>% else %}</w:t>
+        <w:t>{% endfor %}</w:t>
+      </w:r>
+      <w:r>
+        <w:rPr>
+          <w:rFonts w:ascii="Cambria" w:hAnsi="Cambria"/>
+          <w:bCs w:val="0"/>
+          <w:color w:val="000000"/>
+          <w:sz w:val="22"/>
+          <w:szCs w:val="22"/>
+        </w:rPr>
+        <w:t>{% else %}</w:t>
       </w:r>
     </w:p>
     <w:p>
@@ -932,23 +712,23 @@
           <w:sz w:val="22"/>
           <w:szCs w:val="22"/>
         </w:rPr>
-        <w:t xml:space="preserve">{% </w:t>
-      </w:r>
-      <w:proofErr w:type="spellStart"/>
-      <w:r>
-        <w:rPr>
-          <w:rFonts w:ascii="Cambria" w:hAnsi="Cambria"/>
-          <w:bCs w:val="0"/>
-          <w:color w:val="000000"/>
-          <w:sz w:val="22"/>
-          <w:szCs w:val="22"/>
-        </w:rPr>
-        <w:t>endif</w:t>
-      </w:r>
-      <w:proofErr w:type="spellEnd"/>
-      <w:r>
-        <w:rPr>
-          <w:rFonts w:ascii="Cambria" w:hAnsi="Cambria"/>
+        <w:t>{% endif %}</w:t>
+      </w:r>
+      <w:r>
+        <w:rPr>
+          <w:rFonts w:ascii="Cambria" w:hAnsi="Cambria"/>
+          <w:b/>
+          <w:bCs w:val="0"/>
+          <w:color w:val="000000"/>
+          <w:sz w:val="22"/>
+          <w:szCs w:val="22"/>
+        </w:rPr>
+        <w:t>Rhino Birth:</w:t>
+      </w:r>
+      <w:r>
+        <w:rPr>
+          <w:rFonts w:ascii="Cambria" w:hAnsi="Cambria"/>
+          <w:b/>
           <w:bCs w:val="0"/>
           <w:color w:val="000000"/>
           <w:sz w:val="22"/>
@@ -956,17 +736,6 @@
         </w:rPr>
         <w:t xml:space="preserve"> </w:t>
       </w:r>
-      <w:proofErr w:type="gramStart"/>
-      <w:r>
-        <w:rPr>
-          <w:rFonts w:ascii="Cambria" w:hAnsi="Cambria"/>
-          <w:bCs w:val="0"/>
-          <w:color w:val="000000"/>
-          <w:sz w:val="22"/>
-          <w:szCs w:val="22"/>
-        </w:rPr>
-        <w:t>%}</w:t>
-      </w:r>
       <w:r>
         <w:rPr>
           <w:rFonts w:ascii="Cambria" w:hAnsi="Cambria"/>
@@ -976,65 +745,7 @@
           <w:sz w:val="22"/>
           <w:szCs w:val="22"/>
         </w:rPr>
-        <w:t>Rhino</w:t>
-      </w:r>
-      <w:proofErr w:type="gramEnd"/>
-      <w:r>
-        <w:rPr>
-          <w:rFonts w:ascii="Cambria" w:hAnsi="Cambria"/>
-          <w:b/>
-          <w:bCs w:val="0"/>
-          <w:color w:val="000000"/>
-          <w:sz w:val="22"/>
-          <w:szCs w:val="22"/>
-        </w:rPr>
-        <w:t xml:space="preserve"> Birth:</w:t>
-      </w:r>
-      <w:r>
-        <w:rPr>
-          <w:rFonts w:ascii="Cambria" w:hAnsi="Cambria"/>
-          <w:b/>
-          <w:bCs w:val="0"/>
-          <w:color w:val="000000"/>
-          <w:sz w:val="22"/>
-          <w:szCs w:val="22"/>
-        </w:rPr>
-        <w:t xml:space="preserve"> </w:t>
-      </w:r>
-      <w:r>
-        <w:rPr>
-          <w:rFonts w:ascii="Cambria" w:hAnsi="Cambria"/>
-          <w:b/>
-          <w:bCs w:val="0"/>
-          <w:color w:val="000000"/>
-          <w:sz w:val="22"/>
-          <w:szCs w:val="22"/>
-        </w:rPr>
-        <w:t xml:space="preserve">{% if </w:t>
-      </w:r>
-      <w:proofErr w:type="spellStart"/>
-      <w:r>
-        <w:rPr>
-          <w:rFonts w:ascii="Cambria" w:hAnsi="Cambria"/>
-          <w:b/>
-          <w:bCs w:val="0"/>
-          <w:color w:val="000000"/>
-          <w:sz w:val="22"/>
-          <w:szCs w:val="22"/>
-        </w:rPr>
-        <w:t>rhino_births</w:t>
-      </w:r>
-      <w:proofErr w:type="spellEnd"/>
-      <w:r>
-        <w:rPr>
-          <w:rFonts w:ascii="Cambria" w:hAnsi="Cambria"/>
-          <w:b/>
-          <w:bCs w:val="0"/>
-          <w:color w:val="000000"/>
-          <w:sz w:val="22"/>
-          <w:szCs w:val="22"/>
-        </w:rPr>
-        <w:t xml:space="preserve"> %}</w:t>
+        <w:t>{% if rhino_births %}</w:t>
       </w:r>
     </w:p>
     <w:tbl>
@@ -1202,51 +913,7 @@
                 <w:sz w:val="22"/>
                 <w:szCs w:val="22"/>
               </w:rPr>
-              <w:t>{%</w:t>
-            </w:r>
-            <w:proofErr w:type="spellStart"/>
-            <w:r>
-              <w:rPr>
-                <w:rFonts w:ascii="Cambria" w:hAnsi="Cambria"/>
-                <w:bCs w:val="0"/>
-                <w:color w:val="000000"/>
-                <w:sz w:val="22"/>
-                <w:szCs w:val="22"/>
-              </w:rPr>
-              <w:t>tr</w:t>
-            </w:r>
-            <w:proofErr w:type="spellEnd"/>
-            <w:r>
-              <w:rPr>
-                <w:rFonts w:ascii="Cambria" w:hAnsi="Cambria"/>
-                <w:bCs w:val="0"/>
-                <w:color w:val="000000"/>
-                <w:sz w:val="22"/>
-                <w:szCs w:val="22"/>
-              </w:rPr>
-              <w:t xml:space="preserve"> for item in </w:t>
-            </w:r>
-            <w:proofErr w:type="spellStart"/>
-            <w:r>
-              <w:rPr>
-                <w:rFonts w:ascii="Cambria" w:hAnsi="Cambria"/>
-                <w:bCs w:val="0"/>
-                <w:color w:val="000000"/>
-                <w:sz w:val="22"/>
-                <w:szCs w:val="22"/>
-              </w:rPr>
-              <w:t>rhino_births</w:t>
-            </w:r>
-            <w:proofErr w:type="spellEnd"/>
-            <w:r>
-              <w:rPr>
-                <w:rFonts w:ascii="Cambria" w:hAnsi="Cambria"/>
-                <w:bCs w:val="0"/>
-                <w:color w:val="000000"/>
-                <w:sz w:val="22"/>
-                <w:szCs w:val="22"/>
-              </w:rPr>
-              <w:t xml:space="preserve"> %}</w:t>
+              <w:t>{%tr for item in rhino_births %}</w:t>
             </w:r>
           </w:p>
         </w:tc>
@@ -1277,31 +944,7 @@
                 <w:sz w:val="22"/>
                 <w:szCs w:val="22"/>
               </w:rPr>
-              <w:t xml:space="preserve">{{ </w:t>
-            </w:r>
-            <w:proofErr w:type="spellStart"/>
-            <w:r>
-              <w:rPr>
-                <w:rFonts w:ascii="Cambria" w:hAnsi="Cambria"/>
-                <w:b w:val="0"/>
-                <w:bCs/>
-                <w:color w:val="000000"/>
-                <w:sz w:val="22"/>
-                <w:szCs w:val="22"/>
-              </w:rPr>
-              <w:t>item.conservancy</w:t>
-            </w:r>
-            <w:proofErr w:type="spellEnd"/>
-            <w:r>
-              <w:rPr>
-                <w:rFonts w:ascii="Cambria" w:hAnsi="Cambria"/>
-                <w:b w:val="0"/>
-                <w:bCs/>
-                <w:color w:val="000000"/>
-                <w:sz w:val="22"/>
-                <w:szCs w:val="22"/>
-              </w:rPr>
-              <w:t xml:space="preserve"> }}</w:t>
+              <w:t>{{ item.conservancy }}</w:t>
             </w:r>
           </w:p>
         </w:tc>
@@ -1328,10 +971,17 @@
                 <w:sz w:val="22"/>
                 <w:szCs w:val="22"/>
               </w:rPr>
-              <w:t xml:space="preserve">{{ </w:t>
-            </w:r>
-            <w:proofErr w:type="spellStart"/>
-            <w:r>
+              <w:t>{{ item.color }}</w:t>
+            </w:r>
+          </w:p>
+        </w:tc>
+        <w:tc>
+          <w:tcPr>
+            <w:tcW w:w="3780" w:type="dxa"/>
+          </w:tcPr>
+          <w:p>
+            <w:pPr>
+              <w:cnfStyle w:val="000000000000" w:firstRow="0" w:lastRow="0" w:firstColumn="0" w:lastColumn="0" w:oddVBand="0" w:evenVBand="0" w:oddHBand="0" w:evenHBand="0" w:firstRowFirstColumn="0" w:firstRowLastColumn="0" w:lastRowFirstColumn="0" w:lastRowLastColumn="0"/>
               <w:rPr>
                 <w:rFonts w:ascii="Cambria" w:hAnsi="Cambria"/>
                 <w:bCs w:val="0"/>
@@ -1339,9 +989,7 @@
                 <w:sz w:val="22"/>
                 <w:szCs w:val="22"/>
               </w:rPr>
-              <w:t>item.color</w:t>
-            </w:r>
-            <w:proofErr w:type="spellEnd"/>
+            </w:pPr>
             <w:r>
               <w:rPr>
                 <w:rFonts w:ascii="Cambria" w:hAnsi="Cambria"/>
@@ -1350,13 +998,13 @@
                 <w:sz w:val="22"/>
                 <w:szCs w:val="22"/>
               </w:rPr>
-              <w:t xml:space="preserve"> }}</w:t>
-            </w:r>
-          </w:p>
-        </w:tc>
-        <w:tc>
-          <w:tcPr>
-            <w:tcW w:w="3780" w:type="dxa"/>
+              <w:t>{{ item.mother }}</w:t>
+            </w:r>
+          </w:p>
+        </w:tc>
+        <w:tc>
+          <w:tcPr>
+            <w:tcW w:w="1975" w:type="dxa"/>
           </w:tcPr>
           <w:p>
             <w:pPr>
@@ -1377,78 +1025,7 @@
                 <w:sz w:val="22"/>
                 <w:szCs w:val="22"/>
               </w:rPr>
-              <w:t xml:space="preserve">{{ </w:t>
-            </w:r>
-            <w:proofErr w:type="spellStart"/>
-            <w:r>
-              <w:rPr>
-                <w:rFonts w:ascii="Cambria" w:hAnsi="Cambria"/>
-                <w:bCs w:val="0"/>
-                <w:color w:val="000000"/>
-                <w:sz w:val="22"/>
-                <w:szCs w:val="22"/>
-              </w:rPr>
-              <w:t>item.mother</w:t>
-            </w:r>
-            <w:proofErr w:type="spellEnd"/>
-            <w:r>
-              <w:rPr>
-                <w:rFonts w:ascii="Cambria" w:hAnsi="Cambria"/>
-                <w:bCs w:val="0"/>
-                <w:color w:val="000000"/>
-                <w:sz w:val="22"/>
-                <w:szCs w:val="22"/>
-              </w:rPr>
-              <w:t xml:space="preserve"> }}</w:t>
-            </w:r>
-          </w:p>
-        </w:tc>
-        <w:tc>
-          <w:tcPr>
-            <w:tcW w:w="1975" w:type="dxa"/>
-          </w:tcPr>
-          <w:p>
-            <w:pPr>
-              <w:cnfStyle w:val="000000000000" w:firstRow="0" w:lastRow="0" w:firstColumn="0" w:lastColumn="0" w:oddVBand="0" w:evenVBand="0" w:oddHBand="0" w:evenHBand="0" w:firstRowFirstColumn="0" w:firstRowLastColumn="0" w:lastRowFirstColumn="0" w:lastRowLastColumn="0"/>
-              <w:rPr>
-                <w:rFonts w:ascii="Cambria" w:hAnsi="Cambria"/>
-                <w:bCs w:val="0"/>
-                <w:color w:val="000000"/>
-                <w:sz w:val="22"/>
-                <w:szCs w:val="22"/>
-              </w:rPr>
-            </w:pPr>
-            <w:r>
-              <w:rPr>
-                <w:rFonts w:ascii="Cambria" w:hAnsi="Cambria"/>
-                <w:bCs w:val="0"/>
-                <w:color w:val="000000"/>
-                <w:sz w:val="22"/>
-                <w:szCs w:val="22"/>
-              </w:rPr>
-              <w:t xml:space="preserve">{{ </w:t>
-            </w:r>
-            <w:proofErr w:type="spellStart"/>
-            <w:r>
-              <w:rPr>
-                <w:rFonts w:ascii="Cambria" w:hAnsi="Cambria"/>
-                <w:bCs w:val="0"/>
-                <w:color w:val="000000"/>
-                <w:sz w:val="22"/>
-                <w:szCs w:val="22"/>
-              </w:rPr>
-              <w:t>item.health</w:t>
-            </w:r>
-            <w:proofErr w:type="spellEnd"/>
-            <w:r>
-              <w:rPr>
-                <w:rFonts w:ascii="Cambria" w:hAnsi="Cambria"/>
-                <w:bCs w:val="0"/>
-                <w:color w:val="000000"/>
-                <w:sz w:val="22"/>
-                <w:szCs w:val="22"/>
-              </w:rPr>
-              <w:t xml:space="preserve"> }}</w:t>
+              <w:t>{{ item.health }}</w:t>
             </w:r>
           </w:p>
         </w:tc>
@@ -1482,55 +1059,7 @@
                 <w:sz w:val="22"/>
                 <w:szCs w:val="22"/>
               </w:rPr>
-              <w:t>{%</w:t>
-            </w:r>
-            <w:proofErr w:type="spellStart"/>
-            <w:r>
-              <w:rPr>
-                <w:rFonts w:ascii="Cambria" w:hAnsi="Cambria"/>
-                <w:b w:val="0"/>
-                <w:bCs/>
-                <w:color w:val="000000"/>
-                <w:sz w:val="22"/>
-                <w:szCs w:val="22"/>
-              </w:rPr>
-              <w:t>tr</w:t>
-            </w:r>
-            <w:proofErr w:type="spellEnd"/>
-            <w:r>
-              <w:rPr>
-                <w:rFonts w:ascii="Cambria" w:hAnsi="Cambria"/>
-                <w:b w:val="0"/>
-                <w:bCs/>
-                <w:color w:val="000000"/>
-                <w:sz w:val="22"/>
-                <w:szCs w:val="22"/>
-              </w:rPr>
-              <w:t xml:space="preserve"> </w:t>
-            </w:r>
-            <w:proofErr w:type="spellStart"/>
-            <w:r>
-              <w:rPr>
-                <w:rFonts w:ascii="Cambria" w:hAnsi="Cambria"/>
-                <w:b w:val="0"/>
-                <w:bCs/>
-                <w:color w:val="000000"/>
-                <w:sz w:val="22"/>
-                <w:szCs w:val="22"/>
-              </w:rPr>
-              <w:t>endfor</w:t>
-            </w:r>
-            <w:proofErr w:type="spellEnd"/>
-            <w:r>
-              <w:rPr>
-                <w:rFonts w:ascii="Cambria" w:hAnsi="Cambria"/>
-                <w:b w:val="0"/>
-                <w:bCs/>
-                <w:color w:val="000000"/>
-                <w:sz w:val="22"/>
-                <w:szCs w:val="22"/>
-              </w:rPr>
-              <w:t xml:space="preserve"> %}</w:t>
+              <w:t>{%tr endfor %}</w:t>
             </w:r>
           </w:p>
         </w:tc>
@@ -1631,52 +1160,19 @@
           <w:sz w:val="22"/>
           <w:szCs w:val="22"/>
         </w:rPr>
-        <w:t xml:space="preserve">No rhino births </w:t>
-      </w:r>
-      <w:proofErr w:type="gramStart"/>
-      <w:r>
-        <w:rPr>
-          <w:rFonts w:ascii="Cambria" w:hAnsi="Cambria"/>
-          <w:bCs w:val="0"/>
-          <w:color w:val="000000"/>
-          <w:sz w:val="22"/>
-          <w:szCs w:val="22"/>
-        </w:rPr>
-        <w:t>reported.</w:t>
-      </w:r>
-      <w:r>
-        <w:rPr>
-          <w:rFonts w:ascii="Cambria" w:hAnsi="Cambria"/>
-          <w:bCs w:val="0"/>
-          <w:color w:val="000000"/>
-          <w:sz w:val="22"/>
-          <w:szCs w:val="22"/>
-        </w:rPr>
-        <w:t>{</w:t>
-      </w:r>
-      <w:proofErr w:type="gramEnd"/>
-      <w:r>
-        <w:rPr>
-          <w:rFonts w:ascii="Cambria" w:hAnsi="Cambria"/>
-          <w:bCs w:val="0"/>
-          <w:color w:val="000000"/>
-          <w:sz w:val="22"/>
-          <w:szCs w:val="22"/>
-        </w:rPr>
-        <w:t xml:space="preserve">% </w:t>
-      </w:r>
-      <w:proofErr w:type="spellStart"/>
-      <w:r>
-        <w:rPr>
-          <w:rFonts w:ascii="Cambria" w:hAnsi="Cambria"/>
-          <w:bCs w:val="0"/>
-          <w:color w:val="000000"/>
-          <w:sz w:val="22"/>
-          <w:szCs w:val="22"/>
-        </w:rPr>
-        <w:t>endif</w:t>
-      </w:r>
-      <w:proofErr w:type="spellEnd"/>
+        <w:lastRenderedPageBreak/>
+        <w:t>No rhino births reported.</w:t>
+      </w:r>
+      <w:r>
+        <w:rPr>
+          <w:rFonts w:ascii="Cambria" w:hAnsi="Cambria"/>
+          <w:bCs w:val="0"/>
+          <w:color w:val="000000"/>
+          <w:sz w:val="22"/>
+          <w:szCs w:val="22"/>
+        </w:rPr>
+        <w:t>{% endif</w:t>
+      </w:r>
       <w:r>
         <w:rPr>
           <w:rFonts w:ascii="Cambria" w:hAnsi="Cambria"/>
@@ -1719,7 +1215,6 @@
           <w:sz w:val="22"/>
           <w:szCs w:val="22"/>
         </w:rPr>
-        <w:lastRenderedPageBreak/>
         <w:t>Rhinos Missing for three days or more within Lewa.</w:t>
       </w:r>
     </w:p>
@@ -1820,51 +1315,7 @@
                 <w:sz w:val="22"/>
                 <w:szCs w:val="22"/>
               </w:rPr>
-              <w:t>{%</w:t>
-            </w:r>
-            <w:proofErr w:type="spellStart"/>
-            <w:r>
-              <w:rPr>
-                <w:rFonts w:ascii="Cambria" w:hAnsi="Cambria"/>
-                <w:b w:val="0"/>
-                <w:color w:val="000000"/>
-                <w:sz w:val="22"/>
-                <w:szCs w:val="22"/>
-              </w:rPr>
-              <w:t>tr</w:t>
-            </w:r>
-            <w:proofErr w:type="spellEnd"/>
-            <w:r>
-              <w:rPr>
-                <w:rFonts w:ascii="Cambria" w:hAnsi="Cambria"/>
-                <w:b w:val="0"/>
-                <w:color w:val="000000"/>
-                <w:sz w:val="22"/>
-                <w:szCs w:val="22"/>
-              </w:rPr>
-              <w:t xml:space="preserve"> for item in </w:t>
-            </w:r>
-            <w:proofErr w:type="spellStart"/>
-            <w:r>
-              <w:rPr>
-                <w:rFonts w:ascii="Cambria" w:hAnsi="Cambria"/>
-                <w:b w:val="0"/>
-                <w:color w:val="000000"/>
-                <w:sz w:val="22"/>
-                <w:szCs w:val="22"/>
-              </w:rPr>
-              <w:t>rhino_missing</w:t>
-            </w:r>
-            <w:proofErr w:type="spellEnd"/>
-            <w:r>
-              <w:rPr>
-                <w:rFonts w:ascii="Cambria" w:hAnsi="Cambria"/>
-                <w:b w:val="0"/>
-                <w:color w:val="000000"/>
-                <w:sz w:val="22"/>
-                <w:szCs w:val="22"/>
-              </w:rPr>
-              <w:t xml:space="preserve"> %}</w:t>
+              <w:t>{%tr for item in rhino_missing %}</w:t>
             </w:r>
           </w:p>
         </w:tc>
@@ -1955,29 +1406,7 @@
                 <w:sz w:val="22"/>
                 <w:szCs w:val="22"/>
               </w:rPr>
-              <w:t>{{</w:t>
-            </w:r>
-            <w:proofErr w:type="spellStart"/>
-            <w:r>
-              <w:rPr>
-                <w:rFonts w:ascii="Cambria" w:hAnsi="Cambria"/>
-                <w:bCs w:val="0"/>
-                <w:color w:val="000000"/>
-                <w:sz w:val="22"/>
-                <w:szCs w:val="22"/>
-              </w:rPr>
-              <w:t>item.value</w:t>
-            </w:r>
-            <w:proofErr w:type="spellEnd"/>
-            <w:r>
-              <w:rPr>
-                <w:rFonts w:ascii="Cambria" w:hAnsi="Cambria"/>
-                <w:bCs w:val="0"/>
-                <w:color w:val="000000"/>
-                <w:sz w:val="22"/>
-                <w:szCs w:val="22"/>
-              </w:rPr>
-              <w:t>}} days</w:t>
+              <w:t>{{item.value}} days</w:t>
             </w:r>
           </w:p>
         </w:tc>
@@ -2014,51 +1443,7 @@
                 <w:sz w:val="22"/>
                 <w:szCs w:val="22"/>
               </w:rPr>
-              <w:t>{%</w:t>
-            </w:r>
-            <w:proofErr w:type="spellStart"/>
-            <w:r>
-              <w:rPr>
-                <w:rFonts w:ascii="Cambria" w:hAnsi="Cambria"/>
-                <w:b w:val="0"/>
-                <w:color w:val="000000"/>
-                <w:sz w:val="22"/>
-                <w:szCs w:val="22"/>
-              </w:rPr>
-              <w:t>tr</w:t>
-            </w:r>
-            <w:proofErr w:type="spellEnd"/>
-            <w:r>
-              <w:rPr>
-                <w:rFonts w:ascii="Cambria" w:hAnsi="Cambria"/>
-                <w:b w:val="0"/>
-                <w:color w:val="000000"/>
-                <w:sz w:val="22"/>
-                <w:szCs w:val="22"/>
-              </w:rPr>
-              <w:t xml:space="preserve"> </w:t>
-            </w:r>
-            <w:proofErr w:type="spellStart"/>
-            <w:r>
-              <w:rPr>
-                <w:rFonts w:ascii="Cambria" w:hAnsi="Cambria"/>
-                <w:b w:val="0"/>
-                <w:color w:val="000000"/>
-                <w:sz w:val="22"/>
-                <w:szCs w:val="22"/>
-              </w:rPr>
-              <w:t>endfor</w:t>
-            </w:r>
-            <w:proofErr w:type="spellEnd"/>
-            <w:r>
-              <w:rPr>
-                <w:rFonts w:ascii="Cambria" w:hAnsi="Cambria"/>
-                <w:b w:val="0"/>
-                <w:color w:val="000000"/>
-                <w:sz w:val="22"/>
-                <w:szCs w:val="22"/>
-              </w:rPr>
-              <w:t xml:space="preserve"> %}</w:t>
+              <w:t>{%tr endfor %}</w:t>
             </w:r>
           </w:p>
         </w:tc>
@@ -2156,39 +1541,7 @@
           <w:sz w:val="22"/>
           <w:szCs w:val="22"/>
         </w:rPr>
-        <w:t xml:space="preserve">{% if </w:t>
-      </w:r>
-      <w:proofErr w:type="spellStart"/>
-      <w:r>
-        <w:rPr>
-          <w:rFonts w:ascii="Cambria" w:hAnsi="Cambria"/>
-          <w:bCs w:val="0"/>
-          <w:color w:val="000000"/>
-          <w:sz w:val="22"/>
-          <w:szCs w:val="22"/>
-        </w:rPr>
-        <w:t>rhino_</w:t>
-      </w:r>
-      <w:r>
-        <w:rPr>
-          <w:rFonts w:ascii="Cambria" w:hAnsi="Cambria"/>
-          <w:bCs w:val="0"/>
-          <w:color w:val="000000"/>
-          <w:sz w:val="22"/>
-          <w:szCs w:val="22"/>
-        </w:rPr>
-        <w:t>territorial_movement</w:t>
-      </w:r>
-      <w:proofErr w:type="spellEnd"/>
-      <w:r>
-        <w:rPr>
-          <w:rFonts w:ascii="Cambria" w:hAnsi="Cambria"/>
-          <w:bCs w:val="0"/>
-          <w:color w:val="000000"/>
-          <w:sz w:val="22"/>
-          <w:szCs w:val="22"/>
-        </w:rPr>
-        <w:t xml:space="preserve"> %}</w:t>
+        <w:t>{% if rhino_territorial_movement %}</w:t>
       </w:r>
     </w:p>
     <w:tbl>
@@ -2393,10 +1746,19 @@
                 <w:sz w:val="22"/>
                 <w:szCs w:val="22"/>
               </w:rPr>
-              <w:t>{%</w:t>
-            </w:r>
-            <w:proofErr w:type="spellStart"/>
-            <w:r>
+              <w:t>{%tr for item in rhino_territorial_movement %}</w:t>
+            </w:r>
+          </w:p>
+        </w:tc>
+      </w:tr>
+      <w:tr>
+        <w:tc>
+          <w:tcPr>
+            <w:cnfStyle w:val="001000000000" w:firstRow="0" w:lastRow="0" w:firstColumn="1" w:lastColumn="0" w:oddVBand="0" w:evenVBand="0" w:oddHBand="0" w:evenHBand="0" w:firstRowFirstColumn="0" w:firstRowLastColumn="0" w:lastRowFirstColumn="0" w:lastRowLastColumn="0"/>
+            <w:tcW w:w="1435" w:type="dxa"/>
+          </w:tcPr>
+          <w:p>
+            <w:pPr>
               <w:rPr>
                 <w:rFonts w:ascii="Cambria" w:hAnsi="Cambria"/>
                 <w:b w:val="0"/>
@@ -2405,9 +1767,7 @@
                 <w:sz w:val="22"/>
                 <w:szCs w:val="22"/>
               </w:rPr>
-              <w:t>tr</w:t>
-            </w:r>
-            <w:proofErr w:type="spellEnd"/>
+            </w:pPr>
             <w:r>
               <w:rPr>
                 <w:rFonts w:ascii="Cambria" w:hAnsi="Cambria"/>
@@ -2417,86 +1777,7 @@
                 <w:sz w:val="22"/>
                 <w:szCs w:val="22"/>
               </w:rPr>
-              <w:t xml:space="preserve"> for item in </w:t>
-            </w:r>
-            <w:proofErr w:type="spellStart"/>
-            <w:r>
-              <w:rPr>
-                <w:rFonts w:ascii="Cambria" w:hAnsi="Cambria"/>
-                <w:b w:val="0"/>
-                <w:bCs/>
-                <w:color w:val="000000"/>
-                <w:sz w:val="22"/>
-                <w:szCs w:val="22"/>
-              </w:rPr>
-              <w:t>rhino_territorial_movement</w:t>
-            </w:r>
-            <w:proofErr w:type="spellEnd"/>
-            <w:r>
-              <w:rPr>
-                <w:rFonts w:ascii="Cambria" w:hAnsi="Cambria"/>
-                <w:b w:val="0"/>
-                <w:bCs/>
-                <w:color w:val="000000"/>
-                <w:sz w:val="22"/>
-                <w:szCs w:val="22"/>
-              </w:rPr>
-              <w:t xml:space="preserve"> %}</w:t>
-            </w:r>
-          </w:p>
-        </w:tc>
-      </w:tr>
-      <w:tr>
-        <w:tc>
-          <w:tcPr>
-            <w:cnfStyle w:val="001000000000" w:firstRow="0" w:lastRow="0" w:firstColumn="1" w:lastColumn="0" w:oddVBand="0" w:evenVBand="0" w:oddHBand="0" w:evenHBand="0" w:firstRowFirstColumn="0" w:firstRowLastColumn="0" w:lastRowFirstColumn="0" w:lastRowLastColumn="0"/>
-            <w:tcW w:w="1435" w:type="dxa"/>
-          </w:tcPr>
-          <w:p>
-            <w:pPr>
-              <w:rPr>
-                <w:rFonts w:ascii="Cambria" w:hAnsi="Cambria"/>
-                <w:b w:val="0"/>
-                <w:bCs/>
-                <w:color w:val="000000"/>
-                <w:sz w:val="22"/>
-                <w:szCs w:val="22"/>
-              </w:rPr>
-            </w:pPr>
-            <w:r>
-              <w:rPr>
-                <w:rFonts w:ascii="Cambria" w:hAnsi="Cambria"/>
-                <w:b w:val="0"/>
-                <w:bCs/>
-                <w:color w:val="000000"/>
-                <w:sz w:val="22"/>
-                <w:szCs w:val="22"/>
-              </w:rPr>
-              <w:t xml:space="preserve">{{ </w:t>
-            </w:r>
-            <w:proofErr w:type="spellStart"/>
-            <w:r>
-              <w:rPr>
-                <w:rFonts w:ascii="Cambria" w:hAnsi="Cambria"/>
-                <w:b w:val="0"/>
-                <w:bCs/>
-                <w:color w:val="000000"/>
-                <w:sz w:val="22"/>
-                <w:szCs w:val="22"/>
-              </w:rPr>
-              <w:t>item.conservancy</w:t>
-            </w:r>
-            <w:proofErr w:type="spellEnd"/>
-            <w:r>
-              <w:rPr>
-                <w:rFonts w:ascii="Cambria" w:hAnsi="Cambria"/>
-                <w:b w:val="0"/>
-                <w:bCs/>
-                <w:color w:val="000000"/>
-                <w:sz w:val="22"/>
-                <w:szCs w:val="22"/>
-              </w:rPr>
-              <w:t xml:space="preserve"> }}</w:t>
+              <w:t>{{ item.conservancy }}</w:t>
             </w:r>
           </w:p>
         </w:tc>
@@ -2523,10 +1804,17 @@
                 <w:sz w:val="22"/>
                 <w:szCs w:val="22"/>
               </w:rPr>
-              <w:t xml:space="preserve">{{ </w:t>
-            </w:r>
-            <w:proofErr w:type="spellStart"/>
-            <w:r>
+              <w:t>{{ item.color }}</w:t>
+            </w:r>
+          </w:p>
+        </w:tc>
+        <w:tc>
+          <w:tcPr>
+            <w:tcW w:w="1890" w:type="dxa"/>
+          </w:tcPr>
+          <w:p>
+            <w:pPr>
+              <w:cnfStyle w:val="000000000000" w:firstRow="0" w:lastRow="0" w:firstColumn="0" w:lastColumn="0" w:oddVBand="0" w:evenVBand="0" w:oddHBand="0" w:evenHBand="0" w:firstRowFirstColumn="0" w:firstRowLastColumn="0" w:lastRowFirstColumn="0" w:lastRowLastColumn="0"/>
               <w:rPr>
                 <w:rFonts w:ascii="Cambria" w:hAnsi="Cambria"/>
                 <w:bCs w:val="0"/>
@@ -2534,9 +1822,7 @@
                 <w:sz w:val="22"/>
                 <w:szCs w:val="22"/>
               </w:rPr>
-              <w:t>item.color</w:t>
-            </w:r>
-            <w:proofErr w:type="spellEnd"/>
+            </w:pPr>
             <w:r>
               <w:rPr>
                 <w:rFonts w:ascii="Cambria" w:hAnsi="Cambria"/>
@@ -2545,13 +1831,13 @@
                 <w:sz w:val="22"/>
                 <w:szCs w:val="22"/>
               </w:rPr>
-              <w:t xml:space="preserve"> }}</w:t>
-            </w:r>
-          </w:p>
-        </w:tc>
-        <w:tc>
-          <w:tcPr>
-            <w:tcW w:w="1890" w:type="dxa"/>
+              <w:t>{{ item.station }}</w:t>
+            </w:r>
+          </w:p>
+        </w:tc>
+        <w:tc>
+          <w:tcPr>
+            <w:tcW w:w="1710" w:type="dxa"/>
           </w:tcPr>
           <w:p>
             <w:pPr>
@@ -2572,10 +1858,17 @@
                 <w:sz w:val="22"/>
                 <w:szCs w:val="22"/>
               </w:rPr>
-              <w:t xml:space="preserve">{{ </w:t>
-            </w:r>
-            <w:proofErr w:type="spellStart"/>
-            <w:r>
+              <w:t>{{ item.rhinos }}</w:t>
+            </w:r>
+          </w:p>
+        </w:tc>
+        <w:tc>
+          <w:tcPr>
+            <w:tcW w:w="1715" w:type="dxa"/>
+          </w:tcPr>
+          <w:p>
+            <w:pPr>
+              <w:cnfStyle w:val="000000000000" w:firstRow="0" w:lastRow="0" w:firstColumn="0" w:lastColumn="0" w:oddVBand="0" w:evenVBand="0" w:oddHBand="0" w:evenHBand="0" w:firstRowFirstColumn="0" w:firstRowLastColumn="0" w:lastRowFirstColumn="0" w:lastRowLastColumn="0"/>
               <w:rPr>
                 <w:rFonts w:ascii="Cambria" w:hAnsi="Cambria"/>
                 <w:bCs w:val="0"/>
@@ -2583,9 +1876,7 @@
                 <w:sz w:val="22"/>
                 <w:szCs w:val="22"/>
               </w:rPr>
-              <w:t>item.station</w:t>
-            </w:r>
-            <w:proofErr w:type="spellEnd"/>
+            </w:pPr>
             <w:r>
               <w:rPr>
                 <w:rFonts w:ascii="Cambria" w:hAnsi="Cambria"/>
@@ -2594,13 +1885,13 @@
                 <w:sz w:val="22"/>
                 <w:szCs w:val="22"/>
               </w:rPr>
-              <w:t xml:space="preserve"> }}</w:t>
-            </w:r>
-          </w:p>
-        </w:tc>
-        <w:tc>
-          <w:tcPr>
-            <w:tcW w:w="1710" w:type="dxa"/>
+              <w:t>{{ item.behavior }}</w:t>
+            </w:r>
+          </w:p>
+        </w:tc>
+        <w:tc>
+          <w:tcPr>
+            <w:tcW w:w="1340" w:type="dxa"/>
           </w:tcPr>
           <w:p>
             <w:pPr>
@@ -2621,137 +1912,7 @@
                 <w:sz w:val="22"/>
                 <w:szCs w:val="22"/>
               </w:rPr>
-              <w:t xml:space="preserve">{{ </w:t>
-            </w:r>
-            <w:proofErr w:type="spellStart"/>
-            <w:r>
-              <w:rPr>
-                <w:rFonts w:ascii="Cambria" w:hAnsi="Cambria"/>
-                <w:bCs w:val="0"/>
-                <w:color w:val="000000"/>
-                <w:sz w:val="22"/>
-                <w:szCs w:val="22"/>
-              </w:rPr>
-              <w:t>item.rhinos</w:t>
-            </w:r>
-            <w:proofErr w:type="spellEnd"/>
-            <w:r>
-              <w:rPr>
-                <w:rFonts w:ascii="Cambria" w:hAnsi="Cambria"/>
-                <w:bCs w:val="0"/>
-                <w:color w:val="000000"/>
-                <w:sz w:val="22"/>
-                <w:szCs w:val="22"/>
-              </w:rPr>
-              <w:t xml:space="preserve"> }}</w:t>
-            </w:r>
-          </w:p>
-        </w:tc>
-        <w:tc>
-          <w:tcPr>
-            <w:tcW w:w="1715" w:type="dxa"/>
-          </w:tcPr>
-          <w:p>
-            <w:pPr>
-              <w:cnfStyle w:val="000000000000" w:firstRow="0" w:lastRow="0" w:firstColumn="0" w:lastColumn="0" w:oddVBand="0" w:evenVBand="0" w:oddHBand="0" w:evenHBand="0" w:firstRowFirstColumn="0" w:firstRowLastColumn="0" w:lastRowFirstColumn="0" w:lastRowLastColumn="0"/>
-              <w:rPr>
-                <w:rFonts w:ascii="Cambria" w:hAnsi="Cambria"/>
-                <w:bCs w:val="0"/>
-                <w:color w:val="000000"/>
-                <w:sz w:val="22"/>
-                <w:szCs w:val="22"/>
-              </w:rPr>
-            </w:pPr>
-            <w:r>
-              <w:rPr>
-                <w:rFonts w:ascii="Cambria" w:hAnsi="Cambria"/>
-                <w:bCs w:val="0"/>
-                <w:color w:val="000000"/>
-                <w:sz w:val="22"/>
-                <w:szCs w:val="22"/>
-              </w:rPr>
-              <w:t xml:space="preserve">{{ </w:t>
-            </w:r>
-            <w:proofErr w:type="spellStart"/>
-            <w:r>
-              <w:rPr>
-                <w:rFonts w:ascii="Cambria" w:hAnsi="Cambria"/>
-                <w:bCs w:val="0"/>
-                <w:color w:val="000000"/>
-                <w:sz w:val="22"/>
-                <w:szCs w:val="22"/>
-              </w:rPr>
-              <w:t>item.</w:t>
-            </w:r>
-            <w:r>
-              <w:rPr>
-                <w:rFonts w:ascii="Cambria" w:hAnsi="Cambria"/>
-                <w:bCs w:val="0"/>
-                <w:color w:val="000000"/>
-                <w:sz w:val="22"/>
-                <w:szCs w:val="22"/>
-              </w:rPr>
-              <w:t>behavior</w:t>
-            </w:r>
-            <w:proofErr w:type="spellEnd"/>
-            <w:r>
-              <w:rPr>
-                <w:rFonts w:ascii="Cambria" w:hAnsi="Cambria"/>
-                <w:bCs w:val="0"/>
-                <w:color w:val="000000"/>
-                <w:sz w:val="22"/>
-                <w:szCs w:val="22"/>
-              </w:rPr>
-              <w:t xml:space="preserve"> }}</w:t>
-            </w:r>
-          </w:p>
-        </w:tc>
-        <w:tc>
-          <w:tcPr>
-            <w:tcW w:w="1340" w:type="dxa"/>
-          </w:tcPr>
-          <w:p>
-            <w:pPr>
-              <w:cnfStyle w:val="000000000000" w:firstRow="0" w:lastRow="0" w:firstColumn="0" w:lastColumn="0" w:oddVBand="0" w:evenVBand="0" w:oddHBand="0" w:evenHBand="0" w:firstRowFirstColumn="0" w:firstRowLastColumn="0" w:lastRowFirstColumn="0" w:lastRowLastColumn="0"/>
-              <w:rPr>
-                <w:rFonts w:ascii="Cambria" w:hAnsi="Cambria"/>
-                <w:bCs w:val="0"/>
-                <w:color w:val="000000"/>
-                <w:sz w:val="22"/>
-                <w:szCs w:val="22"/>
-              </w:rPr>
-            </w:pPr>
-            <w:r>
-              <w:rPr>
-                <w:rFonts w:ascii="Cambria" w:hAnsi="Cambria"/>
-                <w:bCs w:val="0"/>
-                <w:color w:val="000000"/>
-                <w:sz w:val="22"/>
-                <w:szCs w:val="22"/>
-              </w:rPr>
-              <w:t xml:space="preserve">{{ </w:t>
-            </w:r>
-            <w:proofErr w:type="spellStart"/>
-            <w:r>
-              <w:rPr>
-                <w:rFonts w:ascii="Cambria" w:hAnsi="Cambria"/>
-                <w:bCs w:val="0"/>
-                <w:color w:val="000000"/>
-                <w:sz w:val="22"/>
-                <w:szCs w:val="22"/>
-              </w:rPr>
-              <w:t>item.health</w:t>
-            </w:r>
-            <w:proofErr w:type="spellEnd"/>
-            <w:r>
-              <w:rPr>
-                <w:rFonts w:ascii="Cambria" w:hAnsi="Cambria"/>
-                <w:bCs w:val="0"/>
-                <w:color w:val="000000"/>
-                <w:sz w:val="22"/>
-                <w:szCs w:val="22"/>
-              </w:rPr>
-              <w:t xml:space="preserve"> }}</w:t>
+              <w:t>{{ item.health }}</w:t>
             </w:r>
           </w:p>
         </w:tc>
@@ -2785,55 +1946,7 @@
                 <w:sz w:val="22"/>
                 <w:szCs w:val="22"/>
               </w:rPr>
-              <w:t>{%</w:t>
-            </w:r>
-            <w:proofErr w:type="spellStart"/>
-            <w:r>
-              <w:rPr>
-                <w:rFonts w:ascii="Cambria" w:hAnsi="Cambria"/>
-                <w:b w:val="0"/>
-                <w:bCs/>
-                <w:color w:val="000000"/>
-                <w:sz w:val="22"/>
-                <w:szCs w:val="22"/>
-              </w:rPr>
-              <w:t>tr</w:t>
-            </w:r>
-            <w:proofErr w:type="spellEnd"/>
-            <w:r>
-              <w:rPr>
-                <w:rFonts w:ascii="Cambria" w:hAnsi="Cambria"/>
-                <w:b w:val="0"/>
-                <w:bCs/>
-                <w:color w:val="000000"/>
-                <w:sz w:val="22"/>
-                <w:szCs w:val="22"/>
-              </w:rPr>
-              <w:t xml:space="preserve"> </w:t>
-            </w:r>
-            <w:proofErr w:type="spellStart"/>
-            <w:r>
-              <w:rPr>
-                <w:rFonts w:ascii="Cambria" w:hAnsi="Cambria"/>
-                <w:b w:val="0"/>
-                <w:bCs/>
-                <w:color w:val="000000"/>
-                <w:sz w:val="22"/>
-                <w:szCs w:val="22"/>
-              </w:rPr>
-              <w:t>endfor</w:t>
-            </w:r>
-            <w:proofErr w:type="spellEnd"/>
-            <w:r>
-              <w:rPr>
-                <w:rFonts w:ascii="Cambria" w:hAnsi="Cambria"/>
-                <w:b w:val="0"/>
-                <w:bCs/>
-                <w:color w:val="000000"/>
-                <w:sz w:val="22"/>
-                <w:szCs w:val="22"/>
-              </w:rPr>
-              <w:t xml:space="preserve"> %}</w:t>
+              <w:t>{%tr endfor %}</w:t>
             </w:r>
           </w:p>
         </w:tc>
@@ -3010,29 +2123,7 @@
           <w:sz w:val="22"/>
           <w:szCs w:val="22"/>
         </w:rPr>
-        <w:t xml:space="preserve">{% </w:t>
-      </w:r>
-      <w:proofErr w:type="spellStart"/>
-      <w:r>
-        <w:rPr>
-          <w:rFonts w:ascii="Cambria" w:hAnsi="Cambria"/>
-          <w:bCs w:val="0"/>
-          <w:color w:val="000000"/>
-          <w:sz w:val="22"/>
-          <w:szCs w:val="22"/>
-        </w:rPr>
-        <w:t>endif</w:t>
-      </w:r>
-      <w:proofErr w:type="spellEnd"/>
-      <w:r>
-        <w:rPr>
-          <w:rFonts w:ascii="Cambria" w:hAnsi="Cambria"/>
-          <w:bCs w:val="0"/>
-          <w:color w:val="000000"/>
-          <w:sz w:val="22"/>
-          <w:szCs w:val="22"/>
-        </w:rPr>
-        <w:t xml:space="preserve"> %}</w:t>
+        <w:t>{% endif %}</w:t>
       </w:r>
     </w:p>
     <w:p>
@@ -3084,57 +2175,7 @@
           <w:sz w:val="22"/>
           <w:szCs w:val="22"/>
         </w:rPr>
-        <w:t xml:space="preserve">% for </w:t>
-      </w:r>
-      <w:proofErr w:type="spellStart"/>
-      <w:r>
-        <w:rPr>
-          <w:rFonts w:ascii="Cambria" w:hAnsi="Cambria"/>
-          <w:color w:val="000000"/>
-          <w:sz w:val="22"/>
-          <w:szCs w:val="22"/>
-        </w:rPr>
-        <w:t>os</w:t>
-      </w:r>
-      <w:proofErr w:type="spellEnd"/>
-      <w:r>
-        <w:rPr>
-          <w:rFonts w:ascii="Cambria" w:hAnsi="Cambria"/>
-          <w:color w:val="000000"/>
-          <w:sz w:val="22"/>
-          <w:szCs w:val="22"/>
-        </w:rPr>
-        <w:t xml:space="preserve"> in </w:t>
-      </w:r>
-      <w:proofErr w:type="spellStart"/>
-      <w:r>
-        <w:rPr>
-          <w:rFonts w:ascii="Cambria" w:hAnsi="Cambria"/>
-          <w:color w:val="000000"/>
-          <w:sz w:val="22"/>
-          <w:szCs w:val="22"/>
-        </w:rPr>
-        <w:t>other_sightings</w:t>
-      </w:r>
-      <w:proofErr w:type="spellEnd"/>
-      <w:r>
-        <w:rPr>
-          <w:rFonts w:ascii="Cambria" w:hAnsi="Cambria"/>
-          <w:color w:val="000000"/>
-          <w:sz w:val="22"/>
-          <w:szCs w:val="22"/>
-        </w:rPr>
-        <w:t xml:space="preserve"> </w:t>
-      </w:r>
-      <w:proofErr w:type="gramStart"/>
-      <w:r>
-        <w:rPr>
-          <w:rFonts w:ascii="Cambria" w:hAnsi="Cambria"/>
-          <w:color w:val="000000"/>
-          <w:sz w:val="22"/>
-          <w:szCs w:val="22"/>
-        </w:rPr>
-        <w:t>%}</w:t>
+        <w:t>% for os in other_sightings %}</w:t>
       </w:r>
       <w:r>
         <w:rPr>
@@ -3145,9 +2186,8 @@
           <w:sz w:val="22"/>
           <w:szCs w:val="22"/>
         </w:rPr>
-        <w:t>Other</w:t>
-      </w:r>
-      <w:proofErr w:type="gramEnd"/>
+        <w:t>Other wildlife s</w:t>
+      </w:r>
       <w:r>
         <w:rPr>
           <w:rFonts w:ascii="Cambria" w:hAnsi="Cambria"/>
@@ -3157,42 +2197,7 @@
           <w:sz w:val="22"/>
           <w:szCs w:val="22"/>
         </w:rPr>
-        <w:t xml:space="preserve"> wildlife s</w:t>
-      </w:r>
-      <w:r>
-        <w:rPr>
-          <w:rFonts w:ascii="Cambria" w:hAnsi="Cambria"/>
-          <w:b/>
-          <w:bCs w:val="0"/>
-          <w:color w:val="000000"/>
-          <w:sz w:val="22"/>
-          <w:szCs w:val="22"/>
-        </w:rPr>
-        <w:t xml:space="preserve">ightings on {{ </w:t>
-      </w:r>
-      <w:proofErr w:type="spellStart"/>
-      <w:r>
-        <w:rPr>
-          <w:rFonts w:ascii="Cambria" w:hAnsi="Cambria"/>
-          <w:b/>
-          <w:bCs w:val="0"/>
-          <w:color w:val="000000"/>
-          <w:sz w:val="22"/>
-          <w:szCs w:val="22"/>
-        </w:rPr>
-        <w:t>os.conservancy</w:t>
-      </w:r>
-      <w:proofErr w:type="spellEnd"/>
-      <w:r>
-        <w:rPr>
-          <w:rFonts w:ascii="Cambria" w:hAnsi="Cambria"/>
-          <w:b/>
-          <w:bCs w:val="0"/>
-          <w:color w:val="000000"/>
-          <w:sz w:val="22"/>
-          <w:szCs w:val="22"/>
-        </w:rPr>
-        <w:t xml:space="preserve"> }</w:t>
+        <w:t>ightings on {{ os.conservancy }</w:t>
       </w:r>
       <w:r>
         <w:rPr>
@@ -3317,7 +2322,6 @@
               </w:rPr>
               <w:t>{%</w:t>
             </w:r>
-            <w:proofErr w:type="spellStart"/>
             <w:r>
               <w:rPr>
                 <w:rFonts w:ascii="Cambria" w:hAnsi="Cambria"/>
@@ -3326,40 +2330,7 @@
                 <w:sz w:val="22"/>
                 <w:szCs w:val="22"/>
               </w:rPr>
-              <w:t>tr</w:t>
-            </w:r>
-            <w:proofErr w:type="spellEnd"/>
-            <w:r>
-              <w:rPr>
-                <w:rFonts w:ascii="Cambria" w:hAnsi="Cambria"/>
-                <w:b w:val="0"/>
-                <w:color w:val="000000"/>
-                <w:sz w:val="22"/>
-                <w:szCs w:val="22"/>
-              </w:rPr>
-              <w:t xml:space="preserve"> for item in </w:t>
-            </w:r>
-            <w:proofErr w:type="spellStart"/>
-            <w:r>
-              <w:rPr>
-                <w:rFonts w:ascii="Cambria" w:hAnsi="Cambria"/>
-                <w:b w:val="0"/>
-                <w:color w:val="000000"/>
-                <w:sz w:val="22"/>
-                <w:szCs w:val="22"/>
-              </w:rPr>
-              <w:t>os.sightings</w:t>
-            </w:r>
-            <w:proofErr w:type="spellEnd"/>
-            <w:r>
-              <w:rPr>
-                <w:rFonts w:ascii="Cambria" w:hAnsi="Cambria"/>
-                <w:b w:val="0"/>
-                <w:color w:val="000000"/>
-                <w:sz w:val="22"/>
-                <w:szCs w:val="22"/>
-              </w:rPr>
-              <w:t xml:space="preserve"> </w:t>
+              <w:t xml:space="preserve">tr for item in os.sightings </w:t>
             </w:r>
             <w:r>
               <w:rPr>
@@ -3435,29 +2406,7 @@
                 <w:sz w:val="22"/>
                 <w:szCs w:val="22"/>
               </w:rPr>
-              <w:t xml:space="preserve">{{ </w:t>
-            </w:r>
-            <w:proofErr w:type="spellStart"/>
-            <w:r>
-              <w:rPr>
-                <w:rFonts w:ascii="Cambria" w:hAnsi="Cambria"/>
-                <w:b w:val="0"/>
-                <w:color w:val="000000"/>
-                <w:sz w:val="22"/>
-                <w:szCs w:val="22"/>
-              </w:rPr>
-              <w:t>item.species</w:t>
-            </w:r>
-            <w:proofErr w:type="spellEnd"/>
-            <w:r>
-              <w:rPr>
-                <w:rFonts w:ascii="Cambria" w:hAnsi="Cambria"/>
-                <w:b w:val="0"/>
-                <w:color w:val="000000"/>
-                <w:sz w:val="22"/>
-                <w:szCs w:val="22"/>
-              </w:rPr>
-              <w:t>}}</w:t>
+              <w:t>{{ item.species}}</w:t>
             </w:r>
           </w:p>
         </w:tc>
@@ -3490,29 +2439,7 @@
                 <w:sz w:val="22"/>
                 <w:szCs w:val="22"/>
               </w:rPr>
-              <w:t>{{</w:t>
-            </w:r>
-            <w:proofErr w:type="spellStart"/>
-            <w:r>
-              <w:rPr>
-                <w:rFonts w:ascii="Cambria" w:hAnsi="Cambria"/>
-                <w:bCs w:val="0"/>
-                <w:color w:val="000000"/>
-                <w:sz w:val="22"/>
-                <w:szCs w:val="22"/>
-              </w:rPr>
-              <w:t>item.count</w:t>
-            </w:r>
-            <w:proofErr w:type="spellEnd"/>
-            <w:r>
-              <w:rPr>
-                <w:rFonts w:ascii="Cambria" w:hAnsi="Cambria"/>
-                <w:bCs w:val="0"/>
-                <w:color w:val="000000"/>
-                <w:sz w:val="22"/>
-                <w:szCs w:val="22"/>
-              </w:rPr>
-              <w:t>}}</w:t>
+              <w:t>{{item.count}}</w:t>
             </w:r>
           </w:p>
         </w:tc>
@@ -3551,7 +2478,6 @@
               </w:rPr>
               <w:t>{%</w:t>
             </w:r>
-            <w:proofErr w:type="spellStart"/>
             <w:r>
               <w:rPr>
                 <w:rFonts w:ascii="Cambria" w:hAnsi="Cambria"/>
@@ -3560,40 +2486,7 @@
                 <w:sz w:val="22"/>
                 <w:szCs w:val="22"/>
               </w:rPr>
-              <w:t>tr</w:t>
-            </w:r>
-            <w:proofErr w:type="spellEnd"/>
-            <w:r>
-              <w:rPr>
-                <w:rFonts w:ascii="Cambria" w:hAnsi="Cambria"/>
-                <w:b w:val="0"/>
-                <w:color w:val="000000"/>
-                <w:sz w:val="22"/>
-                <w:szCs w:val="22"/>
-              </w:rPr>
-              <w:t xml:space="preserve"> </w:t>
-            </w:r>
-            <w:proofErr w:type="spellStart"/>
-            <w:r>
-              <w:rPr>
-                <w:rFonts w:ascii="Cambria" w:hAnsi="Cambria"/>
-                <w:b w:val="0"/>
-                <w:color w:val="000000"/>
-                <w:sz w:val="22"/>
-                <w:szCs w:val="22"/>
-              </w:rPr>
-              <w:t>endfor</w:t>
-            </w:r>
-            <w:proofErr w:type="spellEnd"/>
-            <w:r>
-              <w:rPr>
-                <w:rFonts w:ascii="Cambria" w:hAnsi="Cambria"/>
-                <w:b w:val="0"/>
-                <w:color w:val="000000"/>
-                <w:sz w:val="22"/>
-                <w:szCs w:val="22"/>
-              </w:rPr>
-              <w:t xml:space="preserve"> %}</w:t>
+              <w:t>tr endfor %}</w:t>
             </w:r>
           </w:p>
         </w:tc>
@@ -3676,41 +2569,7 @@
           <w:sz w:val="22"/>
           <w:szCs w:val="22"/>
         </w:rPr>
-        <w:t>ted = {{</w:t>
-      </w:r>
-      <w:proofErr w:type="spellStart"/>
-      <w:proofErr w:type="gramStart"/>
-      <w:r>
-        <w:rPr>
-          <w:rFonts w:ascii="Cambria" w:hAnsi="Cambria"/>
-          <w:b/>
-          <w:color w:val="000000"/>
-          <w:sz w:val="22"/>
-          <w:szCs w:val="22"/>
-        </w:rPr>
-        <w:t>os.total</w:t>
-      </w:r>
-      <w:proofErr w:type="gramEnd"/>
-      <w:r>
-        <w:rPr>
-          <w:rFonts w:ascii="Cambria" w:hAnsi="Cambria"/>
-          <w:b/>
-          <w:color w:val="000000"/>
-          <w:sz w:val="22"/>
-          <w:szCs w:val="22"/>
-        </w:rPr>
-        <w:t>_sightings</w:t>
-      </w:r>
-      <w:proofErr w:type="spellEnd"/>
-      <w:r>
-        <w:rPr>
-          <w:rFonts w:ascii="Cambria" w:hAnsi="Cambria"/>
-          <w:b/>
-          <w:color w:val="000000"/>
-          <w:sz w:val="22"/>
-          <w:szCs w:val="22"/>
-        </w:rPr>
-        <w:t>}} reported.</w:t>
+        <w:t>ted = {{os.total_sightings}} reported.</w:t>
       </w:r>
     </w:p>
     <w:p>
@@ -3752,29 +2611,7 @@
           <w:sz w:val="22"/>
           <w:szCs w:val="22"/>
         </w:rPr>
-        <w:t xml:space="preserve">{% </w:t>
-      </w:r>
-      <w:proofErr w:type="spellStart"/>
-      <w:r>
-        <w:rPr>
-          <w:rFonts w:ascii="Cambria" w:hAnsi="Cambria"/>
-          <w:b/>
-          <w:color w:val="000000"/>
-          <w:sz w:val="22"/>
-          <w:szCs w:val="22"/>
-        </w:rPr>
-        <w:t>endfor</w:t>
-      </w:r>
-      <w:proofErr w:type="spellEnd"/>
-      <w:r>
-        <w:rPr>
-          <w:rFonts w:ascii="Cambria" w:hAnsi="Cambria"/>
-          <w:b/>
-          <w:color w:val="000000"/>
-          <w:sz w:val="22"/>
-          <w:szCs w:val="22"/>
-        </w:rPr>
-        <w:t xml:space="preserve"> %}</w:t>
+        <w:t>{% endfor %}</w:t>
       </w:r>
     </w:p>
     <w:p>
@@ -3816,6 +2653,7 @@
           <w:sz w:val="22"/>
           <w:szCs w:val="22"/>
         </w:rPr>
+        <w:lastRenderedPageBreak/>
         <w:t>Wildlife mortality:</w:t>
       </w:r>
       <w:r>
@@ -3836,27 +2674,7 @@
           <w:sz w:val="22"/>
           <w:szCs w:val="22"/>
         </w:rPr>
-        <w:t xml:space="preserve">{% if </w:t>
-      </w:r>
-      <w:r>
-        <w:rPr>
-          <w:rFonts w:ascii="Cambria" w:hAnsi="Cambria"/>
-          <w:bCs w:val="0"/>
-          <w:color w:val="000000"/>
-          <w:sz w:val="22"/>
-          <w:szCs w:val="22"/>
-        </w:rPr>
-        <w:t>carcass</w:t>
-      </w:r>
-      <w:r>
-        <w:rPr>
-          <w:rFonts w:ascii="Cambria" w:hAnsi="Cambria"/>
-          <w:bCs w:val="0"/>
-          <w:color w:val="000000"/>
-          <w:sz w:val="22"/>
-          <w:szCs w:val="22"/>
-        </w:rPr>
-        <w:t xml:space="preserve"> %}</w:t>
+        <w:t>{% if carcass %}</w:t>
       </w:r>
     </w:p>
     <w:tbl>
@@ -3899,7 +2717,6 @@
                 <w:sz w:val="22"/>
                 <w:szCs w:val="22"/>
               </w:rPr>
-              <w:lastRenderedPageBreak/>
               <w:t>Conservancy</w:t>
             </w:r>
           </w:p>
@@ -4037,7 +2854,6 @@
               </w:rPr>
               <w:t>{%</w:t>
             </w:r>
-            <w:proofErr w:type="spellStart"/>
             <w:r>
               <w:rPr>
                 <w:rFonts w:ascii="Cambria" w:hAnsi="Cambria"/>
@@ -4047,10 +2863,19 @@
                 <w:sz w:val="22"/>
                 <w:szCs w:val="22"/>
               </w:rPr>
-              <w:t>tr</w:t>
-            </w:r>
-            <w:proofErr w:type="spellEnd"/>
-            <w:r>
+              <w:t>tr for item in carcass %}</w:t>
+            </w:r>
+          </w:p>
+        </w:tc>
+      </w:tr>
+      <w:tr>
+        <w:tc>
+          <w:tcPr>
+            <w:cnfStyle w:val="001000000000" w:firstRow="0" w:lastRow="0" w:firstColumn="1" w:lastColumn="0" w:oddVBand="0" w:evenVBand="0" w:oddHBand="0" w:evenHBand="0" w:firstRowFirstColumn="0" w:firstRowLastColumn="0" w:lastRowFirstColumn="0" w:lastRowLastColumn="0"/>
+            <w:tcW w:w="1524" w:type="dxa"/>
+          </w:tcPr>
+          <w:p>
+            <w:pPr>
               <w:rPr>
                 <w:rFonts w:ascii="Cambria" w:hAnsi="Cambria"/>
                 <w:b w:val="0"/>
@@ -4059,19 +2884,8 @@
                 <w:sz w:val="22"/>
                 <w:szCs w:val="22"/>
               </w:rPr>
-              <w:t xml:space="preserve"> for item in carcass %}</w:t>
-            </w:r>
-          </w:p>
-        </w:tc>
-      </w:tr>
-      <w:tr>
-        <w:tc>
-          <w:tcPr>
-            <w:cnfStyle w:val="001000000000" w:firstRow="0" w:lastRow="0" w:firstColumn="1" w:lastColumn="0" w:oddVBand="0" w:evenVBand="0" w:oddHBand="0" w:evenHBand="0" w:firstRowFirstColumn="0" w:firstRowLastColumn="0" w:lastRowFirstColumn="0" w:lastRowLastColumn="0"/>
-            <w:tcW w:w="1524" w:type="dxa"/>
-          </w:tcPr>
-          <w:p>
-            <w:pPr>
+            </w:pPr>
+            <w:r>
               <w:rPr>
                 <w:rFonts w:ascii="Cambria" w:hAnsi="Cambria"/>
                 <w:b w:val="0"/>
@@ -4080,36 +2894,103 @@
                 <w:sz w:val="22"/>
                 <w:szCs w:val="22"/>
               </w:rPr>
-            </w:pPr>
-            <w:r>
-              <w:rPr>
-                <w:rFonts w:ascii="Cambria" w:hAnsi="Cambria"/>
-                <w:b w:val="0"/>
-                <w:bCs/>
-                <w:color w:val="000000"/>
-                <w:sz w:val="22"/>
-                <w:szCs w:val="22"/>
-              </w:rPr>
-              <w:t xml:space="preserve">{{ </w:t>
-            </w:r>
-            <w:proofErr w:type="spellStart"/>
-            <w:r>
-              <w:rPr>
-                <w:rFonts w:ascii="Cambria" w:hAnsi="Cambria"/>
-                <w:b w:val="0"/>
-                <w:bCs/>
-                <w:color w:val="000000"/>
-                <w:sz w:val="22"/>
-                <w:szCs w:val="22"/>
-              </w:rPr>
-              <w:t>item.conservancy</w:t>
-            </w:r>
-            <w:proofErr w:type="spellEnd"/>
-            <w:r>
-              <w:rPr>
-                <w:rFonts w:ascii="Cambria" w:hAnsi="Cambria"/>
-                <w:b w:val="0"/>
-                <w:bCs/>
+              <w:t>{{ item.conservancy }}</w:t>
+            </w:r>
+          </w:p>
+        </w:tc>
+        <w:tc>
+          <w:tcPr>
+            <w:tcW w:w="1891" w:type="dxa"/>
+          </w:tcPr>
+          <w:p>
+            <w:pPr>
+              <w:cnfStyle w:val="000000000000" w:firstRow="0" w:lastRow="0" w:firstColumn="0" w:lastColumn="0" w:oddVBand="0" w:evenVBand="0" w:oddHBand="0" w:evenHBand="0" w:firstRowFirstColumn="0" w:firstRowLastColumn="0" w:lastRowFirstColumn="0" w:lastRowLastColumn="0"/>
+              <w:rPr>
+                <w:rFonts w:ascii="Cambria" w:hAnsi="Cambria"/>
+                <w:bCs w:val="0"/>
+                <w:color w:val="000000"/>
+                <w:sz w:val="22"/>
+                <w:szCs w:val="22"/>
+              </w:rPr>
+            </w:pPr>
+            <w:r>
+              <w:rPr>
+                <w:rFonts w:ascii="Cambria" w:hAnsi="Cambria"/>
+                <w:bCs w:val="0"/>
+                <w:color w:val="000000"/>
+                <w:sz w:val="22"/>
+                <w:szCs w:val="22"/>
+              </w:rPr>
+              <w:t>{{ item.species }}</w:t>
+            </w:r>
+          </w:p>
+        </w:tc>
+        <w:tc>
+          <w:tcPr>
+            <w:tcW w:w="2251" w:type="dxa"/>
+          </w:tcPr>
+          <w:p>
+            <w:pPr>
+              <w:cnfStyle w:val="000000000000" w:firstRow="0" w:lastRow="0" w:firstColumn="0" w:lastColumn="0" w:oddVBand="0" w:evenVBand="0" w:oddHBand="0" w:evenHBand="0" w:firstRowFirstColumn="0" w:firstRowLastColumn="0" w:lastRowFirstColumn="0" w:lastRowLastColumn="0"/>
+              <w:rPr>
+                <w:rFonts w:ascii="Cambria" w:hAnsi="Cambria"/>
+                <w:bCs w:val="0"/>
+                <w:color w:val="000000"/>
+                <w:sz w:val="22"/>
+                <w:szCs w:val="22"/>
+              </w:rPr>
+            </w:pPr>
+            <w:r>
+              <w:rPr>
+                <w:rFonts w:ascii="Cambria" w:hAnsi="Cambria"/>
+                <w:bCs w:val="0"/>
+                <w:color w:val="000000"/>
+                <w:sz w:val="22"/>
+                <w:szCs w:val="22"/>
+              </w:rPr>
+              <w:t>{{ item.station }}</w:t>
+            </w:r>
+          </w:p>
+        </w:tc>
+        <w:tc>
+          <w:tcPr>
+            <w:tcW w:w="2609" w:type="dxa"/>
+          </w:tcPr>
+          <w:p>
+            <w:pPr>
+              <w:cnfStyle w:val="000000000000" w:firstRow="0" w:lastRow="0" w:firstColumn="0" w:lastColumn="0" w:oddVBand="0" w:evenVBand="0" w:oddHBand="0" w:evenHBand="0" w:firstRowFirstColumn="0" w:firstRowLastColumn="0" w:lastRowFirstColumn="0" w:lastRowLastColumn="0"/>
+              <w:rPr>
+                <w:rFonts w:ascii="Cambria" w:hAnsi="Cambria"/>
+                <w:bCs w:val="0"/>
+                <w:color w:val="000000"/>
+                <w:sz w:val="22"/>
+                <w:szCs w:val="22"/>
+              </w:rPr>
+            </w:pPr>
+            <w:r>
+              <w:rPr>
+                <w:rFonts w:ascii="Cambria" w:hAnsi="Cambria"/>
+                <w:bCs w:val="0"/>
+                <w:color w:val="000000"/>
+                <w:sz w:val="22"/>
+                <w:szCs w:val="22"/>
+              </w:rPr>
+              <w:t>{{ item.</w:t>
+            </w:r>
+            <w:r>
+              <w:rPr>
+                <w:rFonts w:ascii="Cambria" w:hAnsi="Cambria"/>
+                <w:bCs w:val="0"/>
+                <w:color w:val="000000"/>
+                <w:sz w:val="22"/>
+                <w:szCs w:val="22"/>
+              </w:rPr>
+              <w:t>cause_of_death</w:t>
+            </w:r>
+            <w:r>
+              <w:rPr>
+                <w:rFonts w:ascii="Cambria" w:hAnsi="Cambria"/>
+                <w:bCs w:val="0"/>
                 <w:color w:val="000000"/>
                 <w:sz w:val="22"/>
                 <w:szCs w:val="22"/>
@@ -4120,7 +3001,7 @@
         </w:tc>
         <w:tc>
           <w:tcPr>
-            <w:tcW w:w="1891" w:type="dxa"/>
+            <w:tcW w:w="900" w:type="dxa"/>
           </w:tcPr>
           <w:p>
             <w:pPr>
@@ -4141,206 +3022,7 @@
                 <w:sz w:val="22"/>
                 <w:szCs w:val="22"/>
               </w:rPr>
-              <w:t xml:space="preserve">{{ </w:t>
-            </w:r>
-            <w:proofErr w:type="spellStart"/>
-            <w:r>
-              <w:rPr>
-                <w:rFonts w:ascii="Cambria" w:hAnsi="Cambria"/>
-                <w:bCs w:val="0"/>
-                <w:color w:val="000000"/>
-                <w:sz w:val="22"/>
-                <w:szCs w:val="22"/>
-              </w:rPr>
-              <w:t>item.</w:t>
-            </w:r>
-            <w:r>
-              <w:rPr>
-                <w:rFonts w:ascii="Cambria" w:hAnsi="Cambria"/>
-                <w:bCs w:val="0"/>
-                <w:color w:val="000000"/>
-                <w:sz w:val="22"/>
-                <w:szCs w:val="22"/>
-              </w:rPr>
-              <w:t>species</w:t>
-            </w:r>
-            <w:proofErr w:type="spellEnd"/>
-            <w:r>
-              <w:rPr>
-                <w:rFonts w:ascii="Cambria" w:hAnsi="Cambria"/>
-                <w:bCs w:val="0"/>
-                <w:color w:val="000000"/>
-                <w:sz w:val="22"/>
-                <w:szCs w:val="22"/>
-              </w:rPr>
-              <w:t xml:space="preserve"> }}</w:t>
-            </w:r>
-          </w:p>
-        </w:tc>
-        <w:tc>
-          <w:tcPr>
-            <w:tcW w:w="2251" w:type="dxa"/>
-          </w:tcPr>
-          <w:p>
-            <w:pPr>
-              <w:cnfStyle w:val="000000000000" w:firstRow="0" w:lastRow="0" w:firstColumn="0" w:lastColumn="0" w:oddVBand="0" w:evenVBand="0" w:oddHBand="0" w:evenHBand="0" w:firstRowFirstColumn="0" w:firstRowLastColumn="0" w:lastRowFirstColumn="0" w:lastRowLastColumn="0"/>
-              <w:rPr>
-                <w:rFonts w:ascii="Cambria" w:hAnsi="Cambria"/>
-                <w:bCs w:val="0"/>
-                <w:color w:val="000000"/>
-                <w:sz w:val="22"/>
-                <w:szCs w:val="22"/>
-              </w:rPr>
-            </w:pPr>
-            <w:r>
-              <w:rPr>
-                <w:rFonts w:ascii="Cambria" w:hAnsi="Cambria"/>
-                <w:bCs w:val="0"/>
-                <w:color w:val="000000"/>
-                <w:sz w:val="22"/>
-                <w:szCs w:val="22"/>
-              </w:rPr>
-              <w:t xml:space="preserve">{{ </w:t>
-            </w:r>
-            <w:proofErr w:type="spellStart"/>
-            <w:r>
-              <w:rPr>
-                <w:rFonts w:ascii="Cambria" w:hAnsi="Cambria"/>
-                <w:bCs w:val="0"/>
-                <w:color w:val="000000"/>
-                <w:sz w:val="22"/>
-                <w:szCs w:val="22"/>
-              </w:rPr>
-              <w:t>item.station</w:t>
-            </w:r>
-            <w:proofErr w:type="spellEnd"/>
-            <w:r>
-              <w:rPr>
-                <w:rFonts w:ascii="Cambria" w:hAnsi="Cambria"/>
-                <w:bCs w:val="0"/>
-                <w:color w:val="000000"/>
-                <w:sz w:val="22"/>
-                <w:szCs w:val="22"/>
-              </w:rPr>
-              <w:t xml:space="preserve"> }}</w:t>
-            </w:r>
-          </w:p>
-        </w:tc>
-        <w:tc>
-          <w:tcPr>
-            <w:tcW w:w="2609" w:type="dxa"/>
-          </w:tcPr>
-          <w:p>
-            <w:pPr>
-              <w:cnfStyle w:val="000000000000" w:firstRow="0" w:lastRow="0" w:firstColumn="0" w:lastColumn="0" w:oddVBand="0" w:evenVBand="0" w:oddHBand="0" w:evenHBand="0" w:firstRowFirstColumn="0" w:firstRowLastColumn="0" w:lastRowFirstColumn="0" w:lastRowLastColumn="0"/>
-              <w:rPr>
-                <w:rFonts w:ascii="Cambria" w:hAnsi="Cambria"/>
-                <w:bCs w:val="0"/>
-                <w:color w:val="000000"/>
-                <w:sz w:val="22"/>
-                <w:szCs w:val="22"/>
-              </w:rPr>
-            </w:pPr>
-            <w:r>
-              <w:rPr>
-                <w:rFonts w:ascii="Cambria" w:hAnsi="Cambria"/>
-                <w:bCs w:val="0"/>
-                <w:color w:val="000000"/>
-                <w:sz w:val="22"/>
-                <w:szCs w:val="22"/>
-              </w:rPr>
-              <w:t xml:space="preserve">{{ </w:t>
-            </w:r>
-            <w:proofErr w:type="spellStart"/>
-            <w:r>
-              <w:rPr>
-                <w:rFonts w:ascii="Cambria" w:hAnsi="Cambria"/>
-                <w:bCs w:val="0"/>
-                <w:color w:val="000000"/>
-                <w:sz w:val="22"/>
-                <w:szCs w:val="22"/>
-              </w:rPr>
-              <w:t>item.</w:t>
-            </w:r>
-            <w:r>
-              <w:rPr>
-                <w:rFonts w:ascii="Cambria" w:hAnsi="Cambria"/>
-                <w:bCs w:val="0"/>
-                <w:color w:val="000000"/>
-                <w:sz w:val="22"/>
-                <w:szCs w:val="22"/>
-              </w:rPr>
-              <w:t>cause_of_death</w:t>
-            </w:r>
-            <w:proofErr w:type="spellEnd"/>
-            <w:r>
-              <w:rPr>
-                <w:rFonts w:ascii="Cambria" w:hAnsi="Cambria"/>
-                <w:bCs w:val="0"/>
-                <w:color w:val="000000"/>
-                <w:sz w:val="22"/>
-                <w:szCs w:val="22"/>
-              </w:rPr>
-              <w:t xml:space="preserve"> }}</w:t>
-            </w:r>
-          </w:p>
-        </w:tc>
-        <w:tc>
-          <w:tcPr>
-            <w:tcW w:w="900" w:type="dxa"/>
-          </w:tcPr>
-          <w:p>
-            <w:pPr>
-              <w:cnfStyle w:val="000000000000" w:firstRow="0" w:lastRow="0" w:firstColumn="0" w:lastColumn="0" w:oddVBand="0" w:evenVBand="0" w:oddHBand="0" w:evenHBand="0" w:firstRowFirstColumn="0" w:firstRowLastColumn="0" w:lastRowFirstColumn="0" w:lastRowLastColumn="0"/>
-              <w:rPr>
-                <w:rFonts w:ascii="Cambria" w:hAnsi="Cambria"/>
-                <w:bCs w:val="0"/>
-                <w:color w:val="000000"/>
-                <w:sz w:val="22"/>
-                <w:szCs w:val="22"/>
-              </w:rPr>
-            </w:pPr>
-            <w:r>
-              <w:rPr>
-                <w:rFonts w:ascii="Cambria" w:hAnsi="Cambria"/>
-                <w:bCs w:val="0"/>
-                <w:color w:val="000000"/>
-                <w:sz w:val="22"/>
-                <w:szCs w:val="22"/>
-              </w:rPr>
-              <w:t xml:space="preserve">{{ </w:t>
-            </w:r>
-            <w:proofErr w:type="spellStart"/>
-            <w:r>
-              <w:rPr>
-                <w:rFonts w:ascii="Cambria" w:hAnsi="Cambria"/>
-                <w:bCs w:val="0"/>
-                <w:color w:val="000000"/>
-                <w:sz w:val="22"/>
-                <w:szCs w:val="22"/>
-              </w:rPr>
-              <w:t>item.</w:t>
-            </w:r>
-            <w:r>
-              <w:rPr>
-                <w:rFonts w:ascii="Cambria" w:hAnsi="Cambria"/>
-                <w:bCs w:val="0"/>
-                <w:color w:val="000000"/>
-                <w:sz w:val="22"/>
-                <w:szCs w:val="22"/>
-              </w:rPr>
-              <w:t>number_animals</w:t>
-            </w:r>
-            <w:proofErr w:type="spellEnd"/>
-            <w:r>
-              <w:rPr>
-                <w:rFonts w:ascii="Cambria" w:hAnsi="Cambria"/>
-                <w:bCs w:val="0"/>
-                <w:color w:val="000000"/>
-                <w:sz w:val="22"/>
-                <w:szCs w:val="22"/>
-              </w:rPr>
-              <w:t xml:space="preserve"> }}</w:t>
+              <w:t>{{ item.number_animals }}</w:t>
             </w:r>
           </w:p>
         </w:tc>
@@ -4374,55 +3056,7 @@
                 <w:sz w:val="22"/>
                 <w:szCs w:val="22"/>
               </w:rPr>
-              <w:t>{%</w:t>
-            </w:r>
-            <w:proofErr w:type="spellStart"/>
-            <w:r>
-              <w:rPr>
-                <w:rFonts w:ascii="Cambria" w:hAnsi="Cambria"/>
-                <w:b w:val="0"/>
-                <w:bCs/>
-                <w:color w:val="000000"/>
-                <w:sz w:val="22"/>
-                <w:szCs w:val="22"/>
-              </w:rPr>
-              <w:t>tr</w:t>
-            </w:r>
-            <w:proofErr w:type="spellEnd"/>
-            <w:r>
-              <w:rPr>
-                <w:rFonts w:ascii="Cambria" w:hAnsi="Cambria"/>
-                <w:b w:val="0"/>
-                <w:bCs/>
-                <w:color w:val="000000"/>
-                <w:sz w:val="22"/>
-                <w:szCs w:val="22"/>
-              </w:rPr>
-              <w:t xml:space="preserve"> </w:t>
-            </w:r>
-            <w:proofErr w:type="spellStart"/>
-            <w:r>
-              <w:rPr>
-                <w:rFonts w:ascii="Cambria" w:hAnsi="Cambria"/>
-                <w:b w:val="0"/>
-                <w:bCs/>
-                <w:color w:val="000000"/>
-                <w:sz w:val="22"/>
-                <w:szCs w:val="22"/>
-              </w:rPr>
-              <w:t>endfor</w:t>
-            </w:r>
-            <w:proofErr w:type="spellEnd"/>
-            <w:r>
-              <w:rPr>
-                <w:rFonts w:ascii="Cambria" w:hAnsi="Cambria"/>
-                <w:b w:val="0"/>
-                <w:bCs/>
-                <w:color w:val="000000"/>
-                <w:sz w:val="22"/>
-                <w:szCs w:val="22"/>
-              </w:rPr>
-              <w:t xml:space="preserve"> %}</w:t>
+              <w:t>{%tr endfor %}</w:t>
             </w:r>
           </w:p>
         </w:tc>
@@ -4581,29 +3215,7 @@
           <w:sz w:val="22"/>
           <w:szCs w:val="22"/>
         </w:rPr>
-        <w:t xml:space="preserve">{% </w:t>
-      </w:r>
-      <w:proofErr w:type="spellStart"/>
-      <w:r>
-        <w:rPr>
-          <w:rFonts w:ascii="Cambria" w:hAnsi="Cambria"/>
-          <w:bCs w:val="0"/>
-          <w:color w:val="000000"/>
-          <w:sz w:val="22"/>
-          <w:szCs w:val="22"/>
-        </w:rPr>
-        <w:t>endif</w:t>
-      </w:r>
-      <w:proofErr w:type="spellEnd"/>
-      <w:r>
-        <w:rPr>
-          <w:rFonts w:ascii="Cambria" w:hAnsi="Cambria"/>
-          <w:bCs w:val="0"/>
-          <w:color w:val="000000"/>
-          <w:sz w:val="22"/>
-          <w:szCs w:val="22"/>
-        </w:rPr>
-        <w:t xml:space="preserve"> %}</w:t>
+        <w:t>{% endif %}</w:t>
       </w:r>
     </w:p>
     <w:p>
@@ -4663,61 +3275,17 @@
           <w:sz w:val="22"/>
           <w:szCs w:val="22"/>
         </w:rPr>
-        <w:t xml:space="preserve">Wildlife movement through the </w:t>
-      </w:r>
-      <w:proofErr w:type="gramStart"/>
-      <w:r>
-        <w:rPr>
-          <w:rFonts w:ascii="Cambria" w:hAnsi="Cambria"/>
-          <w:b/>
-          <w:color w:val="000000"/>
-          <w:sz w:val="22"/>
-          <w:szCs w:val="22"/>
-        </w:rPr>
-        <w:t>gaps:</w:t>
-      </w:r>
-      <w:r>
-        <w:rPr>
-          <w:rFonts w:ascii="Cambria" w:hAnsi="Cambria"/>
-          <w:bCs w:val="0"/>
-          <w:color w:val="000000"/>
-          <w:sz w:val="22"/>
-          <w:szCs w:val="22"/>
-        </w:rPr>
-        <w:t>{</w:t>
-      </w:r>
-      <w:proofErr w:type="gramEnd"/>
-      <w:r>
-        <w:rPr>
-          <w:rFonts w:ascii="Cambria" w:hAnsi="Cambria"/>
-          <w:bCs w:val="0"/>
-          <w:color w:val="000000"/>
-          <w:sz w:val="22"/>
-          <w:szCs w:val="22"/>
-        </w:rPr>
-        <w:t xml:space="preserve">% if </w:t>
-      </w:r>
-      <w:proofErr w:type="spellStart"/>
-      <w:r>
-        <w:rPr>
-          <w:rFonts w:ascii="Cambria" w:hAnsi="Cambria"/>
-          <w:bCs w:val="0"/>
-          <w:color w:val="000000"/>
-          <w:sz w:val="22"/>
-          <w:szCs w:val="22"/>
-        </w:rPr>
-        <w:t>gap_movement</w:t>
-      </w:r>
-      <w:proofErr w:type="spellEnd"/>
-      <w:r>
-        <w:rPr>
-          <w:rFonts w:ascii="Cambria" w:hAnsi="Cambria"/>
-          <w:bCs w:val="0"/>
-          <w:color w:val="000000"/>
-          <w:sz w:val="22"/>
-          <w:szCs w:val="22"/>
-        </w:rPr>
-        <w:t xml:space="preserve"> %}</w:t>
+        <w:t>Wildlife movement through the gaps:</w:t>
+      </w:r>
+      <w:r>
+        <w:rPr>
+          <w:rFonts w:ascii="Cambria" w:hAnsi="Cambria"/>
+          <w:bCs w:val="0"/>
+          <w:color w:val="000000"/>
+          <w:sz w:val="22"/>
+          <w:szCs w:val="22"/>
+        </w:rPr>
+        <w:t>{% if gap_movement %}</w:t>
       </w:r>
     </w:p>
     <w:p>
@@ -4887,42 +3455,8 @@
                 <w:sz w:val="22"/>
                 <w:szCs w:val="22"/>
               </w:rPr>
-              <w:t>{%</w:t>
-            </w:r>
-            <w:proofErr w:type="spellStart"/>
-            <w:r>
-              <w:rPr>
-                <w:rFonts w:ascii="Cambria" w:hAnsi="Cambria"/>
-                <w:b w:val="0"/>
-                <w:color w:val="000000"/>
-                <w:sz w:val="22"/>
-                <w:szCs w:val="22"/>
-              </w:rPr>
-              <w:t>tr</w:t>
-            </w:r>
-            <w:proofErr w:type="spellEnd"/>
-            <w:r>
-              <w:rPr>
-                <w:rFonts w:ascii="Cambria" w:hAnsi="Cambria"/>
-                <w:b w:val="0"/>
-                <w:color w:val="000000"/>
-                <w:sz w:val="22"/>
-                <w:szCs w:val="22"/>
-              </w:rPr>
-              <w:t xml:space="preserve"> for item in </w:t>
-            </w:r>
-            <w:proofErr w:type="spellStart"/>
-            <w:r>
-              <w:rPr>
-                <w:rFonts w:ascii="Cambria" w:hAnsi="Cambria"/>
-                <w:b w:val="0"/>
-                <w:color w:val="000000"/>
-                <w:sz w:val="22"/>
-                <w:szCs w:val="22"/>
-              </w:rPr>
-              <w:t>gap_movement</w:t>
-            </w:r>
-            <w:proofErr w:type="spellEnd"/>
+              <w:t>{%tr for item in gap_movement</w:t>
+            </w:r>
             <w:r>
               <w:rPr>
                 <w:rFonts w:ascii="Cambria" w:hAnsi="Cambria"/>
@@ -5035,29 +3569,7 @@
                 <w:sz w:val="22"/>
                 <w:szCs w:val="22"/>
               </w:rPr>
-              <w:t>{{</w:t>
-            </w:r>
-            <w:proofErr w:type="spellStart"/>
-            <w:r>
-              <w:rPr>
-                <w:rFonts w:ascii="Cambria" w:hAnsi="Cambria"/>
-                <w:b w:val="0"/>
-                <w:color w:val="000000"/>
-                <w:sz w:val="22"/>
-                <w:szCs w:val="22"/>
-              </w:rPr>
-              <w:t>item.gap_name</w:t>
-            </w:r>
-            <w:proofErr w:type="spellEnd"/>
-            <w:r>
-              <w:rPr>
-                <w:rFonts w:ascii="Cambria" w:hAnsi="Cambria"/>
-                <w:b w:val="0"/>
-                <w:color w:val="000000"/>
-                <w:sz w:val="22"/>
-                <w:szCs w:val="22"/>
-              </w:rPr>
-              <w:t>}}</w:t>
+              <w:t>{{item.gap_name}}</w:t>
             </w:r>
           </w:p>
         </w:tc>
@@ -5090,29 +3602,7 @@
                 <w:sz w:val="22"/>
                 <w:szCs w:val="22"/>
               </w:rPr>
-              <w:t>{{</w:t>
-            </w:r>
-            <w:proofErr w:type="spellStart"/>
-            <w:r>
-              <w:rPr>
-                <w:rFonts w:ascii="Cambria" w:hAnsi="Cambria"/>
-                <w:bCs w:val="0"/>
-                <w:color w:val="000000"/>
-                <w:sz w:val="22"/>
-                <w:szCs w:val="22"/>
-              </w:rPr>
-              <w:t>item.species</w:t>
-            </w:r>
-            <w:proofErr w:type="spellEnd"/>
-            <w:r>
-              <w:rPr>
-                <w:rFonts w:ascii="Cambria" w:hAnsi="Cambria"/>
-                <w:bCs w:val="0"/>
-                <w:color w:val="000000"/>
-                <w:sz w:val="22"/>
-                <w:szCs w:val="22"/>
-              </w:rPr>
-              <w:t>}}</w:t>
+              <w:t>{{item.species}}</w:t>
             </w:r>
           </w:p>
         </w:tc>
@@ -5145,29 +3635,7 @@
                 <w:sz w:val="22"/>
                 <w:szCs w:val="22"/>
               </w:rPr>
-              <w:t>{{</w:t>
-            </w:r>
-            <w:proofErr w:type="spellStart"/>
-            <w:r>
-              <w:rPr>
-                <w:rFonts w:ascii="Cambria" w:hAnsi="Cambria"/>
-                <w:bCs w:val="0"/>
-                <w:color w:val="000000"/>
-                <w:sz w:val="22"/>
-                <w:szCs w:val="22"/>
-              </w:rPr>
-              <w:t>item.total_in</w:t>
-            </w:r>
-            <w:proofErr w:type="spellEnd"/>
-            <w:r>
-              <w:rPr>
-                <w:rFonts w:ascii="Cambria" w:hAnsi="Cambria"/>
-                <w:bCs w:val="0"/>
-                <w:color w:val="000000"/>
-                <w:sz w:val="22"/>
-                <w:szCs w:val="22"/>
-              </w:rPr>
-              <w:t>}}</w:t>
+              <w:t>{{item.total_in}}</w:t>
             </w:r>
           </w:p>
         </w:tc>
@@ -5200,29 +3668,7 @@
                 <w:sz w:val="22"/>
                 <w:szCs w:val="22"/>
               </w:rPr>
-              <w:t>{{</w:t>
-            </w:r>
-            <w:proofErr w:type="spellStart"/>
-            <w:r>
-              <w:rPr>
-                <w:rFonts w:ascii="Cambria" w:hAnsi="Cambria"/>
-                <w:bCs w:val="0"/>
-                <w:color w:val="000000"/>
-                <w:sz w:val="22"/>
-                <w:szCs w:val="22"/>
-              </w:rPr>
-              <w:t>item.total_out</w:t>
-            </w:r>
-            <w:proofErr w:type="spellEnd"/>
-            <w:r>
-              <w:rPr>
-                <w:rFonts w:ascii="Cambria" w:hAnsi="Cambria"/>
-                <w:bCs w:val="0"/>
-                <w:color w:val="000000"/>
-                <w:sz w:val="22"/>
-                <w:szCs w:val="22"/>
-              </w:rPr>
-              <w:t>}}</w:t>
+              <w:t>{{item.total_out}}</w:t>
             </w:r>
           </w:p>
         </w:tc>
@@ -5259,51 +3705,7 @@
                 <w:sz w:val="22"/>
                 <w:szCs w:val="22"/>
               </w:rPr>
-              <w:t>{%</w:t>
-            </w:r>
-            <w:proofErr w:type="spellStart"/>
-            <w:r>
-              <w:rPr>
-                <w:rFonts w:ascii="Cambria" w:hAnsi="Cambria"/>
-                <w:b w:val="0"/>
-                <w:color w:val="000000"/>
-                <w:sz w:val="22"/>
-                <w:szCs w:val="22"/>
-              </w:rPr>
-              <w:t>tr</w:t>
-            </w:r>
-            <w:proofErr w:type="spellEnd"/>
-            <w:r>
-              <w:rPr>
-                <w:rFonts w:ascii="Cambria" w:hAnsi="Cambria"/>
-                <w:b w:val="0"/>
-                <w:color w:val="000000"/>
-                <w:sz w:val="22"/>
-                <w:szCs w:val="22"/>
-              </w:rPr>
-              <w:t xml:space="preserve"> </w:t>
-            </w:r>
-            <w:proofErr w:type="spellStart"/>
-            <w:r>
-              <w:rPr>
-                <w:rFonts w:ascii="Cambria" w:hAnsi="Cambria"/>
-                <w:b w:val="0"/>
-                <w:color w:val="000000"/>
-                <w:sz w:val="22"/>
-                <w:szCs w:val="22"/>
-              </w:rPr>
-              <w:t>endfor</w:t>
-            </w:r>
-            <w:proofErr w:type="spellEnd"/>
-            <w:r>
-              <w:rPr>
-                <w:rFonts w:ascii="Cambria" w:hAnsi="Cambria"/>
-                <w:b w:val="0"/>
-                <w:color w:val="000000"/>
-                <w:sz w:val="22"/>
-                <w:szCs w:val="22"/>
-              </w:rPr>
-              <w:t xml:space="preserve"> %}</w:t>
+              <w:t>{%tr endfor %}</w:t>
             </w:r>
           </w:p>
         </w:tc>
@@ -5455,29 +3857,7 @@
           <w:sz w:val="22"/>
           <w:szCs w:val="22"/>
         </w:rPr>
-        <w:t xml:space="preserve">{% </w:t>
-      </w:r>
-      <w:proofErr w:type="spellStart"/>
-      <w:r>
-        <w:rPr>
-          <w:rFonts w:ascii="Cambria" w:hAnsi="Cambria"/>
-          <w:bCs w:val="0"/>
-          <w:color w:val="000000"/>
-          <w:sz w:val="22"/>
-          <w:szCs w:val="22"/>
-        </w:rPr>
-        <w:t>endif</w:t>
-      </w:r>
-      <w:proofErr w:type="spellEnd"/>
-      <w:r>
-        <w:rPr>
-          <w:rFonts w:ascii="Cambria" w:hAnsi="Cambria"/>
-          <w:bCs w:val="0"/>
-          <w:color w:val="000000"/>
-          <w:sz w:val="22"/>
-          <w:szCs w:val="22"/>
-        </w:rPr>
-        <w:t xml:space="preserve"> %}</w:t>
+        <w:t>{% endif %}</w:t>
       </w:r>
     </w:p>
     <w:p>
@@ -5856,6 +4236,7 @@
           <w:sz w:val="22"/>
           <w:szCs w:val="22"/>
         </w:rPr>
+        <w:lastRenderedPageBreak/>
         <w:t>Rainfall</w:t>
       </w:r>
     </w:p>
@@ -6003,7 +4384,6 @@
         </w:rPr>
         <w:t xml:space="preserve">Rainfall for: </w:t>
       </w:r>
-      <w:proofErr w:type="gramStart"/>
       <w:r>
         <w:rPr>
           <w:rFonts w:ascii="Cambria" w:hAnsi="Cambria"/>
@@ -6024,9 +4404,30 @@
           <w:sz w:val="22"/>
           <w:szCs w:val="22"/>
         </w:rPr>
+        <w:t xml:space="preserve"> conservancy.</w:t>
+      </w:r>
+      <w:r>
+        <w:rPr>
+          <w:rFonts w:ascii="Cambria" w:hAnsi="Cambria"/>
+          <w:b/>
+          <w:bCs w:val="0"/>
+          <w:color w:val="000000"/>
+          <w:sz w:val="22"/>
+          <w:szCs w:val="22"/>
+        </w:rPr>
+        <w:t>conservancy</w:t>
+      </w:r>
+      <w:r>
+        <w:rPr>
+          <w:rFonts w:ascii="Cambria" w:hAnsi="Cambria"/>
+          <w:b/>
+          <w:bCs w:val="0"/>
+          <w:color w:val="000000"/>
+          <w:sz w:val="22"/>
+          <w:szCs w:val="22"/>
+        </w:rPr>
         <w:t xml:space="preserve"> </w:t>
       </w:r>
-      <w:proofErr w:type="spellStart"/>
       <w:r>
         <w:rPr>
           <w:rFonts w:ascii="Cambria" w:hAnsi="Cambria"/>
@@ -6036,52 +4437,6 @@
           <w:sz w:val="22"/>
           <w:szCs w:val="22"/>
         </w:rPr>
-        <w:t>conservancy</w:t>
-      </w:r>
-      <w:proofErr w:type="gramEnd"/>
-      <w:r>
-        <w:rPr>
-          <w:rFonts w:ascii="Cambria" w:hAnsi="Cambria"/>
-          <w:b/>
-          <w:bCs w:val="0"/>
-          <w:color w:val="000000"/>
-          <w:sz w:val="22"/>
-          <w:szCs w:val="22"/>
-        </w:rPr>
-        <w:t>.</w:t>
-      </w:r>
-      <w:r>
-        <w:rPr>
-          <w:rFonts w:ascii="Cambria" w:hAnsi="Cambria"/>
-          <w:b/>
-          <w:bCs w:val="0"/>
-          <w:color w:val="000000"/>
-          <w:sz w:val="22"/>
-          <w:szCs w:val="22"/>
-        </w:rPr>
-        <w:t>conservancy</w:t>
-      </w:r>
-      <w:proofErr w:type="spellEnd"/>
-      <w:r>
-        <w:rPr>
-          <w:rFonts w:ascii="Cambria" w:hAnsi="Cambria"/>
-          <w:b/>
-          <w:bCs w:val="0"/>
-          <w:color w:val="000000"/>
-          <w:sz w:val="22"/>
-          <w:szCs w:val="22"/>
-        </w:rPr>
-        <w:t xml:space="preserve"> </w:t>
-      </w:r>
-      <w:r>
-        <w:rPr>
-          <w:rFonts w:ascii="Cambria" w:hAnsi="Cambria"/>
-          <w:b/>
-          <w:bCs w:val="0"/>
-          <w:color w:val="000000"/>
-          <w:sz w:val="22"/>
-          <w:szCs w:val="22"/>
-        </w:rPr>
         <w:t>}}</w:t>
       </w:r>
       <w:r>
@@ -6092,39 +4447,17 @@
           <w:sz w:val="22"/>
           <w:szCs w:val="22"/>
         </w:rPr>
-        <w:t xml:space="preserve">{% if </w:t>
-      </w:r>
-      <w:proofErr w:type="spellStart"/>
-      <w:r>
-        <w:rPr>
-          <w:rFonts w:ascii="Cambria" w:hAnsi="Cambria"/>
-          <w:bCs w:val="0"/>
-          <w:color w:val="000000"/>
-          <w:sz w:val="22"/>
-          <w:szCs w:val="22"/>
-        </w:rPr>
-        <w:t>conservancy.rainfa</w:t>
-      </w:r>
-      <w:r>
-        <w:rPr>
-          <w:rFonts w:ascii="Cambria" w:hAnsi="Cambria"/>
-          <w:bCs w:val="0"/>
-          <w:color w:val="000000"/>
-          <w:sz w:val="22"/>
-          <w:szCs w:val="22"/>
-        </w:rPr>
-        <w:t>ll</w:t>
-      </w:r>
-      <w:proofErr w:type="spellEnd"/>
-      <w:r>
-        <w:rPr>
-          <w:rFonts w:ascii="Cambria" w:hAnsi="Cambria"/>
-          <w:bCs w:val="0"/>
-          <w:color w:val="000000"/>
-          <w:sz w:val="22"/>
-          <w:szCs w:val="22"/>
-        </w:rPr>
-        <w:t xml:space="preserve"> %}</w:t>
+        <w:t>{% if conservancy.rainfa</w:t>
+      </w:r>
+      <w:r>
+        <w:rPr>
+          <w:rFonts w:ascii="Cambria" w:hAnsi="Cambria"/>
+          <w:bCs w:val="0"/>
+          <w:color w:val="000000"/>
+          <w:sz w:val="22"/>
+          <w:szCs w:val="22"/>
+        </w:rPr>
+        <w:t>ll %}</w:t>
       </w:r>
     </w:p>
     <w:tbl>
@@ -6228,51 +4561,7 @@
                 <w:sz w:val="22"/>
                 <w:szCs w:val="22"/>
               </w:rPr>
-              <w:t>{%</w:t>
-            </w:r>
-            <w:proofErr w:type="spellStart"/>
-            <w:r>
-              <w:rPr>
-                <w:rFonts w:ascii="Cambria" w:hAnsi="Cambria"/>
-                <w:b w:val="0"/>
-                <w:color w:val="000000"/>
-                <w:sz w:val="22"/>
-                <w:szCs w:val="22"/>
-              </w:rPr>
-              <w:t>tr</w:t>
-            </w:r>
-            <w:proofErr w:type="spellEnd"/>
-            <w:r>
-              <w:rPr>
-                <w:rFonts w:ascii="Cambria" w:hAnsi="Cambria"/>
-                <w:b w:val="0"/>
-                <w:color w:val="000000"/>
-                <w:sz w:val="22"/>
-                <w:szCs w:val="22"/>
-              </w:rPr>
-              <w:t xml:space="preserve"> for item in </w:t>
-            </w:r>
-            <w:proofErr w:type="spellStart"/>
-            <w:r>
-              <w:rPr>
-                <w:rFonts w:ascii="Cambria" w:hAnsi="Cambria"/>
-                <w:b w:val="0"/>
-                <w:color w:val="000000"/>
-                <w:sz w:val="22"/>
-                <w:szCs w:val="22"/>
-              </w:rPr>
-              <w:t>conservancy.rainfall</w:t>
-            </w:r>
-            <w:proofErr w:type="spellEnd"/>
-            <w:r>
-              <w:rPr>
-                <w:rFonts w:ascii="Cambria" w:hAnsi="Cambria"/>
-                <w:b w:val="0"/>
-                <w:color w:val="000000"/>
-                <w:sz w:val="22"/>
-                <w:szCs w:val="22"/>
-              </w:rPr>
-              <w:t xml:space="preserve"> %}</w:t>
+              <w:t>{%tr for item in conservancy.rainfall %}</w:t>
             </w:r>
           </w:p>
         </w:tc>
@@ -6333,32 +4622,8 @@
                 <w:sz w:val="22"/>
                 <w:szCs w:val="22"/>
               </w:rPr>
-              <w:t xml:space="preserve">{{ </w:t>
-            </w:r>
-            <w:proofErr w:type="spellStart"/>
-            <w:r>
-              <w:rPr>
-                <w:rFonts w:ascii="Cambria" w:hAnsi="Cambria"/>
-                <w:b w:val="0"/>
-                <w:color w:val="000000"/>
-                <w:sz w:val="22"/>
-                <w:szCs w:val="22"/>
-              </w:rPr>
-              <w:t>item.station</w:t>
-            </w:r>
-            <w:proofErr w:type="spellEnd"/>
-            <w:r>
-              <w:rPr>
-                <w:rFonts w:ascii="Cambria" w:hAnsi="Cambria"/>
-                <w:b w:val="0"/>
-                <w:color w:val="000000"/>
-                <w:sz w:val="22"/>
-                <w:szCs w:val="22"/>
-              </w:rPr>
-              <w:t xml:space="preserve"> }}</w:t>
-            </w:r>
-            <w:bookmarkStart w:id="0" w:name="_GoBack"/>
-            <w:bookmarkEnd w:id="0"/>
+              <w:t>{{ item.station }}</w:t>
+            </w:r>
           </w:p>
         </w:tc>
         <w:tc>
@@ -6388,27 +4653,7 @@
                 <w:sz w:val="22"/>
                 <w:szCs w:val="22"/>
               </w:rPr>
-              <w:t xml:space="preserve">{{ </w:t>
-            </w:r>
-            <w:proofErr w:type="spellStart"/>
-            <w:r>
-              <w:rPr>
-                <w:rFonts w:ascii="Cambria" w:hAnsi="Cambria"/>
-                <w:color w:val="000000"/>
-                <w:sz w:val="22"/>
-                <w:szCs w:val="22"/>
-              </w:rPr>
-              <w:t>item.total_mm</w:t>
-            </w:r>
-            <w:proofErr w:type="spellEnd"/>
-            <w:r>
-              <w:rPr>
-                <w:rFonts w:ascii="Cambria" w:hAnsi="Cambria"/>
-                <w:color w:val="000000"/>
-                <w:sz w:val="22"/>
-                <w:szCs w:val="22"/>
-              </w:rPr>
-              <w:t xml:space="preserve"> }}</w:t>
+              <w:t>{{ item.total_mm }}</w:t>
             </w:r>
           </w:p>
         </w:tc>
@@ -6447,51 +4692,7 @@
                 <w:sz w:val="22"/>
                 <w:szCs w:val="22"/>
               </w:rPr>
-              <w:t>{%</w:t>
-            </w:r>
-            <w:proofErr w:type="spellStart"/>
-            <w:r>
-              <w:rPr>
-                <w:rFonts w:ascii="Cambria" w:hAnsi="Cambria"/>
-                <w:b w:val="0"/>
-                <w:color w:val="000000"/>
-                <w:sz w:val="22"/>
-                <w:szCs w:val="22"/>
-              </w:rPr>
-              <w:t>tr</w:t>
-            </w:r>
-            <w:proofErr w:type="spellEnd"/>
-            <w:r>
-              <w:rPr>
-                <w:rFonts w:ascii="Cambria" w:hAnsi="Cambria"/>
-                <w:b w:val="0"/>
-                <w:color w:val="000000"/>
-                <w:sz w:val="22"/>
-                <w:szCs w:val="22"/>
-              </w:rPr>
-              <w:t xml:space="preserve"> </w:t>
-            </w:r>
-            <w:proofErr w:type="spellStart"/>
-            <w:r>
-              <w:rPr>
-                <w:rFonts w:ascii="Cambria" w:hAnsi="Cambria"/>
-                <w:b w:val="0"/>
-                <w:color w:val="000000"/>
-                <w:sz w:val="22"/>
-                <w:szCs w:val="22"/>
-              </w:rPr>
-              <w:t>endfor</w:t>
-            </w:r>
-            <w:proofErr w:type="spellEnd"/>
-            <w:r>
-              <w:rPr>
-                <w:rFonts w:ascii="Cambria" w:hAnsi="Cambria"/>
-                <w:b w:val="0"/>
-                <w:color w:val="000000"/>
-                <w:sz w:val="22"/>
-                <w:szCs w:val="22"/>
-              </w:rPr>
-              <w:t xml:space="preserve"> %}</w:t>
+              <w:t>{%tr endfor %}</w:t>
             </w:r>
           </w:p>
         </w:tc>
@@ -6600,29 +4801,7 @@
           <w:sz w:val="22"/>
           <w:szCs w:val="22"/>
         </w:rPr>
-        <w:t xml:space="preserve">{% </w:t>
-      </w:r>
-      <w:proofErr w:type="spellStart"/>
-      <w:r>
-        <w:rPr>
-          <w:rFonts w:ascii="Cambria" w:hAnsi="Cambria"/>
-          <w:bCs w:val="0"/>
-          <w:color w:val="000000"/>
-          <w:sz w:val="22"/>
-          <w:szCs w:val="22"/>
-        </w:rPr>
-        <w:t>endif</w:t>
-      </w:r>
-      <w:proofErr w:type="spellEnd"/>
-      <w:r>
-        <w:rPr>
-          <w:rFonts w:ascii="Cambria" w:hAnsi="Cambria"/>
-          <w:bCs w:val="0"/>
-          <w:color w:val="000000"/>
-          <w:sz w:val="22"/>
-          <w:szCs w:val="22"/>
-        </w:rPr>
-        <w:t xml:space="preserve"> %}</w:t>
+        <w:t>{% endif %}</w:t>
       </w:r>
     </w:p>
     <w:p>
@@ -6660,27 +4839,15 @@
         </w:rPr>
         <w:t xml:space="preserve"> </w:t>
       </w:r>
-      <w:proofErr w:type="spellStart"/>
-      <w:r>
-        <w:rPr>
-          <w:rFonts w:ascii="Cambria" w:hAnsi="Cambria"/>
-          <w:bCs w:val="0"/>
-          <w:color w:val="000000"/>
-          <w:sz w:val="22"/>
-          <w:szCs w:val="22"/>
-        </w:rPr>
-        <w:t>endfor</w:t>
-      </w:r>
-      <w:proofErr w:type="spellEnd"/>
-      <w:r>
-        <w:rPr>
-          <w:rFonts w:ascii="Cambria" w:hAnsi="Cambria"/>
-          <w:bCs w:val="0"/>
-          <w:color w:val="000000"/>
-          <w:sz w:val="22"/>
-          <w:szCs w:val="22"/>
-        </w:rPr>
-        <w:t>%}</w:t>
+      <w:r>
+        <w:rPr>
+          <w:rFonts w:ascii="Cambria" w:hAnsi="Cambria"/>
+          <w:bCs w:val="0"/>
+          <w:color w:val="000000"/>
+          <w:sz w:val="22"/>
+          <w:szCs w:val="22"/>
+        </w:rPr>
+        <w:t>endfor%}</w:t>
       </w:r>
     </w:p>
     <w:p>
@@ -6808,9 +4975,8 @@
           <w:sz w:val="22"/>
           <w:szCs w:val="22"/>
         </w:rPr>
-        <w:t xml:space="preserve">Fence </w:t>
-      </w:r>
-      <w:proofErr w:type="gramStart"/>
+        <w:t>Fence Break</w:t>
+      </w:r>
       <w:r>
         <w:rPr>
           <w:rFonts w:ascii="Cambria" w:hAnsi="Cambria"/>
@@ -6819,7 +4985,7 @@
           <w:sz w:val="22"/>
           <w:szCs w:val="22"/>
         </w:rPr>
-        <w:t>Break</w:t>
+        <w:t>age</w:t>
       </w:r>
       <w:r>
         <w:rPr>
@@ -6829,16 +4995,6 @@
           <w:sz w:val="22"/>
           <w:szCs w:val="22"/>
         </w:rPr>
-        <w:t>age</w:t>
-      </w:r>
-      <w:r>
-        <w:rPr>
-          <w:rFonts w:ascii="Cambria" w:hAnsi="Cambria"/>
-          <w:b/>
-          <w:color w:val="000000"/>
-          <w:sz w:val="22"/>
-          <w:szCs w:val="22"/>
-        </w:rPr>
         <w:t>s</w:t>
       </w:r>
       <w:r>
@@ -6849,40 +5005,7 @@
           <w:sz w:val="22"/>
           <w:szCs w:val="22"/>
         </w:rPr>
-        <w:t>{</w:t>
-      </w:r>
-      <w:proofErr w:type="gramEnd"/>
-      <w:r>
-        <w:rPr>
-          <w:rFonts w:ascii="Cambria" w:hAnsi="Cambria"/>
-          <w:bCs w:val="0"/>
-          <w:color w:val="000000"/>
-          <w:sz w:val="22"/>
-          <w:szCs w:val="22"/>
-        </w:rPr>
-        <w:t xml:space="preserve">% if </w:t>
-      </w:r>
-      <w:proofErr w:type="spellStart"/>
-      <w:r>
-        <w:rPr>
-          <w:rFonts w:ascii="Cambria" w:hAnsi="Cambria"/>
-          <w:bCs w:val="0"/>
-          <w:color w:val="000000"/>
-          <w:sz w:val="22"/>
-          <w:szCs w:val="22"/>
-        </w:rPr>
-        <w:t>fence_breakage</w:t>
-      </w:r>
-      <w:proofErr w:type="spellEnd"/>
-      <w:r>
-        <w:rPr>
-          <w:rFonts w:ascii="Cambria" w:hAnsi="Cambria"/>
-          <w:bCs w:val="0"/>
-          <w:color w:val="000000"/>
-          <w:sz w:val="22"/>
-          <w:szCs w:val="22"/>
-        </w:rPr>
-        <w:t xml:space="preserve"> %}</w:t>
+        <w:t>{% if fence_breakage %}</w:t>
       </w:r>
     </w:p>
     <w:p>
@@ -7095,18 +5218,8 @@
                 <w:sz w:val="22"/>
                 <w:szCs w:val="22"/>
               </w:rPr>
-              <w:t xml:space="preserve">Logistics </w:t>
-            </w:r>
-            <w:proofErr w:type="spellStart"/>
-            <w:r>
-              <w:rPr>
-                <w:rFonts w:ascii="Calibri" w:hAnsi="Calibri"/>
-                <w:sz w:val="22"/>
-                <w:szCs w:val="22"/>
-              </w:rPr>
-              <w:t>Feeback</w:t>
-            </w:r>
-            <w:proofErr w:type="spellEnd"/>
+              <w:t>Logistics Feeback</w:t>
+            </w:r>
           </w:p>
         </w:tc>
       </w:tr>
@@ -7144,51 +5257,7 @@
                 <w:sz w:val="22"/>
                 <w:szCs w:val="22"/>
               </w:rPr>
-              <w:t>{%</w:t>
-            </w:r>
-            <w:proofErr w:type="spellStart"/>
-            <w:r>
-              <w:rPr>
-                <w:rFonts w:ascii="Cambria" w:hAnsi="Cambria"/>
-                <w:b w:val="0"/>
-                <w:color w:val="000000"/>
-                <w:sz w:val="22"/>
-                <w:szCs w:val="22"/>
-              </w:rPr>
-              <w:t>tr</w:t>
-            </w:r>
-            <w:proofErr w:type="spellEnd"/>
-            <w:r>
-              <w:rPr>
-                <w:rFonts w:ascii="Cambria" w:hAnsi="Cambria"/>
-                <w:b w:val="0"/>
-                <w:color w:val="000000"/>
-                <w:sz w:val="22"/>
-                <w:szCs w:val="22"/>
-              </w:rPr>
-              <w:t xml:space="preserve"> for item in </w:t>
-            </w:r>
-            <w:proofErr w:type="spellStart"/>
-            <w:r>
-              <w:rPr>
-                <w:rFonts w:ascii="Cambria" w:hAnsi="Cambria"/>
-                <w:b w:val="0"/>
-                <w:color w:val="000000"/>
-                <w:sz w:val="22"/>
-                <w:szCs w:val="22"/>
-              </w:rPr>
-              <w:t>fence_breakage</w:t>
-            </w:r>
-            <w:proofErr w:type="spellEnd"/>
-            <w:r>
-              <w:rPr>
-                <w:rFonts w:ascii="Cambria" w:hAnsi="Cambria"/>
-                <w:b w:val="0"/>
-                <w:color w:val="000000"/>
-                <w:sz w:val="22"/>
-                <w:szCs w:val="22"/>
-              </w:rPr>
-              <w:t xml:space="preserve"> %}</w:t>
+              <w:t>{%tr for item in fence_breakage %}</w:t>
             </w:r>
           </w:p>
         </w:tc>
@@ -7222,29 +5291,7 @@
                 <w:sz w:val="22"/>
                 <w:szCs w:val="22"/>
               </w:rPr>
-              <w:t xml:space="preserve">{{ </w:t>
-            </w:r>
-            <w:proofErr w:type="spellStart"/>
-            <w:r>
-              <w:rPr>
-                <w:rFonts w:ascii="Cambria" w:hAnsi="Cambria"/>
-                <w:b w:val="0"/>
-                <w:color w:val="000000"/>
-                <w:sz w:val="22"/>
-                <w:szCs w:val="22"/>
-              </w:rPr>
-              <w:t>item.time</w:t>
-            </w:r>
-            <w:proofErr w:type="spellEnd"/>
-            <w:r>
-              <w:rPr>
-                <w:rFonts w:ascii="Cambria" w:hAnsi="Cambria"/>
-                <w:b w:val="0"/>
-                <w:color w:val="000000"/>
-                <w:sz w:val="22"/>
-                <w:szCs w:val="22"/>
-              </w:rPr>
-              <w:t xml:space="preserve"> }}</w:t>
+              <w:t>{{ item.time }}</w:t>
             </w:r>
           </w:p>
         </w:tc>
@@ -7274,27 +5321,7 @@
                 <w:sz w:val="22"/>
                 <w:szCs w:val="22"/>
               </w:rPr>
-              <w:t>{{</w:t>
-            </w:r>
-            <w:proofErr w:type="spellStart"/>
-            <w:r>
-              <w:rPr>
-                <w:rFonts w:ascii="Cambria" w:hAnsi="Cambria"/>
-                <w:color w:val="000000"/>
-                <w:sz w:val="22"/>
-                <w:szCs w:val="22"/>
-              </w:rPr>
-              <w:t>item.section</w:t>
-            </w:r>
-            <w:proofErr w:type="spellEnd"/>
-            <w:r>
-              <w:rPr>
-                <w:rFonts w:ascii="Cambria" w:hAnsi="Cambria"/>
-                <w:color w:val="000000"/>
-                <w:sz w:val="22"/>
-                <w:szCs w:val="22"/>
-              </w:rPr>
-              <w:t xml:space="preserve"> }}</w:t>
+              <w:t>{{item.section }}</w:t>
             </w:r>
           </w:p>
         </w:tc>
@@ -7324,27 +5351,7 @@
                 <w:sz w:val="22"/>
                 <w:szCs w:val="22"/>
               </w:rPr>
-              <w:t xml:space="preserve">{{ </w:t>
-            </w:r>
-            <w:proofErr w:type="spellStart"/>
-            <w:r>
-              <w:rPr>
-                <w:rFonts w:ascii="Cambria" w:hAnsi="Cambria"/>
-                <w:color w:val="000000"/>
-                <w:sz w:val="22"/>
-                <w:szCs w:val="22"/>
-              </w:rPr>
-              <w:t>item.species</w:t>
-            </w:r>
-            <w:proofErr w:type="spellEnd"/>
-            <w:r>
-              <w:rPr>
-                <w:rFonts w:ascii="Cambria" w:hAnsi="Cambria"/>
-                <w:color w:val="000000"/>
-                <w:sz w:val="22"/>
-                <w:szCs w:val="22"/>
-              </w:rPr>
-              <w:t xml:space="preserve"> }}</w:t>
+              <w:t>{{ item.species }}</w:t>
             </w:r>
           </w:p>
         </w:tc>
@@ -7374,27 +5381,7 @@
                 <w:sz w:val="22"/>
                 <w:szCs w:val="22"/>
               </w:rPr>
-              <w:t xml:space="preserve">{{ </w:t>
-            </w:r>
-            <w:proofErr w:type="spellStart"/>
-            <w:r>
-              <w:rPr>
-                <w:rFonts w:ascii="Cambria" w:hAnsi="Cambria"/>
-                <w:color w:val="000000"/>
-                <w:sz w:val="22"/>
-                <w:szCs w:val="22"/>
-              </w:rPr>
-              <w:t>item.animal_name</w:t>
-            </w:r>
-            <w:proofErr w:type="spellEnd"/>
-            <w:r>
-              <w:rPr>
-                <w:rFonts w:ascii="Cambria" w:hAnsi="Cambria"/>
-                <w:color w:val="000000"/>
-                <w:sz w:val="22"/>
-                <w:szCs w:val="22"/>
-              </w:rPr>
-              <w:t>}}</w:t>
+              <w:t>{{ item.animal_name}}</w:t>
             </w:r>
           </w:p>
         </w:tc>
@@ -7424,27 +5411,7 @@
                 <w:sz w:val="22"/>
                 <w:szCs w:val="22"/>
               </w:rPr>
-              <w:t xml:space="preserve">{{ </w:t>
-            </w:r>
-            <w:proofErr w:type="spellStart"/>
-            <w:r>
-              <w:rPr>
-                <w:rFonts w:ascii="Cambria" w:hAnsi="Cambria"/>
-                <w:color w:val="000000"/>
-                <w:sz w:val="22"/>
-                <w:szCs w:val="22"/>
-              </w:rPr>
-              <w:t>item.reported_by</w:t>
-            </w:r>
-            <w:proofErr w:type="spellEnd"/>
-            <w:r>
-              <w:rPr>
-                <w:rFonts w:ascii="Cambria" w:hAnsi="Cambria"/>
-                <w:color w:val="000000"/>
-                <w:sz w:val="22"/>
-                <w:szCs w:val="22"/>
-              </w:rPr>
-              <w:t>}}</w:t>
+              <w:t>{{ item.reported_by}}</w:t>
             </w:r>
           </w:p>
         </w:tc>
@@ -7474,27 +5441,7 @@
                 <w:sz w:val="22"/>
                 <w:szCs w:val="22"/>
               </w:rPr>
-              <w:t xml:space="preserve">{{ </w:t>
-            </w:r>
-            <w:proofErr w:type="spellStart"/>
-            <w:r>
-              <w:rPr>
-                <w:rFonts w:ascii="Cambria" w:hAnsi="Cambria"/>
-                <w:color w:val="000000"/>
-                <w:sz w:val="22"/>
-                <w:szCs w:val="22"/>
-              </w:rPr>
-              <w:t>item.action</w:t>
-            </w:r>
-            <w:proofErr w:type="spellEnd"/>
-            <w:r>
-              <w:rPr>
-                <w:rFonts w:ascii="Cambria" w:hAnsi="Cambria"/>
-                <w:color w:val="000000"/>
-                <w:sz w:val="22"/>
-                <w:szCs w:val="22"/>
-              </w:rPr>
-              <w:t>}}</w:t>
+              <w:t>{{ item.action}}</w:t>
             </w:r>
           </w:p>
         </w:tc>
@@ -7524,36 +5471,16 @@
                 <w:sz w:val="22"/>
                 <w:szCs w:val="22"/>
               </w:rPr>
-              <w:t>{{</w:t>
-            </w:r>
-            <w:proofErr w:type="spellStart"/>
-            <w:r>
-              <w:rPr>
-                <w:rFonts w:ascii="Cambria" w:hAnsi="Cambria"/>
-                <w:color w:val="000000"/>
-                <w:sz w:val="22"/>
-                <w:szCs w:val="22"/>
-              </w:rPr>
-              <w:t>item.feed</w:t>
-            </w:r>
-            <w:r>
-              <w:rPr>
-                <w:rFonts w:ascii="Cambria" w:hAnsi="Cambria"/>
-                <w:color w:val="000000"/>
-                <w:sz w:val="22"/>
-                <w:szCs w:val="22"/>
-              </w:rPr>
-              <w:t>back</w:t>
-            </w:r>
-            <w:proofErr w:type="spellEnd"/>
-            <w:r>
-              <w:rPr>
-                <w:rFonts w:ascii="Cambria" w:hAnsi="Cambria"/>
-                <w:color w:val="000000"/>
-                <w:sz w:val="22"/>
-                <w:szCs w:val="22"/>
-              </w:rPr>
-              <w:t xml:space="preserve"> }}</w:t>
+              <w:t>{{item.feed</w:t>
+            </w:r>
+            <w:r>
+              <w:rPr>
+                <w:rFonts w:ascii="Cambria" w:hAnsi="Cambria"/>
+                <w:color w:val="000000"/>
+                <w:sz w:val="22"/>
+                <w:szCs w:val="22"/>
+              </w:rPr>
+              <w:t>back }}</w:t>
             </w:r>
           </w:p>
         </w:tc>
@@ -7590,51 +5517,7 @@
                 <w:sz w:val="22"/>
                 <w:szCs w:val="22"/>
               </w:rPr>
-              <w:t>{%</w:t>
-            </w:r>
-            <w:proofErr w:type="spellStart"/>
-            <w:r>
-              <w:rPr>
-                <w:rFonts w:ascii="Cambria" w:hAnsi="Cambria"/>
-                <w:b w:val="0"/>
-                <w:color w:val="000000"/>
-                <w:sz w:val="22"/>
-                <w:szCs w:val="22"/>
-              </w:rPr>
-              <w:t>tr</w:t>
-            </w:r>
-            <w:proofErr w:type="spellEnd"/>
-            <w:r>
-              <w:rPr>
-                <w:rFonts w:ascii="Cambria" w:hAnsi="Cambria"/>
-                <w:b w:val="0"/>
-                <w:color w:val="000000"/>
-                <w:sz w:val="22"/>
-                <w:szCs w:val="22"/>
-              </w:rPr>
-              <w:t xml:space="preserve"> </w:t>
-            </w:r>
-            <w:proofErr w:type="spellStart"/>
-            <w:r>
-              <w:rPr>
-                <w:rFonts w:ascii="Cambria" w:hAnsi="Cambria"/>
-                <w:b w:val="0"/>
-                <w:color w:val="000000"/>
-                <w:sz w:val="22"/>
-                <w:szCs w:val="22"/>
-              </w:rPr>
-              <w:t>endfor</w:t>
-            </w:r>
-            <w:proofErr w:type="spellEnd"/>
-            <w:r>
-              <w:rPr>
-                <w:rFonts w:ascii="Cambria" w:hAnsi="Cambria"/>
-                <w:b w:val="0"/>
-                <w:color w:val="000000"/>
-                <w:sz w:val="22"/>
-                <w:szCs w:val="22"/>
-              </w:rPr>
-              <w:t xml:space="preserve"> %}</w:t>
+              <w:t>{%tr endfor %}</w:t>
             </w:r>
           </w:p>
         </w:tc>
@@ -7846,27 +5729,7 @@
           <w:sz w:val="22"/>
           <w:szCs w:val="22"/>
         </w:rPr>
-        <w:t xml:space="preserve">{% </w:t>
-      </w:r>
-      <w:proofErr w:type="spellStart"/>
-      <w:r>
-        <w:rPr>
-          <w:rFonts w:ascii="Cambria" w:hAnsi="Cambria"/>
-          <w:color w:val="000000"/>
-          <w:sz w:val="22"/>
-          <w:szCs w:val="22"/>
-        </w:rPr>
-        <w:t>endif</w:t>
-      </w:r>
-      <w:proofErr w:type="spellEnd"/>
-      <w:r>
-        <w:rPr>
-          <w:rFonts w:ascii="Cambria" w:hAnsi="Cambria"/>
-          <w:color w:val="000000"/>
-          <w:sz w:val="22"/>
-          <w:szCs w:val="22"/>
-        </w:rPr>
-        <w:t xml:space="preserve"> %}</w:t>
+        <w:t>{% endif %}</w:t>
       </w:r>
     </w:p>
     <w:p>
@@ -7938,6 +5801,7 @@
           <w:sz w:val="22"/>
           <w:szCs w:val="22"/>
         </w:rPr>
+        <w:lastRenderedPageBreak/>
         <w:t>&lt;report details&gt;</w:t>
       </w:r>
     </w:p>
@@ -7964,7 +5828,6 @@
           <w:sz w:val="22"/>
           <w:szCs w:val="22"/>
         </w:rPr>
-        <w:lastRenderedPageBreak/>
         <w:t>---</w:t>
       </w:r>
     </w:p>
@@ -8074,15 +5937,7 @@
       <w:pStyle w:val="Footer"/>
     </w:pPr>
     <w:r>
-      <w:t>{{</w:t>
-    </w:r>
-    <w:proofErr w:type="spellStart"/>
-    <w:r>
-      <w:t>footer_text</w:t>
-    </w:r>
-    <w:proofErr w:type="spellEnd"/>
-    <w:r>
-      <w:t>}}</w:t>
+      <w:t>{{footer_text}}</w:t>
     </w:r>
   </w:p>
 </w:ftr>
@@ -8353,6 +6208,146 @@
 <file path=word/numbering.xml><?xml version="1.0" encoding="utf-8"?>
 <w:numbering xmlns:wpc="http://schemas.microsoft.com/office/word/2010/wordprocessingCanvas" xmlns:mo="http://schemas.microsoft.com/office/mac/office/2008/main" xmlns:mc="http://schemas.openxmlformats.org/markup-compatibility/2006" xmlns:mv="urn:schemas-microsoft-com:mac:vml" xmlns:o="urn:schemas-microsoft-com:office:office" xmlns:r="http://schemas.openxmlformats.org/officeDocument/2006/relationships" xmlns:m="http://schemas.openxmlformats.org/officeDocument/2006/math" xmlns:v="urn:schemas-microsoft-com:vml" xmlns:wp14="http://schemas.microsoft.com/office/word/2010/wordprocessingDrawing" xmlns:wp="http://schemas.openxmlformats.org/drawingml/2006/wordprocessingDrawing" xmlns:w10="urn:schemas-microsoft-com:office:word" xmlns:w="http://schemas.openxmlformats.org/wordprocessingml/2006/main" xmlns:w14="http://schemas.microsoft.com/office/word/2010/wordml" xmlns:w15="http://schemas.microsoft.com/office/word/2012/wordml" xmlns:wpg="http://schemas.microsoft.com/office/word/2010/wordprocessingGroup" xmlns:wpi="http://schemas.microsoft.com/office/word/2010/wordprocessingInk" xmlns:wne="http://schemas.microsoft.com/office/word/2006/wordml" xmlns:wps="http://schemas.microsoft.com/office/word/2010/wordprocessingShape" mc:Ignorable="w14 w15 wp14">
   <w:abstractNum w:abstractNumId="0">
+    <w:nsid w:val="FFFFFF1D"/>
+    <w:multiLevelType w:val="multilevel"/>
+    <w:tmpl w:val="F3B4D8C2"/>
+    <w:lvl w:ilvl="0">
+      <w:start w:val="1"/>
+      <w:numFmt w:val="bullet"/>
+      <w:lvlText w:val=""/>
+      <w:lvlJc w:val="left"/>
+      <w:pPr>
+        <w:tabs>
+          <w:tab w:val="num" w:pos="0"/>
+        </w:tabs>
+        <w:ind w:left="0" w:firstLine="0"/>
+      </w:pPr>
+      <w:rPr>
+        <w:rFonts w:ascii="Symbol" w:hAnsi="Symbol" w:hint="default"/>
+      </w:rPr>
+    </w:lvl>
+    <w:lvl w:ilvl="1">
+      <w:start w:val="1"/>
+      <w:numFmt w:val="bullet"/>
+      <w:lvlText w:val=""/>
+      <w:lvlJc w:val="left"/>
+      <w:pPr>
+        <w:tabs>
+          <w:tab w:val="num" w:pos="720"/>
+        </w:tabs>
+        <w:ind w:left="1080" w:hanging="360"/>
+      </w:pPr>
+      <w:rPr>
+        <w:rFonts w:ascii="Symbol" w:hAnsi="Symbol" w:hint="default"/>
+      </w:rPr>
+    </w:lvl>
+    <w:lvl w:ilvl="2">
+      <w:start w:val="1"/>
+      <w:numFmt w:val="bullet"/>
+      <w:lvlText w:val="o"/>
+      <w:lvlJc w:val="left"/>
+      <w:pPr>
+        <w:tabs>
+          <w:tab w:val="num" w:pos="1440"/>
+        </w:tabs>
+        <w:ind w:left="1800" w:hanging="360"/>
+      </w:pPr>
+      <w:rPr>
+        <w:rFonts w:ascii="Courier New" w:hAnsi="Courier New" w:cs="Courier New" w:hint="default"/>
+      </w:rPr>
+    </w:lvl>
+    <w:lvl w:ilvl="3">
+      <w:start w:val="1"/>
+      <w:numFmt w:val="bullet"/>
+      <w:lvlText w:val=""/>
+      <w:lvlJc w:val="left"/>
+      <w:pPr>
+        <w:tabs>
+          <w:tab w:val="num" w:pos="2160"/>
+        </w:tabs>
+        <w:ind w:left="2520" w:hanging="360"/>
+      </w:pPr>
+      <w:rPr>
+        <w:rFonts w:ascii="Wingdings" w:hAnsi="Wingdings" w:hint="default"/>
+      </w:rPr>
+    </w:lvl>
+    <w:lvl w:ilvl="4">
+      <w:start w:val="1"/>
+      <w:numFmt w:val="bullet"/>
+      <w:lvlText w:val=""/>
+      <w:lvlJc w:val="left"/>
+      <w:pPr>
+        <w:tabs>
+          <w:tab w:val="num" w:pos="2880"/>
+        </w:tabs>
+        <w:ind w:left="3240" w:hanging="360"/>
+      </w:pPr>
+      <w:rPr>
+        <w:rFonts w:ascii="Wingdings" w:hAnsi="Wingdings" w:hint="default"/>
+      </w:rPr>
+    </w:lvl>
+    <w:lvl w:ilvl="5">
+      <w:start w:val="1"/>
+      <w:numFmt w:val="bullet"/>
+      <w:lvlText w:val=""/>
+      <w:lvlJc w:val="left"/>
+      <w:pPr>
+        <w:tabs>
+          <w:tab w:val="num" w:pos="3600"/>
+        </w:tabs>
+        <w:ind w:left="3960" w:hanging="360"/>
+      </w:pPr>
+      <w:rPr>
+        <w:rFonts w:ascii="Symbol" w:hAnsi="Symbol" w:hint="default"/>
+      </w:rPr>
+    </w:lvl>
+    <w:lvl w:ilvl="6">
+      <w:start w:val="1"/>
+      <w:numFmt w:val="bullet"/>
+      <w:lvlText w:val="o"/>
+      <w:lvlJc w:val="left"/>
+      <w:pPr>
+        <w:tabs>
+          <w:tab w:val="num" w:pos="4320"/>
+        </w:tabs>
+        <w:ind w:left="4680" w:hanging="360"/>
+      </w:pPr>
+      <w:rPr>
+        <w:rFonts w:ascii="Courier New" w:hAnsi="Courier New" w:cs="Courier New" w:hint="default"/>
+      </w:rPr>
+    </w:lvl>
+    <w:lvl w:ilvl="7">
+      <w:start w:val="1"/>
+      <w:numFmt w:val="bullet"/>
+      <w:lvlText w:val=""/>
+      <w:lvlJc w:val="left"/>
+      <w:pPr>
+        <w:tabs>
+          <w:tab w:val="num" w:pos="5040"/>
+        </w:tabs>
+        <w:ind w:left="5400" w:hanging="360"/>
+      </w:pPr>
+      <w:rPr>
+        <w:rFonts w:ascii="Wingdings" w:hAnsi="Wingdings" w:hint="default"/>
+      </w:rPr>
+    </w:lvl>
+    <w:lvl w:ilvl="8">
+      <w:start w:val="1"/>
+      <w:numFmt w:val="bullet"/>
+      <w:lvlText w:val=""/>
+      <w:lvlJc w:val="left"/>
+      <w:pPr>
+        <w:tabs>
+          <w:tab w:val="num" w:pos="5760"/>
+        </w:tabs>
+        <w:ind w:left="6120" w:hanging="360"/>
+      </w:pPr>
+      <w:rPr>
+        <w:rFonts w:ascii="Wingdings" w:hAnsi="Wingdings" w:hint="default"/>
+      </w:rPr>
+    </w:lvl>
+  </w:abstractNum>
+  <w:abstractNum w:abstractNumId="1">
     <w:nsid w:val="10E00BB0"/>
     <w:multiLevelType w:val="hybridMultilevel"/>
     <w:tmpl w:val="8E5A7C5C"/>
@@ -8464,7 +6459,7 @@
       </w:rPr>
     </w:lvl>
   </w:abstractNum>
-  <w:abstractNum w:abstractNumId="1">
+  <w:abstractNum w:abstractNumId="2">
     <w:nsid w:val="266E722D"/>
     <w:multiLevelType w:val="hybridMultilevel"/>
     <w:tmpl w:val="0B369846"/>
@@ -8576,7 +6571,7 @@
       </w:rPr>
     </w:lvl>
   </w:abstractNum>
-  <w:abstractNum w:abstractNumId="2">
+  <w:abstractNum w:abstractNumId="3">
     <w:nsid w:val="372366C8"/>
     <w:multiLevelType w:val="hybridMultilevel"/>
     <w:tmpl w:val="02C0F422"/>
@@ -8689,13 +6684,16 @@
     </w:lvl>
   </w:abstractNum>
   <w:num w:numId="1">
+    <w:abstractNumId w:val="2"/>
+  </w:num>
+  <w:num w:numId="2">
     <w:abstractNumId w:val="1"/>
   </w:num>
-  <w:num w:numId="2">
+  <w:num w:numId="3">
+    <w:abstractNumId w:val="3"/>
+  </w:num>
+  <w:num w:numId="4">
     <w:abstractNumId w:val="0"/>
-  </w:num>
-  <w:num w:numId="3">
-    <w:abstractNumId w:val="2"/>
   </w:num>
   <w:numIdMacAtCleanup w:val="3"/>
 </w:numbering>
@@ -10306,7 +8304,7 @@
 </file>
 
 <file path=customXml/itemProps3.xml><?xml version="1.0" encoding="utf-8"?>
-<ds:datastoreItem xmlns:ds="http://schemas.openxmlformats.org/officeDocument/2006/customXml" ds:itemID="{08983893-5F24-9D49-ACFD-5713A53A7711}">
+<ds:datastoreItem xmlns:ds="http://schemas.openxmlformats.org/officeDocument/2006/customXml" ds:itemID="{84E655B3-00AC-9B4C-B9B7-9856CD810DAC}">
   <ds:schemaRefs>
     <ds:schemaRef ds:uri="http://schemas.openxmlformats.org/officeDocument/2006/bibliography"/>
   </ds:schemaRefs>

</xml_diff>

<commit_message>
Add 'missing rhinos' report section.
</commit_message>
<xml_diff>
--- a/das/reports/docx_template/lewa_sitrep_template.docx
+++ b/das/reports/docx_template/lewa_sitrep_template.docx
@@ -17,6 +17,7 @@
       <w:r>
         <w:t xml:space="preserve"> </w:t>
       </w:r>
+      <w:proofErr w:type="spellStart"/>
       <w:r>
         <w:t>Sit</w:t>
       </w:r>
@@ -26,12 +27,18 @@
       <w:r>
         <w:t>ep</w:t>
       </w:r>
+      <w:proofErr w:type="spellEnd"/>
       <w:r>
         <w:tab/>
       </w:r>
       <w:r>
-        <w:t>{{report_time</w:t>
-      </w:r>
+        <w:t>{{</w:t>
+      </w:r>
+      <w:proofErr w:type="spellStart"/>
+      <w:r>
+        <w:t>report_time</w:t>
+      </w:r>
+      <w:proofErr w:type="spellEnd"/>
       <w:r>
         <w:t>}}</w:t>
       </w:r>
@@ -46,14 +53,45 @@
           <w:szCs w:val="22"/>
         </w:rPr>
       </w:pPr>
-      <w:r>
-        <w:rPr>
-          <w:rFonts w:ascii="Cambria" w:hAnsi="Cambria"/>
-          <w:color w:val="000000"/>
-          <w:sz w:val="22"/>
-          <w:szCs w:val="22"/>
-        </w:rPr>
-        <w:t>{{ report_daterange_text }}</w:t>
+      <w:proofErr w:type="gramStart"/>
+      <w:r>
+        <w:rPr>
+          <w:rFonts w:ascii="Cambria" w:hAnsi="Cambria"/>
+          <w:color w:val="000000"/>
+          <w:sz w:val="22"/>
+          <w:szCs w:val="22"/>
+        </w:rPr>
+        <w:t xml:space="preserve">{{ </w:t>
+      </w:r>
+      <w:proofErr w:type="spellStart"/>
+      <w:r>
+        <w:rPr>
+          <w:rFonts w:ascii="Cambria" w:hAnsi="Cambria"/>
+          <w:color w:val="000000"/>
+          <w:sz w:val="22"/>
+          <w:szCs w:val="22"/>
+        </w:rPr>
+        <w:t>report</w:t>
+      </w:r>
+      <w:proofErr w:type="gramEnd"/>
+      <w:r>
+        <w:rPr>
+          <w:rFonts w:ascii="Cambria" w:hAnsi="Cambria"/>
+          <w:color w:val="000000"/>
+          <w:sz w:val="22"/>
+          <w:szCs w:val="22"/>
+        </w:rPr>
+        <w:t>_daterange_text</w:t>
+      </w:r>
+      <w:proofErr w:type="spellEnd"/>
+      <w:r>
+        <w:rPr>
+          <w:rFonts w:ascii="Cambria" w:hAnsi="Cambria"/>
+          <w:color w:val="000000"/>
+          <w:sz w:val="22"/>
+          <w:szCs w:val="22"/>
+        </w:rPr>
+        <w:t xml:space="preserve"> }}</w:t>
       </w:r>
     </w:p>
     <w:p>
@@ -66,6 +104,7 @@
     </w:p>
     <w:p>
       <w:pPr>
+        <w:keepNext/>
         <w:rPr>
           <w:rFonts w:ascii="Cambria" w:hAnsi="Cambria"/>
           <w:b/>
@@ -74,14 +113,43 @@
         </w:rPr>
       </w:pPr>
       <w:r>
-        <w:t>{% if wildlife_sightings %}</w:t>
-      </w:r>
-      <w:r>
-        <w:t>{% for ws in wildlife_sighting</w:t>
+        <w:t xml:space="preserve">{% if </w:t>
+      </w:r>
+      <w:proofErr w:type="spellStart"/>
+      <w:r>
+        <w:t>wildlife_sightings</w:t>
+      </w:r>
+      <w:proofErr w:type="spellEnd"/>
+      <w:r>
+        <w:t xml:space="preserve"> </w:t>
+      </w:r>
+      <w:proofErr w:type="gramStart"/>
+      <w:r>
+        <w:t>%}</w:t>
+      </w:r>
+      <w:r>
+        <w:t>{</w:t>
+      </w:r>
+      <w:proofErr w:type="gramEnd"/>
+      <w:r>
+        <w:t xml:space="preserve">% for </w:t>
+      </w:r>
+      <w:proofErr w:type="spellStart"/>
+      <w:r>
+        <w:t>ws</w:t>
+      </w:r>
+      <w:proofErr w:type="spellEnd"/>
+      <w:r>
+        <w:t xml:space="preserve"> in </w:t>
+      </w:r>
+      <w:proofErr w:type="spellStart"/>
+      <w:r>
+        <w:t>wildlife_sighting</w:t>
       </w:r>
       <w:r>
         <w:t>s</w:t>
       </w:r>
+      <w:proofErr w:type="spellEnd"/>
       <w:r>
         <w:t xml:space="preserve"> %}</w:t>
       </w:r>
@@ -129,8 +197,9 @@
           <w:sz w:val="22"/>
           <w:szCs w:val="22"/>
         </w:rPr>
-        <w:t>{{ws.</w:t>
-      </w:r>
+        <w:t>{{</w:t>
+      </w:r>
+      <w:proofErr w:type="spellStart"/>
       <w:r>
         <w:rPr>
           <w:rFonts w:ascii="Cambria" w:hAnsi="Cambria"/>
@@ -138,8 +207,18 @@
           <w:sz w:val="22"/>
           <w:szCs w:val="22"/>
         </w:rPr>
+        <w:t>ws.</w:t>
+      </w:r>
+      <w:r>
+        <w:rPr>
+          <w:rFonts w:ascii="Cambria" w:hAnsi="Cambria"/>
+          <w:b/>
+          <w:sz w:val="22"/>
+          <w:szCs w:val="22"/>
+        </w:rPr>
         <w:t>conservancy</w:t>
       </w:r>
+      <w:proofErr w:type="spellEnd"/>
       <w:r>
         <w:rPr>
           <w:rFonts w:ascii="Cambria" w:hAnsi="Cambria"/>
@@ -176,6 +255,7 @@
         </w:rPr>
         <w:t>{{</w:t>
       </w:r>
+      <w:proofErr w:type="spellStart"/>
       <w:r>
         <w:rPr>
           <w:rFonts w:ascii="Cambria" w:hAnsi="Cambria"/>
@@ -192,8 +272,9 @@
           <w:sz w:val="22"/>
           <w:szCs w:val="22"/>
         </w:rPr>
-        <w:t>total_rhino_black}}</w:t>
-      </w:r>
+        <w:t>total_rhino_black</w:t>
+      </w:r>
+      <w:proofErr w:type="spellEnd"/>
       <w:r>
         <w:rPr>
           <w:rFonts w:ascii="Cambria" w:hAnsi="Cambria"/>
@@ -201,6 +282,15 @@
           <w:sz w:val="22"/>
           <w:szCs w:val="22"/>
         </w:rPr>
+        <w:t>}}</w:t>
+      </w:r>
+      <w:r>
+        <w:rPr>
+          <w:rFonts w:ascii="Cambria" w:hAnsi="Cambria"/>
+          <w:b/>
+          <w:sz w:val="22"/>
+          <w:szCs w:val="22"/>
+        </w:rPr>
         <w:t>;</w:t>
       </w:r>
       <w:r>
@@ -230,6 +320,7 @@
         </w:rPr>
         <w:t>{{</w:t>
       </w:r>
+      <w:proofErr w:type="spellStart"/>
       <w:r>
         <w:rPr>
           <w:rFonts w:ascii="Cambria" w:hAnsi="Cambria"/>
@@ -248,6 +339,7 @@
         </w:rPr>
         <w:t>total_rhino_white</w:t>
       </w:r>
+      <w:proofErr w:type="spellEnd"/>
       <w:r>
         <w:rPr>
           <w:rFonts w:ascii="Cambria" w:hAnsi="Cambria"/>
@@ -332,7 +424,51 @@
                 <w:sz w:val="22"/>
                 <w:szCs w:val="22"/>
               </w:rPr>
-              <w:t>{%tr for item in ws.rhino_sightings %}</w:t>
+              <w:t>{%</w:t>
+            </w:r>
+            <w:proofErr w:type="spellStart"/>
+            <w:r>
+              <w:rPr>
+                <w:rFonts w:ascii="Cambria" w:hAnsi="Cambria"/>
+                <w:b w:val="0"/>
+                <w:color w:val="000000"/>
+                <w:sz w:val="22"/>
+                <w:szCs w:val="22"/>
+              </w:rPr>
+              <w:t>tr</w:t>
+            </w:r>
+            <w:proofErr w:type="spellEnd"/>
+            <w:r>
+              <w:rPr>
+                <w:rFonts w:ascii="Cambria" w:hAnsi="Cambria"/>
+                <w:b w:val="0"/>
+                <w:color w:val="000000"/>
+                <w:sz w:val="22"/>
+                <w:szCs w:val="22"/>
+              </w:rPr>
+              <w:t xml:space="preserve"> for item in </w:t>
+            </w:r>
+            <w:proofErr w:type="spellStart"/>
+            <w:r>
+              <w:rPr>
+                <w:rFonts w:ascii="Cambria" w:hAnsi="Cambria"/>
+                <w:b w:val="0"/>
+                <w:color w:val="000000"/>
+                <w:sz w:val="22"/>
+                <w:szCs w:val="22"/>
+              </w:rPr>
+              <w:t>ws.rhino_sightings</w:t>
+            </w:r>
+            <w:proofErr w:type="spellEnd"/>
+            <w:r>
+              <w:rPr>
+                <w:rFonts w:ascii="Cambria" w:hAnsi="Cambria"/>
+                <w:b w:val="0"/>
+                <w:color w:val="000000"/>
+                <w:sz w:val="22"/>
+                <w:szCs w:val="22"/>
+              </w:rPr>
+              <w:t xml:space="preserve"> %}</w:t>
             </w:r>
           </w:p>
         </w:tc>
@@ -388,7 +524,29 @@
                 <w:sz w:val="22"/>
                 <w:szCs w:val="22"/>
               </w:rPr>
-              <w:t>{{item.type}}</w:t>
+              <w:t>{{</w:t>
+            </w:r>
+            <w:proofErr w:type="spellStart"/>
+            <w:r>
+              <w:rPr>
+                <w:rFonts w:ascii="Cambria" w:hAnsi="Cambria"/>
+                <w:b w:val="0"/>
+                <w:color w:val="000000"/>
+                <w:sz w:val="22"/>
+                <w:szCs w:val="22"/>
+              </w:rPr>
+              <w:t>item.type</w:t>
+            </w:r>
+            <w:proofErr w:type="spellEnd"/>
+            <w:r>
+              <w:rPr>
+                <w:rFonts w:ascii="Cambria" w:hAnsi="Cambria"/>
+                <w:b w:val="0"/>
+                <w:color w:val="000000"/>
+                <w:sz w:val="22"/>
+                <w:szCs w:val="22"/>
+              </w:rPr>
+              <w:t>}}</w:t>
             </w:r>
           </w:p>
         </w:tc>
@@ -419,17 +577,48 @@
                 <w:sz w:val="22"/>
                 <w:szCs w:val="22"/>
               </w:rPr>
-              <w:t>{{item.count}}</w:t>
-            </w:r>
-            <w:r>
-              <w:rPr>
-                <w:rFonts w:ascii="Cambria" w:hAnsi="Cambria"/>
-                <w:color w:val="000000"/>
-                <w:sz w:val="22"/>
-                <w:szCs w:val="22"/>
-              </w:rPr>
-              <w:t xml:space="preserve"> {%if item.percentage</w:t>
-            </w:r>
+              <w:t>{{</w:t>
+            </w:r>
+            <w:proofErr w:type="spellStart"/>
+            <w:r>
+              <w:rPr>
+                <w:rFonts w:ascii="Cambria" w:hAnsi="Cambria"/>
+                <w:color w:val="000000"/>
+                <w:sz w:val="22"/>
+                <w:szCs w:val="22"/>
+              </w:rPr>
+              <w:t>item.count</w:t>
+            </w:r>
+            <w:proofErr w:type="spellEnd"/>
+            <w:r>
+              <w:rPr>
+                <w:rFonts w:ascii="Cambria" w:hAnsi="Cambria"/>
+                <w:color w:val="000000"/>
+                <w:sz w:val="22"/>
+                <w:szCs w:val="22"/>
+              </w:rPr>
+              <w:t>}}</w:t>
+            </w:r>
+            <w:r>
+              <w:rPr>
+                <w:rFonts w:ascii="Cambria" w:hAnsi="Cambria"/>
+                <w:color w:val="000000"/>
+                <w:sz w:val="22"/>
+                <w:szCs w:val="22"/>
+              </w:rPr>
+              <w:t xml:space="preserve"> {%if </w:t>
+            </w:r>
+            <w:proofErr w:type="spellStart"/>
+            <w:r>
+              <w:rPr>
+                <w:rFonts w:ascii="Cambria" w:hAnsi="Cambria"/>
+                <w:color w:val="000000"/>
+                <w:sz w:val="22"/>
+                <w:szCs w:val="22"/>
+              </w:rPr>
+              <w:t>item.percentage</w:t>
+            </w:r>
+            <w:proofErr w:type="spellEnd"/>
             <w:r>
               <w:rPr>
                 <w:rFonts w:ascii="Cambria" w:hAnsi="Cambria"/>
@@ -455,16 +644,56 @@
                 <w:sz w:val="22"/>
                 <w:szCs w:val="22"/>
               </w:rPr>
-              <w:t xml:space="preserve"> ({{ item.percentage}})</w:t>
-            </w:r>
-            <w:r>
-              <w:rPr>
-                <w:rFonts w:ascii="Cambria" w:hAnsi="Cambria"/>
-                <w:color w:val="000000"/>
-                <w:sz w:val="22"/>
-                <w:szCs w:val="22"/>
-              </w:rPr>
-              <w:t>{%endif%}</w:t>
+              <w:t xml:space="preserve"> ({{ </w:t>
+            </w:r>
+            <w:proofErr w:type="spellStart"/>
+            <w:r>
+              <w:rPr>
+                <w:rFonts w:ascii="Cambria" w:hAnsi="Cambria"/>
+                <w:color w:val="000000"/>
+                <w:sz w:val="22"/>
+                <w:szCs w:val="22"/>
+              </w:rPr>
+              <w:t>item.percentage</w:t>
+            </w:r>
+            <w:proofErr w:type="spellEnd"/>
+            <w:r>
+              <w:rPr>
+                <w:rFonts w:ascii="Cambria" w:hAnsi="Cambria"/>
+                <w:color w:val="000000"/>
+                <w:sz w:val="22"/>
+                <w:szCs w:val="22"/>
+              </w:rPr>
+              <w:t>}})</w:t>
+            </w:r>
+            <w:r>
+              <w:rPr>
+                <w:rFonts w:ascii="Cambria" w:hAnsi="Cambria"/>
+                <w:color w:val="000000"/>
+                <w:sz w:val="22"/>
+                <w:szCs w:val="22"/>
+              </w:rPr>
+              <w:t>{%</w:t>
+            </w:r>
+            <w:proofErr w:type="spellStart"/>
+            <w:r>
+              <w:rPr>
+                <w:rFonts w:ascii="Cambria" w:hAnsi="Cambria"/>
+                <w:color w:val="000000"/>
+                <w:sz w:val="22"/>
+                <w:szCs w:val="22"/>
+              </w:rPr>
+              <w:t>endif</w:t>
+            </w:r>
+            <w:proofErr w:type="spellEnd"/>
+            <w:r>
+              <w:rPr>
+                <w:rFonts w:ascii="Cambria" w:hAnsi="Cambria"/>
+                <w:color w:val="000000"/>
+                <w:sz w:val="22"/>
+                <w:szCs w:val="22"/>
+              </w:rPr>
+              <w:t>%}</w:t>
             </w:r>
             <w:r>
               <w:rPr>
@@ -510,17 +739,61 @@
                 <w:sz w:val="22"/>
                 <w:szCs w:val="22"/>
               </w:rPr>
-              <w:t>{%tr end</w:t>
-            </w:r>
-            <w:r>
-              <w:rPr>
-                <w:rFonts w:ascii="Cambria" w:hAnsi="Cambria"/>
-                <w:b w:val="0"/>
-                <w:color w:val="000000"/>
-                <w:sz w:val="22"/>
-                <w:szCs w:val="22"/>
-              </w:rPr>
-              <w:t>for %}</w:t>
+              <w:t>{%</w:t>
+            </w:r>
+            <w:proofErr w:type="spellStart"/>
+            <w:r>
+              <w:rPr>
+                <w:rFonts w:ascii="Cambria" w:hAnsi="Cambria"/>
+                <w:b w:val="0"/>
+                <w:color w:val="000000"/>
+                <w:sz w:val="22"/>
+                <w:szCs w:val="22"/>
+              </w:rPr>
+              <w:t>tr</w:t>
+            </w:r>
+            <w:proofErr w:type="spellEnd"/>
+            <w:r>
+              <w:rPr>
+                <w:rFonts w:ascii="Cambria" w:hAnsi="Cambria"/>
+                <w:b w:val="0"/>
+                <w:color w:val="000000"/>
+                <w:sz w:val="22"/>
+                <w:szCs w:val="22"/>
+              </w:rPr>
+              <w:t xml:space="preserve"> </w:t>
+            </w:r>
+            <w:proofErr w:type="spellStart"/>
+            <w:r>
+              <w:rPr>
+                <w:rFonts w:ascii="Cambria" w:hAnsi="Cambria"/>
+                <w:b w:val="0"/>
+                <w:color w:val="000000"/>
+                <w:sz w:val="22"/>
+                <w:szCs w:val="22"/>
+              </w:rPr>
+              <w:t>end</w:t>
+            </w:r>
+            <w:r>
+              <w:rPr>
+                <w:rFonts w:ascii="Cambria" w:hAnsi="Cambria"/>
+                <w:b w:val="0"/>
+                <w:color w:val="000000"/>
+                <w:sz w:val="22"/>
+                <w:szCs w:val="22"/>
+              </w:rPr>
+              <w:t>for</w:t>
+            </w:r>
+            <w:proofErr w:type="spellEnd"/>
+            <w:r>
+              <w:rPr>
+                <w:rFonts w:ascii="Cambria" w:hAnsi="Cambria"/>
+                <w:b w:val="0"/>
+                <w:color w:val="000000"/>
+                <w:sz w:val="22"/>
+                <w:szCs w:val="22"/>
+              </w:rPr>
+              <w:t xml:space="preserve"> %}</w:t>
             </w:r>
           </w:p>
         </w:tc>
@@ -609,19 +882,57 @@
                 <w:sz w:val="22"/>
                 <w:szCs w:val="22"/>
               </w:rPr>
-              <w:t>{{ws.total_sightings}}</w:t>
-            </w:r>
-            <w:r>
-              <w:rPr>
-                <w:rFonts w:ascii="Cambria" w:hAnsi="Cambria"/>
-                <w:color w:val="000000"/>
-                <w:sz w:val="22"/>
-                <w:szCs w:val="22"/>
-              </w:rPr>
-              <w:t xml:space="preserve"> ({{ ws.percentage }})</w:t>
-            </w:r>
-            <w:bookmarkStart w:id="0" w:name="_GoBack"/>
-            <w:bookmarkEnd w:id="0"/>
+              <w:t>{{</w:t>
+            </w:r>
+            <w:proofErr w:type="spellStart"/>
+            <w:r>
+              <w:rPr>
+                <w:rFonts w:ascii="Cambria" w:hAnsi="Cambria"/>
+                <w:color w:val="000000"/>
+                <w:sz w:val="22"/>
+                <w:szCs w:val="22"/>
+              </w:rPr>
+              <w:t>ws.total_sightings</w:t>
+            </w:r>
+            <w:proofErr w:type="spellEnd"/>
+            <w:r>
+              <w:rPr>
+                <w:rFonts w:ascii="Cambria" w:hAnsi="Cambria"/>
+                <w:color w:val="000000"/>
+                <w:sz w:val="22"/>
+                <w:szCs w:val="22"/>
+              </w:rPr>
+              <w:t>}}</w:t>
+            </w:r>
+            <w:r>
+              <w:rPr>
+                <w:rFonts w:ascii="Cambria" w:hAnsi="Cambria"/>
+                <w:color w:val="000000"/>
+                <w:sz w:val="22"/>
+                <w:szCs w:val="22"/>
+              </w:rPr>
+              <w:t xml:space="preserve"> ({{ </w:t>
+            </w:r>
+            <w:proofErr w:type="spellStart"/>
+            <w:r>
+              <w:rPr>
+                <w:rFonts w:ascii="Cambria" w:hAnsi="Cambria"/>
+                <w:color w:val="000000"/>
+                <w:sz w:val="22"/>
+                <w:szCs w:val="22"/>
+              </w:rPr>
+              <w:t>ws.percentage</w:t>
+            </w:r>
+            <w:proofErr w:type="spellEnd"/>
+            <w:r>
+              <w:rPr>
+                <w:rFonts w:ascii="Cambria" w:hAnsi="Cambria"/>
+                <w:color w:val="000000"/>
+                <w:sz w:val="22"/>
+                <w:szCs w:val="22"/>
+              </w:rPr>
+              <w:t xml:space="preserve"> }})</w:t>
+            </w:r>
           </w:p>
         </w:tc>
       </w:tr>
@@ -644,17 +955,61 @@
           <w:sz w:val="22"/>
           <w:szCs w:val="22"/>
         </w:rPr>
-        <w:t>{% endfor %}</w:t>
-      </w:r>
-      <w:r>
-        <w:rPr>
-          <w:rFonts w:ascii="Cambria" w:hAnsi="Cambria"/>
-          <w:bCs w:val="0"/>
-          <w:color w:val="000000"/>
-          <w:sz w:val="22"/>
-          <w:szCs w:val="22"/>
-        </w:rPr>
-        <w:t>{% else %}</w:t>
+        <w:t xml:space="preserve">{% </w:t>
+      </w:r>
+      <w:proofErr w:type="spellStart"/>
+      <w:r>
+        <w:rPr>
+          <w:rFonts w:ascii="Cambria" w:hAnsi="Cambria"/>
+          <w:bCs w:val="0"/>
+          <w:color w:val="000000"/>
+          <w:sz w:val="22"/>
+          <w:szCs w:val="22"/>
+        </w:rPr>
+        <w:t>endfor</w:t>
+      </w:r>
+      <w:proofErr w:type="spellEnd"/>
+      <w:r>
+        <w:rPr>
+          <w:rFonts w:ascii="Cambria" w:hAnsi="Cambria"/>
+          <w:bCs w:val="0"/>
+          <w:color w:val="000000"/>
+          <w:sz w:val="22"/>
+          <w:szCs w:val="22"/>
+        </w:rPr>
+        <w:t xml:space="preserve"> </w:t>
+      </w:r>
+      <w:proofErr w:type="gramStart"/>
+      <w:r>
+        <w:rPr>
+          <w:rFonts w:ascii="Cambria" w:hAnsi="Cambria"/>
+          <w:bCs w:val="0"/>
+          <w:color w:val="000000"/>
+          <w:sz w:val="22"/>
+          <w:szCs w:val="22"/>
+        </w:rPr>
+        <w:t>%}</w:t>
+      </w:r>
+      <w:r>
+        <w:rPr>
+          <w:rFonts w:ascii="Cambria" w:hAnsi="Cambria"/>
+          <w:bCs w:val="0"/>
+          <w:color w:val="000000"/>
+          <w:sz w:val="22"/>
+          <w:szCs w:val="22"/>
+        </w:rPr>
+        <w:t>{</w:t>
+      </w:r>
+      <w:proofErr w:type="gramEnd"/>
+      <w:r>
+        <w:rPr>
+          <w:rFonts w:ascii="Cambria" w:hAnsi="Cambria"/>
+          <w:bCs w:val="0"/>
+          <w:color w:val="000000"/>
+          <w:sz w:val="22"/>
+          <w:szCs w:val="22"/>
+        </w:rPr>
+        <w:t>% else %}</w:t>
       </w:r>
     </w:p>
     <w:p>
@@ -712,8 +1067,43 @@
           <w:sz w:val="22"/>
           <w:szCs w:val="22"/>
         </w:rPr>
-        <w:t>{% endif %}</w:t>
-      </w:r>
+        <w:t xml:space="preserve">{% </w:t>
+      </w:r>
+      <w:proofErr w:type="spellStart"/>
+      <w:r>
+        <w:rPr>
+          <w:rFonts w:ascii="Cambria" w:hAnsi="Cambria"/>
+          <w:bCs w:val="0"/>
+          <w:color w:val="000000"/>
+          <w:sz w:val="22"/>
+          <w:szCs w:val="22"/>
+        </w:rPr>
+        <w:t>endif</w:t>
+      </w:r>
+      <w:proofErr w:type="spellEnd"/>
+      <w:r>
+        <w:rPr>
+          <w:rFonts w:ascii="Cambria" w:hAnsi="Cambria"/>
+          <w:bCs w:val="0"/>
+          <w:color w:val="000000"/>
+          <w:sz w:val="22"/>
+          <w:szCs w:val="22"/>
+        </w:rPr>
+        <w:t xml:space="preserve"> </w:t>
+      </w:r>
+      <w:proofErr w:type="gramStart"/>
+      <w:r>
+        <w:rPr>
+          <w:rFonts w:ascii="Cambria" w:hAnsi="Cambria"/>
+          <w:bCs w:val="0"/>
+          <w:color w:val="000000"/>
+          <w:sz w:val="22"/>
+          <w:szCs w:val="22"/>
+        </w:rPr>
+        <w:t>%}</w:t>
+      </w:r>
+      <w:bookmarkStart w:id="0" w:name="_GoBack"/>
+      <w:bookmarkEnd w:id="0"/>
       <w:r>
         <w:rPr>
           <w:rFonts w:ascii="Cambria" w:hAnsi="Cambria"/>
@@ -723,8 +1113,9 @@
           <w:sz w:val="22"/>
           <w:szCs w:val="22"/>
         </w:rPr>
-        <w:t>Rhino Birth:</w:t>
-      </w:r>
+        <w:t>Rhino</w:t>
+      </w:r>
+      <w:proofErr w:type="gramEnd"/>
       <w:r>
         <w:rPr>
           <w:rFonts w:ascii="Cambria" w:hAnsi="Cambria"/>
@@ -734,6 +1125,17 @@
           <w:sz w:val="22"/>
           <w:szCs w:val="22"/>
         </w:rPr>
+        <w:t xml:space="preserve"> Birth:</w:t>
+      </w:r>
+      <w:r>
+        <w:rPr>
+          <w:rFonts w:ascii="Cambria" w:hAnsi="Cambria"/>
+          <w:b/>
+          <w:bCs w:val="0"/>
+          <w:color w:val="000000"/>
+          <w:sz w:val="22"/>
+          <w:szCs w:val="22"/>
+        </w:rPr>
         <w:t xml:space="preserve"> </w:t>
       </w:r>
       <w:r>
@@ -745,7 +1147,31 @@
           <w:sz w:val="22"/>
           <w:szCs w:val="22"/>
         </w:rPr>
-        <w:t>{% if rhino_births %}</w:t>
+        <w:t xml:space="preserve">{% if </w:t>
+      </w:r>
+      <w:proofErr w:type="spellStart"/>
+      <w:r>
+        <w:rPr>
+          <w:rFonts w:ascii="Cambria" w:hAnsi="Cambria"/>
+          <w:b/>
+          <w:bCs w:val="0"/>
+          <w:color w:val="000000"/>
+          <w:sz w:val="22"/>
+          <w:szCs w:val="22"/>
+        </w:rPr>
+        <w:t>rhino_births</w:t>
+      </w:r>
+      <w:proofErr w:type="spellEnd"/>
+      <w:r>
+        <w:rPr>
+          <w:rFonts w:ascii="Cambria" w:hAnsi="Cambria"/>
+          <w:b/>
+          <w:bCs w:val="0"/>
+          <w:color w:val="000000"/>
+          <w:sz w:val="22"/>
+          <w:szCs w:val="22"/>
+        </w:rPr>
+        <w:t xml:space="preserve"> %}</w:t>
       </w:r>
     </w:p>
     <w:tbl>
@@ -764,6 +1190,7 @@
         <w:trPr>
           <w:cnfStyle w:val="100000000000" w:firstRow="1" w:lastRow="0" w:firstColumn="0" w:lastColumn="0" w:oddVBand="0" w:evenVBand="0" w:oddHBand="0" w:evenHBand="0" w:firstRowFirstColumn="0" w:firstRowLastColumn="0" w:lastRowFirstColumn="0" w:lastRowLastColumn="0"/>
           <w:trHeight w:val="404"/>
+          <w:tblHeader/>
         </w:trPr>
         <w:tc>
           <w:tcPr>
@@ -913,7 +1340,51 @@
                 <w:sz w:val="22"/>
                 <w:szCs w:val="22"/>
               </w:rPr>
-              <w:t>{%tr for item in rhino_births %}</w:t>
+              <w:t>{%</w:t>
+            </w:r>
+            <w:proofErr w:type="spellStart"/>
+            <w:r>
+              <w:rPr>
+                <w:rFonts w:ascii="Cambria" w:hAnsi="Cambria"/>
+                <w:bCs w:val="0"/>
+                <w:color w:val="000000"/>
+                <w:sz w:val="22"/>
+                <w:szCs w:val="22"/>
+              </w:rPr>
+              <w:t>tr</w:t>
+            </w:r>
+            <w:proofErr w:type="spellEnd"/>
+            <w:r>
+              <w:rPr>
+                <w:rFonts w:ascii="Cambria" w:hAnsi="Cambria"/>
+                <w:bCs w:val="0"/>
+                <w:color w:val="000000"/>
+                <w:sz w:val="22"/>
+                <w:szCs w:val="22"/>
+              </w:rPr>
+              <w:t xml:space="preserve"> for item in </w:t>
+            </w:r>
+            <w:proofErr w:type="spellStart"/>
+            <w:r>
+              <w:rPr>
+                <w:rFonts w:ascii="Cambria" w:hAnsi="Cambria"/>
+                <w:bCs w:val="0"/>
+                <w:color w:val="000000"/>
+                <w:sz w:val="22"/>
+                <w:szCs w:val="22"/>
+              </w:rPr>
+              <w:t>rhino_births</w:t>
+            </w:r>
+            <w:proofErr w:type="spellEnd"/>
+            <w:r>
+              <w:rPr>
+                <w:rFonts w:ascii="Cambria" w:hAnsi="Cambria"/>
+                <w:bCs w:val="0"/>
+                <w:color w:val="000000"/>
+                <w:sz w:val="22"/>
+                <w:szCs w:val="22"/>
+              </w:rPr>
+              <w:t xml:space="preserve"> %}</w:t>
             </w:r>
           </w:p>
         </w:tc>
@@ -944,7 +1415,31 @@
                 <w:sz w:val="22"/>
                 <w:szCs w:val="22"/>
               </w:rPr>
-              <w:t>{{ item.conservancy }}</w:t>
+              <w:t xml:space="preserve">{{ </w:t>
+            </w:r>
+            <w:proofErr w:type="spellStart"/>
+            <w:r>
+              <w:rPr>
+                <w:rFonts w:ascii="Cambria" w:hAnsi="Cambria"/>
+                <w:b w:val="0"/>
+                <w:bCs/>
+                <w:color w:val="000000"/>
+                <w:sz w:val="22"/>
+                <w:szCs w:val="22"/>
+              </w:rPr>
+              <w:t>item.conservancy</w:t>
+            </w:r>
+            <w:proofErr w:type="spellEnd"/>
+            <w:r>
+              <w:rPr>
+                <w:rFonts w:ascii="Cambria" w:hAnsi="Cambria"/>
+                <w:b w:val="0"/>
+                <w:bCs/>
+                <w:color w:val="000000"/>
+                <w:sz w:val="22"/>
+                <w:szCs w:val="22"/>
+              </w:rPr>
+              <w:t xml:space="preserve"> }}</w:t>
             </w:r>
           </w:p>
         </w:tc>
@@ -971,7 +1466,29 @@
                 <w:sz w:val="22"/>
                 <w:szCs w:val="22"/>
               </w:rPr>
-              <w:t>{{ item.color }}</w:t>
+              <w:t xml:space="preserve">{{ </w:t>
+            </w:r>
+            <w:proofErr w:type="spellStart"/>
+            <w:r>
+              <w:rPr>
+                <w:rFonts w:ascii="Cambria" w:hAnsi="Cambria"/>
+                <w:bCs w:val="0"/>
+                <w:color w:val="000000"/>
+                <w:sz w:val="22"/>
+                <w:szCs w:val="22"/>
+              </w:rPr>
+              <w:t>item.color</w:t>
+            </w:r>
+            <w:proofErr w:type="spellEnd"/>
+            <w:r>
+              <w:rPr>
+                <w:rFonts w:ascii="Cambria" w:hAnsi="Cambria"/>
+                <w:bCs w:val="0"/>
+                <w:color w:val="000000"/>
+                <w:sz w:val="22"/>
+                <w:szCs w:val="22"/>
+              </w:rPr>
+              <w:t xml:space="preserve"> }}</w:t>
             </w:r>
           </w:p>
         </w:tc>
@@ -998,7 +1515,29 @@
                 <w:sz w:val="22"/>
                 <w:szCs w:val="22"/>
               </w:rPr>
-              <w:t>{{ item.mother }}</w:t>
+              <w:t xml:space="preserve">{{ </w:t>
+            </w:r>
+            <w:proofErr w:type="spellStart"/>
+            <w:r>
+              <w:rPr>
+                <w:rFonts w:ascii="Cambria" w:hAnsi="Cambria"/>
+                <w:bCs w:val="0"/>
+                <w:color w:val="000000"/>
+                <w:sz w:val="22"/>
+                <w:szCs w:val="22"/>
+              </w:rPr>
+              <w:t>item.mother</w:t>
+            </w:r>
+            <w:proofErr w:type="spellEnd"/>
+            <w:r>
+              <w:rPr>
+                <w:rFonts w:ascii="Cambria" w:hAnsi="Cambria"/>
+                <w:bCs w:val="0"/>
+                <w:color w:val="000000"/>
+                <w:sz w:val="22"/>
+                <w:szCs w:val="22"/>
+              </w:rPr>
+              <w:t xml:space="preserve"> }}</w:t>
             </w:r>
           </w:p>
         </w:tc>
@@ -1025,7 +1564,29 @@
                 <w:sz w:val="22"/>
                 <w:szCs w:val="22"/>
               </w:rPr>
-              <w:t>{{ item.health }}</w:t>
+              <w:t xml:space="preserve">{{ </w:t>
+            </w:r>
+            <w:proofErr w:type="spellStart"/>
+            <w:r>
+              <w:rPr>
+                <w:rFonts w:ascii="Cambria" w:hAnsi="Cambria"/>
+                <w:bCs w:val="0"/>
+                <w:color w:val="000000"/>
+                <w:sz w:val="22"/>
+                <w:szCs w:val="22"/>
+              </w:rPr>
+              <w:t>item.health</w:t>
+            </w:r>
+            <w:proofErr w:type="spellEnd"/>
+            <w:r>
+              <w:rPr>
+                <w:rFonts w:ascii="Cambria" w:hAnsi="Cambria"/>
+                <w:bCs w:val="0"/>
+                <w:color w:val="000000"/>
+                <w:sz w:val="22"/>
+                <w:szCs w:val="22"/>
+              </w:rPr>
+              <w:t xml:space="preserve"> }}</w:t>
             </w:r>
           </w:p>
         </w:tc>
@@ -1059,7 +1620,55 @@
                 <w:sz w:val="22"/>
                 <w:szCs w:val="22"/>
               </w:rPr>
-              <w:t>{%tr endfor %}</w:t>
+              <w:t>{%</w:t>
+            </w:r>
+            <w:proofErr w:type="spellStart"/>
+            <w:r>
+              <w:rPr>
+                <w:rFonts w:ascii="Cambria" w:hAnsi="Cambria"/>
+                <w:b w:val="0"/>
+                <w:bCs/>
+                <w:color w:val="000000"/>
+                <w:sz w:val="22"/>
+                <w:szCs w:val="22"/>
+              </w:rPr>
+              <w:t>tr</w:t>
+            </w:r>
+            <w:proofErr w:type="spellEnd"/>
+            <w:r>
+              <w:rPr>
+                <w:rFonts w:ascii="Cambria" w:hAnsi="Cambria"/>
+                <w:b w:val="0"/>
+                <w:bCs/>
+                <w:color w:val="000000"/>
+                <w:sz w:val="22"/>
+                <w:szCs w:val="22"/>
+              </w:rPr>
+              <w:t xml:space="preserve"> </w:t>
+            </w:r>
+            <w:proofErr w:type="spellStart"/>
+            <w:r>
+              <w:rPr>
+                <w:rFonts w:ascii="Cambria" w:hAnsi="Cambria"/>
+                <w:b w:val="0"/>
+                <w:bCs/>
+                <w:color w:val="000000"/>
+                <w:sz w:val="22"/>
+                <w:szCs w:val="22"/>
+              </w:rPr>
+              <w:t>endfor</w:t>
+            </w:r>
+            <w:proofErr w:type="spellEnd"/>
+            <w:r>
+              <w:rPr>
+                <w:rFonts w:ascii="Cambria" w:hAnsi="Cambria"/>
+                <w:b w:val="0"/>
+                <w:bCs/>
+                <w:color w:val="000000"/>
+                <w:sz w:val="22"/>
+                <w:szCs w:val="22"/>
+              </w:rPr>
+              <w:t xml:space="preserve"> %}</w:t>
             </w:r>
           </w:p>
         </w:tc>
@@ -1161,18 +1770,52 @@
           <w:szCs w:val="22"/>
         </w:rPr>
         <w:lastRenderedPageBreak/>
-        <w:t>No rhino births reported.</w:t>
-      </w:r>
-      <w:r>
-        <w:rPr>
-          <w:rFonts w:ascii="Cambria" w:hAnsi="Cambria"/>
-          <w:bCs w:val="0"/>
-          <w:color w:val="000000"/>
-          <w:sz w:val="22"/>
-          <w:szCs w:val="22"/>
-        </w:rPr>
-        <w:t>{% endif</w:t>
-      </w:r>
+        <w:t xml:space="preserve">No rhino births </w:t>
+      </w:r>
+      <w:proofErr w:type="gramStart"/>
+      <w:r>
+        <w:rPr>
+          <w:rFonts w:ascii="Cambria" w:hAnsi="Cambria"/>
+          <w:bCs w:val="0"/>
+          <w:color w:val="000000"/>
+          <w:sz w:val="22"/>
+          <w:szCs w:val="22"/>
+        </w:rPr>
+        <w:t>reported.</w:t>
+      </w:r>
+      <w:r>
+        <w:rPr>
+          <w:rFonts w:ascii="Cambria" w:hAnsi="Cambria"/>
+          <w:bCs w:val="0"/>
+          <w:color w:val="000000"/>
+          <w:sz w:val="22"/>
+          <w:szCs w:val="22"/>
+        </w:rPr>
+        <w:t>{</w:t>
+      </w:r>
+      <w:proofErr w:type="gramEnd"/>
+      <w:r>
+        <w:rPr>
+          <w:rFonts w:ascii="Cambria" w:hAnsi="Cambria"/>
+          <w:bCs w:val="0"/>
+          <w:color w:val="000000"/>
+          <w:sz w:val="22"/>
+          <w:szCs w:val="22"/>
+        </w:rPr>
+        <w:t xml:space="preserve">% </w:t>
+      </w:r>
+      <w:proofErr w:type="spellStart"/>
+      <w:r>
+        <w:rPr>
+          <w:rFonts w:ascii="Cambria" w:hAnsi="Cambria"/>
+          <w:bCs w:val="0"/>
+          <w:color w:val="000000"/>
+          <w:sz w:val="22"/>
+          <w:szCs w:val="22"/>
+        </w:rPr>
+        <w:t>endif</w:t>
+      </w:r>
+      <w:proofErr w:type="spellEnd"/>
       <w:r>
         <w:rPr>
           <w:rFonts w:ascii="Cambria" w:hAnsi="Cambria"/>
@@ -1231,6 +1874,8 @@
       <w:tr>
         <w:trPr>
           <w:cnfStyle w:val="100000000000" w:firstRow="1" w:lastRow="0" w:firstColumn="0" w:lastColumn="0" w:oddVBand="0" w:evenVBand="0" w:oddHBand="0" w:evenHBand="0" w:firstRowFirstColumn="0" w:firstRowLastColumn="0" w:lastRowFirstColumn="0" w:lastRowLastColumn="0"/>
+          <w:trHeight w:val="305"/>
+          <w:tblHeader/>
         </w:trPr>
         <w:tc>
           <w:tcPr>
@@ -1315,7 +1960,51 @@
                 <w:sz w:val="22"/>
                 <w:szCs w:val="22"/>
               </w:rPr>
-              <w:t>{%tr for item in rhino_missing %}</w:t>
+              <w:t>{%</w:t>
+            </w:r>
+            <w:proofErr w:type="spellStart"/>
+            <w:r>
+              <w:rPr>
+                <w:rFonts w:ascii="Cambria" w:hAnsi="Cambria"/>
+                <w:b w:val="0"/>
+                <w:color w:val="000000"/>
+                <w:sz w:val="22"/>
+                <w:szCs w:val="22"/>
+              </w:rPr>
+              <w:t>tr</w:t>
+            </w:r>
+            <w:proofErr w:type="spellEnd"/>
+            <w:r>
+              <w:rPr>
+                <w:rFonts w:ascii="Cambria" w:hAnsi="Cambria"/>
+                <w:b w:val="0"/>
+                <w:color w:val="000000"/>
+                <w:sz w:val="22"/>
+                <w:szCs w:val="22"/>
+              </w:rPr>
+              <w:t xml:space="preserve"> for item in </w:t>
+            </w:r>
+            <w:proofErr w:type="spellStart"/>
+            <w:r>
+              <w:rPr>
+                <w:rFonts w:ascii="Cambria" w:hAnsi="Cambria"/>
+                <w:b w:val="0"/>
+                <w:color w:val="000000"/>
+                <w:sz w:val="22"/>
+                <w:szCs w:val="22"/>
+              </w:rPr>
+              <w:t>missing_rhinos</w:t>
+            </w:r>
+            <w:proofErr w:type="spellEnd"/>
+            <w:r>
+              <w:rPr>
+                <w:rFonts w:ascii="Cambria" w:hAnsi="Cambria"/>
+                <w:b w:val="0"/>
+                <w:color w:val="000000"/>
+                <w:sz w:val="22"/>
+                <w:szCs w:val="22"/>
+              </w:rPr>
+              <w:t xml:space="preserve"> %}</w:t>
             </w:r>
           </w:p>
         </w:tc>
@@ -1374,7 +2063,27 @@
                 <w:sz w:val="22"/>
                 <w:szCs w:val="22"/>
               </w:rPr>
-              <w:t>{{ item.name}}</w:t>
+              <w:t>{{ item.name</w:t>
+            </w:r>
+            <w:r>
+              <w:rPr>
+                <w:rFonts w:ascii="Cambria" w:hAnsi="Cambria"/>
+                <w:b w:val="0"/>
+                <w:color w:val="000000"/>
+                <w:sz w:val="22"/>
+                <w:szCs w:val="22"/>
+              </w:rPr>
+              <w:t xml:space="preserve"> </w:t>
+            </w:r>
+            <w:r>
+              <w:rPr>
+                <w:rFonts w:ascii="Cambria" w:hAnsi="Cambria"/>
+                <w:b w:val="0"/>
+                <w:color w:val="000000"/>
+                <w:sz w:val="22"/>
+                <w:szCs w:val="22"/>
+              </w:rPr>
+              <w:t>}}</w:t>
             </w:r>
           </w:p>
         </w:tc>
@@ -1406,7 +2115,59 @@
                 <w:sz w:val="22"/>
                 <w:szCs w:val="22"/>
               </w:rPr>
-              <w:t>{{item.value}} days</w:t>
+              <w:t>{{</w:t>
+            </w:r>
+            <w:r>
+              <w:rPr>
+                <w:rFonts w:ascii="Cambria" w:hAnsi="Cambria"/>
+                <w:bCs w:val="0"/>
+                <w:color w:val="000000"/>
+                <w:sz w:val="22"/>
+                <w:szCs w:val="22"/>
+              </w:rPr>
+              <w:t xml:space="preserve"> </w:t>
+            </w:r>
+            <w:proofErr w:type="spellStart"/>
+            <w:r>
+              <w:rPr>
+                <w:rFonts w:ascii="Cambria" w:hAnsi="Cambria"/>
+                <w:bCs w:val="0"/>
+                <w:color w:val="000000"/>
+                <w:sz w:val="22"/>
+                <w:szCs w:val="22"/>
+              </w:rPr>
+              <w:t>item.</w:t>
+            </w:r>
+            <w:r>
+              <w:rPr>
+                <w:rFonts w:ascii="Cambria" w:hAnsi="Cambria"/>
+                <w:bCs w:val="0"/>
+                <w:color w:val="000000"/>
+                <w:sz w:val="22"/>
+                <w:szCs w:val="22"/>
+              </w:rPr>
+              <w:t>days_ago</w:t>
+            </w:r>
+            <w:proofErr w:type="spellEnd"/>
+            <w:r>
+              <w:rPr>
+                <w:rFonts w:ascii="Cambria" w:hAnsi="Cambria"/>
+                <w:bCs w:val="0"/>
+                <w:color w:val="000000"/>
+                <w:sz w:val="22"/>
+                <w:szCs w:val="22"/>
+              </w:rPr>
+              <w:t xml:space="preserve"> </w:t>
+            </w:r>
+            <w:r>
+              <w:rPr>
+                <w:rFonts w:ascii="Cambria" w:hAnsi="Cambria"/>
+                <w:bCs w:val="0"/>
+                <w:color w:val="000000"/>
+                <w:sz w:val="22"/>
+                <w:szCs w:val="22"/>
+              </w:rPr>
+              <w:t>}} days</w:t>
             </w:r>
           </w:p>
         </w:tc>
@@ -1443,7 +2204,51 @@
                 <w:sz w:val="22"/>
                 <w:szCs w:val="22"/>
               </w:rPr>
-              <w:t>{%tr endfor %}</w:t>
+              <w:t>{%</w:t>
+            </w:r>
+            <w:proofErr w:type="spellStart"/>
+            <w:r>
+              <w:rPr>
+                <w:rFonts w:ascii="Cambria" w:hAnsi="Cambria"/>
+                <w:b w:val="0"/>
+                <w:color w:val="000000"/>
+                <w:sz w:val="22"/>
+                <w:szCs w:val="22"/>
+              </w:rPr>
+              <w:t>tr</w:t>
+            </w:r>
+            <w:proofErr w:type="spellEnd"/>
+            <w:r>
+              <w:rPr>
+                <w:rFonts w:ascii="Cambria" w:hAnsi="Cambria"/>
+                <w:b w:val="0"/>
+                <w:color w:val="000000"/>
+                <w:sz w:val="22"/>
+                <w:szCs w:val="22"/>
+              </w:rPr>
+              <w:t xml:space="preserve"> </w:t>
+            </w:r>
+            <w:proofErr w:type="spellStart"/>
+            <w:r>
+              <w:rPr>
+                <w:rFonts w:ascii="Cambria" w:hAnsi="Cambria"/>
+                <w:b w:val="0"/>
+                <w:color w:val="000000"/>
+                <w:sz w:val="22"/>
+                <w:szCs w:val="22"/>
+              </w:rPr>
+              <w:t>endfor</w:t>
+            </w:r>
+            <w:proofErr w:type="spellEnd"/>
+            <w:r>
+              <w:rPr>
+                <w:rFonts w:ascii="Cambria" w:hAnsi="Cambria"/>
+                <w:b w:val="0"/>
+                <w:color w:val="000000"/>
+                <w:sz w:val="22"/>
+                <w:szCs w:val="22"/>
+              </w:rPr>
+              <w:t xml:space="preserve"> %}</w:t>
             </w:r>
           </w:p>
         </w:tc>
@@ -1541,7 +2346,29 @@
           <w:sz w:val="22"/>
           <w:szCs w:val="22"/>
         </w:rPr>
-        <w:t>{% if rhino_territorial_movement %}</w:t>
+        <w:t xml:space="preserve">{% if </w:t>
+      </w:r>
+      <w:proofErr w:type="spellStart"/>
+      <w:r>
+        <w:rPr>
+          <w:rFonts w:ascii="Cambria" w:hAnsi="Cambria"/>
+          <w:bCs w:val="0"/>
+          <w:color w:val="000000"/>
+          <w:sz w:val="22"/>
+          <w:szCs w:val="22"/>
+        </w:rPr>
+        <w:t>rhino_territorial_movement</w:t>
+      </w:r>
+      <w:proofErr w:type="spellEnd"/>
+      <w:r>
+        <w:rPr>
+          <w:rFonts w:ascii="Cambria" w:hAnsi="Cambria"/>
+          <w:bCs w:val="0"/>
+          <w:color w:val="000000"/>
+          <w:sz w:val="22"/>
+          <w:szCs w:val="22"/>
+        </w:rPr>
+        <w:t xml:space="preserve"> %}</w:t>
       </w:r>
     </w:p>
     <w:tbl>
@@ -1563,6 +2390,7 @@
         <w:trPr>
           <w:cnfStyle w:val="100000000000" w:firstRow="1" w:lastRow="0" w:firstColumn="0" w:lastColumn="0" w:oddVBand="0" w:evenVBand="0" w:oddHBand="0" w:evenHBand="0" w:firstRowFirstColumn="0" w:firstRowLastColumn="0" w:lastRowFirstColumn="0" w:lastRowLastColumn="0"/>
           <w:trHeight w:val="404"/>
+          <w:tblHeader/>
         </w:trPr>
         <w:tc>
           <w:tcPr>
@@ -1746,7 +2574,55 @@
                 <w:sz w:val="22"/>
                 <w:szCs w:val="22"/>
               </w:rPr>
-              <w:t>{%tr for item in rhino_territorial_movement %}</w:t>
+              <w:t>{%</w:t>
+            </w:r>
+            <w:proofErr w:type="spellStart"/>
+            <w:r>
+              <w:rPr>
+                <w:rFonts w:ascii="Cambria" w:hAnsi="Cambria"/>
+                <w:b w:val="0"/>
+                <w:bCs/>
+                <w:color w:val="000000"/>
+                <w:sz w:val="22"/>
+                <w:szCs w:val="22"/>
+              </w:rPr>
+              <w:t>tr</w:t>
+            </w:r>
+            <w:proofErr w:type="spellEnd"/>
+            <w:r>
+              <w:rPr>
+                <w:rFonts w:ascii="Cambria" w:hAnsi="Cambria"/>
+                <w:b w:val="0"/>
+                <w:bCs/>
+                <w:color w:val="000000"/>
+                <w:sz w:val="22"/>
+                <w:szCs w:val="22"/>
+              </w:rPr>
+              <w:t xml:space="preserve"> for item in </w:t>
+            </w:r>
+            <w:proofErr w:type="spellStart"/>
+            <w:r>
+              <w:rPr>
+                <w:rFonts w:ascii="Cambria" w:hAnsi="Cambria"/>
+                <w:b w:val="0"/>
+                <w:bCs/>
+                <w:color w:val="000000"/>
+                <w:sz w:val="22"/>
+                <w:szCs w:val="22"/>
+              </w:rPr>
+              <w:t>rhino_territorial_movement</w:t>
+            </w:r>
+            <w:proofErr w:type="spellEnd"/>
+            <w:r>
+              <w:rPr>
+                <w:rFonts w:ascii="Cambria" w:hAnsi="Cambria"/>
+                <w:b w:val="0"/>
+                <w:bCs/>
+                <w:color w:val="000000"/>
+                <w:sz w:val="22"/>
+                <w:szCs w:val="22"/>
+              </w:rPr>
+              <w:t xml:space="preserve"> %}</w:t>
             </w:r>
           </w:p>
         </w:tc>
@@ -1777,7 +2653,31 @@
                 <w:sz w:val="22"/>
                 <w:szCs w:val="22"/>
               </w:rPr>
-              <w:t>{{ item.conservancy }}</w:t>
+              <w:t xml:space="preserve">{{ </w:t>
+            </w:r>
+            <w:proofErr w:type="spellStart"/>
+            <w:r>
+              <w:rPr>
+                <w:rFonts w:ascii="Cambria" w:hAnsi="Cambria"/>
+                <w:b w:val="0"/>
+                <w:bCs/>
+                <w:color w:val="000000"/>
+                <w:sz w:val="22"/>
+                <w:szCs w:val="22"/>
+              </w:rPr>
+              <w:t>item.conservancy</w:t>
+            </w:r>
+            <w:proofErr w:type="spellEnd"/>
+            <w:r>
+              <w:rPr>
+                <w:rFonts w:ascii="Cambria" w:hAnsi="Cambria"/>
+                <w:b w:val="0"/>
+                <w:bCs/>
+                <w:color w:val="000000"/>
+                <w:sz w:val="22"/>
+                <w:szCs w:val="22"/>
+              </w:rPr>
+              <w:t xml:space="preserve"> }}</w:t>
             </w:r>
           </w:p>
         </w:tc>
@@ -1804,7 +2704,29 @@
                 <w:sz w:val="22"/>
                 <w:szCs w:val="22"/>
               </w:rPr>
-              <w:t>{{ item.color }}</w:t>
+              <w:t xml:space="preserve">{{ </w:t>
+            </w:r>
+            <w:proofErr w:type="spellStart"/>
+            <w:r>
+              <w:rPr>
+                <w:rFonts w:ascii="Cambria" w:hAnsi="Cambria"/>
+                <w:bCs w:val="0"/>
+                <w:color w:val="000000"/>
+                <w:sz w:val="22"/>
+                <w:szCs w:val="22"/>
+              </w:rPr>
+              <w:t>item.color</w:t>
+            </w:r>
+            <w:proofErr w:type="spellEnd"/>
+            <w:r>
+              <w:rPr>
+                <w:rFonts w:ascii="Cambria" w:hAnsi="Cambria"/>
+                <w:bCs w:val="0"/>
+                <w:color w:val="000000"/>
+                <w:sz w:val="22"/>
+                <w:szCs w:val="22"/>
+              </w:rPr>
+              <w:t xml:space="preserve"> }}</w:t>
             </w:r>
           </w:p>
         </w:tc>
@@ -1831,7 +2753,29 @@
                 <w:sz w:val="22"/>
                 <w:szCs w:val="22"/>
               </w:rPr>
-              <w:t>{{ item.station }}</w:t>
+              <w:t xml:space="preserve">{{ </w:t>
+            </w:r>
+            <w:proofErr w:type="spellStart"/>
+            <w:r>
+              <w:rPr>
+                <w:rFonts w:ascii="Cambria" w:hAnsi="Cambria"/>
+                <w:bCs w:val="0"/>
+                <w:color w:val="000000"/>
+                <w:sz w:val="22"/>
+                <w:szCs w:val="22"/>
+              </w:rPr>
+              <w:t>item.station</w:t>
+            </w:r>
+            <w:proofErr w:type="spellEnd"/>
+            <w:r>
+              <w:rPr>
+                <w:rFonts w:ascii="Cambria" w:hAnsi="Cambria"/>
+                <w:bCs w:val="0"/>
+                <w:color w:val="000000"/>
+                <w:sz w:val="22"/>
+                <w:szCs w:val="22"/>
+              </w:rPr>
+              <w:t xml:space="preserve"> }}</w:t>
             </w:r>
           </w:p>
         </w:tc>
@@ -1858,7 +2802,29 @@
                 <w:sz w:val="22"/>
                 <w:szCs w:val="22"/>
               </w:rPr>
-              <w:t>{{ item.rhinos }}</w:t>
+              <w:t xml:space="preserve">{{ </w:t>
+            </w:r>
+            <w:proofErr w:type="spellStart"/>
+            <w:r>
+              <w:rPr>
+                <w:rFonts w:ascii="Cambria" w:hAnsi="Cambria"/>
+                <w:bCs w:val="0"/>
+                <w:color w:val="000000"/>
+                <w:sz w:val="22"/>
+                <w:szCs w:val="22"/>
+              </w:rPr>
+              <w:t>item.rhinos</w:t>
+            </w:r>
+            <w:proofErr w:type="spellEnd"/>
+            <w:r>
+              <w:rPr>
+                <w:rFonts w:ascii="Cambria" w:hAnsi="Cambria"/>
+                <w:bCs w:val="0"/>
+                <w:color w:val="000000"/>
+                <w:sz w:val="22"/>
+                <w:szCs w:val="22"/>
+              </w:rPr>
+              <w:t xml:space="preserve"> }}</w:t>
             </w:r>
           </w:p>
         </w:tc>
@@ -1885,7 +2851,29 @@
                 <w:sz w:val="22"/>
                 <w:szCs w:val="22"/>
               </w:rPr>
-              <w:t>{{ item.behavior }}</w:t>
+              <w:t xml:space="preserve">{{ </w:t>
+            </w:r>
+            <w:proofErr w:type="spellStart"/>
+            <w:r>
+              <w:rPr>
+                <w:rFonts w:ascii="Cambria" w:hAnsi="Cambria"/>
+                <w:bCs w:val="0"/>
+                <w:color w:val="000000"/>
+                <w:sz w:val="22"/>
+                <w:szCs w:val="22"/>
+              </w:rPr>
+              <w:t>item.behavior</w:t>
+            </w:r>
+            <w:proofErr w:type="spellEnd"/>
+            <w:r>
+              <w:rPr>
+                <w:rFonts w:ascii="Cambria" w:hAnsi="Cambria"/>
+                <w:bCs w:val="0"/>
+                <w:color w:val="000000"/>
+                <w:sz w:val="22"/>
+                <w:szCs w:val="22"/>
+              </w:rPr>
+              <w:t xml:space="preserve"> }}</w:t>
             </w:r>
           </w:p>
         </w:tc>
@@ -1912,7 +2900,29 @@
                 <w:sz w:val="22"/>
                 <w:szCs w:val="22"/>
               </w:rPr>
-              <w:t>{{ item.health }}</w:t>
+              <w:t xml:space="preserve">{{ </w:t>
+            </w:r>
+            <w:proofErr w:type="spellStart"/>
+            <w:r>
+              <w:rPr>
+                <w:rFonts w:ascii="Cambria" w:hAnsi="Cambria"/>
+                <w:bCs w:val="0"/>
+                <w:color w:val="000000"/>
+                <w:sz w:val="22"/>
+                <w:szCs w:val="22"/>
+              </w:rPr>
+              <w:t>item.health</w:t>
+            </w:r>
+            <w:proofErr w:type="spellEnd"/>
+            <w:r>
+              <w:rPr>
+                <w:rFonts w:ascii="Cambria" w:hAnsi="Cambria"/>
+                <w:bCs w:val="0"/>
+                <w:color w:val="000000"/>
+                <w:sz w:val="22"/>
+                <w:szCs w:val="22"/>
+              </w:rPr>
+              <w:t xml:space="preserve"> }}</w:t>
             </w:r>
           </w:p>
         </w:tc>
@@ -1946,7 +2956,55 @@
                 <w:sz w:val="22"/>
                 <w:szCs w:val="22"/>
               </w:rPr>
-              <w:t>{%tr endfor %}</w:t>
+              <w:t>{%</w:t>
+            </w:r>
+            <w:proofErr w:type="spellStart"/>
+            <w:r>
+              <w:rPr>
+                <w:rFonts w:ascii="Cambria" w:hAnsi="Cambria"/>
+                <w:b w:val="0"/>
+                <w:bCs/>
+                <w:color w:val="000000"/>
+                <w:sz w:val="22"/>
+                <w:szCs w:val="22"/>
+              </w:rPr>
+              <w:t>tr</w:t>
+            </w:r>
+            <w:proofErr w:type="spellEnd"/>
+            <w:r>
+              <w:rPr>
+                <w:rFonts w:ascii="Cambria" w:hAnsi="Cambria"/>
+                <w:b w:val="0"/>
+                <w:bCs/>
+                <w:color w:val="000000"/>
+                <w:sz w:val="22"/>
+                <w:szCs w:val="22"/>
+              </w:rPr>
+              <w:t xml:space="preserve"> </w:t>
+            </w:r>
+            <w:proofErr w:type="spellStart"/>
+            <w:r>
+              <w:rPr>
+                <w:rFonts w:ascii="Cambria" w:hAnsi="Cambria"/>
+                <w:b w:val="0"/>
+                <w:bCs/>
+                <w:color w:val="000000"/>
+                <w:sz w:val="22"/>
+                <w:szCs w:val="22"/>
+              </w:rPr>
+              <w:t>endfor</w:t>
+            </w:r>
+            <w:proofErr w:type="spellEnd"/>
+            <w:r>
+              <w:rPr>
+                <w:rFonts w:ascii="Cambria" w:hAnsi="Cambria"/>
+                <w:b w:val="0"/>
+                <w:bCs/>
+                <w:color w:val="000000"/>
+                <w:sz w:val="22"/>
+                <w:szCs w:val="22"/>
+              </w:rPr>
+              <w:t xml:space="preserve"> %}</w:t>
             </w:r>
           </w:p>
         </w:tc>
@@ -2123,7 +3181,29 @@
           <w:sz w:val="22"/>
           <w:szCs w:val="22"/>
         </w:rPr>
-        <w:t>{% endif %}</w:t>
+        <w:t xml:space="preserve">{% </w:t>
+      </w:r>
+      <w:proofErr w:type="spellStart"/>
+      <w:r>
+        <w:rPr>
+          <w:rFonts w:ascii="Cambria" w:hAnsi="Cambria"/>
+          <w:bCs w:val="0"/>
+          <w:color w:val="000000"/>
+          <w:sz w:val="22"/>
+          <w:szCs w:val="22"/>
+        </w:rPr>
+        <w:t>endif</w:t>
+      </w:r>
+      <w:proofErr w:type="spellEnd"/>
+      <w:r>
+        <w:rPr>
+          <w:rFonts w:ascii="Cambria" w:hAnsi="Cambria"/>
+          <w:bCs w:val="0"/>
+          <w:color w:val="000000"/>
+          <w:sz w:val="22"/>
+          <w:szCs w:val="22"/>
+        </w:rPr>
+        <w:t xml:space="preserve"> %}</w:t>
       </w:r>
     </w:p>
     <w:p>
@@ -2175,7 +3255,57 @@
           <w:sz w:val="22"/>
           <w:szCs w:val="22"/>
         </w:rPr>
-        <w:t>% for os in other_sightings %}</w:t>
+        <w:t xml:space="preserve">% for </w:t>
+      </w:r>
+      <w:proofErr w:type="spellStart"/>
+      <w:r>
+        <w:rPr>
+          <w:rFonts w:ascii="Cambria" w:hAnsi="Cambria"/>
+          <w:color w:val="000000"/>
+          <w:sz w:val="22"/>
+          <w:szCs w:val="22"/>
+        </w:rPr>
+        <w:t>os</w:t>
+      </w:r>
+      <w:proofErr w:type="spellEnd"/>
+      <w:r>
+        <w:rPr>
+          <w:rFonts w:ascii="Cambria" w:hAnsi="Cambria"/>
+          <w:color w:val="000000"/>
+          <w:sz w:val="22"/>
+          <w:szCs w:val="22"/>
+        </w:rPr>
+        <w:t xml:space="preserve"> in </w:t>
+      </w:r>
+      <w:proofErr w:type="spellStart"/>
+      <w:r>
+        <w:rPr>
+          <w:rFonts w:ascii="Cambria" w:hAnsi="Cambria"/>
+          <w:color w:val="000000"/>
+          <w:sz w:val="22"/>
+          <w:szCs w:val="22"/>
+        </w:rPr>
+        <w:t>other_sightings</w:t>
+      </w:r>
+      <w:proofErr w:type="spellEnd"/>
+      <w:r>
+        <w:rPr>
+          <w:rFonts w:ascii="Cambria" w:hAnsi="Cambria"/>
+          <w:color w:val="000000"/>
+          <w:sz w:val="22"/>
+          <w:szCs w:val="22"/>
+        </w:rPr>
+        <w:t xml:space="preserve"> </w:t>
+      </w:r>
+      <w:proofErr w:type="gramStart"/>
+      <w:r>
+        <w:rPr>
+          <w:rFonts w:ascii="Cambria" w:hAnsi="Cambria"/>
+          <w:color w:val="000000"/>
+          <w:sz w:val="22"/>
+          <w:szCs w:val="22"/>
+        </w:rPr>
+        <w:t>%}</w:t>
       </w:r>
       <w:r>
         <w:rPr>
@@ -2186,8 +3316,9 @@
           <w:sz w:val="22"/>
           <w:szCs w:val="22"/>
         </w:rPr>
-        <w:t>Other wildlife s</w:t>
-      </w:r>
+        <w:t>Other</w:t>
+      </w:r>
+      <w:proofErr w:type="gramEnd"/>
       <w:r>
         <w:rPr>
           <w:rFonts w:ascii="Cambria" w:hAnsi="Cambria"/>
@@ -2197,7 +3328,42 @@
           <w:sz w:val="22"/>
           <w:szCs w:val="22"/>
         </w:rPr>
-        <w:t>ightings on {{ os.conservancy }</w:t>
+        <w:t xml:space="preserve"> wildlife s</w:t>
+      </w:r>
+      <w:r>
+        <w:rPr>
+          <w:rFonts w:ascii="Cambria" w:hAnsi="Cambria"/>
+          <w:b/>
+          <w:bCs w:val="0"/>
+          <w:color w:val="000000"/>
+          <w:sz w:val="22"/>
+          <w:szCs w:val="22"/>
+        </w:rPr>
+        <w:t xml:space="preserve">ightings on {{ </w:t>
+      </w:r>
+      <w:proofErr w:type="spellStart"/>
+      <w:r>
+        <w:rPr>
+          <w:rFonts w:ascii="Cambria" w:hAnsi="Cambria"/>
+          <w:b/>
+          <w:bCs w:val="0"/>
+          <w:color w:val="000000"/>
+          <w:sz w:val="22"/>
+          <w:szCs w:val="22"/>
+        </w:rPr>
+        <w:t>os.conservancy</w:t>
+      </w:r>
+      <w:proofErr w:type="spellEnd"/>
+      <w:r>
+        <w:rPr>
+          <w:rFonts w:ascii="Cambria" w:hAnsi="Cambria"/>
+          <w:b/>
+          <w:bCs w:val="0"/>
+          <w:color w:val="000000"/>
+          <w:sz w:val="22"/>
+          <w:szCs w:val="22"/>
+        </w:rPr>
+        <w:t xml:space="preserve"> }</w:t>
       </w:r>
       <w:r>
         <w:rPr>
@@ -2236,6 +3402,7 @@
         <w:trPr>
           <w:cnfStyle w:val="100000000000" w:firstRow="1" w:lastRow="0" w:firstColumn="0" w:lastColumn="0" w:oddVBand="0" w:evenVBand="0" w:oddHBand="0" w:evenHBand="0" w:firstRowFirstColumn="0" w:firstRowLastColumn="0" w:lastRowFirstColumn="0" w:lastRowLastColumn="0"/>
           <w:trHeight w:val="296"/>
+          <w:tblHeader/>
         </w:trPr>
         <w:tc>
           <w:tcPr>
@@ -2322,15 +3489,49 @@
               </w:rPr>
               <w:t>{%</w:t>
             </w:r>
-            <w:r>
-              <w:rPr>
-                <w:rFonts w:ascii="Cambria" w:hAnsi="Cambria"/>
-                <w:b w:val="0"/>
-                <w:color w:val="000000"/>
-                <w:sz w:val="22"/>
-                <w:szCs w:val="22"/>
-              </w:rPr>
-              <w:t xml:space="preserve">tr for item in os.sightings </w:t>
+            <w:proofErr w:type="spellStart"/>
+            <w:r>
+              <w:rPr>
+                <w:rFonts w:ascii="Cambria" w:hAnsi="Cambria"/>
+                <w:b w:val="0"/>
+                <w:color w:val="000000"/>
+                <w:sz w:val="22"/>
+                <w:szCs w:val="22"/>
+              </w:rPr>
+              <w:t>tr</w:t>
+            </w:r>
+            <w:proofErr w:type="spellEnd"/>
+            <w:r>
+              <w:rPr>
+                <w:rFonts w:ascii="Cambria" w:hAnsi="Cambria"/>
+                <w:b w:val="0"/>
+                <w:color w:val="000000"/>
+                <w:sz w:val="22"/>
+                <w:szCs w:val="22"/>
+              </w:rPr>
+              <w:t xml:space="preserve"> for item in </w:t>
+            </w:r>
+            <w:proofErr w:type="spellStart"/>
+            <w:r>
+              <w:rPr>
+                <w:rFonts w:ascii="Cambria" w:hAnsi="Cambria"/>
+                <w:b w:val="0"/>
+                <w:color w:val="000000"/>
+                <w:sz w:val="22"/>
+                <w:szCs w:val="22"/>
+              </w:rPr>
+              <w:t>os.sightings</w:t>
+            </w:r>
+            <w:proofErr w:type="spellEnd"/>
+            <w:r>
+              <w:rPr>
+                <w:rFonts w:ascii="Cambria" w:hAnsi="Cambria"/>
+                <w:b w:val="0"/>
+                <w:color w:val="000000"/>
+                <w:sz w:val="22"/>
+                <w:szCs w:val="22"/>
+              </w:rPr>
+              <w:t xml:space="preserve"> </w:t>
             </w:r>
             <w:r>
               <w:rPr>
@@ -2406,7 +3607,29 @@
                 <w:sz w:val="22"/>
                 <w:szCs w:val="22"/>
               </w:rPr>
-              <w:t>{{ item.species}}</w:t>
+              <w:t xml:space="preserve">{{ </w:t>
+            </w:r>
+            <w:proofErr w:type="spellStart"/>
+            <w:r>
+              <w:rPr>
+                <w:rFonts w:ascii="Cambria" w:hAnsi="Cambria"/>
+                <w:b w:val="0"/>
+                <w:color w:val="000000"/>
+                <w:sz w:val="22"/>
+                <w:szCs w:val="22"/>
+              </w:rPr>
+              <w:t>item.species</w:t>
+            </w:r>
+            <w:proofErr w:type="spellEnd"/>
+            <w:r>
+              <w:rPr>
+                <w:rFonts w:ascii="Cambria" w:hAnsi="Cambria"/>
+                <w:b w:val="0"/>
+                <w:color w:val="000000"/>
+                <w:sz w:val="22"/>
+                <w:szCs w:val="22"/>
+              </w:rPr>
+              <w:t>}}</w:t>
             </w:r>
           </w:p>
         </w:tc>
@@ -2439,7 +3662,29 @@
                 <w:sz w:val="22"/>
                 <w:szCs w:val="22"/>
               </w:rPr>
-              <w:t>{{item.count}}</w:t>
+              <w:t>{{</w:t>
+            </w:r>
+            <w:proofErr w:type="spellStart"/>
+            <w:r>
+              <w:rPr>
+                <w:rFonts w:ascii="Cambria" w:hAnsi="Cambria"/>
+                <w:bCs w:val="0"/>
+                <w:color w:val="000000"/>
+                <w:sz w:val="22"/>
+                <w:szCs w:val="22"/>
+              </w:rPr>
+              <w:t>item.count</w:t>
+            </w:r>
+            <w:proofErr w:type="spellEnd"/>
+            <w:r>
+              <w:rPr>
+                <w:rFonts w:ascii="Cambria" w:hAnsi="Cambria"/>
+                <w:bCs w:val="0"/>
+                <w:color w:val="000000"/>
+                <w:sz w:val="22"/>
+                <w:szCs w:val="22"/>
+              </w:rPr>
+              <w:t>}}</w:t>
             </w:r>
           </w:p>
         </w:tc>
@@ -2478,15 +3723,49 @@
               </w:rPr>
               <w:t>{%</w:t>
             </w:r>
-            <w:r>
-              <w:rPr>
-                <w:rFonts w:ascii="Cambria" w:hAnsi="Cambria"/>
-                <w:b w:val="0"/>
-                <w:color w:val="000000"/>
-                <w:sz w:val="22"/>
-                <w:szCs w:val="22"/>
-              </w:rPr>
-              <w:t>tr endfor %}</w:t>
+            <w:proofErr w:type="spellStart"/>
+            <w:r>
+              <w:rPr>
+                <w:rFonts w:ascii="Cambria" w:hAnsi="Cambria"/>
+                <w:b w:val="0"/>
+                <w:color w:val="000000"/>
+                <w:sz w:val="22"/>
+                <w:szCs w:val="22"/>
+              </w:rPr>
+              <w:t>tr</w:t>
+            </w:r>
+            <w:proofErr w:type="spellEnd"/>
+            <w:r>
+              <w:rPr>
+                <w:rFonts w:ascii="Cambria" w:hAnsi="Cambria"/>
+                <w:b w:val="0"/>
+                <w:color w:val="000000"/>
+                <w:sz w:val="22"/>
+                <w:szCs w:val="22"/>
+              </w:rPr>
+              <w:t xml:space="preserve"> </w:t>
+            </w:r>
+            <w:proofErr w:type="spellStart"/>
+            <w:r>
+              <w:rPr>
+                <w:rFonts w:ascii="Cambria" w:hAnsi="Cambria"/>
+                <w:b w:val="0"/>
+                <w:color w:val="000000"/>
+                <w:sz w:val="22"/>
+                <w:szCs w:val="22"/>
+              </w:rPr>
+              <w:t>endfor</w:t>
+            </w:r>
+            <w:proofErr w:type="spellEnd"/>
+            <w:r>
+              <w:rPr>
+                <w:rFonts w:ascii="Cambria" w:hAnsi="Cambria"/>
+                <w:b w:val="0"/>
+                <w:color w:val="000000"/>
+                <w:sz w:val="22"/>
+                <w:szCs w:val="22"/>
+              </w:rPr>
+              <w:t xml:space="preserve"> %}</w:t>
             </w:r>
           </w:p>
         </w:tc>
@@ -2569,7 +3848,41 @@
           <w:sz w:val="22"/>
           <w:szCs w:val="22"/>
         </w:rPr>
-        <w:t>ted = {{os.total_sightings}} reported.</w:t>
+        <w:t>ted = {{</w:t>
+      </w:r>
+      <w:proofErr w:type="spellStart"/>
+      <w:proofErr w:type="gramStart"/>
+      <w:r>
+        <w:rPr>
+          <w:rFonts w:ascii="Cambria" w:hAnsi="Cambria"/>
+          <w:b/>
+          <w:color w:val="000000"/>
+          <w:sz w:val="22"/>
+          <w:szCs w:val="22"/>
+        </w:rPr>
+        <w:t>os.total</w:t>
+      </w:r>
+      <w:proofErr w:type="gramEnd"/>
+      <w:r>
+        <w:rPr>
+          <w:rFonts w:ascii="Cambria" w:hAnsi="Cambria"/>
+          <w:b/>
+          <w:color w:val="000000"/>
+          <w:sz w:val="22"/>
+          <w:szCs w:val="22"/>
+        </w:rPr>
+        <w:t>_sightings</w:t>
+      </w:r>
+      <w:proofErr w:type="spellEnd"/>
+      <w:r>
+        <w:rPr>
+          <w:rFonts w:ascii="Cambria" w:hAnsi="Cambria"/>
+          <w:b/>
+          <w:color w:val="000000"/>
+          <w:sz w:val="22"/>
+          <w:szCs w:val="22"/>
+        </w:rPr>
+        <w:t>}} reported.</w:t>
       </w:r>
     </w:p>
     <w:p>
@@ -2611,7 +3924,29 @@
           <w:sz w:val="22"/>
           <w:szCs w:val="22"/>
         </w:rPr>
-        <w:t>{% endfor %}</w:t>
+        <w:t xml:space="preserve">{% </w:t>
+      </w:r>
+      <w:proofErr w:type="spellStart"/>
+      <w:r>
+        <w:rPr>
+          <w:rFonts w:ascii="Cambria" w:hAnsi="Cambria"/>
+          <w:b/>
+          <w:color w:val="000000"/>
+          <w:sz w:val="22"/>
+          <w:szCs w:val="22"/>
+        </w:rPr>
+        <w:t>endfor</w:t>
+      </w:r>
+      <w:proofErr w:type="spellEnd"/>
+      <w:r>
+        <w:rPr>
+          <w:rFonts w:ascii="Cambria" w:hAnsi="Cambria"/>
+          <w:b/>
+          <w:color w:val="000000"/>
+          <w:sz w:val="22"/>
+          <w:szCs w:val="22"/>
+        </w:rPr>
+        <w:t xml:space="preserve"> %}</w:t>
       </w:r>
     </w:p>
     <w:p>
@@ -2653,7 +3988,6 @@
           <w:sz w:val="22"/>
           <w:szCs w:val="22"/>
         </w:rPr>
-        <w:lastRenderedPageBreak/>
         <w:t>Wildlife mortality:</w:t>
       </w:r>
       <w:r>
@@ -2695,6 +4029,7 @@
         <w:trPr>
           <w:cnfStyle w:val="100000000000" w:firstRow="1" w:lastRow="0" w:firstColumn="0" w:lastColumn="0" w:oddVBand="0" w:evenVBand="0" w:oddHBand="0" w:evenHBand="0" w:firstRowFirstColumn="0" w:firstRowLastColumn="0" w:lastRowFirstColumn="0" w:lastRowLastColumn="0"/>
           <w:trHeight w:val="449"/>
+          <w:tblHeader/>
         </w:trPr>
         <w:tc>
           <w:tcPr>
@@ -2854,6 +4189,7 @@
               </w:rPr>
               <w:t>{%</w:t>
             </w:r>
+            <w:proofErr w:type="spellStart"/>
             <w:r>
               <w:rPr>
                 <w:rFonts w:ascii="Cambria" w:hAnsi="Cambria"/>
@@ -2863,7 +4199,19 @@
                 <w:sz w:val="22"/>
                 <w:szCs w:val="22"/>
               </w:rPr>
-              <w:t>tr for item in carcass %}</w:t>
+              <w:t>tr</w:t>
+            </w:r>
+            <w:proofErr w:type="spellEnd"/>
+            <w:r>
+              <w:rPr>
+                <w:rFonts w:ascii="Cambria" w:hAnsi="Cambria"/>
+                <w:b w:val="0"/>
+                <w:bCs/>
+                <w:color w:val="000000"/>
+                <w:sz w:val="22"/>
+                <w:szCs w:val="22"/>
+              </w:rPr>
+              <w:t xml:space="preserve"> for item in carcass %}</w:t>
             </w:r>
           </w:p>
         </w:tc>
@@ -2894,7 +4242,31 @@
                 <w:sz w:val="22"/>
                 <w:szCs w:val="22"/>
               </w:rPr>
-              <w:t>{{ item.conservancy }}</w:t>
+              <w:t xml:space="preserve">{{ </w:t>
+            </w:r>
+            <w:proofErr w:type="spellStart"/>
+            <w:r>
+              <w:rPr>
+                <w:rFonts w:ascii="Cambria" w:hAnsi="Cambria"/>
+                <w:b w:val="0"/>
+                <w:bCs/>
+                <w:color w:val="000000"/>
+                <w:sz w:val="22"/>
+                <w:szCs w:val="22"/>
+              </w:rPr>
+              <w:t>item.conservancy</w:t>
+            </w:r>
+            <w:proofErr w:type="spellEnd"/>
+            <w:r>
+              <w:rPr>
+                <w:rFonts w:ascii="Cambria" w:hAnsi="Cambria"/>
+                <w:b w:val="0"/>
+                <w:bCs/>
+                <w:color w:val="000000"/>
+                <w:sz w:val="22"/>
+                <w:szCs w:val="22"/>
+              </w:rPr>
+              <w:t xml:space="preserve"> }}</w:t>
             </w:r>
           </w:p>
         </w:tc>
@@ -2921,7 +4293,29 @@
                 <w:sz w:val="22"/>
                 <w:szCs w:val="22"/>
               </w:rPr>
-              <w:t>{{ item.species }}</w:t>
+              <w:t xml:space="preserve">{{ </w:t>
+            </w:r>
+            <w:proofErr w:type="spellStart"/>
+            <w:r>
+              <w:rPr>
+                <w:rFonts w:ascii="Cambria" w:hAnsi="Cambria"/>
+                <w:bCs w:val="0"/>
+                <w:color w:val="000000"/>
+                <w:sz w:val="22"/>
+                <w:szCs w:val="22"/>
+              </w:rPr>
+              <w:t>item.species</w:t>
+            </w:r>
+            <w:proofErr w:type="spellEnd"/>
+            <w:r>
+              <w:rPr>
+                <w:rFonts w:ascii="Cambria" w:hAnsi="Cambria"/>
+                <w:bCs w:val="0"/>
+                <w:color w:val="000000"/>
+                <w:sz w:val="22"/>
+                <w:szCs w:val="22"/>
+              </w:rPr>
+              <w:t xml:space="preserve"> }}</w:t>
             </w:r>
           </w:p>
         </w:tc>
@@ -2948,7 +4342,29 @@
                 <w:sz w:val="22"/>
                 <w:szCs w:val="22"/>
               </w:rPr>
-              <w:t>{{ item.station }}</w:t>
+              <w:t xml:space="preserve">{{ </w:t>
+            </w:r>
+            <w:proofErr w:type="spellStart"/>
+            <w:r>
+              <w:rPr>
+                <w:rFonts w:ascii="Cambria" w:hAnsi="Cambria"/>
+                <w:bCs w:val="0"/>
+                <w:color w:val="000000"/>
+                <w:sz w:val="22"/>
+                <w:szCs w:val="22"/>
+              </w:rPr>
+              <w:t>item.station</w:t>
+            </w:r>
+            <w:proofErr w:type="spellEnd"/>
+            <w:r>
+              <w:rPr>
+                <w:rFonts w:ascii="Cambria" w:hAnsi="Cambria"/>
+                <w:bCs w:val="0"/>
+                <w:color w:val="000000"/>
+                <w:sz w:val="22"/>
+                <w:szCs w:val="22"/>
+              </w:rPr>
+              <w:t xml:space="preserve"> }}</w:t>
             </w:r>
           </w:p>
         </w:tc>
@@ -2975,8 +4391,9 @@
                 <w:sz w:val="22"/>
                 <w:szCs w:val="22"/>
               </w:rPr>
-              <w:t>{{ item.</w:t>
-            </w:r>
+              <w:t xml:space="preserve">{{ </w:t>
+            </w:r>
+            <w:proofErr w:type="spellStart"/>
             <w:r>
               <w:rPr>
                 <w:rFonts w:ascii="Cambria" w:hAnsi="Cambria"/>
@@ -2985,8 +4402,19 @@
                 <w:sz w:val="22"/>
                 <w:szCs w:val="22"/>
               </w:rPr>
+              <w:t>item.</w:t>
+            </w:r>
+            <w:r>
+              <w:rPr>
+                <w:rFonts w:ascii="Cambria" w:hAnsi="Cambria"/>
+                <w:bCs w:val="0"/>
+                <w:color w:val="000000"/>
+                <w:sz w:val="22"/>
+                <w:szCs w:val="22"/>
+              </w:rPr>
               <w:t>cause_of_death</w:t>
             </w:r>
+            <w:proofErr w:type="spellEnd"/>
             <w:r>
               <w:rPr>
                 <w:rFonts w:ascii="Cambria" w:hAnsi="Cambria"/>
@@ -3022,7 +4450,29 @@
                 <w:sz w:val="22"/>
                 <w:szCs w:val="22"/>
               </w:rPr>
-              <w:t>{{ item.number_animals }}</w:t>
+              <w:t xml:space="preserve">{{ </w:t>
+            </w:r>
+            <w:proofErr w:type="spellStart"/>
+            <w:r>
+              <w:rPr>
+                <w:rFonts w:ascii="Cambria" w:hAnsi="Cambria"/>
+                <w:bCs w:val="0"/>
+                <w:color w:val="000000"/>
+                <w:sz w:val="22"/>
+                <w:szCs w:val="22"/>
+              </w:rPr>
+              <w:t>item.number_animals</w:t>
+            </w:r>
+            <w:proofErr w:type="spellEnd"/>
+            <w:r>
+              <w:rPr>
+                <w:rFonts w:ascii="Cambria" w:hAnsi="Cambria"/>
+                <w:bCs w:val="0"/>
+                <w:color w:val="000000"/>
+                <w:sz w:val="22"/>
+                <w:szCs w:val="22"/>
+              </w:rPr>
+              <w:t xml:space="preserve"> }}</w:t>
             </w:r>
           </w:p>
         </w:tc>
@@ -3056,7 +4506,55 @@
                 <w:sz w:val="22"/>
                 <w:szCs w:val="22"/>
               </w:rPr>
-              <w:t>{%tr endfor %}</w:t>
+              <w:t>{%</w:t>
+            </w:r>
+            <w:proofErr w:type="spellStart"/>
+            <w:r>
+              <w:rPr>
+                <w:rFonts w:ascii="Cambria" w:hAnsi="Cambria"/>
+                <w:b w:val="0"/>
+                <w:bCs/>
+                <w:color w:val="000000"/>
+                <w:sz w:val="22"/>
+                <w:szCs w:val="22"/>
+              </w:rPr>
+              <w:t>tr</w:t>
+            </w:r>
+            <w:proofErr w:type="spellEnd"/>
+            <w:r>
+              <w:rPr>
+                <w:rFonts w:ascii="Cambria" w:hAnsi="Cambria"/>
+                <w:b w:val="0"/>
+                <w:bCs/>
+                <w:color w:val="000000"/>
+                <w:sz w:val="22"/>
+                <w:szCs w:val="22"/>
+              </w:rPr>
+              <w:t xml:space="preserve"> </w:t>
+            </w:r>
+            <w:proofErr w:type="spellStart"/>
+            <w:r>
+              <w:rPr>
+                <w:rFonts w:ascii="Cambria" w:hAnsi="Cambria"/>
+                <w:b w:val="0"/>
+                <w:bCs/>
+                <w:color w:val="000000"/>
+                <w:sz w:val="22"/>
+                <w:szCs w:val="22"/>
+              </w:rPr>
+              <w:t>endfor</w:t>
+            </w:r>
+            <w:proofErr w:type="spellEnd"/>
+            <w:r>
+              <w:rPr>
+                <w:rFonts w:ascii="Cambria" w:hAnsi="Cambria"/>
+                <w:b w:val="0"/>
+                <w:bCs/>
+                <w:color w:val="000000"/>
+                <w:sz w:val="22"/>
+                <w:szCs w:val="22"/>
+              </w:rPr>
+              <w:t xml:space="preserve"> %}</w:t>
             </w:r>
           </w:p>
         </w:tc>
@@ -3215,7 +4713,29 @@
           <w:sz w:val="22"/>
           <w:szCs w:val="22"/>
         </w:rPr>
-        <w:t>{% endif %}</w:t>
+        <w:t xml:space="preserve">{% </w:t>
+      </w:r>
+      <w:proofErr w:type="spellStart"/>
+      <w:r>
+        <w:rPr>
+          <w:rFonts w:ascii="Cambria" w:hAnsi="Cambria"/>
+          <w:bCs w:val="0"/>
+          <w:color w:val="000000"/>
+          <w:sz w:val="22"/>
+          <w:szCs w:val="22"/>
+        </w:rPr>
+        <w:t>endif</w:t>
+      </w:r>
+      <w:proofErr w:type="spellEnd"/>
+      <w:r>
+        <w:rPr>
+          <w:rFonts w:ascii="Cambria" w:hAnsi="Cambria"/>
+          <w:bCs w:val="0"/>
+          <w:color w:val="000000"/>
+          <w:sz w:val="22"/>
+          <w:szCs w:val="22"/>
+        </w:rPr>
+        <w:t xml:space="preserve"> %}</w:t>
       </w:r>
     </w:p>
     <w:p>
@@ -3275,17 +4795,61 @@
           <w:sz w:val="22"/>
           <w:szCs w:val="22"/>
         </w:rPr>
-        <w:t>Wildlife movement through the gaps:</w:t>
-      </w:r>
-      <w:r>
-        <w:rPr>
-          <w:rFonts w:ascii="Cambria" w:hAnsi="Cambria"/>
-          <w:bCs w:val="0"/>
-          <w:color w:val="000000"/>
-          <w:sz w:val="22"/>
-          <w:szCs w:val="22"/>
-        </w:rPr>
-        <w:t>{% if gap_movement %}</w:t>
+        <w:t xml:space="preserve">Wildlife movement through the </w:t>
+      </w:r>
+      <w:proofErr w:type="gramStart"/>
+      <w:r>
+        <w:rPr>
+          <w:rFonts w:ascii="Cambria" w:hAnsi="Cambria"/>
+          <w:b/>
+          <w:color w:val="000000"/>
+          <w:sz w:val="22"/>
+          <w:szCs w:val="22"/>
+        </w:rPr>
+        <w:t>gaps:</w:t>
+      </w:r>
+      <w:r>
+        <w:rPr>
+          <w:rFonts w:ascii="Cambria" w:hAnsi="Cambria"/>
+          <w:bCs w:val="0"/>
+          <w:color w:val="000000"/>
+          <w:sz w:val="22"/>
+          <w:szCs w:val="22"/>
+        </w:rPr>
+        <w:t>{</w:t>
+      </w:r>
+      <w:proofErr w:type="gramEnd"/>
+      <w:r>
+        <w:rPr>
+          <w:rFonts w:ascii="Cambria" w:hAnsi="Cambria"/>
+          <w:bCs w:val="0"/>
+          <w:color w:val="000000"/>
+          <w:sz w:val="22"/>
+          <w:szCs w:val="22"/>
+        </w:rPr>
+        <w:t xml:space="preserve">% if </w:t>
+      </w:r>
+      <w:proofErr w:type="spellStart"/>
+      <w:r>
+        <w:rPr>
+          <w:rFonts w:ascii="Cambria" w:hAnsi="Cambria"/>
+          <w:bCs w:val="0"/>
+          <w:color w:val="000000"/>
+          <w:sz w:val="22"/>
+          <w:szCs w:val="22"/>
+        </w:rPr>
+        <w:t>gap_movement</w:t>
+      </w:r>
+      <w:proofErr w:type="spellEnd"/>
+      <w:r>
+        <w:rPr>
+          <w:rFonts w:ascii="Cambria" w:hAnsi="Cambria"/>
+          <w:bCs w:val="0"/>
+          <w:color w:val="000000"/>
+          <w:sz w:val="22"/>
+          <w:szCs w:val="22"/>
+        </w:rPr>
+        <w:t xml:space="preserve"> %}</w:t>
       </w:r>
     </w:p>
     <w:p>
@@ -3316,6 +4880,7 @@
       <w:tr>
         <w:trPr>
           <w:cnfStyle w:val="100000000000" w:firstRow="1" w:lastRow="0" w:firstColumn="0" w:lastColumn="0" w:oddVBand="0" w:evenVBand="0" w:oddHBand="0" w:evenHBand="0" w:firstRowFirstColumn="0" w:firstRowLastColumn="0" w:lastRowFirstColumn="0" w:lastRowLastColumn="0"/>
+          <w:tblHeader/>
         </w:trPr>
         <w:tc>
           <w:tcPr>
@@ -3455,8 +5020,42 @@
                 <w:sz w:val="22"/>
                 <w:szCs w:val="22"/>
               </w:rPr>
-              <w:t>{%tr for item in gap_movement</w:t>
-            </w:r>
+              <w:t>{%</w:t>
+            </w:r>
+            <w:proofErr w:type="spellStart"/>
+            <w:r>
+              <w:rPr>
+                <w:rFonts w:ascii="Cambria" w:hAnsi="Cambria"/>
+                <w:b w:val="0"/>
+                <w:color w:val="000000"/>
+                <w:sz w:val="22"/>
+                <w:szCs w:val="22"/>
+              </w:rPr>
+              <w:t>tr</w:t>
+            </w:r>
+            <w:proofErr w:type="spellEnd"/>
+            <w:r>
+              <w:rPr>
+                <w:rFonts w:ascii="Cambria" w:hAnsi="Cambria"/>
+                <w:b w:val="0"/>
+                <w:color w:val="000000"/>
+                <w:sz w:val="22"/>
+                <w:szCs w:val="22"/>
+              </w:rPr>
+              <w:t xml:space="preserve"> for item in </w:t>
+            </w:r>
+            <w:proofErr w:type="spellStart"/>
+            <w:r>
+              <w:rPr>
+                <w:rFonts w:ascii="Cambria" w:hAnsi="Cambria"/>
+                <w:b w:val="0"/>
+                <w:color w:val="000000"/>
+                <w:sz w:val="22"/>
+                <w:szCs w:val="22"/>
+              </w:rPr>
+              <w:t>gap_movement</w:t>
+            </w:r>
+            <w:proofErr w:type="spellEnd"/>
             <w:r>
               <w:rPr>
                 <w:rFonts w:ascii="Cambria" w:hAnsi="Cambria"/>
@@ -3569,7 +5168,29 @@
                 <w:sz w:val="22"/>
                 <w:szCs w:val="22"/>
               </w:rPr>
-              <w:t>{{item.gap_name}}</w:t>
+              <w:t>{{</w:t>
+            </w:r>
+            <w:proofErr w:type="spellStart"/>
+            <w:r>
+              <w:rPr>
+                <w:rFonts w:ascii="Cambria" w:hAnsi="Cambria"/>
+                <w:b w:val="0"/>
+                <w:color w:val="000000"/>
+                <w:sz w:val="22"/>
+                <w:szCs w:val="22"/>
+              </w:rPr>
+              <w:t>item.gap_name</w:t>
+            </w:r>
+            <w:proofErr w:type="spellEnd"/>
+            <w:r>
+              <w:rPr>
+                <w:rFonts w:ascii="Cambria" w:hAnsi="Cambria"/>
+                <w:b w:val="0"/>
+                <w:color w:val="000000"/>
+                <w:sz w:val="22"/>
+                <w:szCs w:val="22"/>
+              </w:rPr>
+              <w:t>}}</w:t>
             </w:r>
           </w:p>
         </w:tc>
@@ -3602,7 +5223,29 @@
                 <w:sz w:val="22"/>
                 <w:szCs w:val="22"/>
               </w:rPr>
-              <w:t>{{item.species}}</w:t>
+              <w:t>{{</w:t>
+            </w:r>
+            <w:proofErr w:type="spellStart"/>
+            <w:r>
+              <w:rPr>
+                <w:rFonts w:ascii="Cambria" w:hAnsi="Cambria"/>
+                <w:bCs w:val="0"/>
+                <w:color w:val="000000"/>
+                <w:sz w:val="22"/>
+                <w:szCs w:val="22"/>
+              </w:rPr>
+              <w:t>item.species</w:t>
+            </w:r>
+            <w:proofErr w:type="spellEnd"/>
+            <w:r>
+              <w:rPr>
+                <w:rFonts w:ascii="Cambria" w:hAnsi="Cambria"/>
+                <w:bCs w:val="0"/>
+                <w:color w:val="000000"/>
+                <w:sz w:val="22"/>
+                <w:szCs w:val="22"/>
+              </w:rPr>
+              <w:t>}}</w:t>
             </w:r>
           </w:p>
         </w:tc>
@@ -3635,7 +5278,29 @@
                 <w:sz w:val="22"/>
                 <w:szCs w:val="22"/>
               </w:rPr>
-              <w:t>{{item.total_in}}</w:t>
+              <w:t>{{</w:t>
+            </w:r>
+            <w:proofErr w:type="spellStart"/>
+            <w:r>
+              <w:rPr>
+                <w:rFonts w:ascii="Cambria" w:hAnsi="Cambria"/>
+                <w:bCs w:val="0"/>
+                <w:color w:val="000000"/>
+                <w:sz w:val="22"/>
+                <w:szCs w:val="22"/>
+              </w:rPr>
+              <w:t>item.total_in</w:t>
+            </w:r>
+            <w:proofErr w:type="spellEnd"/>
+            <w:r>
+              <w:rPr>
+                <w:rFonts w:ascii="Cambria" w:hAnsi="Cambria"/>
+                <w:bCs w:val="0"/>
+                <w:color w:val="000000"/>
+                <w:sz w:val="22"/>
+                <w:szCs w:val="22"/>
+              </w:rPr>
+              <w:t>}}</w:t>
             </w:r>
           </w:p>
         </w:tc>
@@ -3668,7 +5333,29 @@
                 <w:sz w:val="22"/>
                 <w:szCs w:val="22"/>
               </w:rPr>
-              <w:t>{{item.total_out}}</w:t>
+              <w:t>{{</w:t>
+            </w:r>
+            <w:proofErr w:type="spellStart"/>
+            <w:r>
+              <w:rPr>
+                <w:rFonts w:ascii="Cambria" w:hAnsi="Cambria"/>
+                <w:bCs w:val="0"/>
+                <w:color w:val="000000"/>
+                <w:sz w:val="22"/>
+                <w:szCs w:val="22"/>
+              </w:rPr>
+              <w:t>item.total_out</w:t>
+            </w:r>
+            <w:proofErr w:type="spellEnd"/>
+            <w:r>
+              <w:rPr>
+                <w:rFonts w:ascii="Cambria" w:hAnsi="Cambria"/>
+                <w:bCs w:val="0"/>
+                <w:color w:val="000000"/>
+                <w:sz w:val="22"/>
+                <w:szCs w:val="22"/>
+              </w:rPr>
+              <w:t>}}</w:t>
             </w:r>
           </w:p>
         </w:tc>
@@ -3705,7 +5392,51 @@
                 <w:sz w:val="22"/>
                 <w:szCs w:val="22"/>
               </w:rPr>
-              <w:t>{%tr endfor %}</w:t>
+              <w:t>{%</w:t>
+            </w:r>
+            <w:proofErr w:type="spellStart"/>
+            <w:r>
+              <w:rPr>
+                <w:rFonts w:ascii="Cambria" w:hAnsi="Cambria"/>
+                <w:b w:val="0"/>
+                <w:color w:val="000000"/>
+                <w:sz w:val="22"/>
+                <w:szCs w:val="22"/>
+              </w:rPr>
+              <w:t>tr</w:t>
+            </w:r>
+            <w:proofErr w:type="spellEnd"/>
+            <w:r>
+              <w:rPr>
+                <w:rFonts w:ascii="Cambria" w:hAnsi="Cambria"/>
+                <w:b w:val="0"/>
+                <w:color w:val="000000"/>
+                <w:sz w:val="22"/>
+                <w:szCs w:val="22"/>
+              </w:rPr>
+              <w:t xml:space="preserve"> </w:t>
+            </w:r>
+            <w:proofErr w:type="spellStart"/>
+            <w:r>
+              <w:rPr>
+                <w:rFonts w:ascii="Cambria" w:hAnsi="Cambria"/>
+                <w:b w:val="0"/>
+                <w:color w:val="000000"/>
+                <w:sz w:val="22"/>
+                <w:szCs w:val="22"/>
+              </w:rPr>
+              <w:t>endfor</w:t>
+            </w:r>
+            <w:proofErr w:type="spellEnd"/>
+            <w:r>
+              <w:rPr>
+                <w:rFonts w:ascii="Cambria" w:hAnsi="Cambria"/>
+                <w:b w:val="0"/>
+                <w:color w:val="000000"/>
+                <w:sz w:val="22"/>
+                <w:szCs w:val="22"/>
+              </w:rPr>
+              <w:t xml:space="preserve"> %}</w:t>
             </w:r>
           </w:p>
         </w:tc>
@@ -3857,7 +5588,29 @@
           <w:sz w:val="22"/>
           <w:szCs w:val="22"/>
         </w:rPr>
-        <w:t>{% endif %}</w:t>
+        <w:t xml:space="preserve">{% </w:t>
+      </w:r>
+      <w:proofErr w:type="spellStart"/>
+      <w:r>
+        <w:rPr>
+          <w:rFonts w:ascii="Cambria" w:hAnsi="Cambria"/>
+          <w:bCs w:val="0"/>
+          <w:color w:val="000000"/>
+          <w:sz w:val="22"/>
+          <w:szCs w:val="22"/>
+        </w:rPr>
+        <w:t>endif</w:t>
+      </w:r>
+      <w:proofErr w:type="spellEnd"/>
+      <w:r>
+        <w:rPr>
+          <w:rFonts w:ascii="Cambria" w:hAnsi="Cambria"/>
+          <w:bCs w:val="0"/>
+          <w:color w:val="000000"/>
+          <w:sz w:val="22"/>
+          <w:szCs w:val="22"/>
+        </w:rPr>
+        <w:t xml:space="preserve"> %}</w:t>
       </w:r>
     </w:p>
     <w:p>
@@ -4236,7 +5989,6 @@
           <w:sz w:val="22"/>
           <w:szCs w:val="22"/>
         </w:rPr>
-        <w:lastRenderedPageBreak/>
         <w:t>Rainfall</w:t>
       </w:r>
     </w:p>
@@ -4384,6 +6136,7 @@
         </w:rPr>
         <w:t xml:space="preserve">Rainfall for: </w:t>
       </w:r>
+      <w:proofErr w:type="gramStart"/>
       <w:r>
         <w:rPr>
           <w:rFonts w:ascii="Cambria" w:hAnsi="Cambria"/>
@@ -4404,8 +6157,9 @@
           <w:sz w:val="22"/>
           <w:szCs w:val="22"/>
         </w:rPr>
-        <w:t xml:space="preserve"> conservancy.</w:t>
-      </w:r>
+        <w:t xml:space="preserve"> </w:t>
+      </w:r>
+      <w:proofErr w:type="spellStart"/>
       <w:r>
         <w:rPr>
           <w:rFonts w:ascii="Cambria" w:hAnsi="Cambria"/>
@@ -4417,6 +6171,7 @@
         </w:rPr>
         <w:t>conservancy</w:t>
       </w:r>
+      <w:proofErr w:type="gramEnd"/>
       <w:r>
         <w:rPr>
           <w:rFonts w:ascii="Cambria" w:hAnsi="Cambria"/>
@@ -4426,6 +6181,29 @@
           <w:sz w:val="22"/>
           <w:szCs w:val="22"/>
         </w:rPr>
+        <w:t>.</w:t>
+      </w:r>
+      <w:r>
+        <w:rPr>
+          <w:rFonts w:ascii="Cambria" w:hAnsi="Cambria"/>
+          <w:b/>
+          <w:bCs w:val="0"/>
+          <w:color w:val="000000"/>
+          <w:sz w:val="22"/>
+          <w:szCs w:val="22"/>
+        </w:rPr>
+        <w:t>conservancy</w:t>
+      </w:r>
+      <w:proofErr w:type="spellEnd"/>
+      <w:r>
+        <w:rPr>
+          <w:rFonts w:ascii="Cambria" w:hAnsi="Cambria"/>
+          <w:b/>
+          <w:bCs w:val="0"/>
+          <w:color w:val="000000"/>
+          <w:sz w:val="22"/>
+          <w:szCs w:val="22"/>
+        </w:rPr>
         <w:t xml:space="preserve"> </w:t>
       </w:r>
       <w:r>
@@ -4447,17 +6225,39 @@
           <w:sz w:val="22"/>
           <w:szCs w:val="22"/>
         </w:rPr>
-        <w:t>{% if conservancy.rainfa</w:t>
-      </w:r>
-      <w:r>
-        <w:rPr>
-          <w:rFonts w:ascii="Cambria" w:hAnsi="Cambria"/>
-          <w:bCs w:val="0"/>
-          <w:color w:val="000000"/>
-          <w:sz w:val="22"/>
-          <w:szCs w:val="22"/>
-        </w:rPr>
-        <w:t>ll %}</w:t>
+        <w:t xml:space="preserve">{% if </w:t>
+      </w:r>
+      <w:proofErr w:type="spellStart"/>
+      <w:r>
+        <w:rPr>
+          <w:rFonts w:ascii="Cambria" w:hAnsi="Cambria"/>
+          <w:bCs w:val="0"/>
+          <w:color w:val="000000"/>
+          <w:sz w:val="22"/>
+          <w:szCs w:val="22"/>
+        </w:rPr>
+        <w:t>conservancy.rainfa</w:t>
+      </w:r>
+      <w:r>
+        <w:rPr>
+          <w:rFonts w:ascii="Cambria" w:hAnsi="Cambria"/>
+          <w:bCs w:val="0"/>
+          <w:color w:val="000000"/>
+          <w:sz w:val="22"/>
+          <w:szCs w:val="22"/>
+        </w:rPr>
+        <w:t>ll</w:t>
+      </w:r>
+      <w:proofErr w:type="spellEnd"/>
+      <w:r>
+        <w:rPr>
+          <w:rFonts w:ascii="Cambria" w:hAnsi="Cambria"/>
+          <w:bCs w:val="0"/>
+          <w:color w:val="000000"/>
+          <w:sz w:val="22"/>
+          <w:szCs w:val="22"/>
+        </w:rPr>
+        <w:t xml:space="preserve"> %}</w:t>
       </w:r>
     </w:p>
     <w:tbl>
@@ -4473,6 +6273,7 @@
       <w:tr>
         <w:trPr>
           <w:cnfStyle w:val="100000000000" w:firstRow="1" w:lastRow="0" w:firstColumn="0" w:lastColumn="0" w:oddVBand="0" w:evenVBand="0" w:oddHBand="0" w:evenHBand="0" w:firstRowFirstColumn="0" w:firstRowLastColumn="0" w:lastRowFirstColumn="0" w:lastRowLastColumn="0"/>
+          <w:tblHeader/>
         </w:trPr>
         <w:tc>
           <w:tcPr>
@@ -4561,7 +6362,51 @@
                 <w:sz w:val="22"/>
                 <w:szCs w:val="22"/>
               </w:rPr>
-              <w:t>{%tr for item in conservancy.rainfall %}</w:t>
+              <w:t>{%</w:t>
+            </w:r>
+            <w:proofErr w:type="spellStart"/>
+            <w:r>
+              <w:rPr>
+                <w:rFonts w:ascii="Cambria" w:hAnsi="Cambria"/>
+                <w:b w:val="0"/>
+                <w:color w:val="000000"/>
+                <w:sz w:val="22"/>
+                <w:szCs w:val="22"/>
+              </w:rPr>
+              <w:t>tr</w:t>
+            </w:r>
+            <w:proofErr w:type="spellEnd"/>
+            <w:r>
+              <w:rPr>
+                <w:rFonts w:ascii="Cambria" w:hAnsi="Cambria"/>
+                <w:b w:val="0"/>
+                <w:color w:val="000000"/>
+                <w:sz w:val="22"/>
+                <w:szCs w:val="22"/>
+              </w:rPr>
+              <w:t xml:space="preserve"> for item in </w:t>
+            </w:r>
+            <w:proofErr w:type="spellStart"/>
+            <w:r>
+              <w:rPr>
+                <w:rFonts w:ascii="Cambria" w:hAnsi="Cambria"/>
+                <w:b w:val="0"/>
+                <w:color w:val="000000"/>
+                <w:sz w:val="22"/>
+                <w:szCs w:val="22"/>
+              </w:rPr>
+              <w:t>conservancy.rainfall</w:t>
+            </w:r>
+            <w:proofErr w:type="spellEnd"/>
+            <w:r>
+              <w:rPr>
+                <w:rFonts w:ascii="Cambria" w:hAnsi="Cambria"/>
+                <w:b w:val="0"/>
+                <w:color w:val="000000"/>
+                <w:sz w:val="22"/>
+                <w:szCs w:val="22"/>
+              </w:rPr>
+              <w:t xml:space="preserve"> %}</w:t>
             </w:r>
           </w:p>
         </w:tc>
@@ -4622,7 +6467,29 @@
                 <w:sz w:val="22"/>
                 <w:szCs w:val="22"/>
               </w:rPr>
-              <w:t>{{ item.station }}</w:t>
+              <w:t xml:space="preserve">{{ </w:t>
+            </w:r>
+            <w:proofErr w:type="spellStart"/>
+            <w:r>
+              <w:rPr>
+                <w:rFonts w:ascii="Cambria" w:hAnsi="Cambria"/>
+                <w:b w:val="0"/>
+                <w:color w:val="000000"/>
+                <w:sz w:val="22"/>
+                <w:szCs w:val="22"/>
+              </w:rPr>
+              <w:t>item.station</w:t>
+            </w:r>
+            <w:proofErr w:type="spellEnd"/>
+            <w:r>
+              <w:rPr>
+                <w:rFonts w:ascii="Cambria" w:hAnsi="Cambria"/>
+                <w:b w:val="0"/>
+                <w:color w:val="000000"/>
+                <w:sz w:val="22"/>
+                <w:szCs w:val="22"/>
+              </w:rPr>
+              <w:t xml:space="preserve"> }}</w:t>
             </w:r>
           </w:p>
         </w:tc>
@@ -4653,7 +6520,27 @@
                 <w:sz w:val="22"/>
                 <w:szCs w:val="22"/>
               </w:rPr>
-              <w:t>{{ item.total_mm }}</w:t>
+              <w:t xml:space="preserve">{{ </w:t>
+            </w:r>
+            <w:proofErr w:type="spellStart"/>
+            <w:r>
+              <w:rPr>
+                <w:rFonts w:ascii="Cambria" w:hAnsi="Cambria"/>
+                <w:color w:val="000000"/>
+                <w:sz w:val="22"/>
+                <w:szCs w:val="22"/>
+              </w:rPr>
+              <w:t>item.total_mm</w:t>
+            </w:r>
+            <w:proofErr w:type="spellEnd"/>
+            <w:r>
+              <w:rPr>
+                <w:rFonts w:ascii="Cambria" w:hAnsi="Cambria"/>
+                <w:color w:val="000000"/>
+                <w:sz w:val="22"/>
+                <w:szCs w:val="22"/>
+              </w:rPr>
+              <w:t xml:space="preserve"> }}</w:t>
             </w:r>
           </w:p>
         </w:tc>
@@ -4692,7 +6579,51 @@
                 <w:sz w:val="22"/>
                 <w:szCs w:val="22"/>
               </w:rPr>
-              <w:t>{%tr endfor %}</w:t>
+              <w:t>{%</w:t>
+            </w:r>
+            <w:proofErr w:type="spellStart"/>
+            <w:r>
+              <w:rPr>
+                <w:rFonts w:ascii="Cambria" w:hAnsi="Cambria"/>
+                <w:b w:val="0"/>
+                <w:color w:val="000000"/>
+                <w:sz w:val="22"/>
+                <w:szCs w:val="22"/>
+              </w:rPr>
+              <w:t>tr</w:t>
+            </w:r>
+            <w:proofErr w:type="spellEnd"/>
+            <w:r>
+              <w:rPr>
+                <w:rFonts w:ascii="Cambria" w:hAnsi="Cambria"/>
+                <w:b w:val="0"/>
+                <w:color w:val="000000"/>
+                <w:sz w:val="22"/>
+                <w:szCs w:val="22"/>
+              </w:rPr>
+              <w:t xml:space="preserve"> </w:t>
+            </w:r>
+            <w:proofErr w:type="spellStart"/>
+            <w:r>
+              <w:rPr>
+                <w:rFonts w:ascii="Cambria" w:hAnsi="Cambria"/>
+                <w:b w:val="0"/>
+                <w:color w:val="000000"/>
+                <w:sz w:val="22"/>
+                <w:szCs w:val="22"/>
+              </w:rPr>
+              <w:t>endfor</w:t>
+            </w:r>
+            <w:proofErr w:type="spellEnd"/>
+            <w:r>
+              <w:rPr>
+                <w:rFonts w:ascii="Cambria" w:hAnsi="Cambria"/>
+                <w:b w:val="0"/>
+                <w:color w:val="000000"/>
+                <w:sz w:val="22"/>
+                <w:szCs w:val="22"/>
+              </w:rPr>
+              <w:t xml:space="preserve"> %}</w:t>
             </w:r>
           </w:p>
         </w:tc>
@@ -4801,7 +6732,29 @@
           <w:sz w:val="22"/>
           <w:szCs w:val="22"/>
         </w:rPr>
-        <w:t>{% endif %}</w:t>
+        <w:t xml:space="preserve">{% </w:t>
+      </w:r>
+      <w:proofErr w:type="spellStart"/>
+      <w:r>
+        <w:rPr>
+          <w:rFonts w:ascii="Cambria" w:hAnsi="Cambria"/>
+          <w:bCs w:val="0"/>
+          <w:color w:val="000000"/>
+          <w:sz w:val="22"/>
+          <w:szCs w:val="22"/>
+        </w:rPr>
+        <w:t>endif</w:t>
+      </w:r>
+      <w:proofErr w:type="spellEnd"/>
+      <w:r>
+        <w:rPr>
+          <w:rFonts w:ascii="Cambria" w:hAnsi="Cambria"/>
+          <w:bCs w:val="0"/>
+          <w:color w:val="000000"/>
+          <w:sz w:val="22"/>
+          <w:szCs w:val="22"/>
+        </w:rPr>
+        <w:t xml:space="preserve"> %}</w:t>
       </w:r>
     </w:p>
     <w:p>
@@ -4839,15 +6792,27 @@
         </w:rPr>
         <w:t xml:space="preserve"> </w:t>
       </w:r>
-      <w:r>
-        <w:rPr>
-          <w:rFonts w:ascii="Cambria" w:hAnsi="Cambria"/>
-          <w:bCs w:val="0"/>
-          <w:color w:val="000000"/>
-          <w:sz w:val="22"/>
-          <w:szCs w:val="22"/>
-        </w:rPr>
-        <w:t>endfor%}</w:t>
+      <w:proofErr w:type="spellStart"/>
+      <w:r>
+        <w:rPr>
+          <w:rFonts w:ascii="Cambria" w:hAnsi="Cambria"/>
+          <w:bCs w:val="0"/>
+          <w:color w:val="000000"/>
+          <w:sz w:val="22"/>
+          <w:szCs w:val="22"/>
+        </w:rPr>
+        <w:t>endfor</w:t>
+      </w:r>
+      <w:proofErr w:type="spellEnd"/>
+      <w:r>
+        <w:rPr>
+          <w:rFonts w:ascii="Cambria" w:hAnsi="Cambria"/>
+          <w:bCs w:val="0"/>
+          <w:color w:val="000000"/>
+          <w:sz w:val="22"/>
+          <w:szCs w:val="22"/>
+        </w:rPr>
+        <w:t>%}</w:t>
       </w:r>
     </w:p>
     <w:p>
@@ -4975,8 +6940,9 @@
           <w:sz w:val="22"/>
           <w:szCs w:val="22"/>
         </w:rPr>
-        <w:t>Fence Break</w:t>
-      </w:r>
+        <w:t xml:space="preserve">Fence </w:t>
+      </w:r>
+      <w:proofErr w:type="gramStart"/>
       <w:r>
         <w:rPr>
           <w:rFonts w:ascii="Cambria" w:hAnsi="Cambria"/>
@@ -4985,6 +6951,16 @@
           <w:sz w:val="22"/>
           <w:szCs w:val="22"/>
         </w:rPr>
+        <w:t>Break</w:t>
+      </w:r>
+      <w:r>
+        <w:rPr>
+          <w:rFonts w:ascii="Cambria" w:hAnsi="Cambria"/>
+          <w:b/>
+          <w:color w:val="000000"/>
+          <w:sz w:val="22"/>
+          <w:szCs w:val="22"/>
+        </w:rPr>
         <w:t>age</w:t>
       </w:r>
       <w:r>
@@ -5005,7 +6981,40 @@
           <w:sz w:val="22"/>
           <w:szCs w:val="22"/>
         </w:rPr>
-        <w:t>{% if fence_breakage %}</w:t>
+        <w:t>{</w:t>
+      </w:r>
+      <w:proofErr w:type="gramEnd"/>
+      <w:r>
+        <w:rPr>
+          <w:rFonts w:ascii="Cambria" w:hAnsi="Cambria"/>
+          <w:bCs w:val="0"/>
+          <w:color w:val="000000"/>
+          <w:sz w:val="22"/>
+          <w:szCs w:val="22"/>
+        </w:rPr>
+        <w:t xml:space="preserve">% if </w:t>
+      </w:r>
+      <w:proofErr w:type="spellStart"/>
+      <w:r>
+        <w:rPr>
+          <w:rFonts w:ascii="Cambria" w:hAnsi="Cambria"/>
+          <w:bCs w:val="0"/>
+          <w:color w:val="000000"/>
+          <w:sz w:val="22"/>
+          <w:szCs w:val="22"/>
+        </w:rPr>
+        <w:t>fence_breakage</w:t>
+      </w:r>
+      <w:proofErr w:type="spellEnd"/>
+      <w:r>
+        <w:rPr>
+          <w:rFonts w:ascii="Cambria" w:hAnsi="Cambria"/>
+          <w:bCs w:val="0"/>
+          <w:color w:val="000000"/>
+          <w:sz w:val="22"/>
+          <w:szCs w:val="22"/>
+        </w:rPr>
+        <w:t xml:space="preserve"> %}</w:t>
       </w:r>
     </w:p>
     <w:p>
@@ -5039,6 +7048,7 @@
       <w:tr>
         <w:trPr>
           <w:cnfStyle w:val="100000000000" w:firstRow="1" w:lastRow="0" w:firstColumn="0" w:lastColumn="0" w:oddVBand="0" w:evenVBand="0" w:oddHBand="0" w:evenHBand="0" w:firstRowFirstColumn="0" w:firstRowLastColumn="0" w:lastRowFirstColumn="0" w:lastRowLastColumn="0"/>
+          <w:tblHeader/>
         </w:trPr>
         <w:tc>
           <w:tcPr>
@@ -5218,8 +7228,18 @@
                 <w:sz w:val="22"/>
                 <w:szCs w:val="22"/>
               </w:rPr>
-              <w:t>Logistics Feeback</w:t>
-            </w:r>
+              <w:t xml:space="preserve">Logistics </w:t>
+            </w:r>
+            <w:proofErr w:type="spellStart"/>
+            <w:r>
+              <w:rPr>
+                <w:rFonts w:ascii="Calibri" w:hAnsi="Calibri"/>
+                <w:sz w:val="22"/>
+                <w:szCs w:val="22"/>
+              </w:rPr>
+              <w:t>Feeback</w:t>
+            </w:r>
+            <w:proofErr w:type="spellEnd"/>
           </w:p>
         </w:tc>
       </w:tr>
@@ -5257,7 +7277,51 @@
                 <w:sz w:val="22"/>
                 <w:szCs w:val="22"/>
               </w:rPr>
-              <w:t>{%tr for item in fence_breakage %}</w:t>
+              <w:t>{%</w:t>
+            </w:r>
+            <w:proofErr w:type="spellStart"/>
+            <w:r>
+              <w:rPr>
+                <w:rFonts w:ascii="Cambria" w:hAnsi="Cambria"/>
+                <w:b w:val="0"/>
+                <w:color w:val="000000"/>
+                <w:sz w:val="22"/>
+                <w:szCs w:val="22"/>
+              </w:rPr>
+              <w:t>tr</w:t>
+            </w:r>
+            <w:proofErr w:type="spellEnd"/>
+            <w:r>
+              <w:rPr>
+                <w:rFonts w:ascii="Cambria" w:hAnsi="Cambria"/>
+                <w:b w:val="0"/>
+                <w:color w:val="000000"/>
+                <w:sz w:val="22"/>
+                <w:szCs w:val="22"/>
+              </w:rPr>
+              <w:t xml:space="preserve"> for item in </w:t>
+            </w:r>
+            <w:proofErr w:type="spellStart"/>
+            <w:r>
+              <w:rPr>
+                <w:rFonts w:ascii="Cambria" w:hAnsi="Cambria"/>
+                <w:b w:val="0"/>
+                <w:color w:val="000000"/>
+                <w:sz w:val="22"/>
+                <w:szCs w:val="22"/>
+              </w:rPr>
+              <w:t>fence_breakage</w:t>
+            </w:r>
+            <w:proofErr w:type="spellEnd"/>
+            <w:r>
+              <w:rPr>
+                <w:rFonts w:ascii="Cambria" w:hAnsi="Cambria"/>
+                <w:b w:val="0"/>
+                <w:color w:val="000000"/>
+                <w:sz w:val="22"/>
+                <w:szCs w:val="22"/>
+              </w:rPr>
+              <w:t xml:space="preserve"> %}</w:t>
             </w:r>
           </w:p>
         </w:tc>
@@ -5291,7 +7355,29 @@
                 <w:sz w:val="22"/>
                 <w:szCs w:val="22"/>
               </w:rPr>
-              <w:t>{{ item.time }}</w:t>
+              <w:t xml:space="preserve">{{ </w:t>
+            </w:r>
+            <w:proofErr w:type="spellStart"/>
+            <w:r>
+              <w:rPr>
+                <w:rFonts w:ascii="Cambria" w:hAnsi="Cambria"/>
+                <w:b w:val="0"/>
+                <w:color w:val="000000"/>
+                <w:sz w:val="22"/>
+                <w:szCs w:val="22"/>
+              </w:rPr>
+              <w:t>item.time</w:t>
+            </w:r>
+            <w:proofErr w:type="spellEnd"/>
+            <w:r>
+              <w:rPr>
+                <w:rFonts w:ascii="Cambria" w:hAnsi="Cambria"/>
+                <w:b w:val="0"/>
+                <w:color w:val="000000"/>
+                <w:sz w:val="22"/>
+                <w:szCs w:val="22"/>
+              </w:rPr>
+              <w:t xml:space="preserve"> }}</w:t>
             </w:r>
           </w:p>
         </w:tc>
@@ -5321,7 +7407,27 @@
                 <w:sz w:val="22"/>
                 <w:szCs w:val="22"/>
               </w:rPr>
-              <w:t>{{item.section }}</w:t>
+              <w:t>{{</w:t>
+            </w:r>
+            <w:proofErr w:type="spellStart"/>
+            <w:r>
+              <w:rPr>
+                <w:rFonts w:ascii="Cambria" w:hAnsi="Cambria"/>
+                <w:color w:val="000000"/>
+                <w:sz w:val="22"/>
+                <w:szCs w:val="22"/>
+              </w:rPr>
+              <w:t>item.section</w:t>
+            </w:r>
+            <w:proofErr w:type="spellEnd"/>
+            <w:r>
+              <w:rPr>
+                <w:rFonts w:ascii="Cambria" w:hAnsi="Cambria"/>
+                <w:color w:val="000000"/>
+                <w:sz w:val="22"/>
+                <w:szCs w:val="22"/>
+              </w:rPr>
+              <w:t xml:space="preserve"> }}</w:t>
             </w:r>
           </w:p>
         </w:tc>
@@ -5351,7 +7457,27 @@
                 <w:sz w:val="22"/>
                 <w:szCs w:val="22"/>
               </w:rPr>
-              <w:t>{{ item.species }}</w:t>
+              <w:t xml:space="preserve">{{ </w:t>
+            </w:r>
+            <w:proofErr w:type="spellStart"/>
+            <w:r>
+              <w:rPr>
+                <w:rFonts w:ascii="Cambria" w:hAnsi="Cambria"/>
+                <w:color w:val="000000"/>
+                <w:sz w:val="22"/>
+                <w:szCs w:val="22"/>
+              </w:rPr>
+              <w:t>item.species</w:t>
+            </w:r>
+            <w:proofErr w:type="spellEnd"/>
+            <w:r>
+              <w:rPr>
+                <w:rFonts w:ascii="Cambria" w:hAnsi="Cambria"/>
+                <w:color w:val="000000"/>
+                <w:sz w:val="22"/>
+                <w:szCs w:val="22"/>
+              </w:rPr>
+              <w:t xml:space="preserve"> }}</w:t>
             </w:r>
           </w:p>
         </w:tc>
@@ -5381,7 +7507,27 @@
                 <w:sz w:val="22"/>
                 <w:szCs w:val="22"/>
               </w:rPr>
-              <w:t>{{ item.animal_name}}</w:t>
+              <w:t xml:space="preserve">{{ </w:t>
+            </w:r>
+            <w:proofErr w:type="spellStart"/>
+            <w:r>
+              <w:rPr>
+                <w:rFonts w:ascii="Cambria" w:hAnsi="Cambria"/>
+                <w:color w:val="000000"/>
+                <w:sz w:val="22"/>
+                <w:szCs w:val="22"/>
+              </w:rPr>
+              <w:t>item.animal_name</w:t>
+            </w:r>
+            <w:proofErr w:type="spellEnd"/>
+            <w:r>
+              <w:rPr>
+                <w:rFonts w:ascii="Cambria" w:hAnsi="Cambria"/>
+                <w:color w:val="000000"/>
+                <w:sz w:val="22"/>
+                <w:szCs w:val="22"/>
+              </w:rPr>
+              <w:t>}}</w:t>
             </w:r>
           </w:p>
         </w:tc>
@@ -5411,7 +7557,27 @@
                 <w:sz w:val="22"/>
                 <w:szCs w:val="22"/>
               </w:rPr>
-              <w:t>{{ item.reported_by}}</w:t>
+              <w:t xml:space="preserve">{{ </w:t>
+            </w:r>
+            <w:proofErr w:type="spellStart"/>
+            <w:r>
+              <w:rPr>
+                <w:rFonts w:ascii="Cambria" w:hAnsi="Cambria"/>
+                <w:color w:val="000000"/>
+                <w:sz w:val="22"/>
+                <w:szCs w:val="22"/>
+              </w:rPr>
+              <w:t>item.reported_by</w:t>
+            </w:r>
+            <w:proofErr w:type="spellEnd"/>
+            <w:r>
+              <w:rPr>
+                <w:rFonts w:ascii="Cambria" w:hAnsi="Cambria"/>
+                <w:color w:val="000000"/>
+                <w:sz w:val="22"/>
+                <w:szCs w:val="22"/>
+              </w:rPr>
+              <w:t>}}</w:t>
             </w:r>
           </w:p>
         </w:tc>
@@ -5441,7 +7607,27 @@
                 <w:sz w:val="22"/>
                 <w:szCs w:val="22"/>
               </w:rPr>
-              <w:t>{{ item.action}}</w:t>
+              <w:t xml:space="preserve">{{ </w:t>
+            </w:r>
+            <w:proofErr w:type="spellStart"/>
+            <w:r>
+              <w:rPr>
+                <w:rFonts w:ascii="Cambria" w:hAnsi="Cambria"/>
+                <w:color w:val="000000"/>
+                <w:sz w:val="22"/>
+                <w:szCs w:val="22"/>
+              </w:rPr>
+              <w:t>item.action</w:t>
+            </w:r>
+            <w:proofErr w:type="spellEnd"/>
+            <w:r>
+              <w:rPr>
+                <w:rFonts w:ascii="Cambria" w:hAnsi="Cambria"/>
+                <w:color w:val="000000"/>
+                <w:sz w:val="22"/>
+                <w:szCs w:val="22"/>
+              </w:rPr>
+              <w:t>}}</w:t>
             </w:r>
           </w:p>
         </w:tc>
@@ -5471,16 +7657,36 @@
                 <w:sz w:val="22"/>
                 <w:szCs w:val="22"/>
               </w:rPr>
-              <w:t>{{item.feed</w:t>
-            </w:r>
-            <w:r>
-              <w:rPr>
-                <w:rFonts w:ascii="Cambria" w:hAnsi="Cambria"/>
-                <w:color w:val="000000"/>
-                <w:sz w:val="22"/>
-                <w:szCs w:val="22"/>
-              </w:rPr>
-              <w:t>back }}</w:t>
+              <w:t>{{</w:t>
+            </w:r>
+            <w:proofErr w:type="spellStart"/>
+            <w:r>
+              <w:rPr>
+                <w:rFonts w:ascii="Cambria" w:hAnsi="Cambria"/>
+                <w:color w:val="000000"/>
+                <w:sz w:val="22"/>
+                <w:szCs w:val="22"/>
+              </w:rPr>
+              <w:t>item.feed</w:t>
+            </w:r>
+            <w:r>
+              <w:rPr>
+                <w:rFonts w:ascii="Cambria" w:hAnsi="Cambria"/>
+                <w:color w:val="000000"/>
+                <w:sz w:val="22"/>
+                <w:szCs w:val="22"/>
+              </w:rPr>
+              <w:t>back</w:t>
+            </w:r>
+            <w:proofErr w:type="spellEnd"/>
+            <w:r>
+              <w:rPr>
+                <w:rFonts w:ascii="Cambria" w:hAnsi="Cambria"/>
+                <w:color w:val="000000"/>
+                <w:sz w:val="22"/>
+                <w:szCs w:val="22"/>
+              </w:rPr>
+              <w:t xml:space="preserve"> }}</w:t>
             </w:r>
           </w:p>
         </w:tc>
@@ -5517,7 +7723,51 @@
                 <w:sz w:val="22"/>
                 <w:szCs w:val="22"/>
               </w:rPr>
-              <w:t>{%tr endfor %}</w:t>
+              <w:t>{%</w:t>
+            </w:r>
+            <w:proofErr w:type="spellStart"/>
+            <w:r>
+              <w:rPr>
+                <w:rFonts w:ascii="Cambria" w:hAnsi="Cambria"/>
+                <w:b w:val="0"/>
+                <w:color w:val="000000"/>
+                <w:sz w:val="22"/>
+                <w:szCs w:val="22"/>
+              </w:rPr>
+              <w:t>tr</w:t>
+            </w:r>
+            <w:proofErr w:type="spellEnd"/>
+            <w:r>
+              <w:rPr>
+                <w:rFonts w:ascii="Cambria" w:hAnsi="Cambria"/>
+                <w:b w:val="0"/>
+                <w:color w:val="000000"/>
+                <w:sz w:val="22"/>
+                <w:szCs w:val="22"/>
+              </w:rPr>
+              <w:t xml:space="preserve"> </w:t>
+            </w:r>
+            <w:proofErr w:type="spellStart"/>
+            <w:r>
+              <w:rPr>
+                <w:rFonts w:ascii="Cambria" w:hAnsi="Cambria"/>
+                <w:b w:val="0"/>
+                <w:color w:val="000000"/>
+                <w:sz w:val="22"/>
+                <w:szCs w:val="22"/>
+              </w:rPr>
+              <w:t>endfor</w:t>
+            </w:r>
+            <w:proofErr w:type="spellEnd"/>
+            <w:r>
+              <w:rPr>
+                <w:rFonts w:ascii="Cambria" w:hAnsi="Cambria"/>
+                <w:b w:val="0"/>
+                <w:color w:val="000000"/>
+                <w:sz w:val="22"/>
+                <w:szCs w:val="22"/>
+              </w:rPr>
+              <w:t xml:space="preserve"> %}</w:t>
             </w:r>
           </w:p>
         </w:tc>
@@ -5729,7 +7979,27 @@
           <w:sz w:val="22"/>
           <w:szCs w:val="22"/>
         </w:rPr>
-        <w:t>{% endif %}</w:t>
+        <w:t xml:space="preserve">{% </w:t>
+      </w:r>
+      <w:proofErr w:type="spellStart"/>
+      <w:r>
+        <w:rPr>
+          <w:rFonts w:ascii="Cambria" w:hAnsi="Cambria"/>
+          <w:color w:val="000000"/>
+          <w:sz w:val="22"/>
+          <w:szCs w:val="22"/>
+        </w:rPr>
+        <w:t>endif</w:t>
+      </w:r>
+      <w:proofErr w:type="spellEnd"/>
+      <w:r>
+        <w:rPr>
+          <w:rFonts w:ascii="Cambria" w:hAnsi="Cambria"/>
+          <w:color w:val="000000"/>
+          <w:sz w:val="22"/>
+          <w:szCs w:val="22"/>
+        </w:rPr>
+        <w:t xml:space="preserve"> %}</w:t>
       </w:r>
     </w:p>
     <w:p>
@@ -5749,6 +8019,7 @@
         <w:pStyle w:val="Heading1"/>
       </w:pPr>
       <w:r>
+        <w:lastRenderedPageBreak/>
         <w:t>N.R.T. Report</w:t>
       </w:r>
     </w:p>
@@ -5801,7 +8072,6 @@
           <w:sz w:val="22"/>
           <w:szCs w:val="22"/>
         </w:rPr>
-        <w:lastRenderedPageBreak/>
         <w:t>&lt;report details&gt;</w:t>
       </w:r>
     </w:p>
@@ -5937,7 +8207,15 @@
       <w:pStyle w:val="Footer"/>
     </w:pPr>
     <w:r>
-      <w:t>{{footer_text}}</w:t>
+      <w:t>{{</w:t>
+    </w:r>
+    <w:proofErr w:type="spellStart"/>
+    <w:r>
+      <w:t>footer_text</w:t>
+    </w:r>
+    <w:proofErr w:type="spellEnd"/>
+    <w:r>
+      <w:t>}}</w:t>
     </w:r>
   </w:p>
 </w:ftr>
@@ -6210,7 +8488,7 @@
   <w:abstractNum w:abstractNumId="0">
     <w:nsid w:val="FFFFFF1D"/>
     <w:multiLevelType w:val="multilevel"/>
-    <w:tmpl w:val="F3B4D8C2"/>
+    <w:tmpl w:val="588A3FD8"/>
     <w:lvl w:ilvl="0">
       <w:start w:val="1"/>
       <w:numFmt w:val="bullet"/>
@@ -8304,7 +10582,7 @@
 </file>
 
 <file path=customXml/itemProps3.xml><?xml version="1.0" encoding="utf-8"?>
-<ds:datastoreItem xmlns:ds="http://schemas.openxmlformats.org/officeDocument/2006/customXml" ds:itemID="{84E655B3-00AC-9B4C-B9B7-9856CD810DAC}">
+<ds:datastoreItem xmlns:ds="http://schemas.openxmlformats.org/officeDocument/2006/customXml" ds:itemID="{92809E92-A2FC-F643-87CD-6268055D5DC4}">
   <ds:schemaRefs>
     <ds:schemaRef ds:uri="http://schemas.openxmlformats.org/officeDocument/2006/bibliography"/>
   </ds:schemaRefs>

</xml_diff>

<commit_message>
Add list of security events.
</commit_message>
<xml_diff>
--- a/das/reports/docx_template/lewa_sitrep_template.docx
+++ b/das/reports/docx_template/lewa_sitrep_template.docx
@@ -1102,8 +1102,6 @@
         </w:rPr>
         <w:t>%}</w:t>
       </w:r>
-      <w:bookmarkStart w:id="0" w:name="_GoBack"/>
-      <w:bookmarkEnd w:id="0"/>
       <w:r>
         <w:rPr>
           <w:rFonts w:ascii="Cambria" w:hAnsi="Cambria"/>
@@ -5957,20 +5955,14 @@
         <w:spacing w:before="0" w:beforeAutospacing="0" w:after="0"/>
         <w:rPr>
           <w:rFonts w:ascii="Cambria" w:hAnsi="Cambria"/>
+          <w:b/>
           <w:bCs w:val="0"/>
           <w:color w:val="000000"/>
           <w:sz w:val="22"/>
           <w:szCs w:val="22"/>
         </w:rPr>
       </w:pPr>
-    </w:p>
-    <w:p>
-      <w:pPr>
-        <w:tabs>
-          <w:tab w:val="clear" w:pos="2940"/>
-          <w:tab w:val="center" w:pos="995"/>
-        </w:tabs>
-        <w:spacing w:before="0" w:beforeAutospacing="0" w:after="0"/>
+      <w:r>
         <w:rPr>
           <w:rFonts w:ascii="Cambria" w:hAnsi="Cambria"/>
           <w:b/>
@@ -5979,16 +5971,7 @@
           <w:sz w:val="22"/>
           <w:szCs w:val="22"/>
         </w:rPr>
-      </w:pPr>
-      <w:r>
-        <w:rPr>
-          <w:rFonts w:ascii="Cambria" w:hAnsi="Cambria"/>
-          <w:b/>
-          <w:bCs w:val="0"/>
-          <w:color w:val="000000"/>
-          <w:sz w:val="22"/>
-          <w:szCs w:val="22"/>
-        </w:rPr>
+        <w:lastRenderedPageBreak/>
         <w:t>Rainfall</w:t>
       </w:r>
     </w:p>
@@ -6838,6 +6821,8 @@
       <w:r>
         <w:t>Security</w:t>
       </w:r>
+      <w:bookmarkStart w:id="0" w:name="_GoBack"/>
+      <w:bookmarkEnd w:id="0"/>
     </w:p>
     <w:p>
       <w:pPr>
@@ -6897,7 +6882,405 @@
           <w:sz w:val="22"/>
           <w:szCs w:val="22"/>
         </w:rPr>
-        <w:t>&lt;reports&gt;</w:t>
+        <w:t xml:space="preserve">{% for se in </w:t>
+      </w:r>
+      <w:proofErr w:type="spellStart"/>
+      <w:r>
+        <w:rPr>
+          <w:rFonts w:ascii="Cambria" w:hAnsi="Cambria"/>
+          <w:bCs w:val="0"/>
+          <w:color w:val="000000"/>
+          <w:sz w:val="22"/>
+          <w:szCs w:val="22"/>
+        </w:rPr>
+        <w:t>security_events</w:t>
+      </w:r>
+      <w:proofErr w:type="spellEnd"/>
+      <w:r>
+        <w:rPr>
+          <w:rFonts w:ascii="Cambria" w:hAnsi="Cambria"/>
+          <w:bCs w:val="0"/>
+          <w:color w:val="000000"/>
+          <w:sz w:val="22"/>
+          <w:szCs w:val="22"/>
+        </w:rPr>
+        <w:t xml:space="preserve"> %}</w:t>
+      </w:r>
+    </w:p>
+    <w:p>
+      <w:pPr>
+        <w:shd w:val="clear" w:color="auto" w:fill="E2EFD9" w:themeFill="accent6" w:themeFillTint="33"/>
+        <w:tabs>
+          <w:tab w:val="clear" w:pos="2940"/>
+          <w:tab w:val="right" w:pos="9360"/>
+        </w:tabs>
+        <w:spacing w:before="0" w:beforeAutospacing="0" w:after="0"/>
+        <w:rPr>
+          <w:rFonts w:ascii="Cambria" w:hAnsi="Cambria"/>
+          <w:bCs w:val="0"/>
+          <w:color w:val="000000"/>
+          <w:sz w:val="22"/>
+          <w:szCs w:val="22"/>
+        </w:rPr>
+      </w:pPr>
+      <w:proofErr w:type="gramStart"/>
+      <w:r>
+        <w:rPr>
+          <w:rFonts w:ascii="Cambria" w:hAnsi="Cambria"/>
+          <w:b/>
+          <w:bCs w:val="0"/>
+          <w:color w:val="000000"/>
+          <w:sz w:val="22"/>
+          <w:szCs w:val="22"/>
+        </w:rPr>
+        <w:t xml:space="preserve">{{ </w:t>
+      </w:r>
+      <w:proofErr w:type="spellStart"/>
+      <w:r>
+        <w:rPr>
+          <w:rFonts w:ascii="Cambria" w:hAnsi="Cambria"/>
+          <w:b/>
+          <w:bCs w:val="0"/>
+          <w:color w:val="000000"/>
+          <w:sz w:val="22"/>
+          <w:szCs w:val="22"/>
+        </w:rPr>
+        <w:t>se</w:t>
+      </w:r>
+      <w:proofErr w:type="gramEnd"/>
+      <w:r>
+        <w:rPr>
+          <w:rFonts w:ascii="Cambria" w:hAnsi="Cambria"/>
+          <w:b/>
+          <w:bCs w:val="0"/>
+          <w:color w:val="000000"/>
+          <w:sz w:val="22"/>
+          <w:szCs w:val="22"/>
+        </w:rPr>
+        <w:t>.event_name</w:t>
+      </w:r>
+      <w:proofErr w:type="spellEnd"/>
+      <w:r>
+        <w:rPr>
+          <w:rFonts w:ascii="Cambria" w:hAnsi="Cambria"/>
+          <w:b/>
+          <w:bCs w:val="0"/>
+          <w:color w:val="000000"/>
+          <w:sz w:val="22"/>
+          <w:szCs w:val="22"/>
+        </w:rPr>
+        <w:t>}}:</w:t>
+      </w:r>
+      <w:r>
+        <w:rPr>
+          <w:rFonts w:ascii="Cambria" w:hAnsi="Cambria"/>
+          <w:bCs w:val="0"/>
+          <w:color w:val="000000"/>
+          <w:sz w:val="22"/>
+          <w:szCs w:val="22"/>
+        </w:rPr>
+        <w:t xml:space="preserve"> </w:t>
+      </w:r>
+      <w:r>
+        <w:rPr>
+          <w:rFonts w:ascii="Cambria" w:hAnsi="Cambria"/>
+          <w:bCs w:val="0"/>
+          <w:color w:val="000000"/>
+          <w:sz w:val="22"/>
+          <w:szCs w:val="22"/>
+        </w:rPr>
+        <w:t xml:space="preserve">{{ </w:t>
+      </w:r>
+      <w:proofErr w:type="spellStart"/>
+      <w:r>
+        <w:rPr>
+          <w:rFonts w:ascii="Cambria" w:hAnsi="Cambria"/>
+          <w:bCs w:val="0"/>
+          <w:color w:val="000000"/>
+          <w:sz w:val="22"/>
+          <w:szCs w:val="22"/>
+        </w:rPr>
+        <w:t>se.</w:t>
+      </w:r>
+      <w:r>
+        <w:rPr>
+          <w:rFonts w:ascii="Cambria" w:hAnsi="Cambria"/>
+          <w:bCs w:val="0"/>
+          <w:color w:val="000000"/>
+          <w:sz w:val="22"/>
+          <w:szCs w:val="22"/>
+        </w:rPr>
+        <w:t>message</w:t>
+      </w:r>
+      <w:proofErr w:type="spellEnd"/>
+      <w:r>
+        <w:rPr>
+          <w:rFonts w:ascii="Cambria" w:hAnsi="Cambria"/>
+          <w:bCs w:val="0"/>
+          <w:color w:val="000000"/>
+          <w:sz w:val="22"/>
+          <w:szCs w:val="22"/>
+        </w:rPr>
+        <w:t xml:space="preserve"> }}</w:t>
+      </w:r>
+      <w:r>
+        <w:rPr>
+          <w:rFonts w:ascii="Cambria" w:hAnsi="Cambria"/>
+          <w:bCs w:val="0"/>
+          <w:color w:val="000000"/>
+          <w:sz w:val="22"/>
+          <w:szCs w:val="22"/>
+        </w:rPr>
+        <w:tab/>
+        <w:t xml:space="preserve">{{ </w:t>
+      </w:r>
+      <w:proofErr w:type="spellStart"/>
+      <w:r>
+        <w:rPr>
+          <w:rFonts w:ascii="Cambria" w:hAnsi="Cambria"/>
+          <w:bCs w:val="0"/>
+          <w:color w:val="000000"/>
+          <w:sz w:val="22"/>
+          <w:szCs w:val="22"/>
+        </w:rPr>
+        <w:t>se.event_time</w:t>
+      </w:r>
+      <w:proofErr w:type="spellEnd"/>
+      <w:r>
+        <w:rPr>
+          <w:rFonts w:ascii="Cambria" w:hAnsi="Cambria"/>
+          <w:bCs w:val="0"/>
+          <w:color w:val="000000"/>
+          <w:sz w:val="22"/>
+          <w:szCs w:val="22"/>
+        </w:rPr>
+        <w:t>}}</w:t>
+      </w:r>
+    </w:p>
+    <w:p>
+      <w:pPr>
+        <w:tabs>
+          <w:tab w:val="clear" w:pos="2940"/>
+          <w:tab w:val="right" w:pos="9360"/>
+        </w:tabs>
+        <w:spacing w:before="0" w:beforeAutospacing="0" w:after="0"/>
+        <w:ind w:left="1080" w:hanging="360"/>
+        <w:rPr>
+          <w:rFonts w:ascii="Cambria" w:hAnsi="Cambria"/>
+          <w:bCs w:val="0"/>
+          <w:color w:val="000000"/>
+          <w:sz w:val="22"/>
+          <w:szCs w:val="22"/>
+        </w:rPr>
+      </w:pPr>
+      <w:r>
+        <w:rPr>
+          <w:rFonts w:ascii="Cambria" w:hAnsi="Cambria"/>
+          <w:bCs w:val="0"/>
+          <w:color w:val="000000"/>
+          <w:sz w:val="22"/>
+          <w:szCs w:val="22"/>
+        </w:rPr>
+        <w:t xml:space="preserve">{% </w:t>
+      </w:r>
+      <w:r>
+        <w:rPr>
+          <w:rFonts w:ascii="Cambria" w:hAnsi="Cambria"/>
+          <w:bCs w:val="0"/>
+          <w:color w:val="000000"/>
+          <w:sz w:val="22"/>
+          <w:szCs w:val="22"/>
+        </w:rPr>
+        <w:t xml:space="preserve">for </w:t>
+      </w:r>
+      <w:proofErr w:type="spellStart"/>
+      <w:r>
+        <w:rPr>
+          <w:rFonts w:ascii="Cambria" w:hAnsi="Cambria"/>
+          <w:bCs w:val="0"/>
+          <w:color w:val="000000"/>
+          <w:sz w:val="22"/>
+          <w:szCs w:val="22"/>
+        </w:rPr>
+        <w:t>att</w:t>
+      </w:r>
+      <w:proofErr w:type="spellEnd"/>
+      <w:r>
+        <w:rPr>
+          <w:rFonts w:ascii="Cambria" w:hAnsi="Cambria"/>
+          <w:bCs w:val="0"/>
+          <w:color w:val="000000"/>
+          <w:sz w:val="22"/>
+          <w:szCs w:val="22"/>
+        </w:rPr>
+        <w:t xml:space="preserve"> in </w:t>
+      </w:r>
+      <w:proofErr w:type="spellStart"/>
+      <w:proofErr w:type="gramStart"/>
+      <w:r>
+        <w:rPr>
+          <w:rFonts w:ascii="Cambria" w:hAnsi="Cambria"/>
+          <w:bCs w:val="0"/>
+          <w:color w:val="000000"/>
+          <w:sz w:val="22"/>
+          <w:szCs w:val="22"/>
+        </w:rPr>
+        <w:t>se.attributes</w:t>
+      </w:r>
+      <w:proofErr w:type="spellEnd"/>
+      <w:proofErr w:type="gramEnd"/>
+      <w:r>
+        <w:rPr>
+          <w:rFonts w:ascii="Cambria" w:hAnsi="Cambria"/>
+          <w:bCs w:val="0"/>
+          <w:color w:val="000000"/>
+          <w:sz w:val="22"/>
+          <w:szCs w:val="22"/>
+        </w:rPr>
+        <w:t xml:space="preserve"> %}</w:t>
+      </w:r>
+      <w:r>
+        <w:rPr>
+          <w:rFonts w:ascii="Cambria" w:hAnsi="Cambria"/>
+          <w:b/>
+          <w:bCs w:val="0"/>
+          <w:color w:val="000000"/>
+          <w:sz w:val="22"/>
+          <w:szCs w:val="22"/>
+        </w:rPr>
+        <w:t>{{att.name}}:</w:t>
+      </w:r>
+      <w:r>
+        <w:rPr>
+          <w:rFonts w:ascii="Cambria" w:hAnsi="Cambria"/>
+          <w:bCs w:val="0"/>
+          <w:color w:val="000000"/>
+          <w:sz w:val="22"/>
+          <w:szCs w:val="22"/>
+        </w:rPr>
+        <w:t xml:space="preserve"> {{</w:t>
+      </w:r>
+      <w:proofErr w:type="spellStart"/>
+      <w:r>
+        <w:rPr>
+          <w:rFonts w:ascii="Cambria" w:hAnsi="Cambria"/>
+          <w:bCs w:val="0"/>
+          <w:color w:val="000000"/>
+          <w:sz w:val="22"/>
+          <w:szCs w:val="22"/>
+        </w:rPr>
+        <w:t>att.value</w:t>
+      </w:r>
+      <w:proofErr w:type="spellEnd"/>
+      <w:r>
+        <w:rPr>
+          <w:rFonts w:ascii="Cambria" w:hAnsi="Cambria"/>
+          <w:bCs w:val="0"/>
+          <w:color w:val="000000"/>
+          <w:sz w:val="22"/>
+          <w:szCs w:val="22"/>
+        </w:rPr>
+        <w:t>}}</w:t>
+      </w:r>
+    </w:p>
+    <w:p>
+      <w:pPr>
+        <w:tabs>
+          <w:tab w:val="clear" w:pos="2940"/>
+          <w:tab w:val="right" w:pos="9360"/>
+        </w:tabs>
+        <w:spacing w:before="0" w:beforeAutospacing="0" w:after="0"/>
+        <w:ind w:left="720"/>
+        <w:rPr>
+          <w:rFonts w:ascii="Cambria" w:hAnsi="Cambria"/>
+          <w:bCs w:val="0"/>
+          <w:color w:val="000000"/>
+          <w:sz w:val="22"/>
+          <w:szCs w:val="22"/>
+        </w:rPr>
+      </w:pPr>
+      <w:r>
+        <w:rPr>
+          <w:rFonts w:ascii="Cambria" w:hAnsi="Cambria"/>
+          <w:b/>
+          <w:bCs w:val="0"/>
+          <w:color w:val="000000"/>
+          <w:sz w:val="22"/>
+          <w:szCs w:val="22"/>
+        </w:rPr>
+        <w:t xml:space="preserve">{% </w:t>
+      </w:r>
+      <w:proofErr w:type="spellStart"/>
+      <w:r>
+        <w:rPr>
+          <w:rFonts w:ascii="Cambria" w:hAnsi="Cambria"/>
+          <w:b/>
+          <w:bCs w:val="0"/>
+          <w:color w:val="000000"/>
+          <w:sz w:val="22"/>
+          <w:szCs w:val="22"/>
+        </w:rPr>
+        <w:t>endfor</w:t>
+      </w:r>
+      <w:proofErr w:type="spellEnd"/>
+      <w:r>
+        <w:rPr>
+          <w:rFonts w:ascii="Cambria" w:hAnsi="Cambria"/>
+          <w:b/>
+          <w:bCs w:val="0"/>
+          <w:color w:val="000000"/>
+          <w:sz w:val="22"/>
+          <w:szCs w:val="22"/>
+        </w:rPr>
+        <w:t xml:space="preserve"> %}</w:t>
+      </w:r>
+    </w:p>
+    <w:p>
+      <w:pPr>
+        <w:tabs>
+          <w:tab w:val="clear" w:pos="2940"/>
+          <w:tab w:val="center" w:pos="995"/>
+        </w:tabs>
+        <w:spacing w:before="0" w:beforeAutospacing="0" w:after="0"/>
+        <w:rPr>
+          <w:rFonts w:ascii="Cambria" w:hAnsi="Cambria"/>
+          <w:bCs w:val="0"/>
+          <w:color w:val="000000"/>
+          <w:sz w:val="22"/>
+          <w:szCs w:val="22"/>
+        </w:rPr>
+      </w:pPr>
+      <w:r>
+        <w:rPr>
+          <w:rFonts w:ascii="Cambria" w:hAnsi="Cambria"/>
+          <w:bCs w:val="0"/>
+          <w:color w:val="000000"/>
+          <w:sz w:val="22"/>
+          <w:szCs w:val="22"/>
+        </w:rPr>
+        <w:t xml:space="preserve">{% </w:t>
+      </w:r>
+      <w:proofErr w:type="spellStart"/>
+      <w:r>
+        <w:rPr>
+          <w:rFonts w:ascii="Cambria" w:hAnsi="Cambria"/>
+          <w:bCs w:val="0"/>
+          <w:color w:val="000000"/>
+          <w:sz w:val="22"/>
+          <w:szCs w:val="22"/>
+        </w:rPr>
+        <w:t>endfor</w:t>
+      </w:r>
+      <w:proofErr w:type="spellEnd"/>
+      <w:r>
+        <w:rPr>
+          <w:rFonts w:ascii="Cambria" w:hAnsi="Cambria"/>
+          <w:bCs w:val="0"/>
+          <w:color w:val="000000"/>
+          <w:sz w:val="22"/>
+          <w:szCs w:val="22"/>
+        </w:rPr>
+        <w:t xml:space="preserve"> %}</w:t>
       </w:r>
     </w:p>
     <w:p>
@@ -8488,7 +8871,7 @@
   <w:abstractNum w:abstractNumId="0">
     <w:nsid w:val="FFFFFF1D"/>
     <w:multiLevelType w:val="multilevel"/>
-    <w:tmpl w:val="588A3FD8"/>
+    <w:tmpl w:val="21AC34A8"/>
     <w:lvl w:ilvl="0">
       <w:start w:val="1"/>
       <w:numFmt w:val="bullet"/>
@@ -10582,7 +10965,7 @@
 </file>
 
 <file path=customXml/itemProps3.xml><?xml version="1.0" encoding="utf-8"?>
-<ds:datastoreItem xmlns:ds="http://schemas.openxmlformats.org/officeDocument/2006/customXml" ds:itemID="{92809E92-A2FC-F643-87CD-6268055D5DC4}">
+<ds:datastoreItem xmlns:ds="http://schemas.openxmlformats.org/officeDocument/2006/customXml" ds:itemID="{EE568C64-25A2-6E45-B015-4E5FF7E73732}">
   <ds:schemaRefs>
     <ds:schemaRef ds:uri="http://schemas.openxmlformats.org/officeDocument/2006/bibliography"/>
   </ds:schemaRefs>

</xml_diff>

<commit_message>
Sit-rep report to handle lists and individual items in event_details.
</commit_message>
<xml_diff>
--- a/das/reports/docx_template/lewa_sitrep_template.docx
+++ b/das/reports/docx_template/lewa_sitrep_template.docx
@@ -17,6 +17,7 @@
       <w:r>
         <w:t xml:space="preserve"> </w:t>
       </w:r>
+      <w:proofErr w:type="spellStart"/>
       <w:r>
         <w:t>Sit</w:t>
       </w:r>
@@ -26,12 +27,18 @@
       <w:r>
         <w:t>ep</w:t>
       </w:r>
+      <w:proofErr w:type="spellEnd"/>
       <w:r>
         <w:tab/>
       </w:r>
       <w:r>
-        <w:t>{{report_time</w:t>
-      </w:r>
+        <w:t>{{</w:t>
+      </w:r>
+      <w:proofErr w:type="spellStart"/>
+      <w:r>
+        <w:t>report_time</w:t>
+      </w:r>
+      <w:proofErr w:type="spellEnd"/>
       <w:r>
         <w:t>}}</w:t>
       </w:r>
@@ -46,14 +53,45 @@
           <w:szCs w:val="22"/>
         </w:rPr>
       </w:pPr>
-      <w:r>
-        <w:rPr>
-          <w:rFonts w:ascii="Cambria" w:hAnsi="Cambria"/>
-          <w:color w:val="000000"/>
-          <w:sz w:val="22"/>
-          <w:szCs w:val="22"/>
-        </w:rPr>
-        <w:t>{{ report_daterange_text }}</w:t>
+      <w:proofErr w:type="gramStart"/>
+      <w:r>
+        <w:rPr>
+          <w:rFonts w:ascii="Cambria" w:hAnsi="Cambria"/>
+          <w:color w:val="000000"/>
+          <w:sz w:val="22"/>
+          <w:szCs w:val="22"/>
+        </w:rPr>
+        <w:t xml:space="preserve">{{ </w:t>
+      </w:r>
+      <w:proofErr w:type="spellStart"/>
+      <w:r>
+        <w:rPr>
+          <w:rFonts w:ascii="Cambria" w:hAnsi="Cambria"/>
+          <w:color w:val="000000"/>
+          <w:sz w:val="22"/>
+          <w:szCs w:val="22"/>
+        </w:rPr>
+        <w:t>report</w:t>
+      </w:r>
+      <w:proofErr w:type="gramEnd"/>
+      <w:r>
+        <w:rPr>
+          <w:rFonts w:ascii="Cambria" w:hAnsi="Cambria"/>
+          <w:color w:val="000000"/>
+          <w:sz w:val="22"/>
+          <w:szCs w:val="22"/>
+        </w:rPr>
+        <w:t>_daterange_text</w:t>
+      </w:r>
+      <w:proofErr w:type="spellEnd"/>
+      <w:r>
+        <w:rPr>
+          <w:rFonts w:ascii="Cambria" w:hAnsi="Cambria"/>
+          <w:color w:val="000000"/>
+          <w:sz w:val="22"/>
+          <w:szCs w:val="22"/>
+        </w:rPr>
+        <w:t xml:space="preserve"> }}</w:t>
       </w:r>
     </w:p>
     <w:p>
@@ -75,14 +113,43 @@
         </w:rPr>
       </w:pPr>
       <w:r>
-        <w:t>{% if wildlife_sightings %}</w:t>
-      </w:r>
-      <w:r>
-        <w:t>{% for ws in wildlife_sighting</w:t>
+        <w:t xml:space="preserve">{% if </w:t>
+      </w:r>
+      <w:proofErr w:type="spellStart"/>
+      <w:r>
+        <w:t>wildlife_sightings</w:t>
+      </w:r>
+      <w:proofErr w:type="spellEnd"/>
+      <w:r>
+        <w:t xml:space="preserve"> </w:t>
+      </w:r>
+      <w:proofErr w:type="gramStart"/>
+      <w:r>
+        <w:t>%}</w:t>
+      </w:r>
+      <w:r>
+        <w:t>{</w:t>
+      </w:r>
+      <w:proofErr w:type="gramEnd"/>
+      <w:r>
+        <w:t xml:space="preserve">% for </w:t>
+      </w:r>
+      <w:proofErr w:type="spellStart"/>
+      <w:r>
+        <w:t>ws</w:t>
+      </w:r>
+      <w:proofErr w:type="spellEnd"/>
+      <w:r>
+        <w:t xml:space="preserve"> in </w:t>
+      </w:r>
+      <w:proofErr w:type="spellStart"/>
+      <w:r>
+        <w:t>wildlife_sighting</w:t>
       </w:r>
       <w:r>
         <w:t>s</w:t>
       </w:r>
+      <w:proofErr w:type="spellEnd"/>
       <w:r>
         <w:t xml:space="preserve"> %}</w:t>
       </w:r>
@@ -130,8 +197,9 @@
           <w:sz w:val="22"/>
           <w:szCs w:val="22"/>
         </w:rPr>
-        <w:t>{{ws.</w:t>
-      </w:r>
+        <w:t>{{</w:t>
+      </w:r>
+      <w:proofErr w:type="spellStart"/>
       <w:r>
         <w:rPr>
           <w:rFonts w:ascii="Cambria" w:hAnsi="Cambria"/>
@@ -139,8 +207,18 @@
           <w:sz w:val="22"/>
           <w:szCs w:val="22"/>
         </w:rPr>
+        <w:t>ws.</w:t>
+      </w:r>
+      <w:r>
+        <w:rPr>
+          <w:rFonts w:ascii="Cambria" w:hAnsi="Cambria"/>
+          <w:b/>
+          <w:sz w:val="22"/>
+          <w:szCs w:val="22"/>
+        </w:rPr>
         <w:t>conservancy</w:t>
       </w:r>
+      <w:proofErr w:type="spellEnd"/>
       <w:r>
         <w:rPr>
           <w:rFonts w:ascii="Cambria" w:hAnsi="Cambria"/>
@@ -177,6 +255,7 @@
         </w:rPr>
         <w:t>{{</w:t>
       </w:r>
+      <w:proofErr w:type="spellStart"/>
       <w:r>
         <w:rPr>
           <w:rFonts w:ascii="Cambria" w:hAnsi="Cambria"/>
@@ -193,8 +272,9 @@
           <w:sz w:val="22"/>
           <w:szCs w:val="22"/>
         </w:rPr>
-        <w:t>total_rhino_black}}</w:t>
-      </w:r>
+        <w:t>total_rhino_black</w:t>
+      </w:r>
+      <w:proofErr w:type="spellEnd"/>
       <w:r>
         <w:rPr>
           <w:rFonts w:ascii="Cambria" w:hAnsi="Cambria"/>
@@ -202,6 +282,15 @@
           <w:sz w:val="22"/>
           <w:szCs w:val="22"/>
         </w:rPr>
+        <w:t>}}</w:t>
+      </w:r>
+      <w:r>
+        <w:rPr>
+          <w:rFonts w:ascii="Cambria" w:hAnsi="Cambria"/>
+          <w:b/>
+          <w:sz w:val="22"/>
+          <w:szCs w:val="22"/>
+        </w:rPr>
         <w:t>;</w:t>
       </w:r>
       <w:r>
@@ -231,6 +320,7 @@
         </w:rPr>
         <w:t>{{</w:t>
       </w:r>
+      <w:proofErr w:type="spellStart"/>
       <w:r>
         <w:rPr>
           <w:rFonts w:ascii="Cambria" w:hAnsi="Cambria"/>
@@ -249,6 +339,7 @@
         </w:rPr>
         <w:t>total_rhino_white</w:t>
       </w:r>
+      <w:proofErr w:type="spellEnd"/>
       <w:r>
         <w:rPr>
           <w:rFonts w:ascii="Cambria" w:hAnsi="Cambria"/>
@@ -333,7 +424,51 @@
                 <w:sz w:val="22"/>
                 <w:szCs w:val="22"/>
               </w:rPr>
-              <w:t>{%tr for item in ws.rhino_sightings %}</w:t>
+              <w:t>{%</w:t>
+            </w:r>
+            <w:proofErr w:type="spellStart"/>
+            <w:r>
+              <w:rPr>
+                <w:rFonts w:ascii="Cambria" w:hAnsi="Cambria"/>
+                <w:b w:val="0"/>
+                <w:color w:val="000000"/>
+                <w:sz w:val="22"/>
+                <w:szCs w:val="22"/>
+              </w:rPr>
+              <w:t>tr</w:t>
+            </w:r>
+            <w:proofErr w:type="spellEnd"/>
+            <w:r>
+              <w:rPr>
+                <w:rFonts w:ascii="Cambria" w:hAnsi="Cambria"/>
+                <w:b w:val="0"/>
+                <w:color w:val="000000"/>
+                <w:sz w:val="22"/>
+                <w:szCs w:val="22"/>
+              </w:rPr>
+              <w:t xml:space="preserve"> for item in </w:t>
+            </w:r>
+            <w:proofErr w:type="spellStart"/>
+            <w:r>
+              <w:rPr>
+                <w:rFonts w:ascii="Cambria" w:hAnsi="Cambria"/>
+                <w:b w:val="0"/>
+                <w:color w:val="000000"/>
+                <w:sz w:val="22"/>
+                <w:szCs w:val="22"/>
+              </w:rPr>
+              <w:t>ws.rhino_sightings</w:t>
+            </w:r>
+            <w:proofErr w:type="spellEnd"/>
+            <w:r>
+              <w:rPr>
+                <w:rFonts w:ascii="Cambria" w:hAnsi="Cambria"/>
+                <w:b w:val="0"/>
+                <w:color w:val="000000"/>
+                <w:sz w:val="22"/>
+                <w:szCs w:val="22"/>
+              </w:rPr>
+              <w:t xml:space="preserve"> %}</w:t>
             </w:r>
           </w:p>
         </w:tc>
@@ -389,7 +524,29 @@
                 <w:sz w:val="22"/>
                 <w:szCs w:val="22"/>
               </w:rPr>
-              <w:t>{{item.type}}</w:t>
+              <w:t>{{</w:t>
+            </w:r>
+            <w:proofErr w:type="spellStart"/>
+            <w:r>
+              <w:rPr>
+                <w:rFonts w:ascii="Cambria" w:hAnsi="Cambria"/>
+                <w:b w:val="0"/>
+                <w:color w:val="000000"/>
+                <w:sz w:val="22"/>
+                <w:szCs w:val="22"/>
+              </w:rPr>
+              <w:t>item.type</w:t>
+            </w:r>
+            <w:proofErr w:type="spellEnd"/>
+            <w:r>
+              <w:rPr>
+                <w:rFonts w:ascii="Cambria" w:hAnsi="Cambria"/>
+                <w:b w:val="0"/>
+                <w:color w:val="000000"/>
+                <w:sz w:val="22"/>
+                <w:szCs w:val="22"/>
+              </w:rPr>
+              <w:t>}}</w:t>
             </w:r>
           </w:p>
         </w:tc>
@@ -420,17 +577,48 @@
                 <w:sz w:val="22"/>
                 <w:szCs w:val="22"/>
               </w:rPr>
-              <w:t>{{item.count}}</w:t>
-            </w:r>
-            <w:r>
-              <w:rPr>
-                <w:rFonts w:ascii="Cambria" w:hAnsi="Cambria"/>
-                <w:color w:val="000000"/>
-                <w:sz w:val="22"/>
-                <w:szCs w:val="22"/>
-              </w:rPr>
-              <w:t xml:space="preserve"> {%if item.percentage</w:t>
-            </w:r>
+              <w:t>{{</w:t>
+            </w:r>
+            <w:proofErr w:type="spellStart"/>
+            <w:r>
+              <w:rPr>
+                <w:rFonts w:ascii="Cambria" w:hAnsi="Cambria"/>
+                <w:color w:val="000000"/>
+                <w:sz w:val="22"/>
+                <w:szCs w:val="22"/>
+              </w:rPr>
+              <w:t>item.count</w:t>
+            </w:r>
+            <w:proofErr w:type="spellEnd"/>
+            <w:r>
+              <w:rPr>
+                <w:rFonts w:ascii="Cambria" w:hAnsi="Cambria"/>
+                <w:color w:val="000000"/>
+                <w:sz w:val="22"/>
+                <w:szCs w:val="22"/>
+              </w:rPr>
+              <w:t>}}</w:t>
+            </w:r>
+            <w:r>
+              <w:rPr>
+                <w:rFonts w:ascii="Cambria" w:hAnsi="Cambria"/>
+                <w:color w:val="000000"/>
+                <w:sz w:val="22"/>
+                <w:szCs w:val="22"/>
+              </w:rPr>
+              <w:t xml:space="preserve"> {%if </w:t>
+            </w:r>
+            <w:proofErr w:type="spellStart"/>
+            <w:r>
+              <w:rPr>
+                <w:rFonts w:ascii="Cambria" w:hAnsi="Cambria"/>
+                <w:color w:val="000000"/>
+                <w:sz w:val="22"/>
+                <w:szCs w:val="22"/>
+              </w:rPr>
+              <w:t>item.percentage</w:t>
+            </w:r>
+            <w:proofErr w:type="spellEnd"/>
             <w:r>
               <w:rPr>
                 <w:rFonts w:ascii="Cambria" w:hAnsi="Cambria"/>
@@ -456,16 +644,56 @@
                 <w:sz w:val="22"/>
                 <w:szCs w:val="22"/>
               </w:rPr>
-              <w:t xml:space="preserve"> ({{ item.percentage}})</w:t>
-            </w:r>
-            <w:r>
-              <w:rPr>
-                <w:rFonts w:ascii="Cambria" w:hAnsi="Cambria"/>
-                <w:color w:val="000000"/>
-                <w:sz w:val="22"/>
-                <w:szCs w:val="22"/>
-              </w:rPr>
-              <w:t>{%endif%}</w:t>
+              <w:t xml:space="preserve"> ({{ </w:t>
+            </w:r>
+            <w:proofErr w:type="spellStart"/>
+            <w:r>
+              <w:rPr>
+                <w:rFonts w:ascii="Cambria" w:hAnsi="Cambria"/>
+                <w:color w:val="000000"/>
+                <w:sz w:val="22"/>
+                <w:szCs w:val="22"/>
+              </w:rPr>
+              <w:t>item.percentage</w:t>
+            </w:r>
+            <w:proofErr w:type="spellEnd"/>
+            <w:r>
+              <w:rPr>
+                <w:rFonts w:ascii="Cambria" w:hAnsi="Cambria"/>
+                <w:color w:val="000000"/>
+                <w:sz w:val="22"/>
+                <w:szCs w:val="22"/>
+              </w:rPr>
+              <w:t>}})</w:t>
+            </w:r>
+            <w:r>
+              <w:rPr>
+                <w:rFonts w:ascii="Cambria" w:hAnsi="Cambria"/>
+                <w:color w:val="000000"/>
+                <w:sz w:val="22"/>
+                <w:szCs w:val="22"/>
+              </w:rPr>
+              <w:t>{%</w:t>
+            </w:r>
+            <w:proofErr w:type="spellStart"/>
+            <w:r>
+              <w:rPr>
+                <w:rFonts w:ascii="Cambria" w:hAnsi="Cambria"/>
+                <w:color w:val="000000"/>
+                <w:sz w:val="22"/>
+                <w:szCs w:val="22"/>
+              </w:rPr>
+              <w:t>endif</w:t>
+            </w:r>
+            <w:proofErr w:type="spellEnd"/>
+            <w:r>
+              <w:rPr>
+                <w:rFonts w:ascii="Cambria" w:hAnsi="Cambria"/>
+                <w:color w:val="000000"/>
+                <w:sz w:val="22"/>
+                <w:szCs w:val="22"/>
+              </w:rPr>
+              <w:t>%}</w:t>
             </w:r>
             <w:r>
               <w:rPr>
@@ -511,17 +739,61 @@
                 <w:sz w:val="22"/>
                 <w:szCs w:val="22"/>
               </w:rPr>
-              <w:t>{%tr end</w:t>
-            </w:r>
-            <w:r>
-              <w:rPr>
-                <w:rFonts w:ascii="Cambria" w:hAnsi="Cambria"/>
-                <w:b w:val="0"/>
-                <w:color w:val="000000"/>
-                <w:sz w:val="22"/>
-                <w:szCs w:val="22"/>
-              </w:rPr>
-              <w:t>for %}</w:t>
+              <w:t>{%</w:t>
+            </w:r>
+            <w:proofErr w:type="spellStart"/>
+            <w:r>
+              <w:rPr>
+                <w:rFonts w:ascii="Cambria" w:hAnsi="Cambria"/>
+                <w:b w:val="0"/>
+                <w:color w:val="000000"/>
+                <w:sz w:val="22"/>
+                <w:szCs w:val="22"/>
+              </w:rPr>
+              <w:t>tr</w:t>
+            </w:r>
+            <w:proofErr w:type="spellEnd"/>
+            <w:r>
+              <w:rPr>
+                <w:rFonts w:ascii="Cambria" w:hAnsi="Cambria"/>
+                <w:b w:val="0"/>
+                <w:color w:val="000000"/>
+                <w:sz w:val="22"/>
+                <w:szCs w:val="22"/>
+              </w:rPr>
+              <w:t xml:space="preserve"> </w:t>
+            </w:r>
+            <w:proofErr w:type="spellStart"/>
+            <w:r>
+              <w:rPr>
+                <w:rFonts w:ascii="Cambria" w:hAnsi="Cambria"/>
+                <w:b w:val="0"/>
+                <w:color w:val="000000"/>
+                <w:sz w:val="22"/>
+                <w:szCs w:val="22"/>
+              </w:rPr>
+              <w:t>end</w:t>
+            </w:r>
+            <w:r>
+              <w:rPr>
+                <w:rFonts w:ascii="Cambria" w:hAnsi="Cambria"/>
+                <w:b w:val="0"/>
+                <w:color w:val="000000"/>
+                <w:sz w:val="22"/>
+                <w:szCs w:val="22"/>
+              </w:rPr>
+              <w:t>for</w:t>
+            </w:r>
+            <w:proofErr w:type="spellEnd"/>
+            <w:r>
+              <w:rPr>
+                <w:rFonts w:ascii="Cambria" w:hAnsi="Cambria"/>
+                <w:b w:val="0"/>
+                <w:color w:val="000000"/>
+                <w:sz w:val="22"/>
+                <w:szCs w:val="22"/>
+              </w:rPr>
+              <w:t xml:space="preserve"> %}</w:t>
             </w:r>
           </w:p>
         </w:tc>
@@ -610,16 +882,56 @@
                 <w:sz w:val="22"/>
                 <w:szCs w:val="22"/>
               </w:rPr>
-              <w:t>{{ws.total_sightings}}</w:t>
-            </w:r>
-            <w:r>
-              <w:rPr>
-                <w:rFonts w:ascii="Cambria" w:hAnsi="Cambria"/>
-                <w:color w:val="000000"/>
-                <w:sz w:val="22"/>
-                <w:szCs w:val="22"/>
-              </w:rPr>
-              <w:t xml:space="preserve"> ({{ ws.percentage }})</w:t>
+              <w:t>{{</w:t>
+            </w:r>
+            <w:proofErr w:type="spellStart"/>
+            <w:r>
+              <w:rPr>
+                <w:rFonts w:ascii="Cambria" w:hAnsi="Cambria"/>
+                <w:color w:val="000000"/>
+                <w:sz w:val="22"/>
+                <w:szCs w:val="22"/>
+              </w:rPr>
+              <w:t>ws.total_sightings</w:t>
+            </w:r>
+            <w:proofErr w:type="spellEnd"/>
+            <w:r>
+              <w:rPr>
+                <w:rFonts w:ascii="Cambria" w:hAnsi="Cambria"/>
+                <w:color w:val="000000"/>
+                <w:sz w:val="22"/>
+                <w:szCs w:val="22"/>
+              </w:rPr>
+              <w:t>}}</w:t>
+            </w:r>
+            <w:r>
+              <w:rPr>
+                <w:rFonts w:ascii="Cambria" w:hAnsi="Cambria"/>
+                <w:color w:val="000000"/>
+                <w:sz w:val="22"/>
+                <w:szCs w:val="22"/>
+              </w:rPr>
+              <w:t xml:space="preserve"> ({{ </w:t>
+            </w:r>
+            <w:proofErr w:type="spellStart"/>
+            <w:r>
+              <w:rPr>
+                <w:rFonts w:ascii="Cambria" w:hAnsi="Cambria"/>
+                <w:color w:val="000000"/>
+                <w:sz w:val="22"/>
+                <w:szCs w:val="22"/>
+              </w:rPr>
+              <w:t>ws.percentage</w:t>
+            </w:r>
+            <w:proofErr w:type="spellEnd"/>
+            <w:r>
+              <w:rPr>
+                <w:rFonts w:ascii="Cambria" w:hAnsi="Cambria"/>
+                <w:color w:val="000000"/>
+                <w:sz w:val="22"/>
+                <w:szCs w:val="22"/>
+              </w:rPr>
+              <w:t xml:space="preserve"> }})</w:t>
             </w:r>
           </w:p>
         </w:tc>
@@ -643,17 +955,61 @@
           <w:sz w:val="22"/>
           <w:szCs w:val="22"/>
         </w:rPr>
-        <w:t>{% endfor %}</w:t>
-      </w:r>
-      <w:r>
-        <w:rPr>
-          <w:rFonts w:ascii="Cambria" w:hAnsi="Cambria"/>
-          <w:bCs w:val="0"/>
-          <w:color w:val="000000"/>
-          <w:sz w:val="22"/>
-          <w:szCs w:val="22"/>
-        </w:rPr>
-        <w:t>{% else %}</w:t>
+        <w:t xml:space="preserve">{% </w:t>
+      </w:r>
+      <w:proofErr w:type="spellStart"/>
+      <w:r>
+        <w:rPr>
+          <w:rFonts w:ascii="Cambria" w:hAnsi="Cambria"/>
+          <w:bCs w:val="0"/>
+          <w:color w:val="000000"/>
+          <w:sz w:val="22"/>
+          <w:szCs w:val="22"/>
+        </w:rPr>
+        <w:t>endfor</w:t>
+      </w:r>
+      <w:proofErr w:type="spellEnd"/>
+      <w:r>
+        <w:rPr>
+          <w:rFonts w:ascii="Cambria" w:hAnsi="Cambria"/>
+          <w:bCs w:val="0"/>
+          <w:color w:val="000000"/>
+          <w:sz w:val="22"/>
+          <w:szCs w:val="22"/>
+        </w:rPr>
+        <w:t xml:space="preserve"> </w:t>
+      </w:r>
+      <w:proofErr w:type="gramStart"/>
+      <w:r>
+        <w:rPr>
+          <w:rFonts w:ascii="Cambria" w:hAnsi="Cambria"/>
+          <w:bCs w:val="0"/>
+          <w:color w:val="000000"/>
+          <w:sz w:val="22"/>
+          <w:szCs w:val="22"/>
+        </w:rPr>
+        <w:t>%}</w:t>
+      </w:r>
+      <w:r>
+        <w:rPr>
+          <w:rFonts w:ascii="Cambria" w:hAnsi="Cambria"/>
+          <w:bCs w:val="0"/>
+          <w:color w:val="000000"/>
+          <w:sz w:val="22"/>
+          <w:szCs w:val="22"/>
+        </w:rPr>
+        <w:t>{</w:t>
+      </w:r>
+      <w:proofErr w:type="gramEnd"/>
+      <w:r>
+        <w:rPr>
+          <w:rFonts w:ascii="Cambria" w:hAnsi="Cambria"/>
+          <w:bCs w:val="0"/>
+          <w:color w:val="000000"/>
+          <w:sz w:val="22"/>
+          <w:szCs w:val="22"/>
+        </w:rPr>
+        <w:t>% else %}</w:t>
       </w:r>
     </w:p>
     <w:p>
@@ -711,7 +1067,40 @@
           <w:sz w:val="22"/>
           <w:szCs w:val="22"/>
         </w:rPr>
-        <w:t>{% endif %}</w:t>
+        <w:t xml:space="preserve">{% </w:t>
+      </w:r>
+      <w:proofErr w:type="spellStart"/>
+      <w:r>
+        <w:rPr>
+          <w:rFonts w:ascii="Cambria" w:hAnsi="Cambria"/>
+          <w:bCs w:val="0"/>
+          <w:color w:val="000000"/>
+          <w:sz w:val="22"/>
+          <w:szCs w:val="22"/>
+        </w:rPr>
+        <w:t>endif</w:t>
+      </w:r>
+      <w:proofErr w:type="spellEnd"/>
+      <w:r>
+        <w:rPr>
+          <w:rFonts w:ascii="Cambria" w:hAnsi="Cambria"/>
+          <w:bCs w:val="0"/>
+          <w:color w:val="000000"/>
+          <w:sz w:val="22"/>
+          <w:szCs w:val="22"/>
+        </w:rPr>
+        <w:t xml:space="preserve"> </w:t>
+      </w:r>
+      <w:proofErr w:type="gramStart"/>
+      <w:r>
+        <w:rPr>
+          <w:rFonts w:ascii="Cambria" w:hAnsi="Cambria"/>
+          <w:bCs w:val="0"/>
+          <w:color w:val="000000"/>
+          <w:sz w:val="22"/>
+          <w:szCs w:val="22"/>
+        </w:rPr>
+        <w:t>%}</w:t>
       </w:r>
       <w:r>
         <w:rPr>
@@ -722,8 +1111,9 @@
           <w:sz w:val="22"/>
           <w:szCs w:val="22"/>
         </w:rPr>
-        <w:t>Rhino Birth:</w:t>
-      </w:r>
+        <w:t>Rhino</w:t>
+      </w:r>
+      <w:proofErr w:type="gramEnd"/>
       <w:r>
         <w:rPr>
           <w:rFonts w:ascii="Cambria" w:hAnsi="Cambria"/>
@@ -733,6 +1123,17 @@
           <w:sz w:val="22"/>
           <w:szCs w:val="22"/>
         </w:rPr>
+        <w:t xml:space="preserve"> Birth:</w:t>
+      </w:r>
+      <w:r>
+        <w:rPr>
+          <w:rFonts w:ascii="Cambria" w:hAnsi="Cambria"/>
+          <w:b/>
+          <w:bCs w:val="0"/>
+          <w:color w:val="000000"/>
+          <w:sz w:val="22"/>
+          <w:szCs w:val="22"/>
+        </w:rPr>
         <w:t xml:space="preserve"> </w:t>
       </w:r>
       <w:r>
@@ -744,7 +1145,31 @@
           <w:sz w:val="22"/>
           <w:szCs w:val="22"/>
         </w:rPr>
-        <w:t>{% if rhino_births %}</w:t>
+        <w:t xml:space="preserve">{% if </w:t>
+      </w:r>
+      <w:proofErr w:type="spellStart"/>
+      <w:r>
+        <w:rPr>
+          <w:rFonts w:ascii="Cambria" w:hAnsi="Cambria"/>
+          <w:b/>
+          <w:bCs w:val="0"/>
+          <w:color w:val="000000"/>
+          <w:sz w:val="22"/>
+          <w:szCs w:val="22"/>
+        </w:rPr>
+        <w:t>rhino_births</w:t>
+      </w:r>
+      <w:proofErr w:type="spellEnd"/>
+      <w:r>
+        <w:rPr>
+          <w:rFonts w:ascii="Cambria" w:hAnsi="Cambria"/>
+          <w:b/>
+          <w:bCs w:val="0"/>
+          <w:color w:val="000000"/>
+          <w:sz w:val="22"/>
+          <w:szCs w:val="22"/>
+        </w:rPr>
+        <w:t xml:space="preserve"> %}</w:t>
       </w:r>
     </w:p>
     <w:tbl>
@@ -913,7 +1338,51 @@
                 <w:sz w:val="22"/>
                 <w:szCs w:val="22"/>
               </w:rPr>
-              <w:t>{%tr for item in rhino_births %}</w:t>
+              <w:t>{%</w:t>
+            </w:r>
+            <w:proofErr w:type="spellStart"/>
+            <w:r>
+              <w:rPr>
+                <w:rFonts w:ascii="Cambria" w:hAnsi="Cambria"/>
+                <w:bCs w:val="0"/>
+                <w:color w:val="000000"/>
+                <w:sz w:val="22"/>
+                <w:szCs w:val="22"/>
+              </w:rPr>
+              <w:t>tr</w:t>
+            </w:r>
+            <w:proofErr w:type="spellEnd"/>
+            <w:r>
+              <w:rPr>
+                <w:rFonts w:ascii="Cambria" w:hAnsi="Cambria"/>
+                <w:bCs w:val="0"/>
+                <w:color w:val="000000"/>
+                <w:sz w:val="22"/>
+                <w:szCs w:val="22"/>
+              </w:rPr>
+              <w:t xml:space="preserve"> for item in </w:t>
+            </w:r>
+            <w:proofErr w:type="spellStart"/>
+            <w:r>
+              <w:rPr>
+                <w:rFonts w:ascii="Cambria" w:hAnsi="Cambria"/>
+                <w:bCs w:val="0"/>
+                <w:color w:val="000000"/>
+                <w:sz w:val="22"/>
+                <w:szCs w:val="22"/>
+              </w:rPr>
+              <w:t>rhino_births</w:t>
+            </w:r>
+            <w:proofErr w:type="spellEnd"/>
+            <w:r>
+              <w:rPr>
+                <w:rFonts w:ascii="Cambria" w:hAnsi="Cambria"/>
+                <w:bCs w:val="0"/>
+                <w:color w:val="000000"/>
+                <w:sz w:val="22"/>
+                <w:szCs w:val="22"/>
+              </w:rPr>
+              <w:t xml:space="preserve"> %}</w:t>
             </w:r>
           </w:p>
         </w:tc>
@@ -944,7 +1413,31 @@
                 <w:sz w:val="22"/>
                 <w:szCs w:val="22"/>
               </w:rPr>
-              <w:t>{{ item.conservancy }}</w:t>
+              <w:t xml:space="preserve">{{ </w:t>
+            </w:r>
+            <w:proofErr w:type="spellStart"/>
+            <w:r>
+              <w:rPr>
+                <w:rFonts w:ascii="Cambria" w:hAnsi="Cambria"/>
+                <w:b w:val="0"/>
+                <w:bCs/>
+                <w:color w:val="000000"/>
+                <w:sz w:val="22"/>
+                <w:szCs w:val="22"/>
+              </w:rPr>
+              <w:t>item.conservancy</w:t>
+            </w:r>
+            <w:proofErr w:type="spellEnd"/>
+            <w:r>
+              <w:rPr>
+                <w:rFonts w:ascii="Cambria" w:hAnsi="Cambria"/>
+                <w:b w:val="0"/>
+                <w:bCs/>
+                <w:color w:val="000000"/>
+                <w:sz w:val="22"/>
+                <w:szCs w:val="22"/>
+              </w:rPr>
+              <w:t xml:space="preserve"> }}</w:t>
             </w:r>
           </w:p>
         </w:tc>
@@ -971,7 +1464,29 @@
                 <w:sz w:val="22"/>
                 <w:szCs w:val="22"/>
               </w:rPr>
-              <w:t>{{ item.color }}</w:t>
+              <w:t xml:space="preserve">{{ </w:t>
+            </w:r>
+            <w:proofErr w:type="spellStart"/>
+            <w:r>
+              <w:rPr>
+                <w:rFonts w:ascii="Cambria" w:hAnsi="Cambria"/>
+                <w:bCs w:val="0"/>
+                <w:color w:val="000000"/>
+                <w:sz w:val="22"/>
+                <w:szCs w:val="22"/>
+              </w:rPr>
+              <w:t>item.color</w:t>
+            </w:r>
+            <w:proofErr w:type="spellEnd"/>
+            <w:r>
+              <w:rPr>
+                <w:rFonts w:ascii="Cambria" w:hAnsi="Cambria"/>
+                <w:bCs w:val="0"/>
+                <w:color w:val="000000"/>
+                <w:sz w:val="22"/>
+                <w:szCs w:val="22"/>
+              </w:rPr>
+              <w:t xml:space="preserve"> }}</w:t>
             </w:r>
           </w:p>
         </w:tc>
@@ -998,7 +1513,29 @@
                 <w:sz w:val="22"/>
                 <w:szCs w:val="22"/>
               </w:rPr>
-              <w:t>{{ item.mother }}</w:t>
+              <w:t xml:space="preserve">{{ </w:t>
+            </w:r>
+            <w:proofErr w:type="spellStart"/>
+            <w:r>
+              <w:rPr>
+                <w:rFonts w:ascii="Cambria" w:hAnsi="Cambria"/>
+                <w:bCs w:val="0"/>
+                <w:color w:val="000000"/>
+                <w:sz w:val="22"/>
+                <w:szCs w:val="22"/>
+              </w:rPr>
+              <w:t>item.mother</w:t>
+            </w:r>
+            <w:proofErr w:type="spellEnd"/>
+            <w:r>
+              <w:rPr>
+                <w:rFonts w:ascii="Cambria" w:hAnsi="Cambria"/>
+                <w:bCs w:val="0"/>
+                <w:color w:val="000000"/>
+                <w:sz w:val="22"/>
+                <w:szCs w:val="22"/>
+              </w:rPr>
+              <w:t xml:space="preserve"> }}</w:t>
             </w:r>
           </w:p>
         </w:tc>
@@ -1025,7 +1562,29 @@
                 <w:sz w:val="22"/>
                 <w:szCs w:val="22"/>
               </w:rPr>
-              <w:t>{{ item.health }}</w:t>
+              <w:t xml:space="preserve">{{ </w:t>
+            </w:r>
+            <w:proofErr w:type="spellStart"/>
+            <w:r>
+              <w:rPr>
+                <w:rFonts w:ascii="Cambria" w:hAnsi="Cambria"/>
+                <w:bCs w:val="0"/>
+                <w:color w:val="000000"/>
+                <w:sz w:val="22"/>
+                <w:szCs w:val="22"/>
+              </w:rPr>
+              <w:t>item.health</w:t>
+            </w:r>
+            <w:proofErr w:type="spellEnd"/>
+            <w:r>
+              <w:rPr>
+                <w:rFonts w:ascii="Cambria" w:hAnsi="Cambria"/>
+                <w:bCs w:val="0"/>
+                <w:color w:val="000000"/>
+                <w:sz w:val="22"/>
+                <w:szCs w:val="22"/>
+              </w:rPr>
+              <w:t xml:space="preserve"> }}</w:t>
             </w:r>
           </w:p>
         </w:tc>
@@ -1059,7 +1618,55 @@
                 <w:sz w:val="22"/>
                 <w:szCs w:val="22"/>
               </w:rPr>
-              <w:t>{%tr endfor %}</w:t>
+              <w:t>{%</w:t>
+            </w:r>
+            <w:proofErr w:type="spellStart"/>
+            <w:r>
+              <w:rPr>
+                <w:rFonts w:ascii="Cambria" w:hAnsi="Cambria"/>
+                <w:b w:val="0"/>
+                <w:bCs/>
+                <w:color w:val="000000"/>
+                <w:sz w:val="22"/>
+                <w:szCs w:val="22"/>
+              </w:rPr>
+              <w:t>tr</w:t>
+            </w:r>
+            <w:proofErr w:type="spellEnd"/>
+            <w:r>
+              <w:rPr>
+                <w:rFonts w:ascii="Cambria" w:hAnsi="Cambria"/>
+                <w:b w:val="0"/>
+                <w:bCs/>
+                <w:color w:val="000000"/>
+                <w:sz w:val="22"/>
+                <w:szCs w:val="22"/>
+              </w:rPr>
+              <w:t xml:space="preserve"> </w:t>
+            </w:r>
+            <w:proofErr w:type="spellStart"/>
+            <w:r>
+              <w:rPr>
+                <w:rFonts w:ascii="Cambria" w:hAnsi="Cambria"/>
+                <w:b w:val="0"/>
+                <w:bCs/>
+                <w:color w:val="000000"/>
+                <w:sz w:val="22"/>
+                <w:szCs w:val="22"/>
+              </w:rPr>
+              <w:t>endfor</w:t>
+            </w:r>
+            <w:proofErr w:type="spellEnd"/>
+            <w:r>
+              <w:rPr>
+                <w:rFonts w:ascii="Cambria" w:hAnsi="Cambria"/>
+                <w:b w:val="0"/>
+                <w:bCs/>
+                <w:color w:val="000000"/>
+                <w:sz w:val="22"/>
+                <w:szCs w:val="22"/>
+              </w:rPr>
+              <w:t xml:space="preserve"> %}</w:t>
             </w:r>
           </w:p>
         </w:tc>
@@ -1161,18 +1768,52 @@
           <w:szCs w:val="22"/>
         </w:rPr>
         <w:lastRenderedPageBreak/>
-        <w:t>No rhino births reported.</w:t>
-      </w:r>
-      <w:r>
-        <w:rPr>
-          <w:rFonts w:ascii="Cambria" w:hAnsi="Cambria"/>
-          <w:bCs w:val="0"/>
-          <w:color w:val="000000"/>
-          <w:sz w:val="22"/>
-          <w:szCs w:val="22"/>
-        </w:rPr>
-        <w:t>{% endif</w:t>
-      </w:r>
+        <w:t xml:space="preserve">No rhino births </w:t>
+      </w:r>
+      <w:proofErr w:type="gramStart"/>
+      <w:r>
+        <w:rPr>
+          <w:rFonts w:ascii="Cambria" w:hAnsi="Cambria"/>
+          <w:bCs w:val="0"/>
+          <w:color w:val="000000"/>
+          <w:sz w:val="22"/>
+          <w:szCs w:val="22"/>
+        </w:rPr>
+        <w:t>reported.</w:t>
+      </w:r>
+      <w:r>
+        <w:rPr>
+          <w:rFonts w:ascii="Cambria" w:hAnsi="Cambria"/>
+          <w:bCs w:val="0"/>
+          <w:color w:val="000000"/>
+          <w:sz w:val="22"/>
+          <w:szCs w:val="22"/>
+        </w:rPr>
+        <w:t>{</w:t>
+      </w:r>
+      <w:proofErr w:type="gramEnd"/>
+      <w:r>
+        <w:rPr>
+          <w:rFonts w:ascii="Cambria" w:hAnsi="Cambria"/>
+          <w:bCs w:val="0"/>
+          <w:color w:val="000000"/>
+          <w:sz w:val="22"/>
+          <w:szCs w:val="22"/>
+        </w:rPr>
+        <w:t xml:space="preserve">% </w:t>
+      </w:r>
+      <w:proofErr w:type="spellStart"/>
+      <w:r>
+        <w:rPr>
+          <w:rFonts w:ascii="Cambria" w:hAnsi="Cambria"/>
+          <w:bCs w:val="0"/>
+          <w:color w:val="000000"/>
+          <w:sz w:val="22"/>
+          <w:szCs w:val="22"/>
+        </w:rPr>
+        <w:t>endif</w:t>
+      </w:r>
+      <w:proofErr w:type="spellEnd"/>
       <w:r>
         <w:rPr>
           <w:rFonts w:ascii="Cambria" w:hAnsi="Cambria"/>
@@ -1317,8 +1958,31 @@
                 <w:sz w:val="22"/>
                 <w:szCs w:val="22"/>
               </w:rPr>
-              <w:t xml:space="preserve">{%tr for item in </w:t>
-            </w:r>
+              <w:t>{%</w:t>
+            </w:r>
+            <w:proofErr w:type="spellStart"/>
+            <w:r>
+              <w:rPr>
+                <w:rFonts w:ascii="Cambria" w:hAnsi="Cambria"/>
+                <w:b w:val="0"/>
+                <w:color w:val="000000"/>
+                <w:sz w:val="22"/>
+                <w:szCs w:val="22"/>
+              </w:rPr>
+              <w:t>tr</w:t>
+            </w:r>
+            <w:proofErr w:type="spellEnd"/>
+            <w:r>
+              <w:rPr>
+                <w:rFonts w:ascii="Cambria" w:hAnsi="Cambria"/>
+                <w:b w:val="0"/>
+                <w:color w:val="000000"/>
+                <w:sz w:val="22"/>
+                <w:szCs w:val="22"/>
+              </w:rPr>
+              <w:t xml:space="preserve"> for item in </w:t>
+            </w:r>
+            <w:proofErr w:type="spellStart"/>
             <w:r>
               <w:rPr>
                 <w:rFonts w:ascii="Cambria" w:hAnsi="Cambria"/>
@@ -1329,6 +1993,7 @@
               </w:rPr>
               <w:t>missing_rhinos</w:t>
             </w:r>
+            <w:proofErr w:type="spellEnd"/>
             <w:r>
               <w:rPr>
                 <w:rFonts w:ascii="Cambria" w:hAnsi="Cambria"/>
@@ -1460,6 +2125,7 @@
               </w:rPr>
               <w:t xml:space="preserve"> </w:t>
             </w:r>
+            <w:proofErr w:type="spellStart"/>
             <w:r>
               <w:rPr>
                 <w:rFonts w:ascii="Cambria" w:hAnsi="Cambria"/>
@@ -1480,6 +2146,7 @@
               </w:rPr>
               <w:t>days_ago</w:t>
             </w:r>
+            <w:proofErr w:type="spellEnd"/>
             <w:r>
               <w:rPr>
                 <w:rFonts w:ascii="Cambria" w:hAnsi="Cambria"/>
@@ -1535,7 +2202,51 @@
                 <w:sz w:val="22"/>
                 <w:szCs w:val="22"/>
               </w:rPr>
-              <w:t>{%tr endfor %}</w:t>
+              <w:t>{%</w:t>
+            </w:r>
+            <w:proofErr w:type="spellStart"/>
+            <w:r>
+              <w:rPr>
+                <w:rFonts w:ascii="Cambria" w:hAnsi="Cambria"/>
+                <w:b w:val="0"/>
+                <w:color w:val="000000"/>
+                <w:sz w:val="22"/>
+                <w:szCs w:val="22"/>
+              </w:rPr>
+              <w:t>tr</w:t>
+            </w:r>
+            <w:proofErr w:type="spellEnd"/>
+            <w:r>
+              <w:rPr>
+                <w:rFonts w:ascii="Cambria" w:hAnsi="Cambria"/>
+                <w:b w:val="0"/>
+                <w:color w:val="000000"/>
+                <w:sz w:val="22"/>
+                <w:szCs w:val="22"/>
+              </w:rPr>
+              <w:t xml:space="preserve"> </w:t>
+            </w:r>
+            <w:proofErr w:type="spellStart"/>
+            <w:r>
+              <w:rPr>
+                <w:rFonts w:ascii="Cambria" w:hAnsi="Cambria"/>
+                <w:b w:val="0"/>
+                <w:color w:val="000000"/>
+                <w:sz w:val="22"/>
+                <w:szCs w:val="22"/>
+              </w:rPr>
+              <w:t>endfor</w:t>
+            </w:r>
+            <w:proofErr w:type="spellEnd"/>
+            <w:r>
+              <w:rPr>
+                <w:rFonts w:ascii="Cambria" w:hAnsi="Cambria"/>
+                <w:b w:val="0"/>
+                <w:color w:val="000000"/>
+                <w:sz w:val="22"/>
+                <w:szCs w:val="22"/>
+              </w:rPr>
+              <w:t xml:space="preserve"> %}</w:t>
             </w:r>
           </w:p>
         </w:tc>
@@ -1633,7 +2344,29 @@
           <w:sz w:val="22"/>
           <w:szCs w:val="22"/>
         </w:rPr>
-        <w:t>{% if rhino_territorial_movement %}</w:t>
+        <w:t xml:space="preserve">{% if </w:t>
+      </w:r>
+      <w:proofErr w:type="spellStart"/>
+      <w:r>
+        <w:rPr>
+          <w:rFonts w:ascii="Cambria" w:hAnsi="Cambria"/>
+          <w:bCs w:val="0"/>
+          <w:color w:val="000000"/>
+          <w:sz w:val="22"/>
+          <w:szCs w:val="22"/>
+        </w:rPr>
+        <w:t>rhino_territorial_movement</w:t>
+      </w:r>
+      <w:proofErr w:type="spellEnd"/>
+      <w:r>
+        <w:rPr>
+          <w:rFonts w:ascii="Cambria" w:hAnsi="Cambria"/>
+          <w:bCs w:val="0"/>
+          <w:color w:val="000000"/>
+          <w:sz w:val="22"/>
+          <w:szCs w:val="22"/>
+        </w:rPr>
+        <w:t xml:space="preserve"> %}</w:t>
       </w:r>
     </w:p>
     <w:tbl>
@@ -1839,7 +2572,55 @@
                 <w:sz w:val="22"/>
                 <w:szCs w:val="22"/>
               </w:rPr>
-              <w:t>{%tr for item in rhino_territorial_movement %}</w:t>
+              <w:t>{%</w:t>
+            </w:r>
+            <w:proofErr w:type="spellStart"/>
+            <w:r>
+              <w:rPr>
+                <w:rFonts w:ascii="Cambria" w:hAnsi="Cambria"/>
+                <w:b w:val="0"/>
+                <w:bCs/>
+                <w:color w:val="000000"/>
+                <w:sz w:val="22"/>
+                <w:szCs w:val="22"/>
+              </w:rPr>
+              <w:t>tr</w:t>
+            </w:r>
+            <w:proofErr w:type="spellEnd"/>
+            <w:r>
+              <w:rPr>
+                <w:rFonts w:ascii="Cambria" w:hAnsi="Cambria"/>
+                <w:b w:val="0"/>
+                <w:bCs/>
+                <w:color w:val="000000"/>
+                <w:sz w:val="22"/>
+                <w:szCs w:val="22"/>
+              </w:rPr>
+              <w:t xml:space="preserve"> for item in </w:t>
+            </w:r>
+            <w:proofErr w:type="spellStart"/>
+            <w:r>
+              <w:rPr>
+                <w:rFonts w:ascii="Cambria" w:hAnsi="Cambria"/>
+                <w:b w:val="0"/>
+                <w:bCs/>
+                <w:color w:val="000000"/>
+                <w:sz w:val="22"/>
+                <w:szCs w:val="22"/>
+              </w:rPr>
+              <w:t>rhino_territorial_movement</w:t>
+            </w:r>
+            <w:proofErr w:type="spellEnd"/>
+            <w:r>
+              <w:rPr>
+                <w:rFonts w:ascii="Cambria" w:hAnsi="Cambria"/>
+                <w:b w:val="0"/>
+                <w:bCs/>
+                <w:color w:val="000000"/>
+                <w:sz w:val="22"/>
+                <w:szCs w:val="22"/>
+              </w:rPr>
+              <w:t xml:space="preserve"> %}</w:t>
             </w:r>
           </w:p>
         </w:tc>
@@ -1870,7 +2651,31 @@
                 <w:sz w:val="22"/>
                 <w:szCs w:val="22"/>
               </w:rPr>
-              <w:t>{{ item.conservancy }}</w:t>
+              <w:t xml:space="preserve">{{ </w:t>
+            </w:r>
+            <w:proofErr w:type="spellStart"/>
+            <w:r>
+              <w:rPr>
+                <w:rFonts w:ascii="Cambria" w:hAnsi="Cambria"/>
+                <w:b w:val="0"/>
+                <w:bCs/>
+                <w:color w:val="000000"/>
+                <w:sz w:val="22"/>
+                <w:szCs w:val="22"/>
+              </w:rPr>
+              <w:t>item.conservancy</w:t>
+            </w:r>
+            <w:proofErr w:type="spellEnd"/>
+            <w:r>
+              <w:rPr>
+                <w:rFonts w:ascii="Cambria" w:hAnsi="Cambria"/>
+                <w:b w:val="0"/>
+                <w:bCs/>
+                <w:color w:val="000000"/>
+                <w:sz w:val="22"/>
+                <w:szCs w:val="22"/>
+              </w:rPr>
+              <w:t xml:space="preserve"> }}</w:t>
             </w:r>
           </w:p>
         </w:tc>
@@ -1897,7 +2702,29 @@
                 <w:sz w:val="22"/>
                 <w:szCs w:val="22"/>
               </w:rPr>
-              <w:t>{{ item.color }}</w:t>
+              <w:t xml:space="preserve">{{ </w:t>
+            </w:r>
+            <w:proofErr w:type="spellStart"/>
+            <w:r>
+              <w:rPr>
+                <w:rFonts w:ascii="Cambria" w:hAnsi="Cambria"/>
+                <w:bCs w:val="0"/>
+                <w:color w:val="000000"/>
+                <w:sz w:val="22"/>
+                <w:szCs w:val="22"/>
+              </w:rPr>
+              <w:t>item.color</w:t>
+            </w:r>
+            <w:proofErr w:type="spellEnd"/>
+            <w:r>
+              <w:rPr>
+                <w:rFonts w:ascii="Cambria" w:hAnsi="Cambria"/>
+                <w:bCs w:val="0"/>
+                <w:color w:val="000000"/>
+                <w:sz w:val="22"/>
+                <w:szCs w:val="22"/>
+              </w:rPr>
+              <w:t xml:space="preserve"> }}</w:t>
             </w:r>
           </w:p>
         </w:tc>
@@ -1924,7 +2751,29 @@
                 <w:sz w:val="22"/>
                 <w:szCs w:val="22"/>
               </w:rPr>
-              <w:t>{{ item.station }}</w:t>
+              <w:t xml:space="preserve">{{ </w:t>
+            </w:r>
+            <w:proofErr w:type="spellStart"/>
+            <w:r>
+              <w:rPr>
+                <w:rFonts w:ascii="Cambria" w:hAnsi="Cambria"/>
+                <w:bCs w:val="0"/>
+                <w:color w:val="000000"/>
+                <w:sz w:val="22"/>
+                <w:szCs w:val="22"/>
+              </w:rPr>
+              <w:t>item.station</w:t>
+            </w:r>
+            <w:proofErr w:type="spellEnd"/>
+            <w:r>
+              <w:rPr>
+                <w:rFonts w:ascii="Cambria" w:hAnsi="Cambria"/>
+                <w:bCs w:val="0"/>
+                <w:color w:val="000000"/>
+                <w:sz w:val="22"/>
+                <w:szCs w:val="22"/>
+              </w:rPr>
+              <w:t xml:space="preserve"> }}</w:t>
             </w:r>
           </w:p>
         </w:tc>
@@ -1951,7 +2800,29 @@
                 <w:sz w:val="22"/>
                 <w:szCs w:val="22"/>
               </w:rPr>
-              <w:t>{{ item.rhinos }}</w:t>
+              <w:t xml:space="preserve">{{ </w:t>
+            </w:r>
+            <w:proofErr w:type="spellStart"/>
+            <w:r>
+              <w:rPr>
+                <w:rFonts w:ascii="Cambria" w:hAnsi="Cambria"/>
+                <w:bCs w:val="0"/>
+                <w:color w:val="000000"/>
+                <w:sz w:val="22"/>
+                <w:szCs w:val="22"/>
+              </w:rPr>
+              <w:t>item.rhinos</w:t>
+            </w:r>
+            <w:proofErr w:type="spellEnd"/>
+            <w:r>
+              <w:rPr>
+                <w:rFonts w:ascii="Cambria" w:hAnsi="Cambria"/>
+                <w:bCs w:val="0"/>
+                <w:color w:val="000000"/>
+                <w:sz w:val="22"/>
+                <w:szCs w:val="22"/>
+              </w:rPr>
+              <w:t xml:space="preserve"> }}</w:t>
             </w:r>
           </w:p>
         </w:tc>
@@ -1978,7 +2849,29 @@
                 <w:sz w:val="22"/>
                 <w:szCs w:val="22"/>
               </w:rPr>
-              <w:t>{{ item.behavior }}</w:t>
+              <w:t xml:space="preserve">{{ </w:t>
+            </w:r>
+            <w:proofErr w:type="spellStart"/>
+            <w:r>
+              <w:rPr>
+                <w:rFonts w:ascii="Cambria" w:hAnsi="Cambria"/>
+                <w:bCs w:val="0"/>
+                <w:color w:val="000000"/>
+                <w:sz w:val="22"/>
+                <w:szCs w:val="22"/>
+              </w:rPr>
+              <w:t>item.behavior</w:t>
+            </w:r>
+            <w:proofErr w:type="spellEnd"/>
+            <w:r>
+              <w:rPr>
+                <w:rFonts w:ascii="Cambria" w:hAnsi="Cambria"/>
+                <w:bCs w:val="0"/>
+                <w:color w:val="000000"/>
+                <w:sz w:val="22"/>
+                <w:szCs w:val="22"/>
+              </w:rPr>
+              <w:t xml:space="preserve"> }}</w:t>
             </w:r>
           </w:p>
         </w:tc>
@@ -2005,7 +2898,29 @@
                 <w:sz w:val="22"/>
                 <w:szCs w:val="22"/>
               </w:rPr>
-              <w:t>{{ item.health }}</w:t>
+              <w:t xml:space="preserve">{{ </w:t>
+            </w:r>
+            <w:proofErr w:type="spellStart"/>
+            <w:r>
+              <w:rPr>
+                <w:rFonts w:ascii="Cambria" w:hAnsi="Cambria"/>
+                <w:bCs w:val="0"/>
+                <w:color w:val="000000"/>
+                <w:sz w:val="22"/>
+                <w:szCs w:val="22"/>
+              </w:rPr>
+              <w:t>item.health</w:t>
+            </w:r>
+            <w:proofErr w:type="spellEnd"/>
+            <w:r>
+              <w:rPr>
+                <w:rFonts w:ascii="Cambria" w:hAnsi="Cambria"/>
+                <w:bCs w:val="0"/>
+                <w:color w:val="000000"/>
+                <w:sz w:val="22"/>
+                <w:szCs w:val="22"/>
+              </w:rPr>
+              <w:t xml:space="preserve"> }}</w:t>
             </w:r>
           </w:p>
         </w:tc>
@@ -2039,7 +2954,55 @@
                 <w:sz w:val="22"/>
                 <w:szCs w:val="22"/>
               </w:rPr>
-              <w:t>{%tr endfor %}</w:t>
+              <w:t>{%</w:t>
+            </w:r>
+            <w:proofErr w:type="spellStart"/>
+            <w:r>
+              <w:rPr>
+                <w:rFonts w:ascii="Cambria" w:hAnsi="Cambria"/>
+                <w:b w:val="0"/>
+                <w:bCs/>
+                <w:color w:val="000000"/>
+                <w:sz w:val="22"/>
+                <w:szCs w:val="22"/>
+              </w:rPr>
+              <w:t>tr</w:t>
+            </w:r>
+            <w:proofErr w:type="spellEnd"/>
+            <w:r>
+              <w:rPr>
+                <w:rFonts w:ascii="Cambria" w:hAnsi="Cambria"/>
+                <w:b w:val="0"/>
+                <w:bCs/>
+                <w:color w:val="000000"/>
+                <w:sz w:val="22"/>
+                <w:szCs w:val="22"/>
+              </w:rPr>
+              <w:t xml:space="preserve"> </w:t>
+            </w:r>
+            <w:proofErr w:type="spellStart"/>
+            <w:r>
+              <w:rPr>
+                <w:rFonts w:ascii="Cambria" w:hAnsi="Cambria"/>
+                <w:b w:val="0"/>
+                <w:bCs/>
+                <w:color w:val="000000"/>
+                <w:sz w:val="22"/>
+                <w:szCs w:val="22"/>
+              </w:rPr>
+              <w:t>endfor</w:t>
+            </w:r>
+            <w:proofErr w:type="spellEnd"/>
+            <w:r>
+              <w:rPr>
+                <w:rFonts w:ascii="Cambria" w:hAnsi="Cambria"/>
+                <w:b w:val="0"/>
+                <w:bCs/>
+                <w:color w:val="000000"/>
+                <w:sz w:val="22"/>
+                <w:szCs w:val="22"/>
+              </w:rPr>
+              <w:t xml:space="preserve"> %}</w:t>
             </w:r>
           </w:p>
         </w:tc>
@@ -2216,7 +3179,29 @@
           <w:sz w:val="22"/>
           <w:szCs w:val="22"/>
         </w:rPr>
-        <w:t>{% endif %}</w:t>
+        <w:t xml:space="preserve">{% </w:t>
+      </w:r>
+      <w:proofErr w:type="spellStart"/>
+      <w:r>
+        <w:rPr>
+          <w:rFonts w:ascii="Cambria" w:hAnsi="Cambria"/>
+          <w:bCs w:val="0"/>
+          <w:color w:val="000000"/>
+          <w:sz w:val="22"/>
+          <w:szCs w:val="22"/>
+        </w:rPr>
+        <w:t>endif</w:t>
+      </w:r>
+      <w:proofErr w:type="spellEnd"/>
+      <w:r>
+        <w:rPr>
+          <w:rFonts w:ascii="Cambria" w:hAnsi="Cambria"/>
+          <w:bCs w:val="0"/>
+          <w:color w:val="000000"/>
+          <w:sz w:val="22"/>
+          <w:szCs w:val="22"/>
+        </w:rPr>
+        <w:t xml:space="preserve"> %}</w:t>
       </w:r>
     </w:p>
     <w:p>
@@ -2268,7 +3253,57 @@
           <w:sz w:val="22"/>
           <w:szCs w:val="22"/>
         </w:rPr>
-        <w:t>% for os in other_sightings %}</w:t>
+        <w:t xml:space="preserve">% for </w:t>
+      </w:r>
+      <w:proofErr w:type="spellStart"/>
+      <w:r>
+        <w:rPr>
+          <w:rFonts w:ascii="Cambria" w:hAnsi="Cambria"/>
+          <w:color w:val="000000"/>
+          <w:sz w:val="22"/>
+          <w:szCs w:val="22"/>
+        </w:rPr>
+        <w:t>os</w:t>
+      </w:r>
+      <w:proofErr w:type="spellEnd"/>
+      <w:r>
+        <w:rPr>
+          <w:rFonts w:ascii="Cambria" w:hAnsi="Cambria"/>
+          <w:color w:val="000000"/>
+          <w:sz w:val="22"/>
+          <w:szCs w:val="22"/>
+        </w:rPr>
+        <w:t xml:space="preserve"> in </w:t>
+      </w:r>
+      <w:proofErr w:type="spellStart"/>
+      <w:r>
+        <w:rPr>
+          <w:rFonts w:ascii="Cambria" w:hAnsi="Cambria"/>
+          <w:color w:val="000000"/>
+          <w:sz w:val="22"/>
+          <w:szCs w:val="22"/>
+        </w:rPr>
+        <w:t>other_sightings</w:t>
+      </w:r>
+      <w:proofErr w:type="spellEnd"/>
+      <w:r>
+        <w:rPr>
+          <w:rFonts w:ascii="Cambria" w:hAnsi="Cambria"/>
+          <w:color w:val="000000"/>
+          <w:sz w:val="22"/>
+          <w:szCs w:val="22"/>
+        </w:rPr>
+        <w:t xml:space="preserve"> </w:t>
+      </w:r>
+      <w:proofErr w:type="gramStart"/>
+      <w:r>
+        <w:rPr>
+          <w:rFonts w:ascii="Cambria" w:hAnsi="Cambria"/>
+          <w:color w:val="000000"/>
+          <w:sz w:val="22"/>
+          <w:szCs w:val="22"/>
+        </w:rPr>
+        <w:t>%}</w:t>
       </w:r>
       <w:r>
         <w:rPr>
@@ -2279,8 +3314,9 @@
           <w:sz w:val="22"/>
           <w:szCs w:val="22"/>
         </w:rPr>
-        <w:t>Other wildlife s</w:t>
-      </w:r>
+        <w:t>Other</w:t>
+      </w:r>
+      <w:proofErr w:type="gramEnd"/>
       <w:r>
         <w:rPr>
           <w:rFonts w:ascii="Cambria" w:hAnsi="Cambria"/>
@@ -2290,7 +3326,42 @@
           <w:sz w:val="22"/>
           <w:szCs w:val="22"/>
         </w:rPr>
-        <w:t>ightings on {{ os.conservancy }</w:t>
+        <w:t xml:space="preserve"> wildlife s</w:t>
+      </w:r>
+      <w:r>
+        <w:rPr>
+          <w:rFonts w:ascii="Cambria" w:hAnsi="Cambria"/>
+          <w:b/>
+          <w:bCs w:val="0"/>
+          <w:color w:val="000000"/>
+          <w:sz w:val="22"/>
+          <w:szCs w:val="22"/>
+        </w:rPr>
+        <w:t xml:space="preserve">ightings on {{ </w:t>
+      </w:r>
+      <w:proofErr w:type="spellStart"/>
+      <w:r>
+        <w:rPr>
+          <w:rFonts w:ascii="Cambria" w:hAnsi="Cambria"/>
+          <w:b/>
+          <w:bCs w:val="0"/>
+          <w:color w:val="000000"/>
+          <w:sz w:val="22"/>
+          <w:szCs w:val="22"/>
+        </w:rPr>
+        <w:t>os.conservancy</w:t>
+      </w:r>
+      <w:proofErr w:type="spellEnd"/>
+      <w:r>
+        <w:rPr>
+          <w:rFonts w:ascii="Cambria" w:hAnsi="Cambria"/>
+          <w:b/>
+          <w:bCs w:val="0"/>
+          <w:color w:val="000000"/>
+          <w:sz w:val="22"/>
+          <w:szCs w:val="22"/>
+        </w:rPr>
+        <w:t xml:space="preserve"> }</w:t>
       </w:r>
       <w:r>
         <w:rPr>
@@ -2416,15 +3487,49 @@
               </w:rPr>
               <w:t>{%</w:t>
             </w:r>
-            <w:r>
-              <w:rPr>
-                <w:rFonts w:ascii="Cambria" w:hAnsi="Cambria"/>
-                <w:b w:val="0"/>
-                <w:color w:val="000000"/>
-                <w:sz w:val="22"/>
-                <w:szCs w:val="22"/>
-              </w:rPr>
-              <w:t xml:space="preserve">tr for item in os.sightings </w:t>
+            <w:proofErr w:type="spellStart"/>
+            <w:r>
+              <w:rPr>
+                <w:rFonts w:ascii="Cambria" w:hAnsi="Cambria"/>
+                <w:b w:val="0"/>
+                <w:color w:val="000000"/>
+                <w:sz w:val="22"/>
+                <w:szCs w:val="22"/>
+              </w:rPr>
+              <w:t>tr</w:t>
+            </w:r>
+            <w:proofErr w:type="spellEnd"/>
+            <w:r>
+              <w:rPr>
+                <w:rFonts w:ascii="Cambria" w:hAnsi="Cambria"/>
+                <w:b w:val="0"/>
+                <w:color w:val="000000"/>
+                <w:sz w:val="22"/>
+                <w:szCs w:val="22"/>
+              </w:rPr>
+              <w:t xml:space="preserve"> for item in </w:t>
+            </w:r>
+            <w:proofErr w:type="spellStart"/>
+            <w:r>
+              <w:rPr>
+                <w:rFonts w:ascii="Cambria" w:hAnsi="Cambria"/>
+                <w:b w:val="0"/>
+                <w:color w:val="000000"/>
+                <w:sz w:val="22"/>
+                <w:szCs w:val="22"/>
+              </w:rPr>
+              <w:t>os.sightings</w:t>
+            </w:r>
+            <w:proofErr w:type="spellEnd"/>
+            <w:r>
+              <w:rPr>
+                <w:rFonts w:ascii="Cambria" w:hAnsi="Cambria"/>
+                <w:b w:val="0"/>
+                <w:color w:val="000000"/>
+                <w:sz w:val="22"/>
+                <w:szCs w:val="22"/>
+              </w:rPr>
+              <w:t xml:space="preserve"> </w:t>
             </w:r>
             <w:r>
               <w:rPr>
@@ -2500,7 +3605,29 @@
                 <w:sz w:val="22"/>
                 <w:szCs w:val="22"/>
               </w:rPr>
-              <w:t>{{ item.species}}</w:t>
+              <w:t xml:space="preserve">{{ </w:t>
+            </w:r>
+            <w:proofErr w:type="spellStart"/>
+            <w:r>
+              <w:rPr>
+                <w:rFonts w:ascii="Cambria" w:hAnsi="Cambria"/>
+                <w:b w:val="0"/>
+                <w:color w:val="000000"/>
+                <w:sz w:val="22"/>
+                <w:szCs w:val="22"/>
+              </w:rPr>
+              <w:t>item.species</w:t>
+            </w:r>
+            <w:proofErr w:type="spellEnd"/>
+            <w:r>
+              <w:rPr>
+                <w:rFonts w:ascii="Cambria" w:hAnsi="Cambria"/>
+                <w:b w:val="0"/>
+                <w:color w:val="000000"/>
+                <w:sz w:val="22"/>
+                <w:szCs w:val="22"/>
+              </w:rPr>
+              <w:t>}}</w:t>
             </w:r>
           </w:p>
         </w:tc>
@@ -2533,7 +3660,29 @@
                 <w:sz w:val="22"/>
                 <w:szCs w:val="22"/>
               </w:rPr>
-              <w:t>{{item.count}}</w:t>
+              <w:t>{{</w:t>
+            </w:r>
+            <w:proofErr w:type="spellStart"/>
+            <w:r>
+              <w:rPr>
+                <w:rFonts w:ascii="Cambria" w:hAnsi="Cambria"/>
+                <w:bCs w:val="0"/>
+                <w:color w:val="000000"/>
+                <w:sz w:val="22"/>
+                <w:szCs w:val="22"/>
+              </w:rPr>
+              <w:t>item.count</w:t>
+            </w:r>
+            <w:proofErr w:type="spellEnd"/>
+            <w:r>
+              <w:rPr>
+                <w:rFonts w:ascii="Cambria" w:hAnsi="Cambria"/>
+                <w:bCs w:val="0"/>
+                <w:color w:val="000000"/>
+                <w:sz w:val="22"/>
+                <w:szCs w:val="22"/>
+              </w:rPr>
+              <w:t>}}</w:t>
             </w:r>
           </w:p>
         </w:tc>
@@ -2572,15 +3721,49 @@
               </w:rPr>
               <w:t>{%</w:t>
             </w:r>
-            <w:r>
-              <w:rPr>
-                <w:rFonts w:ascii="Cambria" w:hAnsi="Cambria"/>
-                <w:b w:val="0"/>
-                <w:color w:val="000000"/>
-                <w:sz w:val="22"/>
-                <w:szCs w:val="22"/>
-              </w:rPr>
-              <w:t>tr endfor %}</w:t>
+            <w:proofErr w:type="spellStart"/>
+            <w:r>
+              <w:rPr>
+                <w:rFonts w:ascii="Cambria" w:hAnsi="Cambria"/>
+                <w:b w:val="0"/>
+                <w:color w:val="000000"/>
+                <w:sz w:val="22"/>
+                <w:szCs w:val="22"/>
+              </w:rPr>
+              <w:t>tr</w:t>
+            </w:r>
+            <w:proofErr w:type="spellEnd"/>
+            <w:r>
+              <w:rPr>
+                <w:rFonts w:ascii="Cambria" w:hAnsi="Cambria"/>
+                <w:b w:val="0"/>
+                <w:color w:val="000000"/>
+                <w:sz w:val="22"/>
+                <w:szCs w:val="22"/>
+              </w:rPr>
+              <w:t xml:space="preserve"> </w:t>
+            </w:r>
+            <w:proofErr w:type="spellStart"/>
+            <w:r>
+              <w:rPr>
+                <w:rFonts w:ascii="Cambria" w:hAnsi="Cambria"/>
+                <w:b w:val="0"/>
+                <w:color w:val="000000"/>
+                <w:sz w:val="22"/>
+                <w:szCs w:val="22"/>
+              </w:rPr>
+              <w:t>endfor</w:t>
+            </w:r>
+            <w:proofErr w:type="spellEnd"/>
+            <w:r>
+              <w:rPr>
+                <w:rFonts w:ascii="Cambria" w:hAnsi="Cambria"/>
+                <w:b w:val="0"/>
+                <w:color w:val="000000"/>
+                <w:sz w:val="22"/>
+                <w:szCs w:val="22"/>
+              </w:rPr>
+              <w:t xml:space="preserve"> %}</w:t>
             </w:r>
           </w:p>
         </w:tc>
@@ -2663,7 +3846,41 @@
           <w:sz w:val="22"/>
           <w:szCs w:val="22"/>
         </w:rPr>
-        <w:t>ted = {{os.total_sightings}} reported.</w:t>
+        <w:t>ted = {{</w:t>
+      </w:r>
+      <w:proofErr w:type="spellStart"/>
+      <w:proofErr w:type="gramStart"/>
+      <w:r>
+        <w:rPr>
+          <w:rFonts w:ascii="Cambria" w:hAnsi="Cambria"/>
+          <w:b/>
+          <w:color w:val="000000"/>
+          <w:sz w:val="22"/>
+          <w:szCs w:val="22"/>
+        </w:rPr>
+        <w:t>os.total</w:t>
+      </w:r>
+      <w:proofErr w:type="gramEnd"/>
+      <w:r>
+        <w:rPr>
+          <w:rFonts w:ascii="Cambria" w:hAnsi="Cambria"/>
+          <w:b/>
+          <w:color w:val="000000"/>
+          <w:sz w:val="22"/>
+          <w:szCs w:val="22"/>
+        </w:rPr>
+        <w:t>_sightings</w:t>
+      </w:r>
+      <w:proofErr w:type="spellEnd"/>
+      <w:r>
+        <w:rPr>
+          <w:rFonts w:ascii="Cambria" w:hAnsi="Cambria"/>
+          <w:b/>
+          <w:color w:val="000000"/>
+          <w:sz w:val="22"/>
+          <w:szCs w:val="22"/>
+        </w:rPr>
+        <w:t>}} reported.</w:t>
       </w:r>
     </w:p>
     <w:p>
@@ -2705,7 +3922,29 @@
           <w:sz w:val="22"/>
           <w:szCs w:val="22"/>
         </w:rPr>
-        <w:t>{% endfor %}</w:t>
+        <w:t xml:space="preserve">{% </w:t>
+      </w:r>
+      <w:proofErr w:type="spellStart"/>
+      <w:r>
+        <w:rPr>
+          <w:rFonts w:ascii="Cambria" w:hAnsi="Cambria"/>
+          <w:b/>
+          <w:color w:val="000000"/>
+          <w:sz w:val="22"/>
+          <w:szCs w:val="22"/>
+        </w:rPr>
+        <w:t>endfor</w:t>
+      </w:r>
+      <w:proofErr w:type="spellEnd"/>
+      <w:r>
+        <w:rPr>
+          <w:rFonts w:ascii="Cambria" w:hAnsi="Cambria"/>
+          <w:b/>
+          <w:color w:val="000000"/>
+          <w:sz w:val="22"/>
+          <w:szCs w:val="22"/>
+        </w:rPr>
+        <w:t xml:space="preserve"> %}</w:t>
       </w:r>
     </w:p>
     <w:p>
@@ -2948,6 +4187,7 @@
               </w:rPr>
               <w:t>{%</w:t>
             </w:r>
+            <w:proofErr w:type="spellStart"/>
             <w:r>
               <w:rPr>
                 <w:rFonts w:ascii="Cambria" w:hAnsi="Cambria"/>
@@ -2957,7 +4197,19 @@
                 <w:sz w:val="22"/>
                 <w:szCs w:val="22"/>
               </w:rPr>
-              <w:t>tr for item in carcass %}</w:t>
+              <w:t>tr</w:t>
+            </w:r>
+            <w:proofErr w:type="spellEnd"/>
+            <w:r>
+              <w:rPr>
+                <w:rFonts w:ascii="Cambria" w:hAnsi="Cambria"/>
+                <w:b w:val="0"/>
+                <w:bCs/>
+                <w:color w:val="000000"/>
+                <w:sz w:val="22"/>
+                <w:szCs w:val="22"/>
+              </w:rPr>
+              <w:t xml:space="preserve"> for item in carcass %}</w:t>
             </w:r>
           </w:p>
         </w:tc>
@@ -2988,7 +4240,31 @@
                 <w:sz w:val="22"/>
                 <w:szCs w:val="22"/>
               </w:rPr>
-              <w:t>{{ item.conservancy }}</w:t>
+              <w:t xml:space="preserve">{{ </w:t>
+            </w:r>
+            <w:proofErr w:type="spellStart"/>
+            <w:r>
+              <w:rPr>
+                <w:rFonts w:ascii="Cambria" w:hAnsi="Cambria"/>
+                <w:b w:val="0"/>
+                <w:bCs/>
+                <w:color w:val="000000"/>
+                <w:sz w:val="22"/>
+                <w:szCs w:val="22"/>
+              </w:rPr>
+              <w:t>item.conservancy</w:t>
+            </w:r>
+            <w:proofErr w:type="spellEnd"/>
+            <w:r>
+              <w:rPr>
+                <w:rFonts w:ascii="Cambria" w:hAnsi="Cambria"/>
+                <w:b w:val="0"/>
+                <w:bCs/>
+                <w:color w:val="000000"/>
+                <w:sz w:val="22"/>
+                <w:szCs w:val="22"/>
+              </w:rPr>
+              <w:t xml:space="preserve"> }}</w:t>
             </w:r>
           </w:p>
         </w:tc>
@@ -3015,7 +4291,29 @@
                 <w:sz w:val="22"/>
                 <w:szCs w:val="22"/>
               </w:rPr>
-              <w:t>{{ item.species }}</w:t>
+              <w:t xml:space="preserve">{{ </w:t>
+            </w:r>
+            <w:proofErr w:type="spellStart"/>
+            <w:r>
+              <w:rPr>
+                <w:rFonts w:ascii="Cambria" w:hAnsi="Cambria"/>
+                <w:bCs w:val="0"/>
+                <w:color w:val="000000"/>
+                <w:sz w:val="22"/>
+                <w:szCs w:val="22"/>
+              </w:rPr>
+              <w:t>item.species</w:t>
+            </w:r>
+            <w:proofErr w:type="spellEnd"/>
+            <w:r>
+              <w:rPr>
+                <w:rFonts w:ascii="Cambria" w:hAnsi="Cambria"/>
+                <w:bCs w:val="0"/>
+                <w:color w:val="000000"/>
+                <w:sz w:val="22"/>
+                <w:szCs w:val="22"/>
+              </w:rPr>
+              <w:t xml:space="preserve"> }}</w:t>
             </w:r>
           </w:p>
         </w:tc>
@@ -3042,7 +4340,29 @@
                 <w:sz w:val="22"/>
                 <w:szCs w:val="22"/>
               </w:rPr>
-              <w:t>{{ item.station }}</w:t>
+              <w:t xml:space="preserve">{{ </w:t>
+            </w:r>
+            <w:proofErr w:type="spellStart"/>
+            <w:r>
+              <w:rPr>
+                <w:rFonts w:ascii="Cambria" w:hAnsi="Cambria"/>
+                <w:bCs w:val="0"/>
+                <w:color w:val="000000"/>
+                <w:sz w:val="22"/>
+                <w:szCs w:val="22"/>
+              </w:rPr>
+              <w:t>item.station</w:t>
+            </w:r>
+            <w:proofErr w:type="spellEnd"/>
+            <w:r>
+              <w:rPr>
+                <w:rFonts w:ascii="Cambria" w:hAnsi="Cambria"/>
+                <w:bCs w:val="0"/>
+                <w:color w:val="000000"/>
+                <w:sz w:val="22"/>
+                <w:szCs w:val="22"/>
+              </w:rPr>
+              <w:t xml:space="preserve"> }}</w:t>
             </w:r>
           </w:p>
         </w:tc>
@@ -3069,8 +4389,9 @@
                 <w:sz w:val="22"/>
                 <w:szCs w:val="22"/>
               </w:rPr>
-              <w:t>{{ item.</w:t>
-            </w:r>
+              <w:t xml:space="preserve">{{ </w:t>
+            </w:r>
+            <w:proofErr w:type="spellStart"/>
             <w:r>
               <w:rPr>
                 <w:rFonts w:ascii="Cambria" w:hAnsi="Cambria"/>
@@ -3079,8 +4400,19 @@
                 <w:sz w:val="22"/>
                 <w:szCs w:val="22"/>
               </w:rPr>
+              <w:t>item.</w:t>
+            </w:r>
+            <w:r>
+              <w:rPr>
+                <w:rFonts w:ascii="Cambria" w:hAnsi="Cambria"/>
+                <w:bCs w:val="0"/>
+                <w:color w:val="000000"/>
+                <w:sz w:val="22"/>
+                <w:szCs w:val="22"/>
+              </w:rPr>
               <w:t>cause_of_death</w:t>
             </w:r>
+            <w:proofErr w:type="spellEnd"/>
             <w:r>
               <w:rPr>
                 <w:rFonts w:ascii="Cambria" w:hAnsi="Cambria"/>
@@ -3116,7 +4448,29 @@
                 <w:sz w:val="22"/>
                 <w:szCs w:val="22"/>
               </w:rPr>
-              <w:t>{{ item.number_animals }}</w:t>
+              <w:t xml:space="preserve">{{ </w:t>
+            </w:r>
+            <w:proofErr w:type="spellStart"/>
+            <w:r>
+              <w:rPr>
+                <w:rFonts w:ascii="Cambria" w:hAnsi="Cambria"/>
+                <w:bCs w:val="0"/>
+                <w:color w:val="000000"/>
+                <w:sz w:val="22"/>
+                <w:szCs w:val="22"/>
+              </w:rPr>
+              <w:t>item.number_animals</w:t>
+            </w:r>
+            <w:proofErr w:type="spellEnd"/>
+            <w:r>
+              <w:rPr>
+                <w:rFonts w:ascii="Cambria" w:hAnsi="Cambria"/>
+                <w:bCs w:val="0"/>
+                <w:color w:val="000000"/>
+                <w:sz w:val="22"/>
+                <w:szCs w:val="22"/>
+              </w:rPr>
+              <w:t xml:space="preserve"> }}</w:t>
             </w:r>
           </w:p>
         </w:tc>
@@ -3150,7 +4504,55 @@
                 <w:sz w:val="22"/>
                 <w:szCs w:val="22"/>
               </w:rPr>
-              <w:t>{%tr endfor %}</w:t>
+              <w:t>{%</w:t>
+            </w:r>
+            <w:proofErr w:type="spellStart"/>
+            <w:r>
+              <w:rPr>
+                <w:rFonts w:ascii="Cambria" w:hAnsi="Cambria"/>
+                <w:b w:val="0"/>
+                <w:bCs/>
+                <w:color w:val="000000"/>
+                <w:sz w:val="22"/>
+                <w:szCs w:val="22"/>
+              </w:rPr>
+              <w:t>tr</w:t>
+            </w:r>
+            <w:proofErr w:type="spellEnd"/>
+            <w:r>
+              <w:rPr>
+                <w:rFonts w:ascii="Cambria" w:hAnsi="Cambria"/>
+                <w:b w:val="0"/>
+                <w:bCs/>
+                <w:color w:val="000000"/>
+                <w:sz w:val="22"/>
+                <w:szCs w:val="22"/>
+              </w:rPr>
+              <w:t xml:space="preserve"> </w:t>
+            </w:r>
+            <w:proofErr w:type="spellStart"/>
+            <w:r>
+              <w:rPr>
+                <w:rFonts w:ascii="Cambria" w:hAnsi="Cambria"/>
+                <w:b w:val="0"/>
+                <w:bCs/>
+                <w:color w:val="000000"/>
+                <w:sz w:val="22"/>
+                <w:szCs w:val="22"/>
+              </w:rPr>
+              <w:t>endfor</w:t>
+            </w:r>
+            <w:proofErr w:type="spellEnd"/>
+            <w:r>
+              <w:rPr>
+                <w:rFonts w:ascii="Cambria" w:hAnsi="Cambria"/>
+                <w:b w:val="0"/>
+                <w:bCs/>
+                <w:color w:val="000000"/>
+                <w:sz w:val="22"/>
+                <w:szCs w:val="22"/>
+              </w:rPr>
+              <w:t xml:space="preserve"> %}</w:t>
             </w:r>
           </w:p>
         </w:tc>
@@ -3309,7 +4711,29 @@
           <w:sz w:val="22"/>
           <w:szCs w:val="22"/>
         </w:rPr>
-        <w:t>{% endif %}</w:t>
+        <w:t xml:space="preserve">{% </w:t>
+      </w:r>
+      <w:proofErr w:type="spellStart"/>
+      <w:r>
+        <w:rPr>
+          <w:rFonts w:ascii="Cambria" w:hAnsi="Cambria"/>
+          <w:bCs w:val="0"/>
+          <w:color w:val="000000"/>
+          <w:sz w:val="22"/>
+          <w:szCs w:val="22"/>
+        </w:rPr>
+        <w:t>endif</w:t>
+      </w:r>
+      <w:proofErr w:type="spellEnd"/>
+      <w:r>
+        <w:rPr>
+          <w:rFonts w:ascii="Cambria" w:hAnsi="Cambria"/>
+          <w:bCs w:val="0"/>
+          <w:color w:val="000000"/>
+          <w:sz w:val="22"/>
+          <w:szCs w:val="22"/>
+        </w:rPr>
+        <w:t xml:space="preserve"> %}</w:t>
       </w:r>
     </w:p>
     <w:p>
@@ -3369,17 +4793,61 @@
           <w:sz w:val="22"/>
           <w:szCs w:val="22"/>
         </w:rPr>
-        <w:t>Wildlife movement through the gaps:</w:t>
-      </w:r>
-      <w:r>
-        <w:rPr>
-          <w:rFonts w:ascii="Cambria" w:hAnsi="Cambria"/>
-          <w:bCs w:val="0"/>
-          <w:color w:val="000000"/>
-          <w:sz w:val="22"/>
-          <w:szCs w:val="22"/>
-        </w:rPr>
-        <w:t>{% if gap_movement %}</w:t>
+        <w:t xml:space="preserve">Wildlife movement through the </w:t>
+      </w:r>
+      <w:proofErr w:type="gramStart"/>
+      <w:r>
+        <w:rPr>
+          <w:rFonts w:ascii="Cambria" w:hAnsi="Cambria"/>
+          <w:b/>
+          <w:color w:val="000000"/>
+          <w:sz w:val="22"/>
+          <w:szCs w:val="22"/>
+        </w:rPr>
+        <w:t>gaps:</w:t>
+      </w:r>
+      <w:r>
+        <w:rPr>
+          <w:rFonts w:ascii="Cambria" w:hAnsi="Cambria"/>
+          <w:bCs w:val="0"/>
+          <w:color w:val="000000"/>
+          <w:sz w:val="22"/>
+          <w:szCs w:val="22"/>
+        </w:rPr>
+        <w:t>{</w:t>
+      </w:r>
+      <w:proofErr w:type="gramEnd"/>
+      <w:r>
+        <w:rPr>
+          <w:rFonts w:ascii="Cambria" w:hAnsi="Cambria"/>
+          <w:bCs w:val="0"/>
+          <w:color w:val="000000"/>
+          <w:sz w:val="22"/>
+          <w:szCs w:val="22"/>
+        </w:rPr>
+        <w:t xml:space="preserve">% if </w:t>
+      </w:r>
+      <w:proofErr w:type="spellStart"/>
+      <w:r>
+        <w:rPr>
+          <w:rFonts w:ascii="Cambria" w:hAnsi="Cambria"/>
+          <w:bCs w:val="0"/>
+          <w:color w:val="000000"/>
+          <w:sz w:val="22"/>
+          <w:szCs w:val="22"/>
+        </w:rPr>
+        <w:t>gap_movement</w:t>
+      </w:r>
+      <w:proofErr w:type="spellEnd"/>
+      <w:r>
+        <w:rPr>
+          <w:rFonts w:ascii="Cambria" w:hAnsi="Cambria"/>
+          <w:bCs w:val="0"/>
+          <w:color w:val="000000"/>
+          <w:sz w:val="22"/>
+          <w:szCs w:val="22"/>
+        </w:rPr>
+        <w:t xml:space="preserve"> %}</w:t>
       </w:r>
     </w:p>
     <w:p>
@@ -3550,8 +5018,42 @@
                 <w:sz w:val="22"/>
                 <w:szCs w:val="22"/>
               </w:rPr>
-              <w:t>{%tr for item in gap_movement</w:t>
-            </w:r>
+              <w:t>{%</w:t>
+            </w:r>
+            <w:proofErr w:type="spellStart"/>
+            <w:r>
+              <w:rPr>
+                <w:rFonts w:ascii="Cambria" w:hAnsi="Cambria"/>
+                <w:b w:val="0"/>
+                <w:color w:val="000000"/>
+                <w:sz w:val="22"/>
+                <w:szCs w:val="22"/>
+              </w:rPr>
+              <w:t>tr</w:t>
+            </w:r>
+            <w:proofErr w:type="spellEnd"/>
+            <w:r>
+              <w:rPr>
+                <w:rFonts w:ascii="Cambria" w:hAnsi="Cambria"/>
+                <w:b w:val="0"/>
+                <w:color w:val="000000"/>
+                <w:sz w:val="22"/>
+                <w:szCs w:val="22"/>
+              </w:rPr>
+              <w:t xml:space="preserve"> for item in </w:t>
+            </w:r>
+            <w:proofErr w:type="spellStart"/>
+            <w:r>
+              <w:rPr>
+                <w:rFonts w:ascii="Cambria" w:hAnsi="Cambria"/>
+                <w:b w:val="0"/>
+                <w:color w:val="000000"/>
+                <w:sz w:val="22"/>
+                <w:szCs w:val="22"/>
+              </w:rPr>
+              <w:t>gap_movement</w:t>
+            </w:r>
+            <w:proofErr w:type="spellEnd"/>
             <w:r>
               <w:rPr>
                 <w:rFonts w:ascii="Cambria" w:hAnsi="Cambria"/>
@@ -3664,7 +5166,29 @@
                 <w:sz w:val="22"/>
                 <w:szCs w:val="22"/>
               </w:rPr>
-              <w:t>{{item.gap_name}}</w:t>
+              <w:t>{{</w:t>
+            </w:r>
+            <w:proofErr w:type="spellStart"/>
+            <w:r>
+              <w:rPr>
+                <w:rFonts w:ascii="Cambria" w:hAnsi="Cambria"/>
+                <w:b w:val="0"/>
+                <w:color w:val="000000"/>
+                <w:sz w:val="22"/>
+                <w:szCs w:val="22"/>
+              </w:rPr>
+              <w:t>item.gap_name</w:t>
+            </w:r>
+            <w:proofErr w:type="spellEnd"/>
+            <w:r>
+              <w:rPr>
+                <w:rFonts w:ascii="Cambria" w:hAnsi="Cambria"/>
+                <w:b w:val="0"/>
+                <w:color w:val="000000"/>
+                <w:sz w:val="22"/>
+                <w:szCs w:val="22"/>
+              </w:rPr>
+              <w:t>}}</w:t>
             </w:r>
           </w:p>
         </w:tc>
@@ -3697,7 +5221,29 @@
                 <w:sz w:val="22"/>
                 <w:szCs w:val="22"/>
               </w:rPr>
-              <w:t>{{item.species}}</w:t>
+              <w:t>{{</w:t>
+            </w:r>
+            <w:proofErr w:type="spellStart"/>
+            <w:r>
+              <w:rPr>
+                <w:rFonts w:ascii="Cambria" w:hAnsi="Cambria"/>
+                <w:bCs w:val="0"/>
+                <w:color w:val="000000"/>
+                <w:sz w:val="22"/>
+                <w:szCs w:val="22"/>
+              </w:rPr>
+              <w:t>item.species</w:t>
+            </w:r>
+            <w:proofErr w:type="spellEnd"/>
+            <w:r>
+              <w:rPr>
+                <w:rFonts w:ascii="Cambria" w:hAnsi="Cambria"/>
+                <w:bCs w:val="0"/>
+                <w:color w:val="000000"/>
+                <w:sz w:val="22"/>
+                <w:szCs w:val="22"/>
+              </w:rPr>
+              <w:t>}}</w:t>
             </w:r>
           </w:p>
         </w:tc>
@@ -3730,7 +5276,29 @@
                 <w:sz w:val="22"/>
                 <w:szCs w:val="22"/>
               </w:rPr>
-              <w:t>{{item.total_in}}</w:t>
+              <w:t>{{</w:t>
+            </w:r>
+            <w:proofErr w:type="spellStart"/>
+            <w:r>
+              <w:rPr>
+                <w:rFonts w:ascii="Cambria" w:hAnsi="Cambria"/>
+                <w:bCs w:val="0"/>
+                <w:color w:val="000000"/>
+                <w:sz w:val="22"/>
+                <w:szCs w:val="22"/>
+              </w:rPr>
+              <w:t>item.total_in</w:t>
+            </w:r>
+            <w:proofErr w:type="spellEnd"/>
+            <w:r>
+              <w:rPr>
+                <w:rFonts w:ascii="Cambria" w:hAnsi="Cambria"/>
+                <w:bCs w:val="0"/>
+                <w:color w:val="000000"/>
+                <w:sz w:val="22"/>
+                <w:szCs w:val="22"/>
+              </w:rPr>
+              <w:t>}}</w:t>
             </w:r>
           </w:p>
         </w:tc>
@@ -3763,7 +5331,29 @@
                 <w:sz w:val="22"/>
                 <w:szCs w:val="22"/>
               </w:rPr>
-              <w:t>{{item.total_out}}</w:t>
+              <w:t>{{</w:t>
+            </w:r>
+            <w:proofErr w:type="spellStart"/>
+            <w:r>
+              <w:rPr>
+                <w:rFonts w:ascii="Cambria" w:hAnsi="Cambria"/>
+                <w:bCs w:val="0"/>
+                <w:color w:val="000000"/>
+                <w:sz w:val="22"/>
+                <w:szCs w:val="22"/>
+              </w:rPr>
+              <w:t>item.total_out</w:t>
+            </w:r>
+            <w:proofErr w:type="spellEnd"/>
+            <w:r>
+              <w:rPr>
+                <w:rFonts w:ascii="Cambria" w:hAnsi="Cambria"/>
+                <w:bCs w:val="0"/>
+                <w:color w:val="000000"/>
+                <w:sz w:val="22"/>
+                <w:szCs w:val="22"/>
+              </w:rPr>
+              <w:t>}}</w:t>
             </w:r>
           </w:p>
         </w:tc>
@@ -3800,7 +5390,51 @@
                 <w:sz w:val="22"/>
                 <w:szCs w:val="22"/>
               </w:rPr>
-              <w:t>{%tr endfor %}</w:t>
+              <w:t>{%</w:t>
+            </w:r>
+            <w:proofErr w:type="spellStart"/>
+            <w:r>
+              <w:rPr>
+                <w:rFonts w:ascii="Cambria" w:hAnsi="Cambria"/>
+                <w:b w:val="0"/>
+                <w:color w:val="000000"/>
+                <w:sz w:val="22"/>
+                <w:szCs w:val="22"/>
+              </w:rPr>
+              <w:t>tr</w:t>
+            </w:r>
+            <w:proofErr w:type="spellEnd"/>
+            <w:r>
+              <w:rPr>
+                <w:rFonts w:ascii="Cambria" w:hAnsi="Cambria"/>
+                <w:b w:val="0"/>
+                <w:color w:val="000000"/>
+                <w:sz w:val="22"/>
+                <w:szCs w:val="22"/>
+              </w:rPr>
+              <w:t xml:space="preserve"> </w:t>
+            </w:r>
+            <w:proofErr w:type="spellStart"/>
+            <w:r>
+              <w:rPr>
+                <w:rFonts w:ascii="Cambria" w:hAnsi="Cambria"/>
+                <w:b w:val="0"/>
+                <w:color w:val="000000"/>
+                <w:sz w:val="22"/>
+                <w:szCs w:val="22"/>
+              </w:rPr>
+              <w:t>endfor</w:t>
+            </w:r>
+            <w:proofErr w:type="spellEnd"/>
+            <w:r>
+              <w:rPr>
+                <w:rFonts w:ascii="Cambria" w:hAnsi="Cambria"/>
+                <w:b w:val="0"/>
+                <w:color w:val="000000"/>
+                <w:sz w:val="22"/>
+                <w:szCs w:val="22"/>
+              </w:rPr>
+              <w:t xml:space="preserve"> %}</w:t>
             </w:r>
           </w:p>
         </w:tc>
@@ -3952,7 +5586,29 @@
           <w:sz w:val="22"/>
           <w:szCs w:val="22"/>
         </w:rPr>
-        <w:t>{% endif %}</w:t>
+        <w:t xml:space="preserve">{% </w:t>
+      </w:r>
+      <w:proofErr w:type="spellStart"/>
+      <w:r>
+        <w:rPr>
+          <w:rFonts w:ascii="Cambria" w:hAnsi="Cambria"/>
+          <w:bCs w:val="0"/>
+          <w:color w:val="000000"/>
+          <w:sz w:val="22"/>
+          <w:szCs w:val="22"/>
+        </w:rPr>
+        <w:t>endif</w:t>
+      </w:r>
+      <w:proofErr w:type="spellEnd"/>
+      <w:r>
+        <w:rPr>
+          <w:rFonts w:ascii="Cambria" w:hAnsi="Cambria"/>
+          <w:bCs w:val="0"/>
+          <w:color w:val="000000"/>
+          <w:sz w:val="22"/>
+          <w:szCs w:val="22"/>
+        </w:rPr>
+        <w:t xml:space="preserve"> %}</w:t>
       </w:r>
     </w:p>
     <w:p>
@@ -4020,8 +5676,20 @@
           <w:sz w:val="22"/>
           <w:szCs w:val="22"/>
         </w:rPr>
-        <w:t>{% for hwc</w:t>
-      </w:r>
+        <w:t xml:space="preserve">{% for </w:t>
+      </w:r>
+      <w:proofErr w:type="spellStart"/>
+      <w:r>
+        <w:rPr>
+          <w:rFonts w:ascii="Cambria" w:hAnsi="Cambria"/>
+          <w:bCs w:val="0"/>
+          <w:color w:val="000000"/>
+          <w:sz w:val="22"/>
+          <w:szCs w:val="22"/>
+        </w:rPr>
+        <w:t>hwc</w:t>
+      </w:r>
+      <w:proofErr w:type="spellEnd"/>
       <w:r>
         <w:rPr>
           <w:rFonts w:ascii="Cambria" w:hAnsi="Cambria"/>
@@ -4032,6 +5700,7 @@
         </w:rPr>
         <w:t xml:space="preserve"> in </w:t>
       </w:r>
+      <w:proofErr w:type="spellStart"/>
       <w:r>
         <w:rPr>
           <w:rFonts w:ascii="Cambria" w:hAnsi="Cambria"/>
@@ -4042,6 +5711,7 @@
         </w:rPr>
         <w:t>human_wildlife_conflict</w:t>
       </w:r>
+      <w:proofErr w:type="spellEnd"/>
       <w:r>
         <w:rPr>
           <w:rFonts w:ascii="Cambria" w:hAnsi="Cambria"/>
@@ -4069,6 +5739,7 @@
           <w:szCs w:val="22"/>
         </w:rPr>
       </w:pPr>
+      <w:proofErr w:type="gramStart"/>
       <w:r>
         <w:rPr>
           <w:rFonts w:ascii="Cambria" w:hAnsi="Cambria"/>
@@ -4078,8 +5749,9 @@
           <w:sz w:val="22"/>
           <w:szCs w:val="22"/>
         </w:rPr>
-        <w:t>{{ hwc</w:t>
-      </w:r>
+        <w:t xml:space="preserve">{{ </w:t>
+      </w:r>
+      <w:proofErr w:type="spellStart"/>
       <w:r>
         <w:rPr>
           <w:rFonts w:ascii="Cambria" w:hAnsi="Cambria"/>
@@ -4089,37 +5761,31 @@
           <w:sz w:val="22"/>
           <w:szCs w:val="22"/>
         </w:rPr>
-        <w:t>.event_name}}:</w:t>
-      </w:r>
-      <w:r>
-        <w:rPr>
-          <w:rFonts w:ascii="Cambria" w:hAnsi="Cambria"/>
-          <w:bCs w:val="0"/>
-          <w:color w:val="000000"/>
-          <w:sz w:val="22"/>
-          <w:szCs w:val="22"/>
-        </w:rPr>
-        <w:t xml:space="preserve"> {{ </w:t>
-      </w:r>
-      <w:r>
-        <w:rPr>
-          <w:rFonts w:ascii="Cambria" w:hAnsi="Cambria"/>
-          <w:bCs w:val="0"/>
-          <w:color w:val="000000"/>
-          <w:sz w:val="22"/>
-          <w:szCs w:val="22"/>
-        </w:rPr>
         <w:t>hwc</w:t>
       </w:r>
-      <w:r>
-        <w:rPr>
-          <w:rFonts w:ascii="Cambria" w:hAnsi="Cambria"/>
-          <w:bCs w:val="0"/>
-          <w:color w:val="000000"/>
-          <w:sz w:val="22"/>
-          <w:szCs w:val="22"/>
-        </w:rPr>
-        <w:t>.message }}</w:t>
+      <w:proofErr w:type="gramEnd"/>
+      <w:r>
+        <w:rPr>
+          <w:rFonts w:ascii="Cambria" w:hAnsi="Cambria"/>
+          <w:b/>
+          <w:bCs w:val="0"/>
+          <w:color w:val="000000"/>
+          <w:sz w:val="22"/>
+          <w:szCs w:val="22"/>
+        </w:rPr>
+        <w:t>.event_name</w:t>
+      </w:r>
+      <w:proofErr w:type="spellEnd"/>
+      <w:r>
+        <w:rPr>
+          <w:rFonts w:ascii="Cambria" w:hAnsi="Cambria"/>
+          <w:b/>
+          <w:bCs w:val="0"/>
+          <w:color w:val="000000"/>
+          <w:sz w:val="22"/>
+          <w:szCs w:val="22"/>
+        </w:rPr>
+        <w:t>}}</w:t>
       </w:r>
       <w:r>
         <w:rPr>
@@ -4130,19 +5796,100 @@
           <w:szCs w:val="22"/>
         </w:rPr>
         <w:tab/>
-        <w:t>{{ hwc</w:t>
-      </w:r>
-      <w:bookmarkStart w:id="0" w:name="_GoBack"/>
-      <w:bookmarkEnd w:id="0"/>
-      <w:r>
-        <w:rPr>
-          <w:rFonts w:ascii="Cambria" w:hAnsi="Cambria"/>
-          <w:bCs w:val="0"/>
-          <w:color w:val="000000"/>
-          <w:sz w:val="22"/>
-          <w:szCs w:val="22"/>
-        </w:rPr>
-        <w:t>.event_time}}</w:t>
+        <w:t xml:space="preserve">{{ </w:t>
+      </w:r>
+      <w:proofErr w:type="spellStart"/>
+      <w:r>
+        <w:rPr>
+          <w:rFonts w:ascii="Cambria" w:hAnsi="Cambria"/>
+          <w:bCs w:val="0"/>
+          <w:color w:val="000000"/>
+          <w:sz w:val="22"/>
+          <w:szCs w:val="22"/>
+        </w:rPr>
+        <w:t>hwc</w:t>
+      </w:r>
+      <w:r>
+        <w:rPr>
+          <w:rFonts w:ascii="Cambria" w:hAnsi="Cambria"/>
+          <w:bCs w:val="0"/>
+          <w:color w:val="000000"/>
+          <w:sz w:val="22"/>
+          <w:szCs w:val="22"/>
+        </w:rPr>
+        <w:t>.event_time</w:t>
+      </w:r>
+      <w:proofErr w:type="spellEnd"/>
+      <w:r>
+        <w:rPr>
+          <w:rFonts w:ascii="Cambria" w:hAnsi="Cambria"/>
+          <w:bCs w:val="0"/>
+          <w:color w:val="000000"/>
+          <w:sz w:val="22"/>
+          <w:szCs w:val="22"/>
+        </w:rPr>
+        <w:t>}}</w:t>
+      </w:r>
+    </w:p>
+    <w:p>
+      <w:pPr>
+        <w:shd w:val="clear" w:color="auto" w:fill="E2EFD9" w:themeFill="accent6" w:themeFillTint="33"/>
+        <w:tabs>
+          <w:tab w:val="clear" w:pos="2940"/>
+          <w:tab w:val="right" w:pos="9360"/>
+        </w:tabs>
+        <w:spacing w:before="0" w:beforeAutospacing="0" w:after="0"/>
+        <w:rPr>
+          <w:rFonts w:ascii="Cambria" w:hAnsi="Cambria"/>
+          <w:bCs w:val="0"/>
+          <w:color w:val="000000"/>
+          <w:sz w:val="22"/>
+          <w:szCs w:val="22"/>
+        </w:rPr>
+      </w:pPr>
+      <w:proofErr w:type="gramStart"/>
+      <w:r>
+        <w:rPr>
+          <w:rFonts w:ascii="Cambria" w:hAnsi="Cambria"/>
+          <w:bCs w:val="0"/>
+          <w:color w:val="000000"/>
+          <w:sz w:val="22"/>
+          <w:szCs w:val="22"/>
+        </w:rPr>
+        <w:t xml:space="preserve">{{ </w:t>
+      </w:r>
+      <w:proofErr w:type="spellStart"/>
+      <w:r>
+        <w:rPr>
+          <w:rFonts w:ascii="Cambria" w:hAnsi="Cambria"/>
+          <w:bCs w:val="0"/>
+          <w:color w:val="000000"/>
+          <w:sz w:val="22"/>
+          <w:szCs w:val="22"/>
+        </w:rPr>
+        <w:t>hwc</w:t>
+      </w:r>
+      <w:proofErr w:type="gramEnd"/>
+      <w:r>
+        <w:rPr>
+          <w:rFonts w:ascii="Cambria" w:hAnsi="Cambria"/>
+          <w:bCs w:val="0"/>
+          <w:color w:val="000000"/>
+          <w:sz w:val="22"/>
+          <w:szCs w:val="22"/>
+        </w:rPr>
+        <w:t>.message</w:t>
+      </w:r>
+      <w:proofErr w:type="spellEnd"/>
+      <w:r>
+        <w:rPr>
+          <w:rFonts w:ascii="Cambria" w:hAnsi="Cambria"/>
+          <w:bCs w:val="0"/>
+          <w:color w:val="000000"/>
+          <w:sz w:val="22"/>
+          <w:szCs w:val="22"/>
+        </w:rPr>
+        <w:t>}}</w:t>
       </w:r>
     </w:p>
     <w:p>
@@ -4169,27 +5916,53 @@
           <w:sz w:val="22"/>
           <w:szCs w:val="22"/>
         </w:rPr>
-        <w:t xml:space="preserve">{% </w:t>
-      </w:r>
-      <w:r>
-        <w:rPr>
-          <w:rFonts w:ascii="Cambria" w:hAnsi="Cambria"/>
-          <w:bCs w:val="0"/>
-          <w:color w:val="000000"/>
-          <w:sz w:val="22"/>
-          <w:szCs w:val="22"/>
-        </w:rPr>
-        <w:t>for att in hwc</w:t>
-      </w:r>
-      <w:r>
-        <w:rPr>
-          <w:rFonts w:ascii="Cambria" w:hAnsi="Cambria"/>
-          <w:bCs w:val="0"/>
-          <w:color w:val="000000"/>
-          <w:sz w:val="22"/>
-          <w:szCs w:val="22"/>
-        </w:rPr>
-        <w:t>.attributes %}</w:t>
+        <w:t xml:space="preserve">{% for </w:t>
+      </w:r>
+      <w:proofErr w:type="spellStart"/>
+      <w:r>
+        <w:rPr>
+          <w:rFonts w:ascii="Cambria" w:hAnsi="Cambria"/>
+          <w:bCs w:val="0"/>
+          <w:color w:val="000000"/>
+          <w:sz w:val="22"/>
+          <w:szCs w:val="22"/>
+        </w:rPr>
+        <w:t>att</w:t>
+      </w:r>
+      <w:proofErr w:type="spellEnd"/>
+      <w:r>
+        <w:rPr>
+          <w:rFonts w:ascii="Cambria" w:hAnsi="Cambria"/>
+          <w:bCs w:val="0"/>
+          <w:color w:val="000000"/>
+          <w:sz w:val="22"/>
+          <w:szCs w:val="22"/>
+        </w:rPr>
+        <w:t xml:space="preserve"> in </w:t>
+      </w:r>
+      <w:proofErr w:type="spellStart"/>
+      <w:proofErr w:type="gramStart"/>
+      <w:r>
+        <w:rPr>
+          <w:rFonts w:ascii="Cambria" w:hAnsi="Cambria"/>
+          <w:bCs w:val="0"/>
+          <w:color w:val="000000"/>
+          <w:sz w:val="22"/>
+          <w:szCs w:val="22"/>
+        </w:rPr>
+        <w:t>hwc.attributes</w:t>
+      </w:r>
+      <w:proofErr w:type="spellEnd"/>
+      <w:proofErr w:type="gramEnd"/>
+      <w:r>
+        <w:rPr>
+          <w:rFonts w:ascii="Cambria" w:hAnsi="Cambria"/>
+          <w:bCs w:val="0"/>
+          <w:color w:val="000000"/>
+          <w:sz w:val="22"/>
+          <w:szCs w:val="22"/>
+        </w:rPr>
+        <w:t xml:space="preserve"> %}</w:t>
       </w:r>
       <w:r>
         <w:rPr>
@@ -4210,7 +5983,29 @@
           <w:sz w:val="22"/>
           <w:szCs w:val="22"/>
         </w:rPr>
-        <w:t xml:space="preserve"> {{att.value}}</w:t>
+        <w:t xml:space="preserve"> {{</w:t>
+      </w:r>
+      <w:proofErr w:type="spellStart"/>
+      <w:r>
+        <w:rPr>
+          <w:rFonts w:ascii="Cambria" w:hAnsi="Cambria"/>
+          <w:bCs w:val="0"/>
+          <w:color w:val="000000"/>
+          <w:sz w:val="22"/>
+          <w:szCs w:val="22"/>
+        </w:rPr>
+        <w:t>att.value</w:t>
+      </w:r>
+      <w:proofErr w:type="spellEnd"/>
+      <w:r>
+        <w:rPr>
+          <w:rFonts w:ascii="Cambria" w:hAnsi="Cambria"/>
+          <w:bCs w:val="0"/>
+          <w:color w:val="000000"/>
+          <w:sz w:val="22"/>
+          <w:szCs w:val="22"/>
+        </w:rPr>
+        <w:t>}}</w:t>
       </w:r>
     </w:p>
     <w:p>
@@ -4238,7 +6033,32 @@
           <w:sz w:val="22"/>
           <w:szCs w:val="22"/>
         </w:rPr>
-        <w:t>{% endfor %}</w:t>
+        <w:lastRenderedPageBreak/>
+        <w:t xml:space="preserve">{% </w:t>
+      </w:r>
+      <w:proofErr w:type="spellStart"/>
+      <w:r>
+        <w:rPr>
+          <w:rFonts w:ascii="Cambria" w:hAnsi="Cambria"/>
+          <w:b/>
+          <w:bCs w:val="0"/>
+          <w:color w:val="000000"/>
+          <w:sz w:val="22"/>
+          <w:szCs w:val="22"/>
+        </w:rPr>
+        <w:t>endfor</w:t>
+      </w:r>
+      <w:proofErr w:type="spellEnd"/>
+      <w:r>
+        <w:rPr>
+          <w:rFonts w:ascii="Cambria" w:hAnsi="Cambria"/>
+          <w:b/>
+          <w:bCs w:val="0"/>
+          <w:color w:val="000000"/>
+          <w:sz w:val="22"/>
+          <w:szCs w:val="22"/>
+        </w:rPr>
+        <w:t xml:space="preserve"> %}</w:t>
       </w:r>
     </w:p>
     <w:p>
@@ -4264,8 +6084,29 @@
           <w:sz w:val="22"/>
           <w:szCs w:val="22"/>
         </w:rPr>
-        <w:lastRenderedPageBreak/>
-        <w:t>{% endfor %}</w:t>
+        <w:t xml:space="preserve">{% </w:t>
+      </w:r>
+      <w:proofErr w:type="spellStart"/>
+      <w:r>
+        <w:rPr>
+          <w:rFonts w:ascii="Cambria" w:hAnsi="Cambria"/>
+          <w:bCs w:val="0"/>
+          <w:color w:val="000000"/>
+          <w:sz w:val="22"/>
+          <w:szCs w:val="22"/>
+        </w:rPr>
+        <w:t>endfor</w:t>
+      </w:r>
+      <w:proofErr w:type="spellEnd"/>
+      <w:r>
+        <w:rPr>
+          <w:rFonts w:ascii="Cambria" w:hAnsi="Cambria"/>
+          <w:bCs w:val="0"/>
+          <w:color w:val="000000"/>
+          <w:sz w:val="22"/>
+          <w:szCs w:val="22"/>
+        </w:rPr>
+        <w:t xml:space="preserve"> %}</w:t>
       </w:r>
     </w:p>
     <w:p>
@@ -4468,6 +6309,7 @@
         </w:rPr>
         <w:t xml:space="preserve">Rainfall for: </w:t>
       </w:r>
+      <w:proofErr w:type="gramStart"/>
       <w:r>
         <w:rPr>
           <w:rFonts w:ascii="Cambria" w:hAnsi="Cambria"/>
@@ -4488,8 +6330,9 @@
           <w:sz w:val="22"/>
           <w:szCs w:val="22"/>
         </w:rPr>
-        <w:t xml:space="preserve"> conservancy.</w:t>
-      </w:r>
+        <w:t xml:space="preserve"> </w:t>
+      </w:r>
+      <w:proofErr w:type="spellStart"/>
       <w:r>
         <w:rPr>
           <w:rFonts w:ascii="Cambria" w:hAnsi="Cambria"/>
@@ -4501,6 +6344,7 @@
         </w:rPr>
         <w:t>conservancy</w:t>
       </w:r>
+      <w:proofErr w:type="gramEnd"/>
       <w:r>
         <w:rPr>
           <w:rFonts w:ascii="Cambria" w:hAnsi="Cambria"/>
@@ -4510,6 +6354,29 @@
           <w:sz w:val="22"/>
           <w:szCs w:val="22"/>
         </w:rPr>
+        <w:t>.</w:t>
+      </w:r>
+      <w:r>
+        <w:rPr>
+          <w:rFonts w:ascii="Cambria" w:hAnsi="Cambria"/>
+          <w:b/>
+          <w:bCs w:val="0"/>
+          <w:color w:val="000000"/>
+          <w:sz w:val="22"/>
+          <w:szCs w:val="22"/>
+        </w:rPr>
+        <w:t>conservancy</w:t>
+      </w:r>
+      <w:proofErr w:type="spellEnd"/>
+      <w:r>
+        <w:rPr>
+          <w:rFonts w:ascii="Cambria" w:hAnsi="Cambria"/>
+          <w:b/>
+          <w:bCs w:val="0"/>
+          <w:color w:val="000000"/>
+          <w:sz w:val="22"/>
+          <w:szCs w:val="22"/>
+        </w:rPr>
         <w:t xml:space="preserve"> </w:t>
       </w:r>
       <w:r>
@@ -4531,17 +6398,39 @@
           <w:sz w:val="22"/>
           <w:szCs w:val="22"/>
         </w:rPr>
-        <w:t>{% if conservancy.rainfa</w:t>
-      </w:r>
-      <w:r>
-        <w:rPr>
-          <w:rFonts w:ascii="Cambria" w:hAnsi="Cambria"/>
-          <w:bCs w:val="0"/>
-          <w:color w:val="000000"/>
-          <w:sz w:val="22"/>
-          <w:szCs w:val="22"/>
-        </w:rPr>
-        <w:t>ll %}</w:t>
+        <w:t xml:space="preserve">{% if </w:t>
+      </w:r>
+      <w:proofErr w:type="spellStart"/>
+      <w:r>
+        <w:rPr>
+          <w:rFonts w:ascii="Cambria" w:hAnsi="Cambria"/>
+          <w:bCs w:val="0"/>
+          <w:color w:val="000000"/>
+          <w:sz w:val="22"/>
+          <w:szCs w:val="22"/>
+        </w:rPr>
+        <w:t>conservancy.rainfa</w:t>
+      </w:r>
+      <w:r>
+        <w:rPr>
+          <w:rFonts w:ascii="Cambria" w:hAnsi="Cambria"/>
+          <w:bCs w:val="0"/>
+          <w:color w:val="000000"/>
+          <w:sz w:val="22"/>
+          <w:szCs w:val="22"/>
+        </w:rPr>
+        <w:t>ll</w:t>
+      </w:r>
+      <w:proofErr w:type="spellEnd"/>
+      <w:r>
+        <w:rPr>
+          <w:rFonts w:ascii="Cambria" w:hAnsi="Cambria"/>
+          <w:bCs w:val="0"/>
+          <w:color w:val="000000"/>
+          <w:sz w:val="22"/>
+          <w:szCs w:val="22"/>
+        </w:rPr>
+        <w:t xml:space="preserve"> %}</w:t>
       </w:r>
     </w:p>
     <w:tbl>
@@ -4646,7 +6535,51 @@
                 <w:sz w:val="22"/>
                 <w:szCs w:val="22"/>
               </w:rPr>
-              <w:t>{%tr for item in conservancy.rainfall %}</w:t>
+              <w:t>{%</w:t>
+            </w:r>
+            <w:proofErr w:type="spellStart"/>
+            <w:r>
+              <w:rPr>
+                <w:rFonts w:ascii="Cambria" w:hAnsi="Cambria"/>
+                <w:b w:val="0"/>
+                <w:color w:val="000000"/>
+                <w:sz w:val="22"/>
+                <w:szCs w:val="22"/>
+              </w:rPr>
+              <w:t>tr</w:t>
+            </w:r>
+            <w:proofErr w:type="spellEnd"/>
+            <w:r>
+              <w:rPr>
+                <w:rFonts w:ascii="Cambria" w:hAnsi="Cambria"/>
+                <w:b w:val="0"/>
+                <w:color w:val="000000"/>
+                <w:sz w:val="22"/>
+                <w:szCs w:val="22"/>
+              </w:rPr>
+              <w:t xml:space="preserve"> for item in </w:t>
+            </w:r>
+            <w:proofErr w:type="spellStart"/>
+            <w:r>
+              <w:rPr>
+                <w:rFonts w:ascii="Cambria" w:hAnsi="Cambria"/>
+                <w:b w:val="0"/>
+                <w:color w:val="000000"/>
+                <w:sz w:val="22"/>
+                <w:szCs w:val="22"/>
+              </w:rPr>
+              <w:t>conservancy.rainfall</w:t>
+            </w:r>
+            <w:proofErr w:type="spellEnd"/>
+            <w:r>
+              <w:rPr>
+                <w:rFonts w:ascii="Cambria" w:hAnsi="Cambria"/>
+                <w:b w:val="0"/>
+                <w:color w:val="000000"/>
+                <w:sz w:val="22"/>
+                <w:szCs w:val="22"/>
+              </w:rPr>
+              <w:t xml:space="preserve"> %}</w:t>
             </w:r>
           </w:p>
         </w:tc>
@@ -4707,7 +6640,29 @@
                 <w:sz w:val="22"/>
                 <w:szCs w:val="22"/>
               </w:rPr>
-              <w:t>{{ item.station }}</w:t>
+              <w:t xml:space="preserve">{{ </w:t>
+            </w:r>
+            <w:proofErr w:type="spellStart"/>
+            <w:r>
+              <w:rPr>
+                <w:rFonts w:ascii="Cambria" w:hAnsi="Cambria"/>
+                <w:b w:val="0"/>
+                <w:color w:val="000000"/>
+                <w:sz w:val="22"/>
+                <w:szCs w:val="22"/>
+              </w:rPr>
+              <w:t>item.station</w:t>
+            </w:r>
+            <w:proofErr w:type="spellEnd"/>
+            <w:r>
+              <w:rPr>
+                <w:rFonts w:ascii="Cambria" w:hAnsi="Cambria"/>
+                <w:b w:val="0"/>
+                <w:color w:val="000000"/>
+                <w:sz w:val="22"/>
+                <w:szCs w:val="22"/>
+              </w:rPr>
+              <w:t xml:space="preserve"> }}</w:t>
             </w:r>
           </w:p>
         </w:tc>
@@ -4738,7 +6693,27 @@
                 <w:sz w:val="22"/>
                 <w:szCs w:val="22"/>
               </w:rPr>
-              <w:t>{{ item.total_mm }}</w:t>
+              <w:t xml:space="preserve">{{ </w:t>
+            </w:r>
+            <w:proofErr w:type="spellStart"/>
+            <w:r>
+              <w:rPr>
+                <w:rFonts w:ascii="Cambria" w:hAnsi="Cambria"/>
+                <w:color w:val="000000"/>
+                <w:sz w:val="22"/>
+                <w:szCs w:val="22"/>
+              </w:rPr>
+              <w:t>item.total_mm</w:t>
+            </w:r>
+            <w:proofErr w:type="spellEnd"/>
+            <w:r>
+              <w:rPr>
+                <w:rFonts w:ascii="Cambria" w:hAnsi="Cambria"/>
+                <w:color w:val="000000"/>
+                <w:sz w:val="22"/>
+                <w:szCs w:val="22"/>
+              </w:rPr>
+              <w:t xml:space="preserve"> }}</w:t>
             </w:r>
           </w:p>
         </w:tc>
@@ -4777,7 +6752,51 @@
                 <w:sz w:val="22"/>
                 <w:szCs w:val="22"/>
               </w:rPr>
-              <w:t>{%tr endfor %}</w:t>
+              <w:t>{%</w:t>
+            </w:r>
+            <w:proofErr w:type="spellStart"/>
+            <w:r>
+              <w:rPr>
+                <w:rFonts w:ascii="Cambria" w:hAnsi="Cambria"/>
+                <w:b w:val="0"/>
+                <w:color w:val="000000"/>
+                <w:sz w:val="22"/>
+                <w:szCs w:val="22"/>
+              </w:rPr>
+              <w:t>tr</w:t>
+            </w:r>
+            <w:proofErr w:type="spellEnd"/>
+            <w:r>
+              <w:rPr>
+                <w:rFonts w:ascii="Cambria" w:hAnsi="Cambria"/>
+                <w:b w:val="0"/>
+                <w:color w:val="000000"/>
+                <w:sz w:val="22"/>
+                <w:szCs w:val="22"/>
+              </w:rPr>
+              <w:t xml:space="preserve"> </w:t>
+            </w:r>
+            <w:proofErr w:type="spellStart"/>
+            <w:r>
+              <w:rPr>
+                <w:rFonts w:ascii="Cambria" w:hAnsi="Cambria"/>
+                <w:b w:val="0"/>
+                <w:color w:val="000000"/>
+                <w:sz w:val="22"/>
+                <w:szCs w:val="22"/>
+              </w:rPr>
+              <w:t>endfor</w:t>
+            </w:r>
+            <w:proofErr w:type="spellEnd"/>
+            <w:r>
+              <w:rPr>
+                <w:rFonts w:ascii="Cambria" w:hAnsi="Cambria"/>
+                <w:b w:val="0"/>
+                <w:color w:val="000000"/>
+                <w:sz w:val="22"/>
+                <w:szCs w:val="22"/>
+              </w:rPr>
+              <w:t xml:space="preserve"> %}</w:t>
             </w:r>
           </w:p>
         </w:tc>
@@ -4886,7 +6905,29 @@
           <w:sz w:val="22"/>
           <w:szCs w:val="22"/>
         </w:rPr>
-        <w:t>{% endif %}</w:t>
+        <w:t xml:space="preserve">{% </w:t>
+      </w:r>
+      <w:proofErr w:type="spellStart"/>
+      <w:r>
+        <w:rPr>
+          <w:rFonts w:ascii="Cambria" w:hAnsi="Cambria"/>
+          <w:bCs w:val="0"/>
+          <w:color w:val="000000"/>
+          <w:sz w:val="22"/>
+          <w:szCs w:val="22"/>
+        </w:rPr>
+        <w:t>endif</w:t>
+      </w:r>
+      <w:proofErr w:type="spellEnd"/>
+      <w:r>
+        <w:rPr>
+          <w:rFonts w:ascii="Cambria" w:hAnsi="Cambria"/>
+          <w:bCs w:val="0"/>
+          <w:color w:val="000000"/>
+          <w:sz w:val="22"/>
+          <w:szCs w:val="22"/>
+        </w:rPr>
+        <w:t xml:space="preserve"> %}</w:t>
       </w:r>
     </w:p>
     <w:p>
@@ -4924,15 +6965,27 @@
         </w:rPr>
         <w:t xml:space="preserve"> </w:t>
       </w:r>
-      <w:r>
-        <w:rPr>
-          <w:rFonts w:ascii="Cambria" w:hAnsi="Cambria"/>
-          <w:bCs w:val="0"/>
-          <w:color w:val="000000"/>
-          <w:sz w:val="22"/>
-          <w:szCs w:val="22"/>
-        </w:rPr>
-        <w:t>endfor%}</w:t>
+      <w:proofErr w:type="spellStart"/>
+      <w:r>
+        <w:rPr>
+          <w:rFonts w:ascii="Cambria" w:hAnsi="Cambria"/>
+          <w:bCs w:val="0"/>
+          <w:color w:val="000000"/>
+          <w:sz w:val="22"/>
+          <w:szCs w:val="22"/>
+        </w:rPr>
+        <w:t>endfor</w:t>
+      </w:r>
+      <w:proofErr w:type="spellEnd"/>
+      <w:r>
+        <w:rPr>
+          <w:rFonts w:ascii="Cambria" w:hAnsi="Cambria"/>
+          <w:bCs w:val="0"/>
+          <w:color w:val="000000"/>
+          <w:sz w:val="22"/>
+          <w:szCs w:val="22"/>
+        </w:rPr>
+        <w:t>%}</w:t>
       </w:r>
     </w:p>
     <w:p>
@@ -5037,7 +7090,29 @@
           <w:sz w:val="22"/>
           <w:szCs w:val="22"/>
         </w:rPr>
-        <w:t>{% for se in security_events %}</w:t>
+        <w:t xml:space="preserve">{% for se in </w:t>
+      </w:r>
+      <w:proofErr w:type="spellStart"/>
+      <w:r>
+        <w:rPr>
+          <w:rFonts w:ascii="Cambria" w:hAnsi="Cambria"/>
+          <w:bCs w:val="0"/>
+          <w:color w:val="000000"/>
+          <w:sz w:val="22"/>
+          <w:szCs w:val="22"/>
+        </w:rPr>
+        <w:t>security_events</w:t>
+      </w:r>
+      <w:proofErr w:type="spellEnd"/>
+      <w:r>
+        <w:rPr>
+          <w:rFonts w:ascii="Cambria" w:hAnsi="Cambria"/>
+          <w:bCs w:val="0"/>
+          <w:color w:val="000000"/>
+          <w:sz w:val="22"/>
+          <w:szCs w:val="22"/>
+        </w:rPr>
+        <w:t xml:space="preserve"> %}</w:t>
       </w:r>
     </w:p>
     <w:p>
@@ -5056,6 +7131,7 @@
           <w:szCs w:val="22"/>
         </w:rPr>
       </w:pPr>
+      <w:proofErr w:type="gramStart"/>
       <w:r>
         <w:rPr>
           <w:rFonts w:ascii="Cambria" w:hAnsi="Cambria"/>
@@ -5065,37 +7141,43 @@
           <w:sz w:val="22"/>
           <w:szCs w:val="22"/>
         </w:rPr>
-        <w:t>{{ se.event_name}}:</w:t>
-      </w:r>
-      <w:r>
-        <w:rPr>
-          <w:rFonts w:ascii="Cambria" w:hAnsi="Cambria"/>
-          <w:bCs w:val="0"/>
-          <w:color w:val="000000"/>
-          <w:sz w:val="22"/>
-          <w:szCs w:val="22"/>
-        </w:rPr>
-        <w:t xml:space="preserve"> </w:t>
-      </w:r>
-      <w:r>
-        <w:rPr>
-          <w:rFonts w:ascii="Cambria" w:hAnsi="Cambria"/>
-          <w:bCs w:val="0"/>
-          <w:color w:val="000000"/>
-          <w:sz w:val="22"/>
-          <w:szCs w:val="22"/>
-        </w:rPr>
-        <w:t>{{ se.</w:t>
-      </w:r>
-      <w:r>
-        <w:rPr>
-          <w:rFonts w:ascii="Cambria" w:hAnsi="Cambria"/>
-          <w:bCs w:val="0"/>
-          <w:color w:val="000000"/>
-          <w:sz w:val="22"/>
-          <w:szCs w:val="22"/>
-        </w:rPr>
-        <w:t>message }}</w:t>
+        <w:t xml:space="preserve">{{ </w:t>
+      </w:r>
+      <w:proofErr w:type="spellStart"/>
+      <w:r>
+        <w:rPr>
+          <w:rFonts w:ascii="Cambria" w:hAnsi="Cambria"/>
+          <w:b/>
+          <w:bCs w:val="0"/>
+          <w:color w:val="000000"/>
+          <w:sz w:val="22"/>
+          <w:szCs w:val="22"/>
+        </w:rPr>
+        <w:t>se</w:t>
+      </w:r>
+      <w:proofErr w:type="gramEnd"/>
+      <w:r>
+        <w:rPr>
+          <w:rFonts w:ascii="Cambria" w:hAnsi="Cambria"/>
+          <w:b/>
+          <w:bCs w:val="0"/>
+          <w:color w:val="000000"/>
+          <w:sz w:val="22"/>
+          <w:szCs w:val="22"/>
+        </w:rPr>
+        <w:t>.event_name</w:t>
+      </w:r>
+      <w:proofErr w:type="spellEnd"/>
+      <w:r>
+        <w:rPr>
+          <w:rFonts w:ascii="Cambria" w:hAnsi="Cambria"/>
+          <w:b/>
+          <w:bCs w:val="0"/>
+          <w:color w:val="000000"/>
+          <w:sz w:val="22"/>
+          <w:szCs w:val="22"/>
+        </w:rPr>
+        <w:t>}}</w:t>
       </w:r>
       <w:r>
         <w:rPr>
@@ -5106,7 +7188,92 @@
           <w:szCs w:val="22"/>
         </w:rPr>
         <w:tab/>
-        <w:t>{{ se.event_time}}</w:t>
+        <w:t xml:space="preserve">{{ </w:t>
+      </w:r>
+      <w:proofErr w:type="spellStart"/>
+      <w:r>
+        <w:rPr>
+          <w:rFonts w:ascii="Cambria" w:hAnsi="Cambria"/>
+          <w:bCs w:val="0"/>
+          <w:color w:val="000000"/>
+          <w:sz w:val="22"/>
+          <w:szCs w:val="22"/>
+        </w:rPr>
+        <w:t>se.event_time</w:t>
+      </w:r>
+      <w:proofErr w:type="spellEnd"/>
+      <w:r>
+        <w:rPr>
+          <w:rFonts w:ascii="Cambria" w:hAnsi="Cambria"/>
+          <w:bCs w:val="0"/>
+          <w:color w:val="000000"/>
+          <w:sz w:val="22"/>
+          <w:szCs w:val="22"/>
+        </w:rPr>
+        <w:t>}}</w:t>
+      </w:r>
+    </w:p>
+    <w:p>
+      <w:pPr>
+        <w:shd w:val="clear" w:color="auto" w:fill="E2EFD9" w:themeFill="accent6" w:themeFillTint="33"/>
+        <w:tabs>
+          <w:tab w:val="clear" w:pos="2940"/>
+          <w:tab w:val="right" w:pos="9360"/>
+        </w:tabs>
+        <w:spacing w:before="0" w:beforeAutospacing="0" w:after="0"/>
+        <w:rPr>
+          <w:rFonts w:ascii="Cambria" w:hAnsi="Cambria"/>
+          <w:bCs w:val="0"/>
+          <w:color w:val="000000"/>
+          <w:sz w:val="22"/>
+          <w:szCs w:val="22"/>
+        </w:rPr>
+      </w:pPr>
+      <w:bookmarkStart w:id="0" w:name="_GoBack"/>
+      <w:bookmarkEnd w:id="0"/>
+      <w:proofErr w:type="gramStart"/>
+      <w:r>
+        <w:rPr>
+          <w:rFonts w:ascii="Cambria" w:hAnsi="Cambria"/>
+          <w:bCs w:val="0"/>
+          <w:color w:val="000000"/>
+          <w:sz w:val="22"/>
+          <w:szCs w:val="22"/>
+        </w:rPr>
+        <w:t xml:space="preserve">{{ </w:t>
+      </w:r>
+      <w:proofErr w:type="spellStart"/>
+      <w:r>
+        <w:rPr>
+          <w:rFonts w:ascii="Cambria" w:hAnsi="Cambria"/>
+          <w:bCs w:val="0"/>
+          <w:color w:val="000000"/>
+          <w:sz w:val="22"/>
+          <w:szCs w:val="22"/>
+        </w:rPr>
+        <w:t>se</w:t>
+      </w:r>
+      <w:proofErr w:type="gramEnd"/>
+      <w:r>
+        <w:rPr>
+          <w:rFonts w:ascii="Cambria" w:hAnsi="Cambria"/>
+          <w:bCs w:val="0"/>
+          <w:color w:val="000000"/>
+          <w:sz w:val="22"/>
+          <w:szCs w:val="22"/>
+        </w:rPr>
+        <w:t>.message</w:t>
+      </w:r>
+      <w:proofErr w:type="spellEnd"/>
+      <w:r>
+        <w:rPr>
+          <w:rFonts w:ascii="Cambria" w:hAnsi="Cambria"/>
+          <w:bCs w:val="0"/>
+          <w:color w:val="000000"/>
+          <w:sz w:val="22"/>
+          <w:szCs w:val="22"/>
+        </w:rPr>
+        <w:t xml:space="preserve"> }}</w:t>
       </w:r>
     </w:p>
     <w:p>
@@ -5143,7 +7310,53 @@
           <w:sz w:val="22"/>
           <w:szCs w:val="22"/>
         </w:rPr>
-        <w:t>for att in se.attributes %}</w:t>
+        <w:t xml:space="preserve">for </w:t>
+      </w:r>
+      <w:proofErr w:type="spellStart"/>
+      <w:r>
+        <w:rPr>
+          <w:rFonts w:ascii="Cambria" w:hAnsi="Cambria"/>
+          <w:bCs w:val="0"/>
+          <w:color w:val="000000"/>
+          <w:sz w:val="22"/>
+          <w:szCs w:val="22"/>
+        </w:rPr>
+        <w:t>att</w:t>
+      </w:r>
+      <w:proofErr w:type="spellEnd"/>
+      <w:r>
+        <w:rPr>
+          <w:rFonts w:ascii="Cambria" w:hAnsi="Cambria"/>
+          <w:bCs w:val="0"/>
+          <w:color w:val="000000"/>
+          <w:sz w:val="22"/>
+          <w:szCs w:val="22"/>
+        </w:rPr>
+        <w:t xml:space="preserve"> in </w:t>
+      </w:r>
+      <w:proofErr w:type="spellStart"/>
+      <w:proofErr w:type="gramStart"/>
+      <w:r>
+        <w:rPr>
+          <w:rFonts w:ascii="Cambria" w:hAnsi="Cambria"/>
+          <w:bCs w:val="0"/>
+          <w:color w:val="000000"/>
+          <w:sz w:val="22"/>
+          <w:szCs w:val="22"/>
+        </w:rPr>
+        <w:t>se.attributes</w:t>
+      </w:r>
+      <w:proofErr w:type="spellEnd"/>
+      <w:proofErr w:type="gramEnd"/>
+      <w:r>
+        <w:rPr>
+          <w:rFonts w:ascii="Cambria" w:hAnsi="Cambria"/>
+          <w:bCs w:val="0"/>
+          <w:color w:val="000000"/>
+          <w:sz w:val="22"/>
+          <w:szCs w:val="22"/>
+        </w:rPr>
+        <w:t xml:space="preserve"> %}</w:t>
       </w:r>
       <w:r>
         <w:rPr>
@@ -5164,7 +7377,29 @@
           <w:sz w:val="22"/>
           <w:szCs w:val="22"/>
         </w:rPr>
-        <w:t xml:space="preserve"> {{att.value}}</w:t>
+        <w:t xml:space="preserve"> {{</w:t>
+      </w:r>
+      <w:proofErr w:type="spellStart"/>
+      <w:r>
+        <w:rPr>
+          <w:rFonts w:ascii="Cambria" w:hAnsi="Cambria"/>
+          <w:bCs w:val="0"/>
+          <w:color w:val="000000"/>
+          <w:sz w:val="22"/>
+          <w:szCs w:val="22"/>
+        </w:rPr>
+        <w:t>att.value</w:t>
+      </w:r>
+      <w:proofErr w:type="spellEnd"/>
+      <w:r>
+        <w:rPr>
+          <w:rFonts w:ascii="Cambria" w:hAnsi="Cambria"/>
+          <w:bCs w:val="0"/>
+          <w:color w:val="000000"/>
+          <w:sz w:val="22"/>
+          <w:szCs w:val="22"/>
+        </w:rPr>
+        <w:t>}}</w:t>
       </w:r>
     </w:p>
     <w:p>
@@ -5192,7 +7427,31 @@
           <w:sz w:val="22"/>
           <w:szCs w:val="22"/>
         </w:rPr>
-        <w:t>{% endfor %}</w:t>
+        <w:t xml:space="preserve">{% </w:t>
+      </w:r>
+      <w:proofErr w:type="spellStart"/>
+      <w:r>
+        <w:rPr>
+          <w:rFonts w:ascii="Cambria" w:hAnsi="Cambria"/>
+          <w:b/>
+          <w:bCs w:val="0"/>
+          <w:color w:val="000000"/>
+          <w:sz w:val="22"/>
+          <w:szCs w:val="22"/>
+        </w:rPr>
+        <w:t>endfor</w:t>
+      </w:r>
+      <w:proofErr w:type="spellEnd"/>
+      <w:r>
+        <w:rPr>
+          <w:rFonts w:ascii="Cambria" w:hAnsi="Cambria"/>
+          <w:b/>
+          <w:bCs w:val="0"/>
+          <w:color w:val="000000"/>
+          <w:sz w:val="22"/>
+          <w:szCs w:val="22"/>
+        </w:rPr>
+        <w:t xml:space="preserve"> %}</w:t>
       </w:r>
     </w:p>
     <w:p>
@@ -5218,7 +7477,29 @@
           <w:sz w:val="22"/>
           <w:szCs w:val="22"/>
         </w:rPr>
-        <w:t>{% endfor %}</w:t>
+        <w:t xml:space="preserve">{% </w:t>
+      </w:r>
+      <w:proofErr w:type="spellStart"/>
+      <w:r>
+        <w:rPr>
+          <w:rFonts w:ascii="Cambria" w:hAnsi="Cambria"/>
+          <w:bCs w:val="0"/>
+          <w:color w:val="000000"/>
+          <w:sz w:val="22"/>
+          <w:szCs w:val="22"/>
+        </w:rPr>
+        <w:t>endfor</w:t>
+      </w:r>
+      <w:proofErr w:type="spellEnd"/>
+      <w:r>
+        <w:rPr>
+          <w:rFonts w:ascii="Cambria" w:hAnsi="Cambria"/>
+          <w:bCs w:val="0"/>
+          <w:color w:val="000000"/>
+          <w:sz w:val="22"/>
+          <w:szCs w:val="22"/>
+        </w:rPr>
+        <w:t xml:space="preserve"> %}</w:t>
       </w:r>
     </w:p>
     <w:p>
@@ -5261,8 +7542,9 @@
           <w:sz w:val="22"/>
           <w:szCs w:val="22"/>
         </w:rPr>
-        <w:t>Fence Break</w:t>
-      </w:r>
+        <w:t xml:space="preserve">Fence </w:t>
+      </w:r>
+      <w:proofErr w:type="gramStart"/>
       <w:r>
         <w:rPr>
           <w:rFonts w:ascii="Cambria" w:hAnsi="Cambria"/>
@@ -5271,6 +7553,16 @@
           <w:sz w:val="22"/>
           <w:szCs w:val="22"/>
         </w:rPr>
+        <w:t>Break</w:t>
+      </w:r>
+      <w:r>
+        <w:rPr>
+          <w:rFonts w:ascii="Cambria" w:hAnsi="Cambria"/>
+          <w:b/>
+          <w:color w:val="000000"/>
+          <w:sz w:val="22"/>
+          <w:szCs w:val="22"/>
+        </w:rPr>
         <w:t>age</w:t>
       </w:r>
       <w:r>
@@ -5291,7 +7583,40 @@
           <w:sz w:val="22"/>
           <w:szCs w:val="22"/>
         </w:rPr>
-        <w:t>{% if fence_breakage %}</w:t>
+        <w:t>{</w:t>
+      </w:r>
+      <w:proofErr w:type="gramEnd"/>
+      <w:r>
+        <w:rPr>
+          <w:rFonts w:ascii="Cambria" w:hAnsi="Cambria"/>
+          <w:bCs w:val="0"/>
+          <w:color w:val="000000"/>
+          <w:sz w:val="22"/>
+          <w:szCs w:val="22"/>
+        </w:rPr>
+        <w:t xml:space="preserve">% if </w:t>
+      </w:r>
+      <w:proofErr w:type="spellStart"/>
+      <w:r>
+        <w:rPr>
+          <w:rFonts w:ascii="Cambria" w:hAnsi="Cambria"/>
+          <w:bCs w:val="0"/>
+          <w:color w:val="000000"/>
+          <w:sz w:val="22"/>
+          <w:szCs w:val="22"/>
+        </w:rPr>
+        <w:t>fence_breakage</w:t>
+      </w:r>
+      <w:proofErr w:type="spellEnd"/>
+      <w:r>
+        <w:rPr>
+          <w:rFonts w:ascii="Cambria" w:hAnsi="Cambria"/>
+          <w:bCs w:val="0"/>
+          <w:color w:val="000000"/>
+          <w:sz w:val="22"/>
+          <w:szCs w:val="22"/>
+        </w:rPr>
+        <w:t xml:space="preserve"> %}</w:t>
       </w:r>
     </w:p>
     <w:p>
@@ -5505,8 +7830,18 @@
                 <w:sz w:val="22"/>
                 <w:szCs w:val="22"/>
               </w:rPr>
-              <w:t>Logistics Feeback</w:t>
-            </w:r>
+              <w:t xml:space="preserve">Logistics </w:t>
+            </w:r>
+            <w:proofErr w:type="spellStart"/>
+            <w:r>
+              <w:rPr>
+                <w:rFonts w:ascii="Calibri" w:hAnsi="Calibri"/>
+                <w:sz w:val="22"/>
+                <w:szCs w:val="22"/>
+              </w:rPr>
+              <w:t>Feeback</w:t>
+            </w:r>
+            <w:proofErr w:type="spellEnd"/>
           </w:p>
         </w:tc>
       </w:tr>
@@ -5544,7 +7879,51 @@
                 <w:sz w:val="22"/>
                 <w:szCs w:val="22"/>
               </w:rPr>
-              <w:t>{%tr for item in fence_breakage %}</w:t>
+              <w:t>{%</w:t>
+            </w:r>
+            <w:proofErr w:type="spellStart"/>
+            <w:r>
+              <w:rPr>
+                <w:rFonts w:ascii="Cambria" w:hAnsi="Cambria"/>
+                <w:b w:val="0"/>
+                <w:color w:val="000000"/>
+                <w:sz w:val="22"/>
+                <w:szCs w:val="22"/>
+              </w:rPr>
+              <w:t>tr</w:t>
+            </w:r>
+            <w:proofErr w:type="spellEnd"/>
+            <w:r>
+              <w:rPr>
+                <w:rFonts w:ascii="Cambria" w:hAnsi="Cambria"/>
+                <w:b w:val="0"/>
+                <w:color w:val="000000"/>
+                <w:sz w:val="22"/>
+                <w:szCs w:val="22"/>
+              </w:rPr>
+              <w:t xml:space="preserve"> for item in </w:t>
+            </w:r>
+            <w:proofErr w:type="spellStart"/>
+            <w:r>
+              <w:rPr>
+                <w:rFonts w:ascii="Cambria" w:hAnsi="Cambria"/>
+                <w:b w:val="0"/>
+                <w:color w:val="000000"/>
+                <w:sz w:val="22"/>
+                <w:szCs w:val="22"/>
+              </w:rPr>
+              <w:t>fence_breakage</w:t>
+            </w:r>
+            <w:proofErr w:type="spellEnd"/>
+            <w:r>
+              <w:rPr>
+                <w:rFonts w:ascii="Cambria" w:hAnsi="Cambria"/>
+                <w:b w:val="0"/>
+                <w:color w:val="000000"/>
+                <w:sz w:val="22"/>
+                <w:szCs w:val="22"/>
+              </w:rPr>
+              <w:t xml:space="preserve"> %}</w:t>
             </w:r>
           </w:p>
         </w:tc>
@@ -5578,7 +7957,29 @@
                 <w:sz w:val="22"/>
                 <w:szCs w:val="22"/>
               </w:rPr>
-              <w:t>{{ item.time }}</w:t>
+              <w:t xml:space="preserve">{{ </w:t>
+            </w:r>
+            <w:proofErr w:type="spellStart"/>
+            <w:r>
+              <w:rPr>
+                <w:rFonts w:ascii="Cambria" w:hAnsi="Cambria"/>
+                <w:b w:val="0"/>
+                <w:color w:val="000000"/>
+                <w:sz w:val="22"/>
+                <w:szCs w:val="22"/>
+              </w:rPr>
+              <w:t>item.time</w:t>
+            </w:r>
+            <w:proofErr w:type="spellEnd"/>
+            <w:r>
+              <w:rPr>
+                <w:rFonts w:ascii="Cambria" w:hAnsi="Cambria"/>
+                <w:b w:val="0"/>
+                <w:color w:val="000000"/>
+                <w:sz w:val="22"/>
+                <w:szCs w:val="22"/>
+              </w:rPr>
+              <w:t xml:space="preserve"> }}</w:t>
             </w:r>
           </w:p>
         </w:tc>
@@ -5608,7 +8009,27 @@
                 <w:sz w:val="22"/>
                 <w:szCs w:val="22"/>
               </w:rPr>
-              <w:t>{{item.section }}</w:t>
+              <w:t>{{</w:t>
+            </w:r>
+            <w:proofErr w:type="spellStart"/>
+            <w:r>
+              <w:rPr>
+                <w:rFonts w:ascii="Cambria" w:hAnsi="Cambria"/>
+                <w:color w:val="000000"/>
+                <w:sz w:val="22"/>
+                <w:szCs w:val="22"/>
+              </w:rPr>
+              <w:t>item.section</w:t>
+            </w:r>
+            <w:proofErr w:type="spellEnd"/>
+            <w:r>
+              <w:rPr>
+                <w:rFonts w:ascii="Cambria" w:hAnsi="Cambria"/>
+                <w:color w:val="000000"/>
+                <w:sz w:val="22"/>
+                <w:szCs w:val="22"/>
+              </w:rPr>
+              <w:t xml:space="preserve"> }}</w:t>
             </w:r>
           </w:p>
         </w:tc>
@@ -5638,7 +8059,27 @@
                 <w:sz w:val="22"/>
                 <w:szCs w:val="22"/>
               </w:rPr>
-              <w:t>{{ item.species }}</w:t>
+              <w:t xml:space="preserve">{{ </w:t>
+            </w:r>
+            <w:proofErr w:type="spellStart"/>
+            <w:r>
+              <w:rPr>
+                <w:rFonts w:ascii="Cambria" w:hAnsi="Cambria"/>
+                <w:color w:val="000000"/>
+                <w:sz w:val="22"/>
+                <w:szCs w:val="22"/>
+              </w:rPr>
+              <w:t>item.species</w:t>
+            </w:r>
+            <w:proofErr w:type="spellEnd"/>
+            <w:r>
+              <w:rPr>
+                <w:rFonts w:ascii="Cambria" w:hAnsi="Cambria"/>
+                <w:color w:val="000000"/>
+                <w:sz w:val="22"/>
+                <w:szCs w:val="22"/>
+              </w:rPr>
+              <w:t xml:space="preserve"> }}</w:t>
             </w:r>
           </w:p>
         </w:tc>
@@ -5668,7 +8109,27 @@
                 <w:sz w:val="22"/>
                 <w:szCs w:val="22"/>
               </w:rPr>
-              <w:t>{{ item.animal_name}}</w:t>
+              <w:t xml:space="preserve">{{ </w:t>
+            </w:r>
+            <w:proofErr w:type="spellStart"/>
+            <w:r>
+              <w:rPr>
+                <w:rFonts w:ascii="Cambria" w:hAnsi="Cambria"/>
+                <w:color w:val="000000"/>
+                <w:sz w:val="22"/>
+                <w:szCs w:val="22"/>
+              </w:rPr>
+              <w:t>item.animal_name</w:t>
+            </w:r>
+            <w:proofErr w:type="spellEnd"/>
+            <w:r>
+              <w:rPr>
+                <w:rFonts w:ascii="Cambria" w:hAnsi="Cambria"/>
+                <w:color w:val="000000"/>
+                <w:sz w:val="22"/>
+                <w:szCs w:val="22"/>
+              </w:rPr>
+              <w:t>}}</w:t>
             </w:r>
           </w:p>
         </w:tc>
@@ -5698,7 +8159,27 @@
                 <w:sz w:val="22"/>
                 <w:szCs w:val="22"/>
               </w:rPr>
-              <w:t>{{ item.reported_by}}</w:t>
+              <w:t xml:space="preserve">{{ </w:t>
+            </w:r>
+            <w:proofErr w:type="spellStart"/>
+            <w:r>
+              <w:rPr>
+                <w:rFonts w:ascii="Cambria" w:hAnsi="Cambria"/>
+                <w:color w:val="000000"/>
+                <w:sz w:val="22"/>
+                <w:szCs w:val="22"/>
+              </w:rPr>
+              <w:t>item.reported_by</w:t>
+            </w:r>
+            <w:proofErr w:type="spellEnd"/>
+            <w:r>
+              <w:rPr>
+                <w:rFonts w:ascii="Cambria" w:hAnsi="Cambria"/>
+                <w:color w:val="000000"/>
+                <w:sz w:val="22"/>
+                <w:szCs w:val="22"/>
+              </w:rPr>
+              <w:t>}}</w:t>
             </w:r>
           </w:p>
         </w:tc>
@@ -5728,7 +8209,27 @@
                 <w:sz w:val="22"/>
                 <w:szCs w:val="22"/>
               </w:rPr>
-              <w:t>{{ item.action}}</w:t>
+              <w:t xml:space="preserve">{{ </w:t>
+            </w:r>
+            <w:proofErr w:type="spellStart"/>
+            <w:r>
+              <w:rPr>
+                <w:rFonts w:ascii="Cambria" w:hAnsi="Cambria"/>
+                <w:color w:val="000000"/>
+                <w:sz w:val="22"/>
+                <w:szCs w:val="22"/>
+              </w:rPr>
+              <w:t>item.action</w:t>
+            </w:r>
+            <w:proofErr w:type="spellEnd"/>
+            <w:r>
+              <w:rPr>
+                <w:rFonts w:ascii="Cambria" w:hAnsi="Cambria"/>
+                <w:color w:val="000000"/>
+                <w:sz w:val="22"/>
+                <w:szCs w:val="22"/>
+              </w:rPr>
+              <w:t>}}</w:t>
             </w:r>
           </w:p>
         </w:tc>
@@ -5758,16 +8259,36 @@
                 <w:sz w:val="22"/>
                 <w:szCs w:val="22"/>
               </w:rPr>
-              <w:t>{{item.feed</w:t>
-            </w:r>
-            <w:r>
-              <w:rPr>
-                <w:rFonts w:ascii="Cambria" w:hAnsi="Cambria"/>
-                <w:color w:val="000000"/>
-                <w:sz w:val="22"/>
-                <w:szCs w:val="22"/>
-              </w:rPr>
-              <w:t>back }}</w:t>
+              <w:t>{{</w:t>
+            </w:r>
+            <w:proofErr w:type="spellStart"/>
+            <w:r>
+              <w:rPr>
+                <w:rFonts w:ascii="Cambria" w:hAnsi="Cambria"/>
+                <w:color w:val="000000"/>
+                <w:sz w:val="22"/>
+                <w:szCs w:val="22"/>
+              </w:rPr>
+              <w:t>item.feed</w:t>
+            </w:r>
+            <w:r>
+              <w:rPr>
+                <w:rFonts w:ascii="Cambria" w:hAnsi="Cambria"/>
+                <w:color w:val="000000"/>
+                <w:sz w:val="22"/>
+                <w:szCs w:val="22"/>
+              </w:rPr>
+              <w:t>back</w:t>
+            </w:r>
+            <w:proofErr w:type="spellEnd"/>
+            <w:r>
+              <w:rPr>
+                <w:rFonts w:ascii="Cambria" w:hAnsi="Cambria"/>
+                <w:color w:val="000000"/>
+                <w:sz w:val="22"/>
+                <w:szCs w:val="22"/>
+              </w:rPr>
+              <w:t xml:space="preserve"> }}</w:t>
             </w:r>
           </w:p>
         </w:tc>
@@ -5804,7 +8325,52 @@
                 <w:sz w:val="22"/>
                 <w:szCs w:val="22"/>
               </w:rPr>
-              <w:t>{%tr endfor %}</w:t>
+              <w:lastRenderedPageBreak/>
+              <w:t>{%</w:t>
+            </w:r>
+            <w:proofErr w:type="spellStart"/>
+            <w:r>
+              <w:rPr>
+                <w:rFonts w:ascii="Cambria" w:hAnsi="Cambria"/>
+                <w:b w:val="0"/>
+                <w:color w:val="000000"/>
+                <w:sz w:val="22"/>
+                <w:szCs w:val="22"/>
+              </w:rPr>
+              <w:t>tr</w:t>
+            </w:r>
+            <w:proofErr w:type="spellEnd"/>
+            <w:r>
+              <w:rPr>
+                <w:rFonts w:ascii="Cambria" w:hAnsi="Cambria"/>
+                <w:b w:val="0"/>
+                <w:color w:val="000000"/>
+                <w:sz w:val="22"/>
+                <w:szCs w:val="22"/>
+              </w:rPr>
+              <w:t xml:space="preserve"> </w:t>
+            </w:r>
+            <w:proofErr w:type="spellStart"/>
+            <w:r>
+              <w:rPr>
+                <w:rFonts w:ascii="Cambria" w:hAnsi="Cambria"/>
+                <w:b w:val="0"/>
+                <w:color w:val="000000"/>
+                <w:sz w:val="22"/>
+                <w:szCs w:val="22"/>
+              </w:rPr>
+              <w:t>endfor</w:t>
+            </w:r>
+            <w:proofErr w:type="spellEnd"/>
+            <w:r>
+              <w:rPr>
+                <w:rFonts w:ascii="Cambria" w:hAnsi="Cambria"/>
+                <w:b w:val="0"/>
+                <w:color w:val="000000"/>
+                <w:sz w:val="22"/>
+                <w:szCs w:val="22"/>
+              </w:rPr>
+              <w:t xml:space="preserve"> %}</w:t>
             </w:r>
           </w:p>
         </w:tc>
@@ -5963,7 +8529,6 @@
           <w:sz w:val="22"/>
           <w:szCs w:val="22"/>
         </w:rPr>
-        <w:lastRenderedPageBreak/>
         <w:t>{% else %}</w:t>
       </w:r>
     </w:p>
@@ -6017,7 +8582,27 @@
           <w:sz w:val="22"/>
           <w:szCs w:val="22"/>
         </w:rPr>
-        <w:t>{% endif %}</w:t>
+        <w:t xml:space="preserve">{% </w:t>
+      </w:r>
+      <w:proofErr w:type="spellStart"/>
+      <w:r>
+        <w:rPr>
+          <w:rFonts w:ascii="Cambria" w:hAnsi="Cambria"/>
+          <w:color w:val="000000"/>
+          <w:sz w:val="22"/>
+          <w:szCs w:val="22"/>
+        </w:rPr>
+        <w:t>endif</w:t>
+      </w:r>
+      <w:proofErr w:type="spellEnd"/>
+      <w:r>
+        <w:rPr>
+          <w:rFonts w:ascii="Cambria" w:hAnsi="Cambria"/>
+          <w:color w:val="000000"/>
+          <w:sz w:val="22"/>
+          <w:szCs w:val="22"/>
+        </w:rPr>
+        <w:t xml:space="preserve"> %}</w:t>
       </w:r>
     </w:p>
     <w:p>
@@ -6224,7 +8809,15 @@
       <w:pStyle w:val="Footer"/>
     </w:pPr>
     <w:r>
-      <w:t>{{footer_text}}</w:t>
+      <w:t>{{</w:t>
+    </w:r>
+    <w:proofErr w:type="spellStart"/>
+    <w:r>
+      <w:t>footer_text</w:t>
+    </w:r>
+    <w:proofErr w:type="spellEnd"/>
+    <w:r>
+      <w:t>}}</w:t>
     </w:r>
   </w:p>
 </w:ftr>
@@ -6497,7 +9090,7 @@
   <w:abstractNum w:abstractNumId="0">
     <w:nsid w:val="FFFFFF1D"/>
     <w:multiLevelType w:val="multilevel"/>
-    <w:tmpl w:val="8F204996"/>
+    <w:tmpl w:val="24063DF2"/>
     <w:lvl w:ilvl="0">
       <w:start w:val="1"/>
       <w:numFmt w:val="bullet"/>
@@ -8591,7 +11184,7 @@
 </file>
 
 <file path=customXml/itemProps3.xml><?xml version="1.0" encoding="utf-8"?>
-<ds:datastoreItem xmlns:ds="http://schemas.openxmlformats.org/officeDocument/2006/customXml" ds:itemID="{C714D276-7293-8244-A341-123411F0811C}">
+<ds:datastoreItem xmlns:ds="http://schemas.openxmlformats.org/officeDocument/2006/customXml" ds:itemID="{9BDCFA59-1029-0E44-9E11-DF9686C61AE7}">
   <ds:schemaRefs>
     <ds:schemaRef ds:uri="http://schemas.openxmlformats.org/officeDocument/2006/bibliography"/>
   </ds:schemaRefs>

</xml_diff>